<commit_message>
Se adjunta evidencia de crreación de Fork
</commit_message>
<xml_diff>
--- a/mudevops07_act1_GRUPAL - Evidencias.docx
+++ b/mudevops07_act1_GRUPAL - Evidencias.docx
@@ -7,7 +7,6 @@
         <w:pStyle w:val="TituloApartado1"/>
       </w:pPr>
       <w:bookmarkStart w:id="0" w:name="_Toc459888455"/>
-      <w:proofErr w:type="spellStart"/>
       <w:r>
         <w:rPr>
           <w:i/>
@@ -20,87 +19,51 @@
           <w:i/>
           <w:iCs/>
         </w:rPr>
-        <w:t>ull</w:t>
-      </w:r>
-      <w:proofErr w:type="spellEnd"/>
+        <w:t>ull requests</w:t>
+      </w:r>
+      <w:r>
+        <w:t xml:space="preserve"> en GitHub</w:t>
+      </w:r>
+      <w:r>
+        <w:t xml:space="preserve"> (actividad grupal)</w:t>
+      </w:r>
+    </w:p>
+    <w:p>
+      <w:pPr>
+        <w:rPr>
+          <w:b/>
+        </w:rPr>
+      </w:pPr>
+    </w:p>
+    <w:p>
+      <w:pPr>
+        <w:pStyle w:val="TtuloApartado3"/>
+      </w:pPr>
+      <w:r>
+        <w:t>Objetivos</w:t>
+      </w:r>
+    </w:p>
+    <w:p/>
+    <w:p>
+      <w:r>
+        <w:t xml:space="preserve">En esta actividad </w:t>
+      </w:r>
+      <w:r>
+        <w:t>los estudiantes aprenderán</w:t>
+      </w:r>
+      <w:r>
+        <w:t xml:space="preserve"> la funcionalidad de </w:t>
+      </w:r>
       <w:r>
         <w:rPr>
           <w:i/>
           <w:iCs/>
         </w:rPr>
-        <w:t xml:space="preserve"> </w:t>
-      </w:r>
-      <w:proofErr w:type="spellStart"/>
-      <w:r>
-        <w:rPr>
-          <w:i/>
-          <w:iCs/>
-        </w:rPr>
-        <w:t>requests</w:t>
-      </w:r>
-      <w:proofErr w:type="spellEnd"/>
-      <w:r>
-        <w:t xml:space="preserve"> en GitHub</w:t>
-      </w:r>
-      <w:r>
-        <w:t xml:space="preserve"> (actividad grupal)</w:t>
-      </w:r>
-    </w:p>
-    <w:p>
-      <w:pPr>
-        <w:rPr>
-          <w:b/>
-        </w:rPr>
-      </w:pPr>
-    </w:p>
-    <w:p>
-      <w:pPr>
-        <w:pStyle w:val="TtuloApartado3"/>
-      </w:pPr>
-      <w:r>
-        <w:t>Objetivos</w:t>
-      </w:r>
-    </w:p>
-    <w:p/>
-    <w:p>
-      <w:r>
-        <w:t xml:space="preserve">En esta actividad </w:t>
-      </w:r>
-      <w:r>
-        <w:t>los estudiantes aprenderán</w:t>
-      </w:r>
-      <w:r>
-        <w:t xml:space="preserve"> la funcionalidad de </w:t>
-      </w:r>
-      <w:proofErr w:type="spellStart"/>
-      <w:r>
-        <w:rPr>
-          <w:i/>
-          <w:iCs/>
-        </w:rPr>
-        <w:t>pull</w:t>
-      </w:r>
-      <w:proofErr w:type="spellEnd"/>
-      <w:r>
-        <w:rPr>
-          <w:i/>
-          <w:iCs/>
-        </w:rPr>
-        <w:t xml:space="preserve"> </w:t>
-      </w:r>
-      <w:proofErr w:type="spellStart"/>
-      <w:r>
-        <w:rPr>
-          <w:i/>
-          <w:iCs/>
-        </w:rPr>
-        <w:t>requests</w:t>
-      </w:r>
-      <w:proofErr w:type="spellEnd"/>
+        <w:t>pull requests</w:t>
+      </w:r>
       <w:r>
         <w:t xml:space="preserve"> de GitHub y el manejo de repositorios remotos. El GitHub </w:t>
       </w:r>
-      <w:proofErr w:type="spellStart"/>
       <w:r>
         <w:rPr>
           <w:i/>
@@ -108,7 +71,6 @@
         </w:rPr>
         <w:t>workflow</w:t>
       </w:r>
-      <w:proofErr w:type="spellEnd"/>
       <w:r>
         <w:t xml:space="preserve"> </w:t>
       </w:r>
@@ -130,21 +92,8 @@
     </w:p>
     <w:p/>
     <w:p>
-      <w:proofErr w:type="spellStart"/>
-      <w:r>
-        <w:t>FinTech</w:t>
-      </w:r>
-      <w:proofErr w:type="spellEnd"/>
-      <w:r>
-        <w:t xml:space="preserve"> </w:t>
-      </w:r>
-      <w:proofErr w:type="spellStart"/>
-      <w:r>
-        <w:t>Solutions</w:t>
-      </w:r>
-      <w:proofErr w:type="spellEnd"/>
-      <w:r>
-        <w:t xml:space="preserve"> </w:t>
+      <w:r>
+        <w:t xml:space="preserve">FinTech Solutions </w:t>
       </w:r>
       <w:r>
         <w:t>S.</w:t>
@@ -372,7 +321,6 @@
         </w:rPr>
         <w:t>practica-unir-</w:t>
       </w:r>
-      <w:proofErr w:type="spellStart"/>
       <w:r>
         <w:rPr>
           <w:rFonts w:ascii="Consolas" w:hAnsi="Consolas"/>
@@ -381,7 +329,6 @@
         </w:rPr>
         <w:t>fintech</w:t>
       </w:r>
-      <w:proofErr w:type="spellEnd"/>
       <w:r>
         <w:t>.</w:t>
       </w:r>
@@ -403,41 +350,13 @@
       <w:r>
         <w:t xml:space="preserve"> el repositorio en local con </w:t>
       </w:r>
-      <w:proofErr w:type="spellStart"/>
       <w:r>
         <w:rPr>
           <w:rFonts w:ascii="Consolas" w:hAnsi="Consolas"/>
           <w:sz w:val="20"/>
           <w:szCs w:val="20"/>
         </w:rPr>
-        <w:t>git</w:t>
-      </w:r>
-      <w:proofErr w:type="spellEnd"/>
-      <w:r>
-        <w:rPr>
-          <w:rFonts w:ascii="Consolas" w:hAnsi="Consolas"/>
-          <w:sz w:val="20"/>
-          <w:szCs w:val="20"/>
-        </w:rPr>
-        <w:t xml:space="preserve"> clone &lt;</w:t>
-      </w:r>
-      <w:proofErr w:type="spellStart"/>
-      <w:r>
-        <w:rPr>
-          <w:rFonts w:ascii="Consolas" w:hAnsi="Consolas"/>
-          <w:sz w:val="20"/>
-          <w:szCs w:val="20"/>
-        </w:rPr>
-        <w:t>url</w:t>
-      </w:r>
-      <w:proofErr w:type="spellEnd"/>
-      <w:r>
-        <w:rPr>
-          <w:rFonts w:ascii="Consolas" w:hAnsi="Consolas"/>
-          <w:sz w:val="20"/>
-          <w:szCs w:val="20"/>
-        </w:rPr>
-        <w:t>&gt;.</w:t>
+        <w:t>git clone &lt;url&gt;.</w:t>
       </w:r>
     </w:p>
     <w:p>
@@ -461,7 +380,6 @@
         <w:t xml:space="preserve">sde la página de </w:t>
       </w:r>
       <w:hyperlink r:id="rId12" w:history="1">
-        <w:proofErr w:type="spellStart"/>
         <w:r>
           <w:rPr>
             <w:rStyle w:val="Hyperlink"/>
@@ -469,7 +387,6 @@
           </w:rPr>
           <w:t>Github</w:t>
         </w:r>
-        <w:proofErr w:type="spellEnd"/>
       </w:hyperlink>
       <w:r>
         <w:t xml:space="preserve"> </w:t>
@@ -507,222 +424,151 @@
       <w:r>
         <w:t xml:space="preserve"> </w:t>
       </w:r>
-      <w:proofErr w:type="spellStart"/>
       <w:r>
         <w:rPr>
           <w:rFonts w:ascii="Consolas" w:hAnsi="Consolas"/>
           <w:sz w:val="20"/>
           <w:szCs w:val="20"/>
         </w:rPr>
-        <w:t>git</w:t>
-      </w:r>
-      <w:proofErr w:type="spellEnd"/>
+        <w:t xml:space="preserve">git add . </w:t>
+      </w:r>
+      <w:r>
+        <w:t>(</w:t>
+      </w:r>
+      <w:r>
+        <w:t>cuidado</w:t>
+      </w:r>
+      <w:r>
+        <w:t xml:space="preserve"> con el punto), </w:t>
+      </w:r>
       <w:r>
         <w:rPr>
           <w:rFonts w:ascii="Consolas" w:hAnsi="Consolas"/>
           <w:sz w:val="20"/>
           <w:szCs w:val="20"/>
         </w:rPr>
+        <w:t>git commit -m</w:t>
+      </w:r>
+      <w:r>
         <w:t xml:space="preserve"> </w:t>
       </w:r>
-      <w:proofErr w:type="gramStart"/>
       <w:r>
         <w:rPr>
           <w:rFonts w:ascii="Consolas" w:hAnsi="Consolas"/>
           <w:sz w:val="20"/>
           <w:szCs w:val="20"/>
         </w:rPr>
-        <w:t>add .</w:t>
-      </w:r>
-      <w:proofErr w:type="gramEnd"/>
+        <w:t>"primer commit"</w:t>
+      </w:r>
+      <w:r>
+        <w:t xml:space="preserve"> y </w:t>
+      </w:r>
       <w:r>
         <w:rPr>
           <w:rFonts w:ascii="Consolas" w:hAnsi="Consolas"/>
           <w:sz w:val="20"/>
           <w:szCs w:val="20"/>
         </w:rPr>
-        <w:t xml:space="preserve"> </w:t>
-      </w:r>
-      <w:r>
-        <w:t>(</w:t>
-      </w:r>
-      <w:r>
-        <w:t>cuidado</w:t>
-      </w:r>
-      <w:r>
-        <w:t xml:space="preserve"> con el punto), </w:t>
-      </w:r>
-      <w:proofErr w:type="spellStart"/>
+        <w:t>git push origin master.</w:t>
+      </w:r>
+    </w:p>
+    <w:p>
+      <w:pPr>
+        <w:pStyle w:val="ListParagraph"/>
+        <w:numPr>
+          <w:ilvl w:val="0"/>
+          <w:numId w:val="29"/>
+        </w:numPr>
+      </w:pPr>
+      <w:r>
+        <w:t>También puede</w:t>
+      </w:r>
+      <w:r>
+        <w:t xml:space="preserve"> clonar el repositorio </w:t>
+      </w:r>
       <w:r>
         <w:rPr>
           <w:rFonts w:ascii="Consolas" w:hAnsi="Consolas"/>
           <w:sz w:val="20"/>
           <w:szCs w:val="20"/>
         </w:rPr>
-        <w:t>git</w:t>
-      </w:r>
-      <w:proofErr w:type="spellEnd"/>
+        <w:t>unir-git</w:t>
+      </w:r>
+      <w:r>
+        <w:t xml:space="preserve"> directamente y añadir </w:t>
+      </w:r>
+      <w:r>
+        <w:t xml:space="preserve">su </w:t>
+      </w:r>
+      <w:r>
+        <w:t xml:space="preserve">repositorio como remoto. El objetivo es que </w:t>
+      </w:r>
+      <w:r>
+        <w:t xml:space="preserve">el </w:t>
+      </w:r>
+      <w:r>
+        <w:t xml:space="preserve">repositorio no sea un </w:t>
+      </w:r>
       <w:r>
         <w:rPr>
-          <w:rFonts w:ascii="Consolas" w:hAnsi="Consolas"/>
-          <w:sz w:val="20"/>
-          <w:szCs w:val="20"/>
+          <w:i/>
+          <w:iCs/>
         </w:rPr>
-        <w:t xml:space="preserve"> </w:t>
-      </w:r>
-      <w:proofErr w:type="spellStart"/>
+        <w:t xml:space="preserve">fork </w:t>
+      </w:r>
+      <w:r>
+        <w:t xml:space="preserve">del usado en el caso práctico para no despistar durante la creación de </w:t>
+      </w:r>
       <w:r>
         <w:rPr>
-          <w:rFonts w:ascii="Consolas" w:hAnsi="Consolas"/>
-          <w:sz w:val="20"/>
-          <w:szCs w:val="20"/>
+          <w:i/>
+          <w:iCs/>
         </w:rPr>
-        <w:t>commit</w:t>
-      </w:r>
-      <w:proofErr w:type="spellEnd"/>
+        <w:t>pull requests.</w:t>
+      </w:r>
+    </w:p>
+    <w:p/>
+    <w:p>
+      <w:r>
+        <w:t>Una vez inicializado el repositorio, el administrador compartirá la URL con el resto del grupo</w:t>
+      </w:r>
+      <w:r>
+        <w:t xml:space="preserve">, </w:t>
+      </w:r>
       <w:r>
         <w:rPr>
-          <w:rFonts w:ascii="Consolas" w:hAnsi="Consolas"/>
-          <w:sz w:val="20"/>
-          <w:szCs w:val="20"/>
+          <w:highlight w:val="yellow"/>
         </w:rPr>
-        <w:t xml:space="preserve"> -m</w:t>
-      </w:r>
-      <w:r>
-        <w:t xml:space="preserve"> </w:t>
+        <w:t>pero no</w:t>
       </w:r>
       <w:r>
         <w:rPr>
-          <w:rFonts w:ascii="Consolas" w:hAnsi="Consolas"/>
-          <w:sz w:val="20"/>
-          <w:szCs w:val="20"/>
+          <w:highlight w:val="yellow"/>
         </w:rPr>
-        <w:t xml:space="preserve">"primer </w:t>
-      </w:r>
-      <w:proofErr w:type="spellStart"/>
-      <w:r>
-        <w:rPr>
-          <w:rFonts w:ascii="Consolas" w:hAnsi="Consolas"/>
-          <w:sz w:val="20"/>
-          <w:szCs w:val="20"/>
-        </w:rPr>
-        <w:t>commit</w:t>
-      </w:r>
-      <w:proofErr w:type="spellEnd"/>
-      <w:r>
-        <w:rPr>
-          <w:rFonts w:ascii="Consolas" w:hAnsi="Consolas"/>
-          <w:sz w:val="20"/>
-          <w:szCs w:val="20"/>
-        </w:rPr>
-        <w:t>"</w:t>
-      </w:r>
-      <w:r>
-        <w:t xml:space="preserve"> y </w:t>
-      </w:r>
-      <w:proofErr w:type="spellStart"/>
-      <w:r>
-        <w:rPr>
-          <w:rFonts w:ascii="Consolas" w:hAnsi="Consolas"/>
-          <w:sz w:val="20"/>
-          <w:szCs w:val="20"/>
-        </w:rPr>
-        <w:t>git</w:t>
-      </w:r>
-      <w:proofErr w:type="spellEnd"/>
-      <w:r>
-        <w:rPr>
-          <w:rFonts w:ascii="Consolas" w:hAnsi="Consolas"/>
-          <w:sz w:val="20"/>
-          <w:szCs w:val="20"/>
-        </w:rPr>
-        <w:t xml:space="preserve"> </w:t>
-      </w:r>
-      <w:proofErr w:type="spellStart"/>
-      <w:r>
-        <w:rPr>
-          <w:rFonts w:ascii="Consolas" w:hAnsi="Consolas"/>
-          <w:sz w:val="20"/>
-          <w:szCs w:val="20"/>
-        </w:rPr>
-        <w:t>push</w:t>
-      </w:r>
-      <w:proofErr w:type="spellEnd"/>
-      <w:r>
-        <w:rPr>
-          <w:rFonts w:ascii="Consolas" w:hAnsi="Consolas"/>
-          <w:sz w:val="20"/>
-          <w:szCs w:val="20"/>
-        </w:rPr>
-        <w:t xml:space="preserve"> </w:t>
-      </w:r>
-      <w:proofErr w:type="spellStart"/>
-      <w:r>
-        <w:rPr>
-          <w:rFonts w:ascii="Consolas" w:hAnsi="Consolas"/>
-          <w:sz w:val="20"/>
-          <w:szCs w:val="20"/>
-        </w:rPr>
-        <w:t>origin</w:t>
-      </w:r>
-      <w:proofErr w:type="spellEnd"/>
-      <w:r>
-        <w:rPr>
-          <w:rFonts w:ascii="Consolas" w:hAnsi="Consolas"/>
-          <w:sz w:val="20"/>
-          <w:szCs w:val="20"/>
-        </w:rPr>
-        <w:t xml:space="preserve"> master.</w:t>
+        <w:t xml:space="preserve"> debe dar acceso de escritura a nadie</w:t>
+      </w:r>
+      <w:r>
+        <w:t xml:space="preserve">. </w:t>
+      </w:r>
+      <w:r>
+        <w:t xml:space="preserve">Los demás integrantes deberán </w:t>
+      </w:r>
+      <w:r>
+        <w:t>seguir los pasos del caso práctico:</w:t>
       </w:r>
     </w:p>
+    <w:p/>
     <w:p>
       <w:pPr>
         <w:pStyle w:val="ListParagraph"/>
         <w:numPr>
           <w:ilvl w:val="0"/>
-          <w:numId w:val="29"/>
+          <w:numId w:val="30"/>
         </w:numPr>
       </w:pPr>
       <w:r>
-        <w:t>También puede</w:t>
-      </w:r>
-      <w:r>
-        <w:t xml:space="preserve"> clonar el repositorio </w:t>
-      </w:r>
-      <w:r>
-        <w:rPr>
-          <w:rFonts w:ascii="Consolas" w:hAnsi="Consolas"/>
-          <w:sz w:val="20"/>
-          <w:szCs w:val="20"/>
-        </w:rPr>
-        <w:t>unir-</w:t>
-      </w:r>
-      <w:proofErr w:type="spellStart"/>
-      <w:r>
-        <w:rPr>
-          <w:rFonts w:ascii="Consolas" w:hAnsi="Consolas"/>
-          <w:sz w:val="20"/>
-          <w:szCs w:val="20"/>
-        </w:rPr>
-        <w:t>git</w:t>
-      </w:r>
-      <w:proofErr w:type="spellEnd"/>
-      <w:r>
-        <w:t xml:space="preserve"> directamente y añadir </w:t>
-      </w:r>
-      <w:r>
-        <w:t xml:space="preserve">su </w:t>
-      </w:r>
-      <w:r>
-        <w:t xml:space="preserve">repositorio como remoto. El objetivo es que </w:t>
-      </w:r>
-      <w:r>
-        <w:t xml:space="preserve">el </w:t>
-      </w:r>
-      <w:r>
-        <w:t xml:space="preserve">repositorio no sea un </w:t>
-      </w:r>
-      <w:proofErr w:type="spellStart"/>
+        <w:t xml:space="preserve">Crear un </w:t>
+      </w:r>
       <w:r>
         <w:rPr>
           <w:i/>
@@ -730,81 +576,10 @@
         </w:rPr>
         <w:t>fork</w:t>
       </w:r>
-      <w:proofErr w:type="spellEnd"/>
-      <w:r>
-        <w:rPr>
-          <w:i/>
-          <w:iCs/>
-        </w:rPr>
-        <w:t xml:space="preserve"> </w:t>
-      </w:r>
-      <w:r>
-        <w:t xml:space="preserve">del usado en el caso práctico para no despistar durante la creación de </w:t>
-      </w:r>
-      <w:proofErr w:type="spellStart"/>
-      <w:r>
-        <w:rPr>
-          <w:i/>
-          <w:iCs/>
-        </w:rPr>
-        <w:t>pull</w:t>
-      </w:r>
-      <w:proofErr w:type="spellEnd"/>
-      <w:r>
-        <w:rPr>
-          <w:i/>
-          <w:iCs/>
-        </w:rPr>
-        <w:t xml:space="preserve"> </w:t>
-      </w:r>
-      <w:proofErr w:type="spellStart"/>
-      <w:r>
-        <w:rPr>
-          <w:i/>
-          <w:iCs/>
-        </w:rPr>
-        <w:t>requests</w:t>
-      </w:r>
-      <w:proofErr w:type="spellEnd"/>
-      <w:r>
-        <w:rPr>
-          <w:i/>
-          <w:iCs/>
-        </w:rPr>
-        <w:t>.</w:t>
+      <w:r>
+        <w:t xml:space="preserve"> a partir del repositorio del administrador.</w:t>
       </w:r>
     </w:p>
-    <w:p/>
-    <w:p>
-      <w:r>
-        <w:t>Una vez inicializado el repositorio, el administrador compartirá la URL con el resto del grupo</w:t>
-      </w:r>
-      <w:r>
-        <w:t xml:space="preserve">, </w:t>
-      </w:r>
-      <w:r>
-        <w:rPr>
-          <w:highlight w:val="yellow"/>
-        </w:rPr>
-        <w:t>pero no</w:t>
-      </w:r>
-      <w:r>
-        <w:rPr>
-          <w:highlight w:val="yellow"/>
-        </w:rPr>
-        <w:t xml:space="preserve"> debe dar acceso de escritura a nadie</w:t>
-      </w:r>
-      <w:r>
-        <w:t xml:space="preserve">. </w:t>
-      </w:r>
-      <w:r>
-        <w:t xml:space="preserve">Los demás integrantes deberán </w:t>
-      </w:r>
-      <w:r>
-        <w:t>seguir los pasos del caso práctico:</w:t>
-      </w:r>
-    </w:p>
-    <w:p/>
     <w:p>
       <w:pPr>
         <w:pStyle w:val="ListParagraph"/>
@@ -814,68 +589,35 @@
         </w:numPr>
       </w:pPr>
       <w:r>
-        <w:t xml:space="preserve">Crear un </w:t>
-      </w:r>
-      <w:proofErr w:type="spellStart"/>
+        <w:t>Una vez c</w:t>
+      </w:r>
+      <w:r>
+        <w:t xml:space="preserve">lonado en local, </w:t>
+      </w:r>
+      <w:r>
+        <w:t xml:space="preserve">crear </w:t>
+      </w:r>
+      <w:r>
+        <w:t>una rama nueva</w:t>
+      </w:r>
+      <w:r>
+        <w:t xml:space="preserve"> e</w:t>
+      </w:r>
+      <w:r>
+        <w:t xml:space="preserve"> implementa</w:t>
+      </w:r>
+      <w:r>
+        <w:t xml:space="preserve">r </w:t>
+      </w:r>
+      <w:r>
+        <w:t xml:space="preserve">la funcionalidad, </w:t>
+      </w:r>
       <w:r>
         <w:rPr>
           <w:i/>
           <w:iCs/>
         </w:rPr>
-        <w:t>fork</w:t>
-      </w:r>
-      <w:proofErr w:type="spellEnd"/>
-      <w:r>
-        <w:t xml:space="preserve"> a partir del repositorio del administrador.</w:t>
-      </w:r>
-    </w:p>
-    <w:p>
-      <w:pPr>
-        <w:pStyle w:val="ListParagraph"/>
-        <w:numPr>
-          <w:ilvl w:val="0"/>
-          <w:numId w:val="30"/>
-        </w:numPr>
-      </w:pPr>
-      <w:r>
-        <w:t>Una vez c</w:t>
-      </w:r>
-      <w:r>
-        <w:t xml:space="preserve">lonado en local, </w:t>
-      </w:r>
-      <w:r>
-        <w:t xml:space="preserve">crear </w:t>
-      </w:r>
-      <w:r>
-        <w:t>una rama nueva</w:t>
-      </w:r>
-      <w:r>
-        <w:t xml:space="preserve"> e</w:t>
-      </w:r>
-      <w:r>
-        <w:t xml:space="preserve"> implementa</w:t>
-      </w:r>
-      <w:r>
-        <w:t xml:space="preserve">r </w:t>
-      </w:r>
-      <w:r>
-        <w:t xml:space="preserve">la funcionalidad, </w:t>
-      </w:r>
-      <w:proofErr w:type="spellStart"/>
-      <w:r>
-        <w:rPr>
-          <w:i/>
-          <w:iCs/>
-        </w:rPr>
-        <w:t>commit</w:t>
-      </w:r>
-      <w:proofErr w:type="spellEnd"/>
-      <w:r>
-        <w:rPr>
-          <w:i/>
-          <w:iCs/>
-        </w:rPr>
-        <w:t>.</w:t>
+        <w:t>commit.</w:t>
       </w:r>
       <w:r>
         <w:t xml:space="preserve"> Al clonar en local, </w:t>
@@ -924,7 +666,6 @@
       <w:r>
         <w:t xml:space="preserve"> la rama a su </w:t>
       </w:r>
-      <w:proofErr w:type="spellStart"/>
       <w:r>
         <w:rPr>
           <w:i/>
@@ -932,7 +673,6 @@
         </w:rPr>
         <w:t>fork</w:t>
       </w:r>
-      <w:proofErr w:type="spellEnd"/>
       <w:r>
         <w:t xml:space="preserve"> y crea</w:t>
       </w:r>
@@ -942,37 +682,12 @@
       <w:r>
         <w:t xml:space="preserve"> la </w:t>
       </w:r>
-      <w:proofErr w:type="spellStart"/>
       <w:r>
         <w:rPr>
           <w:i/>
           <w:iCs/>
         </w:rPr>
-        <w:t>pull</w:t>
-      </w:r>
-      <w:proofErr w:type="spellEnd"/>
-      <w:r>
-        <w:rPr>
-          <w:i/>
-          <w:iCs/>
-        </w:rPr>
-        <w:t xml:space="preserve"> </w:t>
-      </w:r>
-      <w:proofErr w:type="spellStart"/>
-      <w:r>
-        <w:rPr>
-          <w:i/>
-          <w:iCs/>
-        </w:rPr>
-        <w:t>request</w:t>
-      </w:r>
-      <w:proofErr w:type="spellEnd"/>
-      <w:r>
-        <w:rPr>
-          <w:i/>
-          <w:iCs/>
-        </w:rPr>
-        <w:t>.</w:t>
+        <w:t>pull request.</w:t>
       </w:r>
     </w:p>
     <w:p>
@@ -1082,7 +797,6 @@
       <w:r>
         <w:t xml:space="preserve">ceptar un nuevo parámetro de línea de comandos que indique si es necesario eliminar palabras duplicadas de la lista antes de imprimirlas (en este caso habrá que modificar la función </w:t>
       </w:r>
-      <w:proofErr w:type="spellStart"/>
       <w:r>
         <w:rPr>
           <w:rFonts w:ascii="Consolas" w:hAnsi="Consolas"/>
@@ -1091,7 +805,6 @@
         </w:rPr>
         <w:t>sort_list</w:t>
       </w:r>
-      <w:proofErr w:type="spellEnd"/>
       <w:r>
         <w:t>)</w:t>
       </w:r>
@@ -1113,23 +826,13 @@
       <w:r>
         <w:t xml:space="preserve">ñadir una directiva en el </w:t>
       </w:r>
-      <w:proofErr w:type="spellStart"/>
       <w:r>
         <w:rPr>
           <w:rFonts w:ascii="Consolas" w:hAnsi="Consolas"/>
           <w:sz w:val="20"/>
           <w:szCs w:val="20"/>
         </w:rPr>
-        <w:t>Makefile</w:t>
-      </w:r>
-      <w:proofErr w:type="spellEnd"/>
-      <w:r>
-        <w:rPr>
-          <w:rFonts w:ascii="Consolas" w:hAnsi="Consolas"/>
-          <w:sz w:val="20"/>
-          <w:szCs w:val="20"/>
-        </w:rPr>
-        <w:t xml:space="preserve"> </w:t>
+        <w:t xml:space="preserve">Makefile </w:t>
       </w:r>
       <w:r>
         <w:t>que ejecute el comando en local, sin arrancar un contenedor de Docker.</w:t>
@@ -1172,23 +875,13 @@
       <w:r>
         <w:t xml:space="preserve">una por línea, y modificar el </w:t>
       </w:r>
-      <w:proofErr w:type="spellStart"/>
       <w:r>
         <w:rPr>
           <w:rFonts w:ascii="Consolas" w:hAnsi="Consolas"/>
           <w:sz w:val="20"/>
           <w:szCs w:val="20"/>
         </w:rPr>
-        <w:t>Makefile</w:t>
-      </w:r>
-      <w:proofErr w:type="spellEnd"/>
-      <w:r>
-        <w:rPr>
-          <w:rFonts w:ascii="Consolas" w:hAnsi="Consolas"/>
-          <w:sz w:val="20"/>
-          <w:szCs w:val="20"/>
-        </w:rPr>
-        <w:t xml:space="preserve"> </w:t>
+        <w:t xml:space="preserve">Makefile </w:t>
       </w:r>
       <w:r>
         <w:t>para que use el nombre del fichero como parámetro de línea de comandos.</w:t>
@@ -1209,15 +902,7 @@
         <w:t xml:space="preserve"> ni</w:t>
       </w:r>
       <w:r>
-        <w:t xml:space="preserve"> Python ni </w:t>
-      </w:r>
-      <w:proofErr w:type="spellStart"/>
-      <w:r>
-        <w:t>Makefiles</w:t>
-      </w:r>
-      <w:proofErr w:type="spellEnd"/>
-      <w:r>
-        <w:t xml:space="preserve">, por lo que no </w:t>
+        <w:t xml:space="preserve"> Python ni Makefiles, por lo que no </w:t>
       </w:r>
       <w:r>
         <w:t xml:space="preserve">deben preocuparse </w:t>
@@ -1255,7 +940,6 @@
       <w:r>
         <w:t xml:space="preserve">cada </w:t>
       </w:r>
-      <w:proofErr w:type="spellStart"/>
       <w:r>
         <w:rPr>
           <w:i/>
@@ -1263,7 +947,6 @@
         </w:rPr>
         <w:t>fork</w:t>
       </w:r>
-      <w:proofErr w:type="spellEnd"/>
       <w:r>
         <w:t>,</w:t>
       </w:r>
@@ -1282,31 +965,13 @@
       <w:r>
         <w:t xml:space="preserve">El administrador debe implementar también una funcionalidad y abrir una </w:t>
       </w:r>
-      <w:proofErr w:type="spellStart"/>
       <w:r>
         <w:rPr>
           <w:i/>
           <w:iCs/>
         </w:rPr>
-        <w:t>pull</w:t>
-      </w:r>
-      <w:proofErr w:type="spellEnd"/>
-      <w:r>
-        <w:rPr>
-          <w:i/>
-          <w:iCs/>
-        </w:rPr>
-        <w:t xml:space="preserve"> </w:t>
-      </w:r>
-      <w:proofErr w:type="spellStart"/>
-      <w:r>
-        <w:rPr>
-          <w:i/>
-          <w:iCs/>
-        </w:rPr>
-        <w:t>request</w:t>
-      </w:r>
-      <w:proofErr w:type="spellEnd"/>
+        <w:t>pull request</w:t>
+      </w:r>
       <w:r>
         <w:t xml:space="preserve"> contra su propio repositorio.</w:t>
       </w:r>
@@ -1350,48 +1015,22 @@
       <w:r>
         <w:t xml:space="preserve"> abrir una </w:t>
       </w:r>
-      <w:proofErr w:type="spellStart"/>
       <w:r>
         <w:rPr>
           <w:i/>
           <w:iCs/>
         </w:rPr>
-        <w:t>pull</w:t>
-      </w:r>
-      <w:proofErr w:type="spellEnd"/>
-      <w:r>
-        <w:rPr>
-          <w:i/>
-          <w:iCs/>
-        </w:rPr>
+        <w:t>pull request.</w:t>
+      </w:r>
+      <w:r>
         <w:t xml:space="preserve"> </w:t>
       </w:r>
-      <w:proofErr w:type="spellStart"/>
-      <w:r>
-        <w:rPr>
-          <w:i/>
-          <w:iCs/>
-        </w:rPr>
-        <w:t>request</w:t>
-      </w:r>
-      <w:proofErr w:type="spellEnd"/>
-      <w:r>
-        <w:rPr>
-          <w:i/>
-          <w:iCs/>
-        </w:rPr>
-        <w:t>.</w:t>
-      </w:r>
-      <w:r>
-        <w:t xml:space="preserve"> </w:t>
-      </w:r>
       <w:r>
         <w:t>Si los cambios se añaden, por ejemplo,</w:t>
       </w:r>
       <w:r>
         <w:t xml:space="preserve"> a </w:t>
       </w:r>
-      <w:proofErr w:type="gramStart"/>
       <w:r>
         <w:rPr>
           <w:rFonts w:ascii="Consolas" w:hAnsi="Consolas"/>
@@ -1403,7 +1042,6 @@
       <w:r>
         <w:t>,</w:t>
       </w:r>
-      <w:proofErr w:type="gramEnd"/>
       <w:r>
         <w:t xml:space="preserve"> cuando s</w:t>
       </w:r>
@@ -1436,59 +1074,13 @@
       <w:r>
         <w:t xml:space="preserve"> con </w:t>
       </w:r>
-      <w:proofErr w:type="spellStart"/>
       <w:r>
         <w:rPr>
           <w:rFonts w:ascii="Consolas" w:hAnsi="Consolas"/>
           <w:sz w:val="20"/>
           <w:szCs w:val="20"/>
         </w:rPr>
-        <w:t>git</w:t>
-      </w:r>
-      <w:proofErr w:type="spellEnd"/>
-      <w:r>
-        <w:rPr>
-          <w:rFonts w:ascii="Consolas" w:hAnsi="Consolas"/>
-          <w:sz w:val="20"/>
-          <w:szCs w:val="20"/>
-        </w:rPr>
-        <w:t xml:space="preserve"> </w:t>
-      </w:r>
-      <w:proofErr w:type="spellStart"/>
-      <w:r>
-        <w:rPr>
-          <w:rFonts w:ascii="Consolas" w:hAnsi="Consolas"/>
-          <w:sz w:val="20"/>
-          <w:szCs w:val="20"/>
-        </w:rPr>
-        <w:t>push</w:t>
-      </w:r>
-      <w:proofErr w:type="spellEnd"/>
-      <w:r>
-        <w:rPr>
-          <w:rFonts w:ascii="Consolas" w:hAnsi="Consolas"/>
-          <w:sz w:val="20"/>
-          <w:szCs w:val="20"/>
-        </w:rPr>
-        <w:t xml:space="preserve"> </w:t>
-      </w:r>
-      <w:proofErr w:type="spellStart"/>
-      <w:r>
-        <w:rPr>
-          <w:rFonts w:ascii="Consolas" w:hAnsi="Consolas"/>
-          <w:sz w:val="20"/>
-          <w:szCs w:val="20"/>
-        </w:rPr>
-        <w:t>origin</w:t>
-      </w:r>
-      <w:proofErr w:type="spellEnd"/>
-      <w:r>
-        <w:rPr>
-          <w:rFonts w:ascii="Consolas" w:hAnsi="Consolas"/>
-          <w:sz w:val="20"/>
-          <w:szCs w:val="20"/>
-        </w:rPr>
-        <w:t xml:space="preserve"> master</w:t>
+        <w:t>git push origin master</w:t>
       </w:r>
       <w:r>
         <w:t>, y</w:t>
@@ -1508,31 +1100,13 @@
       <w:r>
         <w:t xml:space="preserve">cambios en esa rama. No tiene sentido abrir una </w:t>
       </w:r>
-      <w:proofErr w:type="spellStart"/>
       <w:r>
         <w:rPr>
           <w:i/>
           <w:iCs/>
         </w:rPr>
-        <w:t>pull</w:t>
-      </w:r>
-      <w:proofErr w:type="spellEnd"/>
-      <w:r>
-        <w:rPr>
-          <w:i/>
-          <w:iCs/>
-        </w:rPr>
-        <w:t xml:space="preserve"> </w:t>
-      </w:r>
-      <w:proofErr w:type="spellStart"/>
-      <w:r>
-        <w:rPr>
-          <w:i/>
-          <w:iCs/>
-        </w:rPr>
-        <w:t>request</w:t>
-      </w:r>
-      <w:proofErr w:type="spellEnd"/>
+        <w:t>pull request</w:t>
+      </w:r>
       <w:r>
         <w:t xml:space="preserve"> de </w:t>
       </w:r>
@@ -1564,7 +1138,6 @@
       <w:r>
         <w:t xml:space="preserve"> iniciar </w:t>
       </w:r>
-      <w:proofErr w:type="spellStart"/>
       <w:r>
         <w:rPr>
           <w:i/>
@@ -1572,172 +1145,103 @@
         </w:rPr>
         <w:t>fork</w:t>
       </w:r>
-      <w:proofErr w:type="spellEnd"/>
       <w:r>
         <w:t xml:space="preserve"> a la vez para partir del mismo código y facilitar la revisión de </w:t>
       </w:r>
-      <w:proofErr w:type="spellStart"/>
       <w:r>
         <w:rPr>
           <w:i/>
           <w:iCs/>
         </w:rPr>
-        <w:t>pull</w:t>
-      </w:r>
-      <w:proofErr w:type="spellEnd"/>
+        <w:t>pull requests.</w:t>
+      </w:r>
+      <w:r>
+        <w:t xml:space="preserve"> Cuando </w:t>
+      </w:r>
+      <w:r>
+        <w:t xml:space="preserve">las </w:t>
+      </w:r>
       <w:r>
         <w:rPr>
           <w:i/>
           <w:iCs/>
         </w:rPr>
-        <w:t xml:space="preserve"> </w:t>
-      </w:r>
-      <w:proofErr w:type="spellStart"/>
+        <w:t>pull requests</w:t>
+      </w:r>
+      <w:r>
+        <w:t xml:space="preserve"> estén abiertas, </w:t>
+      </w:r>
+      <w:r>
+        <w:t xml:space="preserve">deben </w:t>
+      </w:r>
+      <w:r>
+        <w:t>acceder a ellas</w:t>
+      </w:r>
+      <w:r>
+        <w:t xml:space="preserve"> entre todos</w:t>
+      </w:r>
+      <w:r>
+        <w:t xml:space="preserve">. </w:t>
+      </w:r>
+      <w:r>
+        <w:t>Posteriormente, es necesario comprobar</w:t>
+      </w:r>
+      <w:r>
+        <w:t xml:space="preserve"> el código de </w:t>
+      </w:r>
+      <w:r>
+        <w:t xml:space="preserve">sus </w:t>
+      </w:r>
+      <w:r>
+        <w:t>compañeros.</w:t>
+      </w:r>
+    </w:p>
+    <w:p/>
+    <w:p>
+      <w:r>
+        <w:t>Una vez</w:t>
+      </w:r>
+      <w:r>
+        <w:t xml:space="preserve"> que han revisado</w:t>
+      </w:r>
+      <w:r>
+        <w:t xml:space="preserve"> el código de todas las </w:t>
+      </w:r>
       <w:r>
         <w:rPr>
           <w:i/>
           <w:iCs/>
         </w:rPr>
-        <w:t>requests</w:t>
-      </w:r>
-      <w:proofErr w:type="spellEnd"/>
-      <w:r>
-        <w:rPr>
-          <w:i/>
-          <w:iCs/>
-        </w:rPr>
-        <w:t>.</w:t>
-      </w:r>
-      <w:r>
-        <w:t xml:space="preserve"> Cuando </w:t>
-      </w:r>
-      <w:r>
-        <w:t xml:space="preserve">las </w:t>
-      </w:r>
-      <w:proofErr w:type="spellStart"/>
-      <w:r>
-        <w:rPr>
-          <w:i/>
-          <w:iCs/>
-        </w:rPr>
-        <w:t>pull</w:t>
-      </w:r>
-      <w:proofErr w:type="spellEnd"/>
-      <w:r>
-        <w:rPr>
-          <w:i/>
-          <w:iCs/>
-        </w:rPr>
+        <w:t>pull requests,</w:t>
+      </w:r>
+      <w:r>
+        <w:t xml:space="preserve"> el administrador </w:t>
+      </w:r>
+      <w:r>
+        <w:t>puede</w:t>
+      </w:r>
+      <w:r>
+        <w:t xml:space="preserve"> empezar a fusionarlas. Si hay algunas que hayan modificado las mismas líneas de un fichero, es posible que solo se pueda fusionar una de ellas. Al intentar fusionar la siguiente, GitHub indicará que hay conflictos y no ofrecerá la opción de fusionar. </w:t>
+      </w:r>
+      <w:r>
+        <w:t>En ese caso,</w:t>
+      </w:r>
+      <w:r>
         <w:t xml:space="preserve"> </w:t>
       </w:r>
-      <w:proofErr w:type="spellStart"/>
-      <w:r>
-        <w:rPr>
-          <w:i/>
-          <w:iCs/>
-        </w:rPr>
-        <w:t>requests</w:t>
-      </w:r>
-      <w:proofErr w:type="spellEnd"/>
-      <w:r>
-        <w:t xml:space="preserve"> estén abiertas, </w:t>
-      </w:r>
-      <w:r>
-        <w:t xml:space="preserve">deben </w:t>
-      </w:r>
-      <w:r>
-        <w:t>acceder a ellas</w:t>
-      </w:r>
-      <w:r>
-        <w:t xml:space="preserve"> entre todos</w:t>
-      </w:r>
-      <w:r>
-        <w:t xml:space="preserve">. </w:t>
-      </w:r>
-      <w:r>
-        <w:t>Posteriormente, es necesario comprobar</w:t>
-      </w:r>
-      <w:r>
-        <w:t xml:space="preserve"> el código de </w:t>
-      </w:r>
-      <w:r>
-        <w:t xml:space="preserve">sus </w:t>
-      </w:r>
-      <w:r>
-        <w:t>compañeros.</w:t>
+      <w:r>
+        <w:t xml:space="preserve">lo recomendado es fusionar </w:t>
+      </w:r>
+      <w:r>
+        <w:t>las que puedan, ya que</w:t>
+      </w:r>
+      <w:r>
+        <w:t xml:space="preserve"> la resolución de conflictos no entra en el alcance de esta práctica.</w:t>
       </w:r>
     </w:p>
     <w:p/>
     <w:p>
       <w:r>
-        <w:t>Una vez</w:t>
-      </w:r>
-      <w:r>
-        <w:t xml:space="preserve"> que han revisado</w:t>
-      </w:r>
-      <w:r>
-        <w:t xml:space="preserve"> el código de todas las </w:t>
-      </w:r>
-      <w:proofErr w:type="spellStart"/>
-      <w:r>
-        <w:rPr>
-          <w:i/>
-          <w:iCs/>
-        </w:rPr>
-        <w:t>pull</w:t>
-      </w:r>
-      <w:proofErr w:type="spellEnd"/>
-      <w:r>
-        <w:rPr>
-          <w:i/>
-          <w:iCs/>
-        </w:rPr>
-        <w:t xml:space="preserve"> </w:t>
-      </w:r>
-      <w:proofErr w:type="spellStart"/>
-      <w:r>
-        <w:rPr>
-          <w:i/>
-          <w:iCs/>
-        </w:rPr>
-        <w:t>requests</w:t>
-      </w:r>
-      <w:proofErr w:type="spellEnd"/>
-      <w:r>
-        <w:rPr>
-          <w:i/>
-          <w:iCs/>
-        </w:rPr>
-        <w:t>,</w:t>
-      </w:r>
-      <w:r>
-        <w:t xml:space="preserve"> el administrador </w:t>
-      </w:r>
-      <w:r>
-        <w:t>puede</w:t>
-      </w:r>
-      <w:r>
-        <w:t xml:space="preserve"> empezar a fusionarlas. Si hay algunas que hayan modificado las mismas líneas de un fichero, es posible que solo se pueda fusionar una de ellas. Al intentar fusionar la siguiente, GitHub indicará que hay conflictos y no ofrecerá la opción de fusionar. </w:t>
-      </w:r>
-      <w:r>
-        <w:t>En ese caso,</w:t>
-      </w:r>
-      <w:r>
-        <w:t xml:space="preserve"> </w:t>
-      </w:r>
-      <w:r>
-        <w:t xml:space="preserve">lo recomendado es fusionar </w:t>
-      </w:r>
-      <w:r>
-        <w:t>las que puedan, ya que</w:t>
-      </w:r>
-      <w:r>
-        <w:t xml:space="preserve"> la resolución de conflictos no entra en el alcance de esta práctica.</w:t>
-      </w:r>
-    </w:p>
-    <w:p/>
-    <w:p>
-      <w:r>
         <w:t>Aunque s</w:t>
       </w:r>
       <w:r>
@@ -1765,15 +1269,7 @@
         <w:t>i no identifican</w:t>
       </w:r>
       <w:r>
-        <w:t xml:space="preserve"> cómo ampliar el </w:t>
-      </w:r>
-      <w:proofErr w:type="spellStart"/>
-      <w:r>
-        <w:t>Makefile</w:t>
-      </w:r>
-      <w:proofErr w:type="spellEnd"/>
-      <w:r>
-        <w:t xml:space="preserve">, </w:t>
+        <w:t xml:space="preserve"> cómo ampliar el Makefile, </w:t>
       </w:r>
       <w:r>
         <w:t>etc</w:t>
@@ -3100,15 +2596,7 @@
       </w:pPr>
       <w:r>
         <w:lastRenderedPageBreak/>
-        <w:t xml:space="preserve">Primer </w:t>
-      </w:r>
-      <w:proofErr w:type="spellStart"/>
-      <w:r>
-        <w:t>commit</w:t>
-      </w:r>
-      <w:proofErr w:type="spellEnd"/>
-      <w:r>
-        <w:t xml:space="preserve"> del repositorio</w:t>
+        <w:t>Primer commit del repositorio</w:t>
       </w:r>
     </w:p>
     <w:p>
@@ -3233,13 +2721,8 @@
         </w:numPr>
         <w:ind w:left="284"/>
       </w:pPr>
-      <w:proofErr w:type="spellStart"/>
-      <w:r>
-        <w:t>Url</w:t>
-      </w:r>
-      <w:proofErr w:type="spellEnd"/>
-      <w:r>
-        <w:t xml:space="preserve"> para clonar: </w:t>
+      <w:r>
+        <w:t xml:space="preserve">Url para clonar: </w:t>
       </w:r>
     </w:p>
     <w:p>
@@ -3627,7 +3110,109 @@
       <w:r>
         <w:t xml:space="preserve">El </w:t>
       </w:r>
-      <w:proofErr w:type="spellStart"/>
+      <w:r>
+        <w:rPr>
+          <w:i/>
+          <w:iCs/>
+        </w:rPr>
+        <w:t xml:space="preserve">fork </w:t>
+      </w:r>
+      <w:r>
+        <w:t>de cada desarrollador en GitHub.</w:t>
+      </w:r>
+    </w:p>
+    <w:p>
+      <w:pPr>
+        <w:pStyle w:val="Vietaprimernivel"/>
+        <w:numPr>
+          <w:ilvl w:val="0"/>
+          <w:numId w:val="0"/>
+        </w:numPr>
+        <w:ind w:left="284" w:hanging="284"/>
+      </w:pPr>
+      <w:r>
+        <w:rPr>
+          <w:noProof/>
+        </w:rPr>
+        <w:drawing>
+          <wp:inline distT="0" distB="0" distL="0" distR="0" wp14:anchorId="35F20949" wp14:editId="0F1CB612">
+            <wp:extent cx="5219700" cy="1332230"/>
+            <wp:effectExtent l="0" t="0" r="0" b="1270"/>
+            <wp:docPr id="1920961560" name="Picture 1"/>
+            <wp:cNvGraphicFramePr>
+              <a:graphicFrameLocks xmlns:a="http://schemas.openxmlformats.org/drawingml/2006/main" noChangeAspect="1"/>
+            </wp:cNvGraphicFramePr>
+            <a:graphic xmlns:a="http://schemas.openxmlformats.org/drawingml/2006/main">
+              <a:graphicData uri="http://schemas.openxmlformats.org/drawingml/2006/picture">
+                <pic:pic xmlns:pic="http://schemas.openxmlformats.org/drawingml/2006/picture">
+                  <pic:nvPicPr>
+                    <pic:cNvPr id="1920961560" name=""/>
+                    <pic:cNvPicPr/>
+                  </pic:nvPicPr>
+                  <pic:blipFill>
+                    <a:blip r:embed="rId22"/>
+                    <a:stretch>
+                      <a:fillRect/>
+                    </a:stretch>
+                  </pic:blipFill>
+                  <pic:spPr>
+                    <a:xfrm>
+                      <a:off x="0" y="0"/>
+                      <a:ext cx="5219700" cy="1332230"/>
+                    </a:xfrm>
+                    <a:prstGeom prst="rect">
+                      <a:avLst/>
+                    </a:prstGeom>
+                  </pic:spPr>
+                </pic:pic>
+              </a:graphicData>
+            </a:graphic>
+          </wp:inline>
+        </w:drawing>
+      </w:r>
+    </w:p>
+    <w:p>
+      <w:pPr>
+        <w:pStyle w:val="Vietaprimernivel"/>
+      </w:pPr>
+      <w:r>
+        <w:t xml:space="preserve">El comando </w:t>
+      </w:r>
+      <w:r>
+        <w:rPr>
+          <w:rFonts w:ascii="Consolas" w:hAnsi="Consolas"/>
+          <w:sz w:val="20"/>
+          <w:szCs w:val="20"/>
+        </w:rPr>
+        <w:t>git push origin &lt;rama&gt;</w:t>
+      </w:r>
+      <w:r>
+        <w:t xml:space="preserve"> de cada desarrollador (la captura debe ser de la ventana de la terminal</w:t>
+      </w:r>
+      <w:r>
+        <w:t>)</w:t>
+      </w:r>
+      <w:r>
+        <w:t>.</w:t>
+      </w:r>
+    </w:p>
+    <w:p>
+      <w:pPr>
+        <w:pStyle w:val="Vietaprimernivel"/>
+      </w:pPr>
+      <w:r>
+        <w:t xml:space="preserve">Cada </w:t>
+      </w:r>
+      <w:r>
+        <w:rPr>
+          <w:i/>
+          <w:iCs/>
+        </w:rPr>
+        <w:t>pull request,</w:t>
+      </w:r>
+      <w:r>
+        <w:t xml:space="preserve"> una vez abierta. Debe aparecer el nombre de la rama y el </w:t>
+      </w:r>
       <w:r>
         <w:rPr>
           <w:i/>
@@ -3635,16 +3220,21 @@
         </w:rPr>
         <w:t>fork</w:t>
       </w:r>
-      <w:proofErr w:type="spellEnd"/>
+      <w:r>
+        <w:t xml:space="preserve"> desde el que se ha abierto. La captura </w:t>
+      </w:r>
+      <w:r>
+        <w:t>tiene que</w:t>
+      </w:r>
+      <w:r>
+        <w:t xml:space="preserve"> incluir la pestaña de </w:t>
+      </w:r>
       <w:r>
         <w:rPr>
           <w:i/>
           <w:iCs/>
         </w:rPr>
-        <w:t xml:space="preserve"> </w:t>
-      </w:r>
-      <w:r>
-        <w:t>de cada desarrollador en GitHub.</w:t>
+        <w:t>Files changed.</w:t>
       </w:r>
     </w:p>
     <w:p>
@@ -3652,200 +3242,70 @@
         <w:pStyle w:val="Vietaprimernivel"/>
       </w:pPr>
       <w:r>
-        <w:t xml:space="preserve">El comando </w:t>
-      </w:r>
-      <w:proofErr w:type="spellStart"/>
+        <w:t xml:space="preserve">Lista de </w:t>
+      </w:r>
+      <w:r>
+        <w:rPr>
+          <w:i/>
+          <w:iCs/>
+        </w:rPr>
+        <w:t>pull requests</w:t>
+      </w:r>
+      <w:r>
+        <w:t xml:space="preserve"> en el repositorio principal.</w:t>
+      </w:r>
+    </w:p>
+    <w:p>
+      <w:pPr>
+        <w:pStyle w:val="Vietaprimernivel"/>
+      </w:pPr>
+      <w:r>
+        <w:lastRenderedPageBreak/>
+        <w:t xml:space="preserve">El árbol de </w:t>
+      </w:r>
+      <w:r>
+        <w:rPr>
+          <w:i/>
+          <w:iCs/>
+        </w:rPr>
+        <w:t xml:space="preserve">commits </w:t>
+      </w:r>
+      <w:r>
+        <w:t xml:space="preserve">del repositorio principal tras fusionar todas las </w:t>
+      </w:r>
+      <w:r>
+        <w:rPr>
+          <w:i/>
+          <w:iCs/>
+        </w:rPr>
+        <w:t>pull requests posibles.</w:t>
+      </w:r>
+      <w:r>
+        <w:t xml:space="preserve"> Para ello, acceded a la ruta </w:t>
+      </w:r>
       <w:r>
         <w:rPr>
           <w:rFonts w:ascii="Consolas" w:hAnsi="Consolas"/>
           <w:sz w:val="20"/>
           <w:szCs w:val="20"/>
         </w:rPr>
-        <w:t>git</w:t>
-      </w:r>
-      <w:proofErr w:type="spellEnd"/>
-      <w:r>
-        <w:rPr>
-          <w:rFonts w:ascii="Consolas" w:hAnsi="Consolas"/>
-          <w:sz w:val="20"/>
-          <w:szCs w:val="20"/>
-        </w:rPr>
-        <w:t xml:space="preserve"> </w:t>
-      </w:r>
-      <w:proofErr w:type="spellStart"/>
-      <w:r>
-        <w:rPr>
-          <w:rFonts w:ascii="Consolas" w:hAnsi="Consolas"/>
-          <w:sz w:val="20"/>
-          <w:szCs w:val="20"/>
-        </w:rPr>
-        <w:t>push</w:t>
-      </w:r>
-      <w:proofErr w:type="spellEnd"/>
-      <w:r>
-        <w:rPr>
-          <w:rFonts w:ascii="Consolas" w:hAnsi="Consolas"/>
-          <w:sz w:val="20"/>
-          <w:szCs w:val="20"/>
-        </w:rPr>
-        <w:t xml:space="preserve"> </w:t>
-      </w:r>
-      <w:proofErr w:type="spellStart"/>
-      <w:r>
-        <w:rPr>
-          <w:rFonts w:ascii="Consolas" w:hAnsi="Consolas"/>
-          <w:sz w:val="20"/>
-          <w:szCs w:val="20"/>
-        </w:rPr>
-        <w:t>origin</w:t>
-      </w:r>
-      <w:proofErr w:type="spellEnd"/>
-      <w:r>
-        <w:rPr>
-          <w:rFonts w:ascii="Consolas" w:hAnsi="Consolas"/>
-          <w:sz w:val="20"/>
-          <w:szCs w:val="20"/>
-        </w:rPr>
-        <w:t xml:space="preserve"> &lt;rama&gt;</w:t>
-      </w:r>
-      <w:r>
-        <w:t xml:space="preserve"> de cada desarrollador (la captura debe ser de la ventana de la terminal</w:t>
+        <w:t>/commits/master</w:t>
+      </w:r>
+      <w:r>
+        <w:t xml:space="preserve"> del repositorio</w:t>
+      </w:r>
+      <w:r>
+        <w:t xml:space="preserve"> (</w:t>
+      </w:r>
+      <w:r>
+        <w:t>por ejemplo, https://github.com/&lt;id-usuario-admin&gt;/practica-unir-eiec/commits/master</w:t>
       </w:r>
       <w:r>
         <w:t>)</w:t>
       </w:r>
       <w:r>
-        <w:t>.</w:t>
-      </w:r>
-    </w:p>
-    <w:p>
-      <w:pPr>
-        <w:pStyle w:val="Vietaprimernivel"/>
-      </w:pPr>
-      <w:r>
-        <w:t xml:space="preserve">Cada </w:t>
-      </w:r>
-      <w:proofErr w:type="spellStart"/>
-      <w:r>
-        <w:rPr>
-          <w:i/>
-          <w:iCs/>
-        </w:rPr>
-        <w:t>pull</w:t>
-      </w:r>
-      <w:proofErr w:type="spellEnd"/>
-      <w:r>
-        <w:rPr>
-          <w:i/>
-          <w:iCs/>
-        </w:rPr>
-        <w:t xml:space="preserve"> </w:t>
-      </w:r>
-      <w:proofErr w:type="spellStart"/>
-      <w:r>
-        <w:rPr>
-          <w:i/>
-          <w:iCs/>
-        </w:rPr>
-        <w:t>request</w:t>
-      </w:r>
-      <w:proofErr w:type="spellEnd"/>
-      <w:r>
-        <w:rPr>
-          <w:i/>
-          <w:iCs/>
-        </w:rPr>
-        <w:t>,</w:t>
-      </w:r>
-      <w:r>
-        <w:t xml:space="preserve"> una vez abierta. Debe aparecer el nombre de la rama y el </w:t>
-      </w:r>
-      <w:proofErr w:type="spellStart"/>
-      <w:r>
-        <w:rPr>
-          <w:i/>
-          <w:iCs/>
-        </w:rPr>
-        <w:t>fork</w:t>
-      </w:r>
-      <w:proofErr w:type="spellEnd"/>
-      <w:r>
-        <w:t xml:space="preserve"> desde el que se ha abierto. La captura </w:t>
-      </w:r>
-      <w:r>
-        <w:t>tiene que</w:t>
-      </w:r>
-      <w:r>
-        <w:t xml:space="preserve"> incluir la pestaña de </w:t>
-      </w:r>
-      <w:r>
-        <w:rPr>
-          <w:i/>
-          <w:iCs/>
-        </w:rPr>
-        <w:t xml:space="preserve">Files </w:t>
-      </w:r>
-      <w:proofErr w:type="spellStart"/>
-      <w:r>
-        <w:rPr>
-          <w:i/>
-          <w:iCs/>
-        </w:rPr>
-        <w:t>changed</w:t>
-      </w:r>
-      <w:proofErr w:type="spellEnd"/>
-      <w:r>
-        <w:rPr>
-          <w:i/>
-          <w:iCs/>
-        </w:rPr>
-        <w:t>.</w:t>
-      </w:r>
-    </w:p>
-    <w:p>
-      <w:pPr>
-        <w:pStyle w:val="Vietaprimernivel"/>
-      </w:pPr>
-      <w:r>
-        <w:t xml:space="preserve">Lista de </w:t>
-      </w:r>
-      <w:proofErr w:type="spellStart"/>
-      <w:r>
-        <w:rPr>
-          <w:i/>
-          <w:iCs/>
-        </w:rPr>
-        <w:t>pull</w:t>
-      </w:r>
-      <w:proofErr w:type="spellEnd"/>
-      <w:r>
-        <w:rPr>
-          <w:i/>
-          <w:iCs/>
-        </w:rPr>
-        <w:t xml:space="preserve"> </w:t>
-      </w:r>
-      <w:proofErr w:type="spellStart"/>
-      <w:r>
-        <w:rPr>
-          <w:i/>
-          <w:iCs/>
-        </w:rPr>
-        <w:t>requests</w:t>
-      </w:r>
-      <w:proofErr w:type="spellEnd"/>
-      <w:r>
-        <w:t xml:space="preserve"> en el repositorio principal.</w:t>
-      </w:r>
-    </w:p>
-    <w:p>
-      <w:pPr>
-        <w:pStyle w:val="Vietaprimernivel"/>
-      </w:pPr>
-      <w:r>
-        <w:t xml:space="preserve">El árbol de </w:t>
-      </w:r>
-      <w:proofErr w:type="spellStart"/>
+        <w:t xml:space="preserve">. Deben aparecer los </w:t>
+      </w:r>
       <w:r>
         <w:rPr>
           <w:i/>
@@ -3853,130 +3313,16 @@
         </w:rPr>
         <w:t>commits</w:t>
       </w:r>
-      <w:proofErr w:type="spellEnd"/>
+      <w:r>
+        <w:t xml:space="preserve"> de las </w:t>
+      </w:r>
       <w:r>
         <w:rPr>
           <w:i/>
           <w:iCs/>
         </w:rPr>
-        <w:t xml:space="preserve"> </w:t>
-      </w:r>
-      <w:r>
-        <w:t xml:space="preserve">del repositorio principal tras fusionar todas las </w:t>
-      </w:r>
-      <w:proofErr w:type="spellStart"/>
-      <w:r>
-        <w:rPr>
-          <w:i/>
-          <w:iCs/>
-        </w:rPr>
-        <w:t>pull</w:t>
-      </w:r>
-      <w:proofErr w:type="spellEnd"/>
-      <w:r>
-        <w:rPr>
-          <w:i/>
-          <w:iCs/>
-        </w:rPr>
-        <w:t xml:space="preserve"> </w:t>
-      </w:r>
-      <w:proofErr w:type="spellStart"/>
-      <w:r>
-        <w:rPr>
-          <w:i/>
-          <w:iCs/>
-        </w:rPr>
-        <w:t>requests</w:t>
-      </w:r>
-      <w:proofErr w:type="spellEnd"/>
-      <w:r>
-        <w:rPr>
-          <w:i/>
-          <w:iCs/>
-        </w:rPr>
-        <w:t xml:space="preserve"> posibles.</w:t>
-      </w:r>
-      <w:r>
-        <w:t xml:space="preserve"> Para ello, acceded a la ruta </w:t>
-      </w:r>
-      <w:r>
-        <w:rPr>
-          <w:rFonts w:ascii="Consolas" w:hAnsi="Consolas"/>
-          <w:sz w:val="20"/>
-          <w:szCs w:val="20"/>
-        </w:rPr>
-        <w:t>/</w:t>
-      </w:r>
-      <w:proofErr w:type="spellStart"/>
-      <w:r>
-        <w:rPr>
-          <w:rFonts w:ascii="Consolas" w:hAnsi="Consolas"/>
-          <w:sz w:val="20"/>
-          <w:szCs w:val="20"/>
-        </w:rPr>
-        <w:t>commits</w:t>
-      </w:r>
-      <w:proofErr w:type="spellEnd"/>
-      <w:r>
-        <w:rPr>
-          <w:rFonts w:ascii="Consolas" w:hAnsi="Consolas"/>
-          <w:sz w:val="20"/>
-          <w:szCs w:val="20"/>
-        </w:rPr>
-        <w:t>/master</w:t>
-      </w:r>
-      <w:r>
-        <w:t xml:space="preserve"> del repositorio</w:t>
-      </w:r>
-      <w:r>
-        <w:t xml:space="preserve"> (</w:t>
-      </w:r>
-      <w:r>
-        <w:t>por ejemplo, https://github.com/&lt;id-usuario-admin&gt;/practica-unir-eiec/commits/master</w:t>
-      </w:r>
-      <w:r>
-        <w:t>)</w:t>
-      </w:r>
-      <w:r>
-        <w:t xml:space="preserve">. Deben aparecer los </w:t>
-      </w:r>
-      <w:proofErr w:type="spellStart"/>
-      <w:r>
-        <w:rPr>
-          <w:i/>
-          <w:iCs/>
-        </w:rPr>
-        <w:t>commits</w:t>
-      </w:r>
-      <w:proofErr w:type="spellEnd"/>
-      <w:r>
-        <w:t xml:space="preserve"> de las </w:t>
-      </w:r>
-      <w:proofErr w:type="spellStart"/>
-      <w:r>
-        <w:rPr>
-          <w:i/>
-          <w:iCs/>
-        </w:rPr>
-        <w:t>pull</w:t>
-      </w:r>
-      <w:proofErr w:type="spellEnd"/>
-      <w:r>
-        <w:rPr>
-          <w:i/>
-          <w:iCs/>
-        </w:rPr>
-        <w:t xml:space="preserve"> </w:t>
-      </w:r>
-      <w:proofErr w:type="spellStart"/>
-      <w:r>
-        <w:rPr>
-          <w:i/>
-          <w:iCs/>
-        </w:rPr>
-        <w:t>requests</w:t>
-      </w:r>
-      <w:proofErr w:type="spellEnd"/>
+        <w:t>pull requests</w:t>
+      </w:r>
       <w:r>
         <w:t xml:space="preserve"> que se han fusionado y los autores.</w:t>
       </w:r>
@@ -3987,7 +3333,6 @@
         <w:pStyle w:val="TtuloApartado3"/>
       </w:pPr>
       <w:r>
-        <w:lastRenderedPageBreak/>
         <w:t>Rúbrica</w:t>
       </w:r>
     </w:p>
@@ -4037,7 +3382,6 @@
                 <w:szCs w:val="22"/>
               </w:rPr>
             </w:pPr>
-            <w:proofErr w:type="spellStart"/>
             <w:r>
               <w:rPr>
                 <w:rFonts w:cs="UnitOT-Medi"/>
@@ -4060,46 +3404,7 @@
                 <w:sz w:val="22"/>
                 <w:szCs w:val="22"/>
               </w:rPr>
-              <w:t>ull</w:t>
-            </w:r>
-            <w:proofErr w:type="spellEnd"/>
-            <w:r>
-              <w:rPr>
-                <w:rFonts w:cs="UnitOT-Medi"/>
-                <w:b w:val="0"/>
-                <w:i/>
-                <w:iCs/>
-                <w:color w:val="FFFFFF" w:themeColor="background1"/>
-                <w:sz w:val="22"/>
-                <w:szCs w:val="22"/>
-              </w:rPr>
-              <w:t xml:space="preserve"> </w:t>
-            </w:r>
-            <w:proofErr w:type="spellStart"/>
-            <w:r>
-              <w:rPr>
-                <w:rFonts w:cs="UnitOT-Medi"/>
-                <w:b w:val="0"/>
-                <w:i/>
-                <w:iCs/>
-                <w:color w:val="FFFFFF" w:themeColor="background1"/>
-                <w:sz w:val="22"/>
-                <w:szCs w:val="22"/>
-              </w:rPr>
-              <w:t>requests</w:t>
-            </w:r>
-            <w:proofErr w:type="spellEnd"/>
-            <w:r>
-              <w:rPr>
-                <w:rFonts w:cs="UnitOT-Medi"/>
-                <w:b w:val="0"/>
-                <w:i/>
-                <w:iCs/>
-                <w:color w:val="FFFFFF" w:themeColor="background1"/>
-                <w:sz w:val="22"/>
-                <w:szCs w:val="22"/>
-              </w:rPr>
-              <w:t xml:space="preserve"> </w:t>
+              <w:t xml:space="preserve">ull requests </w:t>
             </w:r>
             <w:r>
               <w:rPr>
@@ -4498,7 +3803,6 @@
               </w:rPr>
               <w:t xml:space="preserve">Cada desarrollador ha creado su </w:t>
             </w:r>
-            <w:proofErr w:type="spellStart"/>
             <w:r>
               <w:rPr>
                 <w:rFonts w:cs="UnitOT-Light"/>
@@ -4507,18 +3811,7 @@
                 <w:sz w:val="20"/>
                 <w:szCs w:val="20"/>
               </w:rPr>
-              <w:t>fork</w:t>
-            </w:r>
-            <w:proofErr w:type="spellEnd"/>
-            <w:r>
-              <w:rPr>
-                <w:rFonts w:cs="UnitOT-Light"/>
-                <w:i/>
-                <w:iCs/>
-                <w:sz w:val="20"/>
-                <w:szCs w:val="20"/>
-              </w:rPr>
-              <w:t xml:space="preserve"> </w:t>
+              <w:t xml:space="preserve">fork </w:t>
             </w:r>
             <w:r>
               <w:rPr>
@@ -4695,7 +3988,6 @@
               </w:rPr>
               <w:t xml:space="preserve">Cada desarrollador ha subido su rama y ha abierto una </w:t>
             </w:r>
-            <w:proofErr w:type="spellStart"/>
             <w:r>
               <w:rPr>
                 <w:rFonts w:cs="UnitOT-Light"/>
@@ -4704,31 +3996,8 @@
                 <w:sz w:val="20"/>
                 <w:szCs w:val="20"/>
               </w:rPr>
-              <w:t>pull</w:t>
+              <w:t>pull request</w:t>
             </w:r>
-            <w:proofErr w:type="spellEnd"/>
-            <w:r>
-              <w:rPr>
-                <w:rFonts w:cs="UnitOT-Light"/>
-                <w:i/>
-                <w:iCs/>
-                <w:sz w:val="20"/>
-                <w:szCs w:val="20"/>
-              </w:rPr>
-              <w:t xml:space="preserve"> </w:t>
-            </w:r>
-            <w:proofErr w:type="spellStart"/>
-            <w:r>
-              <w:rPr>
-                <w:rFonts w:cs="UnitOT-Light"/>
-                <w:i/>
-                <w:iCs/>
-                <w:sz w:val="20"/>
-                <w:szCs w:val="20"/>
-              </w:rPr>
-              <w:t>request</w:t>
-            </w:r>
-            <w:proofErr w:type="spellEnd"/>
             <w:r>
               <w:rPr>
                 <w:rFonts w:cs="UnitOT-Light"/>
@@ -4965,8 +4234,8 @@
       </w:pPr>
     </w:p>
     <w:sectPr>
-      <w:headerReference w:type="default" r:id="rId22"/>
-      <w:footerReference w:type="default" r:id="rId23"/>
+      <w:headerReference w:type="default" r:id="rId23"/>
+      <w:footerReference w:type="default" r:id="rId24"/>
       <w:pgSz w:w="11906" w:h="16838" w:code="9"/>
       <w:pgMar w:top="1418" w:right="1843" w:bottom="1418" w:left="1843" w:header="1134" w:footer="397" w:gutter="0"/>
       <w:cols w:space="708"/>
@@ -10018,31 +9287,6 @@
 </file>
 
 <file path=customXml/item1.xml><?xml version="1.0" encoding="utf-8"?>
-<p:properties xmlns:p="http://schemas.microsoft.com/office/2006/metadata/properties" xmlns:xsi="http://www.w3.org/2001/XMLSchema-instance" xmlns:pc="http://schemas.microsoft.com/office/infopath/2007/PartnerControls">
-  <documentManagement>
-    <lcf76f155ced4ddcb4097134ff3c332f xmlns="27c1adeb-3674-457c-b08c-8a73f31b6e23">
-      <Terms xmlns="http://schemas.microsoft.com/office/infopath/2007/PartnerControls"/>
-    </lcf76f155ced4ddcb4097134ff3c332f>
-    <TaxCatchAll xmlns="0a70e875-3d35-4be2-921f-7117c31bab9b" xsi:nil="true"/>
-    <_Flow_SignoffStatus xmlns="27c1adeb-3674-457c-b08c-8a73f31b6e23" xsi:nil="true"/>
-  </documentManagement>
-</p:properties>
-</file>
-
-<file path=customXml/item2.xml><?xml version="1.0" encoding="utf-8"?>
-<b:Sources xmlns:b="http://schemas.openxmlformats.org/officeDocument/2006/bibliography" xmlns="http://schemas.openxmlformats.org/officeDocument/2006/bibliography" SelectedStyle="\APASixthEditionOfficeOnline.xsl" StyleName="APA" Version="6"/>
-</file>
-
-<file path=customXml/item3.xml><?xml version="1.0" encoding="utf-8"?>
-<?mso-contentType ?>
-<FormTemplates xmlns="http://schemas.microsoft.com/sharepoint/v3/contenttype/forms">
-  <Display>DocumentLibraryForm</Display>
-  <Edit>DocumentLibraryForm</Edit>
-  <New>DocumentLibraryForm</New>
-</FormTemplates>
-</file>
-
-<file path=customXml/item4.xml><?xml version="1.0" encoding="utf-8"?>
 <ct:contentTypeSchema xmlns:ct="http://schemas.microsoft.com/office/2006/metadata/contentType" xmlns:ma="http://schemas.microsoft.com/office/2006/metadata/properties/metaAttributes" ct:_="" ma:_="" ma:contentTypeName="Documento" ma:contentTypeID="0x010100DF3D7C797EA12745A270EF30E38719B9" ma:contentTypeVersion="19" ma:contentTypeDescription="Crear nuevo documento." ma:contentTypeScope="" ma:versionID="9b3f85d10149739ebc40127471298f58">
   <xsd:schema xmlns:xsd="http://www.w3.org/2001/XMLSchema" xmlns:xs="http://www.w3.org/2001/XMLSchema" xmlns:p="http://schemas.microsoft.com/office/2006/metadata/properties" xmlns:ns2="0a70e875-3d35-4be2-921f-7117c31bab9b" xmlns:ns3="27c1adeb-3674-457c-b08c-8a73f31b6e23" targetNamespace="http://schemas.microsoft.com/office/2006/metadata/properties" ma:root="true" ma:fieldsID="0559bebde66b072b3ad70ef2676e7a86" ns2:_="" ns3:_="">
     <xsd:import namespace="0a70e875-3d35-4be2-921f-7117c31bab9b"/>
@@ -10303,34 +9547,32 @@
 </ct:contentTypeSchema>
 </file>
 
-<file path=customXml/itemProps1.xml><?xml version="1.0" encoding="utf-8"?>
-<ds:datastoreItem xmlns:ds="http://schemas.openxmlformats.org/officeDocument/2006/customXml" ds:itemID="{5DA6F32C-6FAE-4705-8722-B42C5F1E24E2}">
-  <ds:schemaRefs>
-    <ds:schemaRef ds:uri="http://schemas.microsoft.com/office/2006/metadata/properties"/>
-    <ds:schemaRef ds:uri="http://schemas.microsoft.com/office/infopath/2007/PartnerControls"/>
-    <ds:schemaRef ds:uri="27c1adeb-3674-457c-b08c-8a73f31b6e23"/>
-    <ds:schemaRef ds:uri="0a70e875-3d35-4be2-921f-7117c31bab9b"/>
-  </ds:schemaRefs>
-</ds:datastoreItem>
+<file path=customXml/item2.xml><?xml version="1.0" encoding="utf-8"?>
+<?mso-contentType ?>
+<FormTemplates xmlns="http://schemas.microsoft.com/sharepoint/v3/contenttype/forms">
+  <Display>DocumentLibraryForm</Display>
+  <Edit>DocumentLibraryForm</Edit>
+  <New>DocumentLibraryForm</New>
+</FormTemplates>
 </file>
 
-<file path=customXml/itemProps2.xml><?xml version="1.0" encoding="utf-8"?>
-<ds:datastoreItem xmlns:ds="http://schemas.openxmlformats.org/officeDocument/2006/customXml" ds:itemID="{68EF0881-AFE3-44EB-8834-1E31251C8A76}">
-  <ds:schemaRefs>
-    <ds:schemaRef ds:uri="http://schemas.openxmlformats.org/officeDocument/2006/bibliography"/>
-  </ds:schemaRefs>
-</ds:datastoreItem>
+<file path=customXml/item3.xml><?xml version="1.0" encoding="utf-8"?>
+<b:Sources xmlns:b="http://schemas.openxmlformats.org/officeDocument/2006/bibliography" xmlns="http://schemas.openxmlformats.org/officeDocument/2006/bibliography" SelectedStyle="\APASixthEditionOfficeOnline.xsl" StyleName="APA" Version="6"/>
 </file>
 
-<file path=customXml/itemProps3.xml><?xml version="1.0" encoding="utf-8"?>
-<ds:datastoreItem xmlns:ds="http://schemas.openxmlformats.org/officeDocument/2006/customXml" ds:itemID="{DADA22EA-30AF-48ED-8DC0-06AFFED52517}">
-  <ds:schemaRefs>
-    <ds:schemaRef ds:uri="http://schemas.microsoft.com/sharepoint/v3/contenttype/forms"/>
-  </ds:schemaRefs>
-</ds:datastoreItem>
+<file path=customXml/item4.xml><?xml version="1.0" encoding="utf-8"?>
+<p:properties xmlns:p="http://schemas.microsoft.com/office/2006/metadata/properties" xmlns:xsi="http://www.w3.org/2001/XMLSchema-instance" xmlns:pc="http://schemas.microsoft.com/office/infopath/2007/PartnerControls">
+  <documentManagement>
+    <lcf76f155ced4ddcb4097134ff3c332f xmlns="27c1adeb-3674-457c-b08c-8a73f31b6e23">
+      <Terms xmlns="http://schemas.microsoft.com/office/infopath/2007/PartnerControls"/>
+    </lcf76f155ced4ddcb4097134ff3c332f>
+    <TaxCatchAll xmlns="0a70e875-3d35-4be2-921f-7117c31bab9b" xsi:nil="true"/>
+    <_Flow_SignoffStatus xmlns="27c1adeb-3674-457c-b08c-8a73f31b6e23" xsi:nil="true"/>
+  </documentManagement>
+</p:properties>
 </file>
 
-<file path=customXml/itemProps4.xml><?xml version="1.0" encoding="utf-8"?>
+<file path=customXml/itemProps1.xml><?xml version="1.0" encoding="utf-8"?>
 <ds:datastoreItem xmlns:ds="http://schemas.openxmlformats.org/officeDocument/2006/customXml" ds:itemID="{77FFC1A5-44DD-4B3F-AE9D-FA35F4DCEA49}">
   <ds:schemaRefs>
     <ds:schemaRef ds:uri="http://schemas.microsoft.com/office/2006/metadata/contentType"/>
@@ -10347,4 +9589,31 @@
     <ds:schemaRef ds:uri="http://schemas.microsoft.com/internal/obd"/>
   </ds:schemaRefs>
 </ds:datastoreItem>
+</file>
+
+<file path=customXml/itemProps2.xml><?xml version="1.0" encoding="utf-8"?>
+<ds:datastoreItem xmlns:ds="http://schemas.openxmlformats.org/officeDocument/2006/customXml" ds:itemID="{DADA22EA-30AF-48ED-8DC0-06AFFED52517}">
+  <ds:schemaRefs>
+    <ds:schemaRef ds:uri="http://schemas.microsoft.com/sharepoint/v3/contenttype/forms"/>
+  </ds:schemaRefs>
+</ds:datastoreItem>
+</file>
+
+<file path=customXml/itemProps3.xml><?xml version="1.0" encoding="utf-8"?>
+<ds:datastoreItem xmlns:ds="http://schemas.openxmlformats.org/officeDocument/2006/customXml" ds:itemID="{68EF0881-AFE3-44EB-8834-1E31251C8A76}">
+  <ds:schemaRefs>
+    <ds:schemaRef ds:uri="http://schemas.openxmlformats.org/officeDocument/2006/bibliography"/>
+  </ds:schemaRefs>
+</ds:datastoreItem>
+</file>
+
+<file path=customXml/itemProps4.xml><?xml version="1.0" encoding="utf-8"?>
+<ds:datastoreItem xmlns:ds="http://schemas.openxmlformats.org/officeDocument/2006/customXml" ds:itemID="{5DA6F32C-6FAE-4705-8722-B42C5F1E24E2}">
+  <ds:schemaRefs>
+    <ds:schemaRef ds:uri="http://schemas.microsoft.com/office/2006/metadata/properties"/>
+    <ds:schemaRef ds:uri="http://schemas.microsoft.com/office/infopath/2007/PartnerControls"/>
+    <ds:schemaRef ds:uri="27c1adeb-3674-457c-b08c-8a73f31b6e23"/>
+    <ds:schemaRef ds:uri="0a70e875-3d35-4be2-921f-7117c31bab9b"/>
+  </ds:schemaRefs>
+</ds:datastoreItem>
 </file>
</xml_diff>

<commit_message>
Se agregan evidencias de los 4 forks
</commit_message>
<xml_diff>
--- a/mudevops07_act1_GRUPAL - Evidencias.docx
+++ b/mudevops07_act1_GRUPAL - Evidencias.docx
@@ -7,6 +7,7 @@
         <w:pStyle w:val="TituloApartado1"/>
       </w:pPr>
       <w:bookmarkStart w:id="0" w:name="_Toc459888455"/>
+      <w:proofErr w:type="spellStart"/>
       <w:r>
         <w:rPr>
           <w:i/>
@@ -19,8 +20,25 @@
           <w:i/>
           <w:iCs/>
         </w:rPr>
-        <w:t>ull requests</w:t>
-      </w:r>
+        <w:t>ull</w:t>
+      </w:r>
+      <w:proofErr w:type="spellEnd"/>
+      <w:r>
+        <w:rPr>
+          <w:i/>
+          <w:iCs/>
+        </w:rPr>
+        <w:t xml:space="preserve"> </w:t>
+      </w:r>
+      <w:proofErr w:type="spellStart"/>
+      <w:r>
+        <w:rPr>
+          <w:i/>
+          <w:iCs/>
+        </w:rPr>
+        <w:t>requests</w:t>
+      </w:r>
+      <w:proofErr w:type="spellEnd"/>
       <w:r>
         <w:t xml:space="preserve"> en GitHub</w:t>
       </w:r>
@@ -54,23 +72,43 @@
       <w:r>
         <w:t xml:space="preserve"> la funcionalidad de </w:t>
       </w:r>
+      <w:proofErr w:type="spellStart"/>
       <w:r>
         <w:rPr>
           <w:i/>
           <w:iCs/>
         </w:rPr>
-        <w:t>pull requests</w:t>
-      </w:r>
-      <w:r>
-        <w:t xml:space="preserve"> de GitHub y el manejo de repositorios remotos. El GitHub </w:t>
-      </w:r>
+        <w:t>pull</w:t>
+      </w:r>
+      <w:proofErr w:type="spellEnd"/>
       <w:r>
         <w:rPr>
           <w:i/>
           <w:iCs/>
         </w:rPr>
+        <w:t xml:space="preserve"> </w:t>
+      </w:r>
+      <w:proofErr w:type="spellStart"/>
+      <w:r>
+        <w:rPr>
+          <w:i/>
+          <w:iCs/>
+        </w:rPr>
+        <w:t>requests</w:t>
+      </w:r>
+      <w:proofErr w:type="spellEnd"/>
+      <w:r>
+        <w:t xml:space="preserve"> de GitHub y el manejo de repositorios remotos. El GitHub </w:t>
+      </w:r>
+      <w:proofErr w:type="spellStart"/>
+      <w:r>
+        <w:rPr>
+          <w:i/>
+          <w:iCs/>
+        </w:rPr>
         <w:t>workflow</w:t>
       </w:r>
+      <w:proofErr w:type="spellEnd"/>
       <w:r>
         <w:t xml:space="preserve"> </w:t>
       </w:r>
@@ -92,8 +130,21 @@
     </w:p>
     <w:p/>
     <w:p>
-      <w:r>
-        <w:t xml:space="preserve">FinTech Solutions </w:t>
+      <w:proofErr w:type="spellStart"/>
+      <w:r>
+        <w:t>FinTech</w:t>
+      </w:r>
+      <w:proofErr w:type="spellEnd"/>
+      <w:r>
+        <w:t xml:space="preserve"> </w:t>
+      </w:r>
+      <w:proofErr w:type="spellStart"/>
+      <w:r>
+        <w:t>Solutions</w:t>
+      </w:r>
+      <w:proofErr w:type="spellEnd"/>
+      <w:r>
+        <w:t xml:space="preserve"> </w:t>
       </w:r>
       <w:r>
         <w:t>S.</w:t>
@@ -321,6 +372,7 @@
         </w:rPr>
         <w:t>practica-unir-</w:t>
       </w:r>
+      <w:proofErr w:type="spellStart"/>
       <w:r>
         <w:rPr>
           <w:rFonts w:ascii="Consolas" w:hAnsi="Consolas"/>
@@ -329,6 +381,7 @@
         </w:rPr>
         <w:t>fintech</w:t>
       </w:r>
+      <w:proofErr w:type="spellEnd"/>
       <w:r>
         <w:t>.</w:t>
       </w:r>
@@ -350,13 +403,41 @@
       <w:r>
         <w:t xml:space="preserve"> el repositorio en local con </w:t>
       </w:r>
+      <w:proofErr w:type="spellStart"/>
       <w:r>
         <w:rPr>
           <w:rFonts w:ascii="Consolas" w:hAnsi="Consolas"/>
           <w:sz w:val="20"/>
           <w:szCs w:val="20"/>
         </w:rPr>
-        <w:t>git clone &lt;url&gt;.</w:t>
+        <w:t>git</w:t>
+      </w:r>
+      <w:proofErr w:type="spellEnd"/>
+      <w:r>
+        <w:rPr>
+          <w:rFonts w:ascii="Consolas" w:hAnsi="Consolas"/>
+          <w:sz w:val="20"/>
+          <w:szCs w:val="20"/>
+        </w:rPr>
+        <w:t xml:space="preserve"> clone &lt;</w:t>
+      </w:r>
+      <w:proofErr w:type="spellStart"/>
+      <w:r>
+        <w:rPr>
+          <w:rFonts w:ascii="Consolas" w:hAnsi="Consolas"/>
+          <w:sz w:val="20"/>
+          <w:szCs w:val="20"/>
+        </w:rPr>
+        <w:t>url</w:t>
+      </w:r>
+      <w:proofErr w:type="spellEnd"/>
+      <w:r>
+        <w:rPr>
+          <w:rFonts w:ascii="Consolas" w:hAnsi="Consolas"/>
+          <w:sz w:val="20"/>
+          <w:szCs w:val="20"/>
+        </w:rPr>
+        <w:t>&gt;.</w:t>
       </w:r>
     </w:p>
     <w:p>
@@ -380,6 +461,7 @@
         <w:t xml:space="preserve">sde la página de </w:t>
       </w:r>
       <w:hyperlink r:id="rId12" w:history="1">
+        <w:proofErr w:type="spellStart"/>
         <w:r>
           <w:rPr>
             <w:rStyle w:val="Hyperlink"/>
@@ -387,6 +469,7 @@
           </w:rPr>
           <w:t>Github</w:t>
         </w:r>
+        <w:proofErr w:type="spellEnd"/>
       </w:hyperlink>
       <w:r>
         <w:t xml:space="preserve"> </w:t>
@@ -424,52 +507,182 @@
       <w:r>
         <w:t xml:space="preserve"> </w:t>
       </w:r>
+      <w:proofErr w:type="spellStart"/>
       <w:r>
         <w:rPr>
           <w:rFonts w:ascii="Consolas" w:hAnsi="Consolas"/>
           <w:sz w:val="20"/>
           <w:szCs w:val="20"/>
         </w:rPr>
-        <w:t xml:space="preserve">git add . </w:t>
-      </w:r>
-      <w:r>
-        <w:t>(</w:t>
-      </w:r>
-      <w:r>
-        <w:t>cuidado</w:t>
-      </w:r>
-      <w:r>
-        <w:t xml:space="preserve"> con el punto), </w:t>
-      </w:r>
+        <w:t>git</w:t>
+      </w:r>
+      <w:proofErr w:type="spellEnd"/>
       <w:r>
         <w:rPr>
           <w:rFonts w:ascii="Consolas" w:hAnsi="Consolas"/>
           <w:sz w:val="20"/>
           <w:szCs w:val="20"/>
         </w:rPr>
-        <w:t>git commit -m</w:t>
-      </w:r>
-      <w:r>
         <w:t xml:space="preserve"> </w:t>
       </w:r>
+      <w:proofErr w:type="spellStart"/>
+      <w:proofErr w:type="gramStart"/>
       <w:r>
         <w:rPr>
           <w:rFonts w:ascii="Consolas" w:hAnsi="Consolas"/>
           <w:sz w:val="20"/>
           <w:szCs w:val="20"/>
         </w:rPr>
-        <w:t>"primer commit"</w:t>
-      </w:r>
-      <w:r>
-        <w:t xml:space="preserve"> y </w:t>
-      </w:r>
+        <w:t>add</w:t>
+      </w:r>
+      <w:proofErr w:type="spellEnd"/>
       <w:r>
         <w:rPr>
           <w:rFonts w:ascii="Consolas" w:hAnsi="Consolas"/>
           <w:sz w:val="20"/>
           <w:szCs w:val="20"/>
         </w:rPr>
-        <w:t>git push origin master.</w:t>
+        <w:t xml:space="preserve"> .</w:t>
+      </w:r>
+      <w:proofErr w:type="gramEnd"/>
+      <w:r>
+        <w:rPr>
+          <w:rFonts w:ascii="Consolas" w:hAnsi="Consolas"/>
+          <w:sz w:val="20"/>
+          <w:szCs w:val="20"/>
+        </w:rPr>
+        <w:t xml:space="preserve"> </w:t>
+      </w:r>
+      <w:r>
+        <w:t>(</w:t>
+      </w:r>
+      <w:r>
+        <w:t>cuidado</w:t>
+      </w:r>
+      <w:r>
+        <w:t xml:space="preserve"> con el punto), </w:t>
+      </w:r>
+      <w:proofErr w:type="spellStart"/>
+      <w:r>
+        <w:rPr>
+          <w:rFonts w:ascii="Consolas" w:hAnsi="Consolas"/>
+          <w:sz w:val="20"/>
+          <w:szCs w:val="20"/>
+        </w:rPr>
+        <w:t>git</w:t>
+      </w:r>
+      <w:proofErr w:type="spellEnd"/>
+      <w:r>
+        <w:rPr>
+          <w:rFonts w:ascii="Consolas" w:hAnsi="Consolas"/>
+          <w:sz w:val="20"/>
+          <w:szCs w:val="20"/>
+        </w:rPr>
+        <w:t xml:space="preserve"> </w:t>
+      </w:r>
+      <w:proofErr w:type="spellStart"/>
+      <w:r>
+        <w:rPr>
+          <w:rFonts w:ascii="Consolas" w:hAnsi="Consolas"/>
+          <w:sz w:val="20"/>
+          <w:szCs w:val="20"/>
+        </w:rPr>
+        <w:t>commit</w:t>
+      </w:r>
+      <w:proofErr w:type="spellEnd"/>
+      <w:r>
+        <w:rPr>
+          <w:rFonts w:ascii="Consolas" w:hAnsi="Consolas"/>
+          <w:sz w:val="20"/>
+          <w:szCs w:val="20"/>
+        </w:rPr>
+        <w:t xml:space="preserve"> -m</w:t>
+      </w:r>
+      <w:r>
+        <w:t xml:space="preserve"> </w:t>
+      </w:r>
+      <w:r>
+        <w:rPr>
+          <w:rFonts w:ascii="Consolas" w:hAnsi="Consolas"/>
+          <w:sz w:val="20"/>
+          <w:szCs w:val="20"/>
+        </w:rPr>
+        <w:t xml:space="preserve">"primer </w:t>
+      </w:r>
+      <w:proofErr w:type="spellStart"/>
+      <w:r>
+        <w:rPr>
+          <w:rFonts w:ascii="Consolas" w:hAnsi="Consolas"/>
+          <w:sz w:val="20"/>
+          <w:szCs w:val="20"/>
+        </w:rPr>
+        <w:t>commit</w:t>
+      </w:r>
+      <w:proofErr w:type="spellEnd"/>
+      <w:r>
+        <w:rPr>
+          <w:rFonts w:ascii="Consolas" w:hAnsi="Consolas"/>
+          <w:sz w:val="20"/>
+          <w:szCs w:val="20"/>
+        </w:rPr>
+        <w:t>"</w:t>
+      </w:r>
+      <w:r>
+        <w:t xml:space="preserve"> y </w:t>
+      </w:r>
+      <w:proofErr w:type="spellStart"/>
+      <w:r>
+        <w:rPr>
+          <w:rFonts w:ascii="Consolas" w:hAnsi="Consolas"/>
+          <w:sz w:val="20"/>
+          <w:szCs w:val="20"/>
+        </w:rPr>
+        <w:t>git</w:t>
+      </w:r>
+      <w:proofErr w:type="spellEnd"/>
+      <w:r>
+        <w:rPr>
+          <w:rFonts w:ascii="Consolas" w:hAnsi="Consolas"/>
+          <w:sz w:val="20"/>
+          <w:szCs w:val="20"/>
+        </w:rPr>
+        <w:t xml:space="preserve"> </w:t>
+      </w:r>
+      <w:proofErr w:type="spellStart"/>
+      <w:r>
+        <w:rPr>
+          <w:rFonts w:ascii="Consolas" w:hAnsi="Consolas"/>
+          <w:sz w:val="20"/>
+          <w:szCs w:val="20"/>
+        </w:rPr>
+        <w:t>push</w:t>
+      </w:r>
+      <w:proofErr w:type="spellEnd"/>
+      <w:r>
+        <w:rPr>
+          <w:rFonts w:ascii="Consolas" w:hAnsi="Consolas"/>
+          <w:sz w:val="20"/>
+          <w:szCs w:val="20"/>
+        </w:rPr>
+        <w:t xml:space="preserve"> </w:t>
+      </w:r>
+      <w:proofErr w:type="spellStart"/>
+      <w:r>
+        <w:rPr>
+          <w:rFonts w:ascii="Consolas" w:hAnsi="Consolas"/>
+          <w:sz w:val="20"/>
+          <w:szCs w:val="20"/>
+        </w:rPr>
+        <w:t>origin</w:t>
+      </w:r>
+      <w:proofErr w:type="spellEnd"/>
+      <w:r>
+        <w:rPr>
+          <w:rFonts w:ascii="Consolas" w:hAnsi="Consolas"/>
+          <w:sz w:val="20"/>
+          <w:szCs w:val="20"/>
+        </w:rPr>
+        <w:t xml:space="preserve"> master.</w:t>
       </w:r>
     </w:p>
     <w:p>
@@ -492,8 +705,18 @@
           <w:sz w:val="20"/>
           <w:szCs w:val="20"/>
         </w:rPr>
-        <w:t>unir-git</w:t>
-      </w:r>
+        <w:t>unir-</w:t>
+      </w:r>
+      <w:proofErr w:type="spellStart"/>
+      <w:r>
+        <w:rPr>
+          <w:rFonts w:ascii="Consolas" w:hAnsi="Consolas"/>
+          <w:sz w:val="20"/>
+          <w:szCs w:val="20"/>
+        </w:rPr>
+        <w:t>git</w:t>
+      </w:r>
+      <w:proofErr w:type="spellEnd"/>
       <w:r>
         <w:t xml:space="preserve"> directamente y añadir </w:t>
       </w:r>
@@ -509,22 +732,56 @@
       <w:r>
         <w:t xml:space="preserve">repositorio no sea un </w:t>
       </w:r>
+      <w:proofErr w:type="spellStart"/>
       <w:r>
         <w:rPr>
           <w:i/>
           <w:iCs/>
         </w:rPr>
-        <w:t xml:space="preserve">fork </w:t>
-      </w:r>
-      <w:r>
-        <w:t xml:space="preserve">del usado en el caso práctico para no despistar durante la creación de </w:t>
-      </w:r>
+        <w:t>fork</w:t>
+      </w:r>
+      <w:proofErr w:type="spellEnd"/>
       <w:r>
         <w:rPr>
           <w:i/>
           <w:iCs/>
         </w:rPr>
-        <w:t>pull requests.</w:t>
+        <w:t xml:space="preserve"> </w:t>
+      </w:r>
+      <w:r>
+        <w:t xml:space="preserve">del usado en el caso práctico para no despistar durante la creación de </w:t>
+      </w:r>
+      <w:proofErr w:type="spellStart"/>
+      <w:r>
+        <w:rPr>
+          <w:i/>
+          <w:iCs/>
+        </w:rPr>
+        <w:t>pull</w:t>
+      </w:r>
+      <w:proofErr w:type="spellEnd"/>
+      <w:r>
+        <w:rPr>
+          <w:i/>
+          <w:iCs/>
+        </w:rPr>
+        <w:t xml:space="preserve"> </w:t>
+      </w:r>
+      <w:proofErr w:type="spellStart"/>
+      <w:r>
+        <w:rPr>
+          <w:i/>
+          <w:iCs/>
+        </w:rPr>
+        <w:t>requests</w:t>
+      </w:r>
+      <w:proofErr w:type="spellEnd"/>
+      <w:r>
+        <w:rPr>
+          <w:i/>
+          <w:iCs/>
+        </w:rPr>
+        <w:t>.</w:t>
       </w:r>
     </w:p>
     <w:p/>
@@ -569,6 +826,7 @@
       <w:r>
         <w:t xml:space="preserve">Crear un </w:t>
       </w:r>
+      <w:proofErr w:type="spellStart"/>
       <w:r>
         <w:rPr>
           <w:i/>
@@ -576,6 +834,7 @@
         </w:rPr>
         <w:t>fork</w:t>
       </w:r>
+      <w:proofErr w:type="spellEnd"/>
       <w:r>
         <w:t xml:space="preserve"> a partir del repositorio del administrador.</w:t>
       </w:r>
@@ -612,12 +871,21 @@
       <w:r>
         <w:t xml:space="preserve">la funcionalidad, </w:t>
       </w:r>
+      <w:proofErr w:type="spellStart"/>
       <w:r>
         <w:rPr>
           <w:i/>
           <w:iCs/>
         </w:rPr>
-        <w:t>commit.</w:t>
+        <w:t>commit</w:t>
+      </w:r>
+      <w:proofErr w:type="spellEnd"/>
+      <w:r>
+        <w:rPr>
+          <w:i/>
+          <w:iCs/>
+        </w:rPr>
+        <w:t>.</w:t>
       </w:r>
       <w:r>
         <w:t xml:space="preserve"> Al clonar en local, </w:t>
@@ -666,6 +934,7 @@
       <w:r>
         <w:t xml:space="preserve"> la rama a su </w:t>
       </w:r>
+      <w:proofErr w:type="spellStart"/>
       <w:r>
         <w:rPr>
           <w:i/>
@@ -673,6 +942,7 @@
         </w:rPr>
         <w:t>fork</w:t>
       </w:r>
+      <w:proofErr w:type="spellEnd"/>
       <w:r>
         <w:t xml:space="preserve"> y crea</w:t>
       </w:r>
@@ -682,12 +952,37 @@
       <w:r>
         <w:t xml:space="preserve"> la </w:t>
       </w:r>
+      <w:proofErr w:type="spellStart"/>
       <w:r>
         <w:rPr>
           <w:i/>
           <w:iCs/>
         </w:rPr>
-        <w:t>pull request.</w:t>
+        <w:t>pull</w:t>
+      </w:r>
+      <w:proofErr w:type="spellEnd"/>
+      <w:r>
+        <w:rPr>
+          <w:i/>
+          <w:iCs/>
+        </w:rPr>
+        <w:t xml:space="preserve"> </w:t>
+      </w:r>
+      <w:proofErr w:type="spellStart"/>
+      <w:r>
+        <w:rPr>
+          <w:i/>
+          <w:iCs/>
+        </w:rPr>
+        <w:t>request</w:t>
+      </w:r>
+      <w:proofErr w:type="spellEnd"/>
+      <w:r>
+        <w:rPr>
+          <w:i/>
+          <w:iCs/>
+        </w:rPr>
+        <w:t>.</w:t>
       </w:r>
     </w:p>
     <w:p>
@@ -797,6 +1092,7 @@
       <w:r>
         <w:t xml:space="preserve">ceptar un nuevo parámetro de línea de comandos que indique si es necesario eliminar palabras duplicadas de la lista antes de imprimirlas (en este caso habrá que modificar la función </w:t>
       </w:r>
+      <w:proofErr w:type="spellStart"/>
       <w:r>
         <w:rPr>
           <w:rFonts w:ascii="Consolas" w:hAnsi="Consolas"/>
@@ -805,6 +1101,7 @@
         </w:rPr>
         <w:t>sort_list</w:t>
       </w:r>
+      <w:proofErr w:type="spellEnd"/>
       <w:r>
         <w:t>)</w:t>
       </w:r>
@@ -826,13 +1123,23 @@
       <w:r>
         <w:t xml:space="preserve">ñadir una directiva en el </w:t>
       </w:r>
+      <w:proofErr w:type="spellStart"/>
       <w:r>
         <w:rPr>
           <w:rFonts w:ascii="Consolas" w:hAnsi="Consolas"/>
           <w:sz w:val="20"/>
           <w:szCs w:val="20"/>
         </w:rPr>
-        <w:t xml:space="preserve">Makefile </w:t>
+        <w:t>Makefile</w:t>
+      </w:r>
+      <w:proofErr w:type="spellEnd"/>
+      <w:r>
+        <w:rPr>
+          <w:rFonts w:ascii="Consolas" w:hAnsi="Consolas"/>
+          <w:sz w:val="20"/>
+          <w:szCs w:val="20"/>
+        </w:rPr>
+        <w:t xml:space="preserve"> </w:t>
       </w:r>
       <w:r>
         <w:t>que ejecute el comando en local, sin arrancar un contenedor de Docker.</w:t>
@@ -875,13 +1182,23 @@
       <w:r>
         <w:t xml:space="preserve">una por línea, y modificar el </w:t>
       </w:r>
+      <w:proofErr w:type="spellStart"/>
       <w:r>
         <w:rPr>
           <w:rFonts w:ascii="Consolas" w:hAnsi="Consolas"/>
           <w:sz w:val="20"/>
           <w:szCs w:val="20"/>
         </w:rPr>
-        <w:t xml:space="preserve">Makefile </w:t>
+        <w:t>Makefile</w:t>
+      </w:r>
+      <w:proofErr w:type="spellEnd"/>
+      <w:r>
+        <w:rPr>
+          <w:rFonts w:ascii="Consolas" w:hAnsi="Consolas"/>
+          <w:sz w:val="20"/>
+          <w:szCs w:val="20"/>
+        </w:rPr>
+        <w:t xml:space="preserve"> </w:t>
       </w:r>
       <w:r>
         <w:t>para que use el nombre del fichero como parámetro de línea de comandos.</w:t>
@@ -902,7 +1219,15 @@
         <w:t xml:space="preserve"> ni</w:t>
       </w:r>
       <w:r>
-        <w:t xml:space="preserve"> Python ni Makefiles, por lo que no </w:t>
+        <w:t xml:space="preserve"> Python ni </w:t>
+      </w:r>
+      <w:proofErr w:type="spellStart"/>
+      <w:r>
+        <w:t>Makefiles</w:t>
+      </w:r>
+      <w:proofErr w:type="spellEnd"/>
+      <w:r>
+        <w:t xml:space="preserve">, por lo que no </w:t>
       </w:r>
       <w:r>
         <w:t xml:space="preserve">deben preocuparse </w:t>
@@ -940,6 +1265,7 @@
       <w:r>
         <w:t xml:space="preserve">cada </w:t>
       </w:r>
+      <w:proofErr w:type="spellStart"/>
       <w:r>
         <w:rPr>
           <w:i/>
@@ -947,6 +1273,7 @@
         </w:rPr>
         <w:t>fork</w:t>
       </w:r>
+      <w:proofErr w:type="spellEnd"/>
       <w:r>
         <w:t>,</w:t>
       </w:r>
@@ -965,13 +1292,31 @@
       <w:r>
         <w:t xml:space="preserve">El administrador debe implementar también una funcionalidad y abrir una </w:t>
       </w:r>
+      <w:proofErr w:type="spellStart"/>
       <w:r>
         <w:rPr>
           <w:i/>
           <w:iCs/>
         </w:rPr>
-        <w:t>pull request</w:t>
-      </w:r>
+        <w:t>pull</w:t>
+      </w:r>
+      <w:proofErr w:type="spellEnd"/>
+      <w:r>
+        <w:rPr>
+          <w:i/>
+          <w:iCs/>
+        </w:rPr>
+        <w:t xml:space="preserve"> </w:t>
+      </w:r>
+      <w:proofErr w:type="spellStart"/>
+      <w:r>
+        <w:rPr>
+          <w:i/>
+          <w:iCs/>
+        </w:rPr>
+        <w:t>request</w:t>
+      </w:r>
+      <w:proofErr w:type="spellEnd"/>
       <w:r>
         <w:t xml:space="preserve"> contra su propio repositorio.</w:t>
       </w:r>
@@ -1015,22 +1360,48 @@
       <w:r>
         <w:t xml:space="preserve"> abrir una </w:t>
       </w:r>
+      <w:proofErr w:type="spellStart"/>
       <w:r>
         <w:rPr>
           <w:i/>
           <w:iCs/>
         </w:rPr>
-        <w:t>pull request.</w:t>
-      </w:r>
-      <w:r>
+        <w:t>pull</w:t>
+      </w:r>
+      <w:proofErr w:type="spellEnd"/>
+      <w:r>
+        <w:rPr>
+          <w:i/>
+          <w:iCs/>
+        </w:rPr>
         <w:t xml:space="preserve"> </w:t>
       </w:r>
+      <w:proofErr w:type="spellStart"/>
+      <w:r>
+        <w:rPr>
+          <w:i/>
+          <w:iCs/>
+        </w:rPr>
+        <w:t>request</w:t>
+      </w:r>
+      <w:proofErr w:type="spellEnd"/>
+      <w:r>
+        <w:rPr>
+          <w:i/>
+          <w:iCs/>
+        </w:rPr>
+        <w:t>.</w:t>
+      </w:r>
+      <w:r>
+        <w:t xml:space="preserve"> </w:t>
+      </w:r>
       <w:r>
         <w:t>Si los cambios se añaden, por ejemplo,</w:t>
       </w:r>
       <w:r>
         <w:t xml:space="preserve"> a </w:t>
       </w:r>
+      <w:proofErr w:type="gramStart"/>
       <w:r>
         <w:rPr>
           <w:rFonts w:ascii="Consolas" w:hAnsi="Consolas"/>
@@ -1042,6 +1413,7 @@
       <w:r>
         <w:t>,</w:t>
       </w:r>
+      <w:proofErr w:type="gramEnd"/>
       <w:r>
         <w:t xml:space="preserve"> cuando s</w:t>
       </w:r>
@@ -1074,59 +1446,123 @@
       <w:r>
         <w:t xml:space="preserve"> con </w:t>
       </w:r>
+      <w:proofErr w:type="spellStart"/>
       <w:r>
         <w:rPr>
           <w:rFonts w:ascii="Consolas" w:hAnsi="Consolas"/>
           <w:sz w:val="20"/>
           <w:szCs w:val="20"/>
         </w:rPr>
-        <w:t>git push origin master</w:t>
-      </w:r>
-      <w:r>
-        <w:t>, y</w:t>
-      </w:r>
-      <w:r>
-        <w:t>a esta</w:t>
-      </w:r>
-      <w:r>
-        <w:t>remo</w:t>
-      </w:r>
-      <w:r>
-        <w:t xml:space="preserve">s integrando </w:t>
-      </w:r>
-      <w:r>
-        <w:t xml:space="preserve">los </w:t>
-      </w:r>
-      <w:r>
-        <w:t xml:space="preserve">cambios en esa rama. No tiene sentido abrir una </w:t>
-      </w:r>
-      <w:r>
-        <w:rPr>
-          <w:i/>
-          <w:iCs/>
-        </w:rPr>
-        <w:t>pull request</w:t>
-      </w:r>
-      <w:r>
-        <w:t xml:space="preserve"> de </w:t>
-      </w:r>
+        <w:t>git</w:t>
+      </w:r>
+      <w:proofErr w:type="spellEnd"/>
       <w:r>
         <w:rPr>
           <w:rFonts w:ascii="Consolas" w:hAnsi="Consolas"/>
           <w:sz w:val="20"/>
           <w:szCs w:val="20"/>
         </w:rPr>
-        <w:t>master</w:t>
-      </w:r>
-      <w:r>
-        <w:t xml:space="preserve"> contra </w:t>
-      </w:r>
+        <w:t xml:space="preserve"> </w:t>
+      </w:r>
+      <w:proofErr w:type="spellStart"/>
       <w:r>
         <w:rPr>
           <w:rFonts w:ascii="Consolas" w:hAnsi="Consolas"/>
           <w:sz w:val="20"/>
           <w:szCs w:val="20"/>
         </w:rPr>
+        <w:t>push</w:t>
+      </w:r>
+      <w:proofErr w:type="spellEnd"/>
+      <w:r>
+        <w:rPr>
+          <w:rFonts w:ascii="Consolas" w:hAnsi="Consolas"/>
+          <w:sz w:val="20"/>
+          <w:szCs w:val="20"/>
+        </w:rPr>
+        <w:t xml:space="preserve"> </w:t>
+      </w:r>
+      <w:proofErr w:type="spellStart"/>
+      <w:r>
+        <w:rPr>
+          <w:rFonts w:ascii="Consolas" w:hAnsi="Consolas"/>
+          <w:sz w:val="20"/>
+          <w:szCs w:val="20"/>
+        </w:rPr>
+        <w:t>origin</w:t>
+      </w:r>
+      <w:proofErr w:type="spellEnd"/>
+      <w:r>
+        <w:rPr>
+          <w:rFonts w:ascii="Consolas" w:hAnsi="Consolas"/>
+          <w:sz w:val="20"/>
+          <w:szCs w:val="20"/>
+        </w:rPr>
+        <w:t xml:space="preserve"> master</w:t>
+      </w:r>
+      <w:r>
+        <w:t>, y</w:t>
+      </w:r>
+      <w:r>
+        <w:t>a esta</w:t>
+      </w:r>
+      <w:r>
+        <w:t>remo</w:t>
+      </w:r>
+      <w:r>
+        <w:t xml:space="preserve">s integrando </w:t>
+      </w:r>
+      <w:r>
+        <w:t xml:space="preserve">los </w:t>
+      </w:r>
+      <w:r>
+        <w:t xml:space="preserve">cambios en esa rama. No tiene sentido abrir una </w:t>
+      </w:r>
+      <w:proofErr w:type="spellStart"/>
+      <w:r>
+        <w:rPr>
+          <w:i/>
+          <w:iCs/>
+        </w:rPr>
+        <w:t>pull</w:t>
+      </w:r>
+      <w:proofErr w:type="spellEnd"/>
+      <w:r>
+        <w:rPr>
+          <w:i/>
+          <w:iCs/>
+        </w:rPr>
+        <w:t xml:space="preserve"> </w:t>
+      </w:r>
+      <w:proofErr w:type="spellStart"/>
+      <w:r>
+        <w:rPr>
+          <w:i/>
+          <w:iCs/>
+        </w:rPr>
+        <w:t>request</w:t>
+      </w:r>
+      <w:proofErr w:type="spellEnd"/>
+      <w:r>
+        <w:t xml:space="preserve"> de </w:t>
+      </w:r>
+      <w:r>
+        <w:rPr>
+          <w:rFonts w:ascii="Consolas" w:hAnsi="Consolas"/>
+          <w:sz w:val="20"/>
+          <w:szCs w:val="20"/>
+        </w:rPr>
+        <w:t>master</w:t>
+      </w:r>
+      <w:r>
+        <w:t xml:space="preserve"> contra </w:t>
+      </w:r>
+      <w:r>
+        <w:rPr>
+          <w:rFonts w:ascii="Consolas" w:hAnsi="Consolas"/>
+          <w:sz w:val="20"/>
+          <w:szCs w:val="20"/>
+        </w:rPr>
         <w:t>master.</w:t>
       </w:r>
     </w:p>
@@ -1138,6 +1574,7 @@
       <w:r>
         <w:t xml:space="preserve"> iniciar </w:t>
       </w:r>
+      <w:proofErr w:type="spellStart"/>
       <w:r>
         <w:rPr>
           <w:i/>
@@ -1145,29 +1582,73 @@
         </w:rPr>
         <w:t>fork</w:t>
       </w:r>
+      <w:proofErr w:type="spellEnd"/>
       <w:r>
         <w:t xml:space="preserve"> a la vez para partir del mismo código y facilitar la revisión de </w:t>
       </w:r>
+      <w:proofErr w:type="spellStart"/>
       <w:r>
         <w:rPr>
           <w:i/>
           <w:iCs/>
         </w:rPr>
-        <w:t>pull requests.</w:t>
-      </w:r>
-      <w:r>
-        <w:t xml:space="preserve"> Cuando </w:t>
-      </w:r>
-      <w:r>
-        <w:t xml:space="preserve">las </w:t>
-      </w:r>
+        <w:t>pull</w:t>
+      </w:r>
+      <w:proofErr w:type="spellEnd"/>
       <w:r>
         <w:rPr>
           <w:i/>
           <w:iCs/>
         </w:rPr>
-        <w:t>pull requests</w:t>
-      </w:r>
+        <w:t xml:space="preserve"> </w:t>
+      </w:r>
+      <w:proofErr w:type="spellStart"/>
+      <w:r>
+        <w:rPr>
+          <w:i/>
+          <w:iCs/>
+        </w:rPr>
+        <w:t>requests</w:t>
+      </w:r>
+      <w:proofErr w:type="spellEnd"/>
+      <w:r>
+        <w:rPr>
+          <w:i/>
+          <w:iCs/>
+        </w:rPr>
+        <w:t>.</w:t>
+      </w:r>
+      <w:r>
+        <w:t xml:space="preserve"> Cuando </w:t>
+      </w:r>
+      <w:r>
+        <w:t xml:space="preserve">las </w:t>
+      </w:r>
+      <w:proofErr w:type="spellStart"/>
+      <w:r>
+        <w:rPr>
+          <w:i/>
+          <w:iCs/>
+        </w:rPr>
+        <w:t>pull</w:t>
+      </w:r>
+      <w:proofErr w:type="spellEnd"/>
+      <w:r>
+        <w:rPr>
+          <w:i/>
+          <w:iCs/>
+        </w:rPr>
+        <w:t xml:space="preserve"> </w:t>
+      </w:r>
+      <w:proofErr w:type="spellStart"/>
+      <w:r>
+        <w:rPr>
+          <w:i/>
+          <w:iCs/>
+        </w:rPr>
+        <w:t>requests</w:t>
+      </w:r>
+      <w:proofErr w:type="spellEnd"/>
       <w:r>
         <w:t xml:space="preserve"> estén abiertas, </w:t>
       </w:r>
@@ -1207,12 +1688,37 @@
       <w:r>
         <w:t xml:space="preserve"> el código de todas las </w:t>
       </w:r>
+      <w:proofErr w:type="spellStart"/>
       <w:r>
         <w:rPr>
           <w:i/>
           <w:iCs/>
         </w:rPr>
-        <w:t>pull requests,</w:t>
+        <w:t>pull</w:t>
+      </w:r>
+      <w:proofErr w:type="spellEnd"/>
+      <w:r>
+        <w:rPr>
+          <w:i/>
+          <w:iCs/>
+        </w:rPr>
+        <w:t xml:space="preserve"> </w:t>
+      </w:r>
+      <w:proofErr w:type="spellStart"/>
+      <w:r>
+        <w:rPr>
+          <w:i/>
+          <w:iCs/>
+        </w:rPr>
+        <w:t>requests</w:t>
+      </w:r>
+      <w:proofErr w:type="spellEnd"/>
+      <w:r>
+        <w:rPr>
+          <w:i/>
+          <w:iCs/>
+        </w:rPr>
+        <w:t>,</w:t>
       </w:r>
       <w:r>
         <w:t xml:space="preserve"> el administrador </w:t>
@@ -1269,7 +1775,15 @@
         <w:t>i no identifican</w:t>
       </w:r>
       <w:r>
-        <w:t xml:space="preserve"> cómo ampliar el Makefile, </w:t>
+        <w:t xml:space="preserve"> cómo ampliar el </w:t>
+      </w:r>
+      <w:proofErr w:type="spellStart"/>
+      <w:r>
+        <w:t>Makefile</w:t>
+      </w:r>
+      <w:proofErr w:type="spellEnd"/>
+      <w:r>
+        <w:t xml:space="preserve">, </w:t>
       </w:r>
       <w:r>
         <w:t>etc</w:t>
@@ -2596,7 +3110,15 @@
       </w:pPr>
       <w:r>
         <w:lastRenderedPageBreak/>
-        <w:t>Primer commit del repositorio</w:t>
+        <w:t xml:space="preserve">Primer </w:t>
+      </w:r>
+      <w:proofErr w:type="spellStart"/>
+      <w:r>
+        <w:t>commit</w:t>
+      </w:r>
+      <w:proofErr w:type="spellEnd"/>
+      <w:r>
+        <w:t xml:space="preserve"> del repositorio</w:t>
       </w:r>
     </w:p>
     <w:p>
@@ -2721,8 +3243,13 @@
         </w:numPr>
         <w:ind w:left="284"/>
       </w:pPr>
-      <w:r>
-        <w:t xml:space="preserve">Url para clonar: </w:t>
+      <w:proofErr w:type="spellStart"/>
+      <w:r>
+        <w:t>Url</w:t>
+      </w:r>
+      <w:proofErr w:type="spellEnd"/>
+      <w:r>
+        <w:t xml:space="preserve"> para clonar: </w:t>
       </w:r>
     </w:p>
     <w:p>
@@ -3110,12 +3637,21 @@
       <w:r>
         <w:t xml:space="preserve">El </w:t>
       </w:r>
+      <w:proofErr w:type="spellStart"/>
       <w:r>
         <w:rPr>
           <w:i/>
           <w:iCs/>
         </w:rPr>
-        <w:t xml:space="preserve">fork </w:t>
+        <w:t>fork</w:t>
+      </w:r>
+      <w:proofErr w:type="spellEnd"/>
+      <w:r>
+        <w:rPr>
+          <w:i/>
+          <w:iCs/>
+        </w:rPr>
+        <w:t xml:space="preserve"> </w:t>
       </w:r>
       <w:r>
         <w:t>de cada desarrollador en GitHub.</w:t>
@@ -3174,155 +3710,484 @@
     <w:p>
       <w:pPr>
         <w:pStyle w:val="Vietaprimernivel"/>
+        <w:numPr>
+          <w:ilvl w:val="0"/>
+          <w:numId w:val="0"/>
+        </w:numPr>
+        <w:ind w:left="284" w:hanging="284"/>
+      </w:pPr>
+      <w:r>
+        <w:rPr>
+          <w:noProof/>
+        </w:rPr>
+        <w:drawing>
+          <wp:inline distT="0" distB="0" distL="0" distR="0" wp14:anchorId="5C86CEAF" wp14:editId="73E26C37">
+            <wp:extent cx="5219700" cy="1078230"/>
+            <wp:effectExtent l="0" t="0" r="0" b="7620"/>
+            <wp:docPr id="1042394250" name="Picture 1"/>
+            <wp:cNvGraphicFramePr>
+              <a:graphicFrameLocks xmlns:a="http://schemas.openxmlformats.org/drawingml/2006/main" noChangeAspect="1"/>
+            </wp:cNvGraphicFramePr>
+            <a:graphic xmlns:a="http://schemas.openxmlformats.org/drawingml/2006/main">
+              <a:graphicData uri="http://schemas.openxmlformats.org/drawingml/2006/picture">
+                <pic:pic xmlns:pic="http://schemas.openxmlformats.org/drawingml/2006/picture">
+                  <pic:nvPicPr>
+                    <pic:cNvPr id="1042394250" name=""/>
+                    <pic:cNvPicPr/>
+                  </pic:nvPicPr>
+                  <pic:blipFill>
+                    <a:blip r:embed="rId23"/>
+                    <a:stretch>
+                      <a:fillRect/>
+                    </a:stretch>
+                  </pic:blipFill>
+                  <pic:spPr>
+                    <a:xfrm>
+                      <a:off x="0" y="0"/>
+                      <a:ext cx="5219700" cy="1078230"/>
+                    </a:xfrm>
+                    <a:prstGeom prst="rect">
+                      <a:avLst/>
+                    </a:prstGeom>
+                  </pic:spPr>
+                </pic:pic>
+              </a:graphicData>
+            </a:graphic>
+          </wp:inline>
+        </w:drawing>
+      </w:r>
+    </w:p>
+    <w:p>
+      <w:pPr>
+        <w:pStyle w:val="Vietaprimernivel"/>
+        <w:numPr>
+          <w:ilvl w:val="0"/>
+          <w:numId w:val="0"/>
+        </w:numPr>
+        <w:ind w:left="284" w:hanging="284"/>
+      </w:pPr>
+      <w:r>
+        <w:rPr>
+          <w:noProof/>
+        </w:rPr>
+        <w:lastRenderedPageBreak/>
+        <w:drawing>
+          <wp:inline distT="0" distB="0" distL="0" distR="0" wp14:anchorId="771908AE" wp14:editId="6283EB10">
+            <wp:extent cx="5219700" cy="1076325"/>
+            <wp:effectExtent l="0" t="0" r="0" b="9525"/>
+            <wp:docPr id="950344817" name="Picture 1"/>
+            <wp:cNvGraphicFramePr>
+              <a:graphicFrameLocks xmlns:a="http://schemas.openxmlformats.org/drawingml/2006/main" noChangeAspect="1"/>
+            </wp:cNvGraphicFramePr>
+            <a:graphic xmlns:a="http://schemas.openxmlformats.org/drawingml/2006/main">
+              <a:graphicData uri="http://schemas.openxmlformats.org/drawingml/2006/picture">
+                <pic:pic xmlns:pic="http://schemas.openxmlformats.org/drawingml/2006/picture">
+                  <pic:nvPicPr>
+                    <pic:cNvPr id="950344817" name=""/>
+                    <pic:cNvPicPr/>
+                  </pic:nvPicPr>
+                  <pic:blipFill>
+                    <a:blip r:embed="rId24"/>
+                    <a:stretch>
+                      <a:fillRect/>
+                    </a:stretch>
+                  </pic:blipFill>
+                  <pic:spPr>
+                    <a:xfrm>
+                      <a:off x="0" y="0"/>
+                      <a:ext cx="5219700" cy="1076325"/>
+                    </a:xfrm>
+                    <a:prstGeom prst="rect">
+                      <a:avLst/>
+                    </a:prstGeom>
+                  </pic:spPr>
+                </pic:pic>
+              </a:graphicData>
+            </a:graphic>
+          </wp:inline>
+        </w:drawing>
+      </w:r>
+    </w:p>
+    <w:p>
+      <w:pPr>
+        <w:pStyle w:val="Vietaprimernivel"/>
+        <w:numPr>
+          <w:ilvl w:val="0"/>
+          <w:numId w:val="0"/>
+        </w:numPr>
+        <w:ind w:left="284" w:hanging="284"/>
+      </w:pPr>
+      <w:r>
+        <w:rPr>
+          <w:noProof/>
+        </w:rPr>
+        <w:drawing>
+          <wp:inline distT="0" distB="0" distL="0" distR="0" wp14:anchorId="1EF2E811" wp14:editId="7DB98178">
+            <wp:extent cx="5219700" cy="1055370"/>
+            <wp:effectExtent l="0" t="0" r="0" b="0"/>
+            <wp:docPr id="1410553037" name="Picture 1"/>
+            <wp:cNvGraphicFramePr>
+              <a:graphicFrameLocks xmlns:a="http://schemas.openxmlformats.org/drawingml/2006/main" noChangeAspect="1"/>
+            </wp:cNvGraphicFramePr>
+            <a:graphic xmlns:a="http://schemas.openxmlformats.org/drawingml/2006/main">
+              <a:graphicData uri="http://schemas.openxmlformats.org/drawingml/2006/picture">
+                <pic:pic xmlns:pic="http://schemas.openxmlformats.org/drawingml/2006/picture">
+                  <pic:nvPicPr>
+                    <pic:cNvPr id="1410553037" name=""/>
+                    <pic:cNvPicPr/>
+                  </pic:nvPicPr>
+                  <pic:blipFill>
+                    <a:blip r:embed="rId25"/>
+                    <a:stretch>
+                      <a:fillRect/>
+                    </a:stretch>
+                  </pic:blipFill>
+                  <pic:spPr>
+                    <a:xfrm>
+                      <a:off x="0" y="0"/>
+                      <a:ext cx="5219700" cy="1055370"/>
+                    </a:xfrm>
+                    <a:prstGeom prst="rect">
+                      <a:avLst/>
+                    </a:prstGeom>
+                  </pic:spPr>
+                </pic:pic>
+              </a:graphicData>
+            </a:graphic>
+          </wp:inline>
+        </w:drawing>
+      </w:r>
+    </w:p>
+    <w:p>
+      <w:pPr>
+        <w:pStyle w:val="Vietaprimernivel"/>
       </w:pPr>
       <w:r>
         <w:t xml:space="preserve">El comando </w:t>
       </w:r>
+      <w:proofErr w:type="spellStart"/>
       <w:r>
         <w:rPr>
           <w:rFonts w:ascii="Consolas" w:hAnsi="Consolas"/>
           <w:sz w:val="20"/>
           <w:szCs w:val="20"/>
         </w:rPr>
-        <w:t>git push origin &lt;rama&gt;</w:t>
-      </w:r>
-      <w:r>
-        <w:t xml:space="preserve"> de cada desarrollador (la captura debe ser de la ventana de la terminal</w:t>
-      </w:r>
-      <w:r>
-        <w:t>)</w:t>
-      </w:r>
-      <w:r>
-        <w:t>.</w:t>
-      </w:r>
-    </w:p>
-    <w:p>
-      <w:pPr>
-        <w:pStyle w:val="Vietaprimernivel"/>
-      </w:pPr>
-      <w:r>
-        <w:t xml:space="preserve">Cada </w:t>
-      </w:r>
-      <w:r>
-        <w:rPr>
-          <w:i/>
-          <w:iCs/>
-        </w:rPr>
-        <w:t>pull request,</w:t>
-      </w:r>
-      <w:r>
-        <w:t xml:space="preserve"> una vez abierta. Debe aparecer el nombre de la rama y el </w:t>
-      </w:r>
-      <w:r>
-        <w:rPr>
-          <w:i/>
-          <w:iCs/>
-        </w:rPr>
-        <w:t>fork</w:t>
-      </w:r>
-      <w:r>
-        <w:t xml:space="preserve"> desde el que se ha abierto. La captura </w:t>
-      </w:r>
-      <w:r>
-        <w:t>tiene que</w:t>
-      </w:r>
-      <w:r>
-        <w:t xml:space="preserve"> incluir la pestaña de </w:t>
-      </w:r>
-      <w:r>
-        <w:rPr>
-          <w:i/>
-          <w:iCs/>
-        </w:rPr>
-        <w:t>Files changed.</w:t>
-      </w:r>
-    </w:p>
-    <w:p>
-      <w:pPr>
-        <w:pStyle w:val="Vietaprimernivel"/>
-      </w:pPr>
-      <w:r>
-        <w:t xml:space="preserve">Lista de </w:t>
-      </w:r>
-      <w:r>
-        <w:rPr>
-          <w:i/>
-          <w:iCs/>
-        </w:rPr>
-        <w:t>pull requests</w:t>
-      </w:r>
-      <w:r>
-        <w:t xml:space="preserve"> en el repositorio principal.</w:t>
-      </w:r>
-    </w:p>
-    <w:p>
-      <w:pPr>
-        <w:pStyle w:val="Vietaprimernivel"/>
-      </w:pPr>
-      <w:r>
-        <w:lastRenderedPageBreak/>
-        <w:t xml:space="preserve">El árbol de </w:t>
-      </w:r>
-      <w:r>
-        <w:rPr>
-          <w:i/>
-          <w:iCs/>
-        </w:rPr>
-        <w:t xml:space="preserve">commits </w:t>
-      </w:r>
-      <w:r>
-        <w:t xml:space="preserve">del repositorio principal tras fusionar todas las </w:t>
-      </w:r>
-      <w:r>
-        <w:rPr>
-          <w:i/>
-          <w:iCs/>
-        </w:rPr>
-        <w:t>pull requests posibles.</w:t>
-      </w:r>
-      <w:r>
-        <w:t xml:space="preserve"> Para ello, acceded a la ruta </w:t>
-      </w:r>
+        <w:t>git</w:t>
+      </w:r>
+      <w:proofErr w:type="spellEnd"/>
       <w:r>
         <w:rPr>
           <w:rFonts w:ascii="Consolas" w:hAnsi="Consolas"/>
           <w:sz w:val="20"/>
           <w:szCs w:val="20"/>
         </w:rPr>
-        <w:t>/commits/master</w:t>
-      </w:r>
-      <w:r>
-        <w:t xml:space="preserve"> del repositorio</w:t>
-      </w:r>
-      <w:r>
-        <w:t xml:space="preserve"> (</w:t>
-      </w:r>
-      <w:r>
-        <w:t>por ejemplo, https://github.com/&lt;id-usuario-admin&gt;/practica-unir-eiec/commits/master</w:t>
+        <w:t xml:space="preserve"> </w:t>
+      </w:r>
+      <w:proofErr w:type="spellStart"/>
+      <w:r>
+        <w:rPr>
+          <w:rFonts w:ascii="Consolas" w:hAnsi="Consolas"/>
+          <w:sz w:val="20"/>
+          <w:szCs w:val="20"/>
+        </w:rPr>
+        <w:t>push</w:t>
+      </w:r>
+      <w:proofErr w:type="spellEnd"/>
+      <w:r>
+        <w:rPr>
+          <w:rFonts w:ascii="Consolas" w:hAnsi="Consolas"/>
+          <w:sz w:val="20"/>
+          <w:szCs w:val="20"/>
+        </w:rPr>
+        <w:t xml:space="preserve"> </w:t>
+      </w:r>
+      <w:proofErr w:type="spellStart"/>
+      <w:r>
+        <w:rPr>
+          <w:rFonts w:ascii="Consolas" w:hAnsi="Consolas"/>
+          <w:sz w:val="20"/>
+          <w:szCs w:val="20"/>
+        </w:rPr>
+        <w:t>origin</w:t>
+      </w:r>
+      <w:proofErr w:type="spellEnd"/>
+      <w:r>
+        <w:rPr>
+          <w:rFonts w:ascii="Consolas" w:hAnsi="Consolas"/>
+          <w:sz w:val="20"/>
+          <w:szCs w:val="20"/>
+        </w:rPr>
+        <w:t xml:space="preserve"> &lt;rama&gt;</w:t>
+      </w:r>
+      <w:r>
+        <w:t xml:space="preserve"> de cada desarrollador (la captura debe ser de la ventana de la terminal</w:t>
       </w:r>
       <w:r>
         <w:t>)</w:t>
       </w:r>
       <w:r>
-        <w:t xml:space="preserve">. Deben aparecer los </w:t>
-      </w:r>
+        <w:t>.</w:t>
+      </w:r>
+    </w:p>
+    <w:p>
+      <w:pPr>
+        <w:pStyle w:val="Vietaprimernivel"/>
+      </w:pPr>
+      <w:r>
+        <w:t xml:space="preserve">Cada </w:t>
+      </w:r>
+      <w:proofErr w:type="spellStart"/>
       <w:r>
         <w:rPr>
           <w:i/>
           <w:iCs/>
         </w:rPr>
-        <w:t>commits</w:t>
-      </w:r>
-      <w:r>
-        <w:t xml:space="preserve"> de las </w:t>
-      </w:r>
+        <w:t>pull</w:t>
+      </w:r>
+      <w:proofErr w:type="spellEnd"/>
       <w:r>
         <w:rPr>
           <w:i/>
           <w:iCs/>
         </w:rPr>
-        <w:t>pull requests</w:t>
-      </w:r>
+        <w:t xml:space="preserve"> </w:t>
+      </w:r>
+      <w:proofErr w:type="spellStart"/>
+      <w:r>
+        <w:rPr>
+          <w:i/>
+          <w:iCs/>
+        </w:rPr>
+        <w:t>request</w:t>
+      </w:r>
+      <w:proofErr w:type="spellEnd"/>
+      <w:r>
+        <w:rPr>
+          <w:i/>
+          <w:iCs/>
+        </w:rPr>
+        <w:t>,</w:t>
+      </w:r>
+      <w:r>
+        <w:t xml:space="preserve"> una vez abierta. Debe aparecer el nombre de la rama y el </w:t>
+      </w:r>
+      <w:proofErr w:type="spellStart"/>
+      <w:r>
+        <w:rPr>
+          <w:i/>
+          <w:iCs/>
+        </w:rPr>
+        <w:t>fork</w:t>
+      </w:r>
+      <w:proofErr w:type="spellEnd"/>
+      <w:r>
+        <w:t xml:space="preserve"> desde el que se ha abierto. La captura </w:t>
+      </w:r>
+      <w:r>
+        <w:t>tiene que</w:t>
+      </w:r>
+      <w:r>
+        <w:t xml:space="preserve"> incluir la pestaña de </w:t>
+      </w:r>
+      <w:r>
+        <w:rPr>
+          <w:i/>
+          <w:iCs/>
+        </w:rPr>
+        <w:t xml:space="preserve">Files </w:t>
+      </w:r>
+      <w:proofErr w:type="spellStart"/>
+      <w:r>
+        <w:rPr>
+          <w:i/>
+          <w:iCs/>
+        </w:rPr>
+        <w:t>changed</w:t>
+      </w:r>
+      <w:proofErr w:type="spellEnd"/>
+      <w:r>
+        <w:rPr>
+          <w:i/>
+          <w:iCs/>
+        </w:rPr>
+        <w:t>.</w:t>
+      </w:r>
+    </w:p>
+    <w:p>
+      <w:pPr>
+        <w:pStyle w:val="Vietaprimernivel"/>
+      </w:pPr>
+      <w:r>
+        <w:t xml:space="preserve">Lista de </w:t>
+      </w:r>
+      <w:proofErr w:type="spellStart"/>
+      <w:r>
+        <w:rPr>
+          <w:i/>
+          <w:iCs/>
+        </w:rPr>
+        <w:t>pull</w:t>
+      </w:r>
+      <w:proofErr w:type="spellEnd"/>
+      <w:r>
+        <w:rPr>
+          <w:i/>
+          <w:iCs/>
+        </w:rPr>
+        <w:t xml:space="preserve"> </w:t>
+      </w:r>
+      <w:proofErr w:type="spellStart"/>
+      <w:r>
+        <w:rPr>
+          <w:i/>
+          <w:iCs/>
+        </w:rPr>
+        <w:t>requests</w:t>
+      </w:r>
+      <w:proofErr w:type="spellEnd"/>
+      <w:r>
+        <w:t xml:space="preserve"> en el repositorio principal.</w:t>
+      </w:r>
+    </w:p>
+    <w:p>
+      <w:pPr>
+        <w:pStyle w:val="Vietaprimernivel"/>
+      </w:pPr>
+      <w:r>
+        <w:t xml:space="preserve">El árbol de </w:t>
+      </w:r>
+      <w:proofErr w:type="spellStart"/>
+      <w:r>
+        <w:rPr>
+          <w:i/>
+          <w:iCs/>
+        </w:rPr>
+        <w:t>commits</w:t>
+      </w:r>
+      <w:proofErr w:type="spellEnd"/>
+      <w:r>
+        <w:rPr>
+          <w:i/>
+          <w:iCs/>
+        </w:rPr>
+        <w:t xml:space="preserve"> </w:t>
+      </w:r>
+      <w:r>
+        <w:t xml:space="preserve">del repositorio principal tras fusionar todas las </w:t>
+      </w:r>
+      <w:proofErr w:type="spellStart"/>
+      <w:r>
+        <w:rPr>
+          <w:i/>
+          <w:iCs/>
+        </w:rPr>
+        <w:t>pull</w:t>
+      </w:r>
+      <w:proofErr w:type="spellEnd"/>
+      <w:r>
+        <w:rPr>
+          <w:i/>
+          <w:iCs/>
+        </w:rPr>
+        <w:t xml:space="preserve"> </w:t>
+      </w:r>
+      <w:proofErr w:type="spellStart"/>
+      <w:r>
+        <w:rPr>
+          <w:i/>
+          <w:iCs/>
+        </w:rPr>
+        <w:t>requests</w:t>
+      </w:r>
+      <w:proofErr w:type="spellEnd"/>
+      <w:r>
+        <w:rPr>
+          <w:i/>
+          <w:iCs/>
+        </w:rPr>
+        <w:t xml:space="preserve"> posibles.</w:t>
+      </w:r>
+      <w:r>
+        <w:t xml:space="preserve"> Para ello, acceded a la ruta </w:t>
+      </w:r>
+      <w:r>
+        <w:rPr>
+          <w:rFonts w:ascii="Consolas" w:hAnsi="Consolas"/>
+          <w:sz w:val="20"/>
+          <w:szCs w:val="20"/>
+        </w:rPr>
+        <w:t>/</w:t>
+      </w:r>
+      <w:proofErr w:type="spellStart"/>
+      <w:r>
+        <w:rPr>
+          <w:rFonts w:ascii="Consolas" w:hAnsi="Consolas"/>
+          <w:sz w:val="20"/>
+          <w:szCs w:val="20"/>
+        </w:rPr>
+        <w:t>commits</w:t>
+      </w:r>
+      <w:proofErr w:type="spellEnd"/>
+      <w:r>
+        <w:rPr>
+          <w:rFonts w:ascii="Consolas" w:hAnsi="Consolas"/>
+          <w:sz w:val="20"/>
+          <w:szCs w:val="20"/>
+        </w:rPr>
+        <w:t>/master</w:t>
+      </w:r>
+      <w:r>
+        <w:t xml:space="preserve"> del repositorio</w:t>
+      </w:r>
+      <w:r>
+        <w:t xml:space="preserve"> (</w:t>
+      </w:r>
+      <w:r>
+        <w:t>por ejemplo, https://github.com/&lt;id-usuario-admin&gt;/practica-unir-eiec/commits/master</w:t>
+      </w:r>
+      <w:r>
+        <w:t>)</w:t>
+      </w:r>
+      <w:r>
+        <w:t xml:space="preserve">. Deben aparecer los </w:t>
+      </w:r>
+      <w:proofErr w:type="spellStart"/>
+      <w:r>
+        <w:rPr>
+          <w:i/>
+          <w:iCs/>
+        </w:rPr>
+        <w:t>commits</w:t>
+      </w:r>
+      <w:proofErr w:type="spellEnd"/>
+      <w:r>
+        <w:t xml:space="preserve"> de las </w:t>
+      </w:r>
+      <w:proofErr w:type="spellStart"/>
+      <w:r>
+        <w:rPr>
+          <w:i/>
+          <w:iCs/>
+        </w:rPr>
+        <w:t>pull</w:t>
+      </w:r>
+      <w:proofErr w:type="spellEnd"/>
+      <w:r>
+        <w:rPr>
+          <w:i/>
+          <w:iCs/>
+        </w:rPr>
+        <w:t xml:space="preserve"> </w:t>
+      </w:r>
+      <w:proofErr w:type="spellStart"/>
+      <w:r>
+        <w:rPr>
+          <w:i/>
+          <w:iCs/>
+        </w:rPr>
+        <w:t>requests</w:t>
+      </w:r>
+      <w:proofErr w:type="spellEnd"/>
       <w:r>
         <w:t xml:space="preserve"> que se han fusionado y los autores.</w:t>
       </w:r>
@@ -3382,6 +4247,7 @@
                 <w:szCs w:val="22"/>
               </w:rPr>
             </w:pPr>
+            <w:proofErr w:type="spellStart"/>
             <w:r>
               <w:rPr>
                 <w:rFonts w:cs="UnitOT-Medi"/>
@@ -3404,7 +4270,46 @@
                 <w:sz w:val="22"/>
                 <w:szCs w:val="22"/>
               </w:rPr>
-              <w:t xml:space="preserve">ull requests </w:t>
+              <w:t>ull</w:t>
+            </w:r>
+            <w:proofErr w:type="spellEnd"/>
+            <w:r>
+              <w:rPr>
+                <w:rFonts w:cs="UnitOT-Medi"/>
+                <w:b w:val="0"/>
+                <w:i/>
+                <w:iCs/>
+                <w:color w:val="FFFFFF" w:themeColor="background1"/>
+                <w:sz w:val="22"/>
+                <w:szCs w:val="22"/>
+              </w:rPr>
+              <w:t xml:space="preserve"> </w:t>
+            </w:r>
+            <w:proofErr w:type="spellStart"/>
+            <w:r>
+              <w:rPr>
+                <w:rFonts w:cs="UnitOT-Medi"/>
+                <w:b w:val="0"/>
+                <w:i/>
+                <w:iCs/>
+                <w:color w:val="FFFFFF" w:themeColor="background1"/>
+                <w:sz w:val="22"/>
+                <w:szCs w:val="22"/>
+              </w:rPr>
+              <w:t>requests</w:t>
+            </w:r>
+            <w:proofErr w:type="spellEnd"/>
+            <w:r>
+              <w:rPr>
+                <w:rFonts w:cs="UnitOT-Medi"/>
+                <w:b w:val="0"/>
+                <w:i/>
+                <w:iCs/>
+                <w:color w:val="FFFFFF" w:themeColor="background1"/>
+                <w:sz w:val="22"/>
+                <w:szCs w:val="22"/>
+              </w:rPr>
+              <w:t xml:space="preserve"> </w:t>
             </w:r>
             <w:r>
               <w:rPr>
@@ -3803,6 +4708,7 @@
               </w:rPr>
               <w:t xml:space="preserve">Cada desarrollador ha creado su </w:t>
             </w:r>
+            <w:proofErr w:type="spellStart"/>
             <w:r>
               <w:rPr>
                 <w:rFonts w:cs="UnitOT-Light"/>
@@ -3811,7 +4717,18 @@
                 <w:sz w:val="20"/>
                 <w:szCs w:val="20"/>
               </w:rPr>
-              <w:t xml:space="preserve">fork </w:t>
+              <w:t>fork</w:t>
+            </w:r>
+            <w:proofErr w:type="spellEnd"/>
+            <w:r>
+              <w:rPr>
+                <w:rFonts w:cs="UnitOT-Light"/>
+                <w:i/>
+                <w:iCs/>
+                <w:sz w:val="20"/>
+                <w:szCs w:val="20"/>
+              </w:rPr>
+              <w:t xml:space="preserve"> </w:t>
             </w:r>
             <w:r>
               <w:rPr>
@@ -3988,6 +4905,7 @@
               </w:rPr>
               <w:t xml:space="preserve">Cada desarrollador ha subido su rama y ha abierto una </w:t>
             </w:r>
+            <w:proofErr w:type="spellStart"/>
             <w:r>
               <w:rPr>
                 <w:rFonts w:cs="UnitOT-Light"/>
@@ -3996,8 +4914,31 @@
                 <w:sz w:val="20"/>
                 <w:szCs w:val="20"/>
               </w:rPr>
-              <w:t>pull request</w:t>
+              <w:t>pull</w:t>
             </w:r>
+            <w:proofErr w:type="spellEnd"/>
+            <w:r>
+              <w:rPr>
+                <w:rFonts w:cs="UnitOT-Light"/>
+                <w:i/>
+                <w:iCs/>
+                <w:sz w:val="20"/>
+                <w:szCs w:val="20"/>
+              </w:rPr>
+              <w:t xml:space="preserve"> </w:t>
+            </w:r>
+            <w:proofErr w:type="spellStart"/>
+            <w:r>
+              <w:rPr>
+                <w:rFonts w:cs="UnitOT-Light"/>
+                <w:i/>
+                <w:iCs/>
+                <w:sz w:val="20"/>
+                <w:szCs w:val="20"/>
+              </w:rPr>
+              <w:t>request</w:t>
+            </w:r>
+            <w:proofErr w:type="spellEnd"/>
             <w:r>
               <w:rPr>
                 <w:rFonts w:cs="UnitOT-Light"/>
@@ -4234,8 +5175,8 @@
       </w:pPr>
     </w:p>
     <w:sectPr>
-      <w:headerReference w:type="default" r:id="rId23"/>
-      <w:footerReference w:type="default" r:id="rId24"/>
+      <w:headerReference w:type="default" r:id="rId26"/>
+      <w:footerReference w:type="default" r:id="rId27"/>
       <w:pgSz w:w="11906" w:h="16838" w:code="9"/>
       <w:pgMar w:top="1418" w:right="1843" w:bottom="1418" w:left="1843" w:header="1134" w:footer="397" w:gutter="0"/>
       <w:cols w:space="708"/>
@@ -9548,19 +10489,6 @@
 </file>
 
 <file path=customXml/item2.xml><?xml version="1.0" encoding="utf-8"?>
-<?mso-contentType ?>
-<FormTemplates xmlns="http://schemas.microsoft.com/sharepoint/v3/contenttype/forms">
-  <Display>DocumentLibraryForm</Display>
-  <Edit>DocumentLibraryForm</Edit>
-  <New>DocumentLibraryForm</New>
-</FormTemplates>
-</file>
-
-<file path=customXml/item3.xml><?xml version="1.0" encoding="utf-8"?>
-<b:Sources xmlns:b="http://schemas.openxmlformats.org/officeDocument/2006/bibliography" xmlns="http://schemas.openxmlformats.org/officeDocument/2006/bibliography" SelectedStyle="\APASixthEditionOfficeOnline.xsl" StyleName="APA" Version="6"/>
-</file>
-
-<file path=customXml/item4.xml><?xml version="1.0" encoding="utf-8"?>
 <p:properties xmlns:p="http://schemas.microsoft.com/office/2006/metadata/properties" xmlns:xsi="http://www.w3.org/2001/XMLSchema-instance" xmlns:pc="http://schemas.microsoft.com/office/infopath/2007/PartnerControls">
   <documentManagement>
     <lcf76f155ced4ddcb4097134ff3c332f xmlns="27c1adeb-3674-457c-b08c-8a73f31b6e23">
@@ -9570,6 +10498,19 @@
     <_Flow_SignoffStatus xmlns="27c1adeb-3674-457c-b08c-8a73f31b6e23" xsi:nil="true"/>
   </documentManagement>
 </p:properties>
+</file>
+
+<file path=customXml/item3.xml><?xml version="1.0" encoding="utf-8"?>
+<b:Sources xmlns:b="http://schemas.openxmlformats.org/officeDocument/2006/bibliography" xmlns="http://schemas.openxmlformats.org/officeDocument/2006/bibliography" SelectedStyle="\APASixthEditionOfficeOnline.xsl" StyleName="APA" Version="6"/>
+</file>
+
+<file path=customXml/item4.xml><?xml version="1.0" encoding="utf-8"?>
+<?mso-contentType ?>
+<FormTemplates xmlns="http://schemas.microsoft.com/sharepoint/v3/contenttype/forms">
+  <Display>DocumentLibraryForm</Display>
+  <Edit>DocumentLibraryForm</Edit>
+  <New>DocumentLibraryForm</New>
+</FormTemplates>
 </file>
 
 <file path=customXml/itemProps1.xml><?xml version="1.0" encoding="utf-8"?>
@@ -9592,9 +10533,12 @@
 </file>
 
 <file path=customXml/itemProps2.xml><?xml version="1.0" encoding="utf-8"?>
-<ds:datastoreItem xmlns:ds="http://schemas.openxmlformats.org/officeDocument/2006/customXml" ds:itemID="{DADA22EA-30AF-48ED-8DC0-06AFFED52517}">
+<ds:datastoreItem xmlns:ds="http://schemas.openxmlformats.org/officeDocument/2006/customXml" ds:itemID="{5DA6F32C-6FAE-4705-8722-B42C5F1E24E2}">
   <ds:schemaRefs>
-    <ds:schemaRef ds:uri="http://schemas.microsoft.com/sharepoint/v3/contenttype/forms"/>
+    <ds:schemaRef ds:uri="http://schemas.microsoft.com/office/2006/metadata/properties"/>
+    <ds:schemaRef ds:uri="http://schemas.microsoft.com/office/infopath/2007/PartnerControls"/>
+    <ds:schemaRef ds:uri="27c1adeb-3674-457c-b08c-8a73f31b6e23"/>
+    <ds:schemaRef ds:uri="0a70e875-3d35-4be2-921f-7117c31bab9b"/>
   </ds:schemaRefs>
 </ds:datastoreItem>
 </file>
@@ -9608,12 +10552,9 @@
 </file>
 
 <file path=customXml/itemProps4.xml><?xml version="1.0" encoding="utf-8"?>
-<ds:datastoreItem xmlns:ds="http://schemas.openxmlformats.org/officeDocument/2006/customXml" ds:itemID="{5DA6F32C-6FAE-4705-8722-B42C5F1E24E2}">
+<ds:datastoreItem xmlns:ds="http://schemas.openxmlformats.org/officeDocument/2006/customXml" ds:itemID="{DADA22EA-30AF-48ED-8DC0-06AFFED52517}">
   <ds:schemaRefs>
-    <ds:schemaRef ds:uri="http://schemas.microsoft.com/office/2006/metadata/properties"/>
-    <ds:schemaRef ds:uri="http://schemas.microsoft.com/office/infopath/2007/PartnerControls"/>
-    <ds:schemaRef ds:uri="27c1adeb-3674-457c-b08c-8a73f31b6e23"/>
-    <ds:schemaRef ds:uri="0a70e875-3d35-4be2-921f-7117c31bab9b"/>
+    <ds:schemaRef ds:uri="http://schemas.microsoft.com/sharepoint/v3/contenttype/forms"/>
   </ds:schemaRefs>
 </ds:datastoreItem>
 </file>
</xml_diff>

<commit_message>
Cambio en el Makefile
</commit_message>
<xml_diff>
--- a/mudevops07_act1_GRUPAL - Evidencias.docx
+++ b/mudevops07_act1_GRUPAL - Evidencias.docx
@@ -1,6 +1,6 @@
 
 <file path=word/document.xml><?xml version="1.0" encoding="utf-8"?>
-<w:document xmlns:wpc="http://schemas.microsoft.com/office/word/2010/wordprocessingCanvas" xmlns:cx="http://schemas.microsoft.com/office/drawing/2014/chartex" xmlns:cx1="http://schemas.microsoft.com/office/drawing/2015/9/8/chartex" xmlns:cx2="http://schemas.microsoft.com/office/drawing/2015/10/21/chartex" xmlns:cx3="http://schemas.microsoft.com/office/drawing/2016/5/9/chartex" xmlns:cx4="http://schemas.microsoft.com/office/drawing/2016/5/10/chartex" xmlns:cx5="http://schemas.microsoft.com/office/drawing/2016/5/11/chartex" xmlns:cx6="http://schemas.microsoft.com/office/drawing/2016/5/12/chartex" xmlns:cx7="http://schemas.microsoft.com/office/drawing/2016/5/13/chartex" xmlns:cx8="http://schemas.microsoft.com/office/drawing/2016/5/14/chartex" xmlns:mc="http://schemas.openxmlformats.org/markup-compatibility/2006" xmlns:aink="http://schemas.microsoft.com/office/drawing/2016/ink" xmlns:am3d="http://schemas.microsoft.com/office/drawing/2017/model3d" xmlns:o="urn:schemas-microsoft-com:office:office" xmlns:oel="http://schemas.microsoft.com/office/2019/extlst" xmlns:r="http://schemas.openxmlformats.org/officeDocument/2006/relationships" xmlns:m="http://schemas.openxmlformats.org/officeDocument/2006/math" xmlns:v="urn:schemas-microsoft-com:vml" xmlns:wp14="http://schemas.microsoft.com/office/word/2010/wordprocessingDrawing" xmlns:wp="http://schemas.openxmlformats.org/drawingml/2006/wordprocessingDrawing" xmlns:w10="urn:schemas-microsoft-com:office:word" xmlns:w="http://schemas.openxmlformats.org/wordprocessingml/2006/main" xmlns:w14="http://schemas.microsoft.com/office/word/2010/wordml" xmlns:w15="http://schemas.microsoft.com/office/word/2012/wordml" xmlns:w16cex="http://schemas.microsoft.com/office/word/2018/wordml/cex" xmlns:w16cid="http://schemas.microsoft.com/office/word/2016/wordml/cid" xmlns:w16="http://schemas.microsoft.com/office/word/2018/wordml" xmlns:w16du="http://schemas.microsoft.com/office/word/2023/wordml/word16du" xmlns:w16sdtdh="http://schemas.microsoft.com/office/word/2020/wordml/sdtdatahash" xmlns:w16se="http://schemas.microsoft.com/office/word/2015/wordml/symex" xmlns:wpg="http://schemas.microsoft.com/office/word/2010/wordprocessingGroup" xmlns:wpi="http://schemas.microsoft.com/office/word/2010/wordprocessingInk" xmlns:wne="http://schemas.microsoft.com/office/word/2006/wordml" xmlns:wps="http://schemas.microsoft.com/office/word/2010/wordprocessingShape" mc:Ignorable="w14 w15 w16se w16cid w16 w16cex w16sdtdh wp14">
+<w:document xmlns:wpc="http://schemas.microsoft.com/office/word/2010/wordprocessingCanvas" xmlns:cx="http://schemas.microsoft.com/office/drawing/2014/chartex" xmlns:cx1="http://schemas.microsoft.com/office/drawing/2015/9/8/chartex" xmlns:cx2="http://schemas.microsoft.com/office/drawing/2015/10/21/chartex" xmlns:cx3="http://schemas.microsoft.com/office/drawing/2016/5/9/chartex" xmlns:cx4="http://schemas.microsoft.com/office/drawing/2016/5/10/chartex" xmlns:cx5="http://schemas.microsoft.com/office/drawing/2016/5/11/chartex" xmlns:cx6="http://schemas.microsoft.com/office/drawing/2016/5/12/chartex" xmlns:cx7="http://schemas.microsoft.com/office/drawing/2016/5/13/chartex" xmlns:cx8="http://schemas.microsoft.com/office/drawing/2016/5/14/chartex" xmlns:mc="http://schemas.openxmlformats.org/markup-compatibility/2006" xmlns:aink="http://schemas.microsoft.com/office/drawing/2016/ink" xmlns:am3d="http://schemas.microsoft.com/office/drawing/2017/model3d" xmlns:o="urn:schemas-microsoft-com:office:office" xmlns:oel="http://schemas.microsoft.com/office/2019/extlst" xmlns:r="http://schemas.openxmlformats.org/officeDocument/2006/relationships" xmlns:m="http://schemas.openxmlformats.org/officeDocument/2006/math" xmlns:v="urn:schemas-microsoft-com:vml" xmlns:wp14="http://schemas.microsoft.com/office/word/2010/wordprocessingDrawing" xmlns:wp="http://schemas.openxmlformats.org/drawingml/2006/wordprocessingDrawing" xmlns:w10="urn:schemas-microsoft-com:office:word" xmlns:w="http://schemas.openxmlformats.org/wordprocessingml/2006/main" xmlns:w14="http://schemas.microsoft.com/office/word/2010/wordml" xmlns:w15="http://schemas.microsoft.com/office/word/2012/wordml" xmlns:w16cex="http://schemas.microsoft.com/office/word/2018/wordml/cex" xmlns:w16cid="http://schemas.microsoft.com/office/word/2016/wordml/cid" xmlns:w16="http://schemas.microsoft.com/office/word/2018/wordml" xmlns:w16du="http://schemas.microsoft.com/office/word/2023/wordml/word16du" xmlns:w16sdtdh="http://schemas.microsoft.com/office/word/2020/wordml/sdtdatahash" xmlns:w16sdtfl="http://schemas.microsoft.com/office/word/2024/wordml/sdtformatlock" xmlns:w16se="http://schemas.microsoft.com/office/word/2015/wordml/symex" xmlns:wpg="http://schemas.microsoft.com/office/word/2010/wordprocessingGroup" xmlns:wpi="http://schemas.microsoft.com/office/word/2010/wordprocessingInk" xmlns:wne="http://schemas.microsoft.com/office/word/2006/wordml" xmlns:wps="http://schemas.microsoft.com/office/word/2010/wordprocessingShape" mc:Ignorable="w14 w15 w16se w16cid w16 w16cex w16sdtdh w16sdtfl w16du wp14">
   <w:body>
     <w:p>
       <w:pPr>
@@ -174,7 +174,7 @@
       <w:hyperlink r:id="rId11" w:history="1">
         <w:r>
           <w:rPr>
-            <w:rStyle w:val="Hyperlink"/>
+            <w:rStyle w:val="Hipervnculo"/>
             <w:sz w:val="24"/>
           </w:rPr>
           <w:t>GitHub</w:t>
@@ -268,7 +268,7 @@
     <w:p/>
     <w:p>
       <w:pPr>
-        <w:pStyle w:val="ListParagraph"/>
+        <w:pStyle w:val="Prrafodelista"/>
         <w:numPr>
           <w:ilvl w:val="0"/>
           <w:numId w:val="29"/>
@@ -335,7 +335,7 @@
     </w:p>
     <w:p>
       <w:pPr>
-        <w:pStyle w:val="ListParagraph"/>
+        <w:pStyle w:val="Prrafodelista"/>
         <w:numPr>
           <w:ilvl w:val="0"/>
           <w:numId w:val="29"/>
@@ -361,7 +361,7 @@
     </w:p>
     <w:p>
       <w:pPr>
-        <w:pStyle w:val="ListParagraph"/>
+        <w:pStyle w:val="Prrafodelista"/>
         <w:numPr>
           <w:ilvl w:val="0"/>
           <w:numId w:val="29"/>
@@ -382,7 +382,7 @@
       <w:hyperlink r:id="rId12" w:history="1">
         <w:r>
           <w:rPr>
-            <w:rStyle w:val="Hyperlink"/>
+            <w:rStyle w:val="Hipervnculo"/>
             <w:sz w:val="24"/>
           </w:rPr>
           <w:t>Github</w:t>
@@ -409,7 +409,7 @@
     </w:p>
     <w:p>
       <w:pPr>
-        <w:pStyle w:val="ListParagraph"/>
+        <w:pStyle w:val="Prrafodelista"/>
         <w:numPr>
           <w:ilvl w:val="0"/>
           <w:numId w:val="29"/>
@@ -474,7 +474,7 @@
     </w:p>
     <w:p>
       <w:pPr>
-        <w:pStyle w:val="ListParagraph"/>
+        <w:pStyle w:val="Prrafodelista"/>
         <w:numPr>
           <w:ilvl w:val="0"/>
           <w:numId w:val="29"/>
@@ -560,7 +560,7 @@
     <w:p/>
     <w:p>
       <w:pPr>
-        <w:pStyle w:val="ListParagraph"/>
+        <w:pStyle w:val="Prrafodelista"/>
         <w:numPr>
           <w:ilvl w:val="0"/>
           <w:numId w:val="30"/>
@@ -582,7 +582,7 @@
     </w:p>
     <w:p>
       <w:pPr>
-        <w:pStyle w:val="ListParagraph"/>
+        <w:pStyle w:val="Prrafodelista"/>
         <w:numPr>
           <w:ilvl w:val="0"/>
           <w:numId w:val="30"/>
@@ -654,7 +654,7 @@
     </w:p>
     <w:p>
       <w:pPr>
-        <w:pStyle w:val="ListParagraph"/>
+        <w:pStyle w:val="Prrafodelista"/>
         <w:numPr>
           <w:ilvl w:val="0"/>
           <w:numId w:val="30"/>
@@ -720,7 +720,7 @@
     <w:p/>
     <w:p>
       <w:pPr>
-        <w:pStyle w:val="ListParagraph"/>
+        <w:pStyle w:val="Prrafodelista"/>
         <w:numPr>
           <w:ilvl w:val="0"/>
           <w:numId w:val="31"/>
@@ -749,7 +749,7 @@
     </w:p>
     <w:p>
       <w:pPr>
-        <w:pStyle w:val="ListParagraph"/>
+        <w:pStyle w:val="Prrafodelista"/>
         <w:numPr>
           <w:ilvl w:val="0"/>
           <w:numId w:val="31"/>
@@ -767,7 +767,7 @@
     </w:p>
     <w:p>
       <w:pPr>
-        <w:pStyle w:val="ListParagraph"/>
+        <w:pStyle w:val="Prrafodelista"/>
         <w:numPr>
           <w:ilvl w:val="0"/>
           <w:numId w:val="31"/>
@@ -785,7 +785,7 @@
     </w:p>
     <w:p>
       <w:pPr>
-        <w:pStyle w:val="ListParagraph"/>
+        <w:pStyle w:val="Prrafodelista"/>
         <w:numPr>
           <w:ilvl w:val="0"/>
           <w:numId w:val="31"/>
@@ -814,7 +814,7 @@
     </w:p>
     <w:p>
       <w:pPr>
-        <w:pStyle w:val="ListParagraph"/>
+        <w:pStyle w:val="Prrafodelista"/>
         <w:numPr>
           <w:ilvl w:val="0"/>
           <w:numId w:val="31"/>
@@ -840,7 +840,7 @@
     </w:p>
     <w:p>
       <w:pPr>
-        <w:pStyle w:val="ListParagraph"/>
+        <w:pStyle w:val="Prrafodelista"/>
         <w:numPr>
           <w:ilvl w:val="0"/>
           <w:numId w:val="31"/>
@@ -1325,7 +1325,7 @@
       <w:hyperlink r:id="rId13" w:history="1">
         <w:r>
           <w:rPr>
-            <w:rStyle w:val="Hyperlink"/>
+            <w:rStyle w:val="Hipervnculo"/>
             <w:sz w:val="24"/>
           </w:rPr>
           <w:t>Tutoriales de trabajo en grupo.</w:t>
@@ -2736,7 +2736,7 @@
       <w:hyperlink r:id="rId18" w:history="1">
         <w:r>
           <w:rPr>
-            <w:rStyle w:val="Hyperlink"/>
+            <w:rStyle w:val="Hipervnculo"/>
             <w:sz w:val="24"/>
           </w:rPr>
           <w:t>https://github.com/MayraABC/CiCd-Act01</w:t>
@@ -2754,7 +2754,7 @@
           <w:numId w:val="39"/>
         </w:numPr>
         <w:rPr>
-          <w:rStyle w:val="Hyperlink"/>
+          <w:rStyle w:val="Hipervnculo"/>
           <w:color w:val="333333"/>
           <w:sz w:val="24"/>
           <w:u w:val="none"/>
@@ -2763,7 +2763,7 @@
       <w:hyperlink r:id="rId19" w:history="1">
         <w:r>
           <w:rPr>
-            <w:rStyle w:val="Hyperlink"/>
+            <w:rStyle w:val="Hipervnculo"/>
             <w:sz w:val="24"/>
           </w:rPr>
           <w:t>https://github.com/MayraABC/CiCd-Act01.git</w:t>
@@ -2779,7 +2779,7 @@
         </w:numPr>
         <w:ind w:left="284" w:hanging="284"/>
         <w:rPr>
-          <w:rStyle w:val="Hyperlink"/>
+          <w:rStyle w:val="Hipervnculo"/>
           <w:color w:val="auto"/>
           <w:sz w:val="24"/>
           <w:u w:val="none"/>
@@ -2795,7 +2795,7 @@
         </w:numPr>
         <w:ind w:left="284" w:hanging="284"/>
         <w:rPr>
-          <w:rStyle w:val="Hyperlink"/>
+          <w:rStyle w:val="Hipervnculo"/>
           <w:color w:val="auto"/>
           <w:sz w:val="24"/>
           <w:u w:val="none"/>
@@ -2811,7 +2811,7 @@
         </w:numPr>
         <w:ind w:left="284" w:hanging="284"/>
         <w:rPr>
-          <w:rStyle w:val="Hyperlink"/>
+          <w:rStyle w:val="Hipervnculo"/>
           <w:color w:val="auto"/>
           <w:sz w:val="24"/>
           <w:u w:val="none"/>
@@ -2827,7 +2827,7 @@
         </w:numPr>
         <w:ind w:left="284" w:hanging="284"/>
         <w:rPr>
-          <w:rStyle w:val="Hyperlink"/>
+          <w:rStyle w:val="Hipervnculo"/>
           <w:color w:val="auto"/>
           <w:sz w:val="24"/>
           <w:u w:val="none"/>
@@ -2843,7 +2843,7 @@
         </w:numPr>
         <w:ind w:left="284" w:hanging="284"/>
         <w:rPr>
-          <w:rStyle w:val="Hyperlink"/>
+          <w:rStyle w:val="Hipervnculo"/>
           <w:b/>
           <w:bCs/>
           <w:color w:val="auto"/>
@@ -2853,7 +2853,7 @@
       </w:pPr>
       <w:r>
         <w:rPr>
-          <w:rStyle w:val="Hyperlink"/>
+          <w:rStyle w:val="Hipervnculo"/>
           <w:b/>
           <w:bCs/>
           <w:color w:val="auto"/>
@@ -2881,7 +2881,7 @@
           <w:noProof/>
         </w:rPr>
         <w:drawing>
-          <wp:anchor distT="0" distB="0" distL="114300" distR="114300" simplePos="0" relativeHeight="251658240" behindDoc="0" locked="0" layoutInCell="1" allowOverlap="1" wp14:anchorId="67A1646B" wp14:editId="39AABAF4">
+          <wp:anchor distT="0" distB="0" distL="114300" distR="114300" simplePos="0" relativeHeight="251658240" behindDoc="0" locked="0" layoutInCell="1" allowOverlap="1" wp14:anchorId="67A1646B" wp14:editId="3BC34A81">
             <wp:simplePos x="0" y="0"/>
             <wp:positionH relativeFrom="column">
               <wp:posOffset>3175</wp:posOffset>
@@ -3330,15 +3330,334 @@
     <w:p/>
     <w:p>
       <w:pPr>
-        <w:pStyle w:val="TtuloApartado3"/>
-      </w:pPr>
-      <w:r>
-        <w:t>Rúbrica</w:t>
+        <w:rPr>
+          <w:b/>
+          <w:bCs/>
+        </w:rPr>
+      </w:pPr>
+      <w:r>
+        <w:rPr>
+          <w:b/>
+          <w:bCs/>
+        </w:rPr>
+        <w:t>Cambio en el archivo Makefile</w:t>
       </w:r>
     </w:p>
     <w:p>
-      <w:pPr>
-        <w:pStyle w:val="ListParagraph"/>
+      <w:r>
+        <w:t>Se procede a realizar un fork del repositorio</w:t>
+      </w:r>
+    </w:p>
+    <w:p>
+      <w:r>
+        <w:drawing>
+          <wp:inline distT="0" distB="0" distL="0" distR="0" wp14:anchorId="3A30CA8F" wp14:editId="6C592A6A">
+            <wp:extent cx="5219700" cy="2930525"/>
+            <wp:effectExtent l="0" t="0" r="0" b="3175"/>
+            <wp:docPr id="1726507763" name="Imagen 1"/>
+            <wp:cNvGraphicFramePr>
+              <a:graphicFrameLocks xmlns:a="http://schemas.openxmlformats.org/drawingml/2006/main" noChangeAspect="1"/>
+            </wp:cNvGraphicFramePr>
+            <a:graphic xmlns:a="http://schemas.openxmlformats.org/drawingml/2006/main">
+              <a:graphicData uri="http://schemas.openxmlformats.org/drawingml/2006/picture">
+                <pic:pic xmlns:pic="http://schemas.openxmlformats.org/drawingml/2006/picture">
+                  <pic:nvPicPr>
+                    <pic:cNvPr id="1726507763" name=""/>
+                    <pic:cNvPicPr/>
+                  </pic:nvPicPr>
+                  <pic:blipFill>
+                    <a:blip r:embed="rId23"/>
+                    <a:stretch>
+                      <a:fillRect/>
+                    </a:stretch>
+                  </pic:blipFill>
+                  <pic:spPr>
+                    <a:xfrm>
+                      <a:off x="0" y="0"/>
+                      <a:ext cx="5219700" cy="2930525"/>
+                    </a:xfrm>
+                    <a:prstGeom prst="rect">
+                      <a:avLst/>
+                    </a:prstGeom>
+                  </pic:spPr>
+                </pic:pic>
+              </a:graphicData>
+            </a:graphic>
+          </wp:inline>
+        </w:drawing>
+      </w:r>
+    </w:p>
+    <w:p/>
+    <w:p>
+      <w:r>
+        <w:t>Se realiza el clonado del repositorio a una carpeta local</w:t>
+      </w:r>
+    </w:p>
+    <w:p>
+      <w:r>
+        <w:drawing>
+          <wp:inline distT="0" distB="0" distL="0" distR="0" wp14:anchorId="11CA6AAA" wp14:editId="58744E54">
+            <wp:extent cx="5219700" cy="852170"/>
+            <wp:effectExtent l="0" t="0" r="0" b="5080"/>
+            <wp:docPr id="1957572857" name="Imagen 1"/>
+            <wp:cNvGraphicFramePr>
+              <a:graphicFrameLocks xmlns:a="http://schemas.openxmlformats.org/drawingml/2006/main" noChangeAspect="1"/>
+            </wp:cNvGraphicFramePr>
+            <a:graphic xmlns:a="http://schemas.openxmlformats.org/drawingml/2006/main">
+              <a:graphicData uri="http://schemas.openxmlformats.org/drawingml/2006/picture">
+                <pic:pic xmlns:pic="http://schemas.openxmlformats.org/drawingml/2006/picture">
+                  <pic:nvPicPr>
+                    <pic:cNvPr id="1957572857" name=""/>
+                    <pic:cNvPicPr/>
+                  </pic:nvPicPr>
+                  <pic:blipFill>
+                    <a:blip r:embed="rId24"/>
+                    <a:stretch>
+                      <a:fillRect/>
+                    </a:stretch>
+                  </pic:blipFill>
+                  <pic:spPr>
+                    <a:xfrm>
+                      <a:off x="0" y="0"/>
+                      <a:ext cx="5219700" cy="852170"/>
+                    </a:xfrm>
+                    <a:prstGeom prst="rect">
+                      <a:avLst/>
+                    </a:prstGeom>
+                  </pic:spPr>
+                </pic:pic>
+              </a:graphicData>
+            </a:graphic>
+          </wp:inline>
+        </w:drawing>
+      </w:r>
+    </w:p>
+    <w:p/>
+    <w:p>
+      <w:pPr>
+        <w:rPr>
+          <w:lang w:val="es-MX"/>
+        </w:rPr>
+      </w:pPr>
+      <w:r>
+        <w:rPr>
+          <w:lang w:val="es-MX"/>
+        </w:rPr>
+        <w:t>S</w:t>
+      </w:r>
+      <w:r>
+        <w:rPr>
+          <w:lang w:val="es-MX"/>
+        </w:rPr>
+        <w:t>e procede a crear una nueva rama llamada “miguel-branch”</w:t>
+      </w:r>
+    </w:p>
+    <w:p>
+      <w:pPr>
+        <w:rPr>
+          <w:lang w:val="es-MX"/>
+        </w:rPr>
+      </w:pPr>
+      <w:r>
+        <w:rPr>
+          <w:lang w:val="es-MX"/>
+        </w:rPr>
+        <w:lastRenderedPageBreak/>
+        <w:drawing>
+          <wp:inline distT="0" distB="0" distL="0" distR="0" wp14:anchorId="7F0E2135" wp14:editId="1C0E072F">
+            <wp:extent cx="5219700" cy="985752"/>
+            <wp:effectExtent l="0" t="0" r="0" b="5080"/>
+            <wp:docPr id="138827818" name="Imagen 1"/>
+            <wp:cNvGraphicFramePr>
+              <a:graphicFrameLocks xmlns:a="http://schemas.openxmlformats.org/drawingml/2006/main" noChangeAspect="1"/>
+            </wp:cNvGraphicFramePr>
+            <a:graphic xmlns:a="http://schemas.openxmlformats.org/drawingml/2006/main">
+              <a:graphicData uri="http://schemas.openxmlformats.org/drawingml/2006/picture">
+                <pic:pic xmlns:pic="http://schemas.openxmlformats.org/drawingml/2006/picture">
+                  <pic:nvPicPr>
+                    <pic:cNvPr id="138827818" name=""/>
+                    <pic:cNvPicPr/>
+                  </pic:nvPicPr>
+                  <pic:blipFill>
+                    <a:blip r:embed="rId25"/>
+                    <a:stretch>
+                      <a:fillRect/>
+                    </a:stretch>
+                  </pic:blipFill>
+                  <pic:spPr>
+                    <a:xfrm>
+                      <a:off x="0" y="0"/>
+                      <a:ext cx="5219700" cy="985752"/>
+                    </a:xfrm>
+                    <a:prstGeom prst="rect">
+                      <a:avLst/>
+                    </a:prstGeom>
+                  </pic:spPr>
+                </pic:pic>
+              </a:graphicData>
+            </a:graphic>
+          </wp:inline>
+        </w:drawing>
+      </w:r>
+    </w:p>
+    <w:p>
+      <w:pPr>
+        <w:rPr>
+          <w:lang w:val="es-MX"/>
+        </w:rPr>
+      </w:pPr>
+    </w:p>
+    <w:p>
+      <w:pPr>
+        <w:rPr>
+          <w:lang w:val="es-MX"/>
+        </w:rPr>
+      </w:pPr>
+      <w:r>
+        <w:rPr>
+          <w:lang w:val="es-MX"/>
+        </w:rPr>
+        <w:t>Se realiza un cambio en el archivo Makefile, se quita el código que tenía por defecto. Se crea variables globales para tener el nombre del archivo y el valor de dup para la validación, y se invoca el python3 para la ejecución local del proyecto.</w:t>
+      </w:r>
+    </w:p>
+    <w:p>
+      <w:pPr>
+        <w:rPr>
+          <w:lang w:val="es-MX"/>
+        </w:rPr>
+      </w:pPr>
+      <w:r>
+        <w:rPr>
+          <w:lang w:val="es-MX"/>
+        </w:rPr>
+        <w:drawing>
+          <wp:inline distT="0" distB="0" distL="0" distR="0" wp14:anchorId="26F3634C" wp14:editId="62351DE5">
+            <wp:extent cx="5400040" cy="2064385"/>
+            <wp:effectExtent l="0" t="0" r="0" b="0"/>
+            <wp:docPr id="281845360" name="Imagen 1"/>
+            <wp:cNvGraphicFramePr>
+              <a:graphicFrameLocks xmlns:a="http://schemas.openxmlformats.org/drawingml/2006/main" noChangeAspect="1"/>
+            </wp:cNvGraphicFramePr>
+            <a:graphic xmlns:a="http://schemas.openxmlformats.org/drawingml/2006/main">
+              <a:graphicData uri="http://schemas.openxmlformats.org/drawingml/2006/picture">
+                <pic:pic xmlns:pic="http://schemas.openxmlformats.org/drawingml/2006/picture">
+                  <pic:nvPicPr>
+                    <pic:cNvPr id="281845360" name=""/>
+                    <pic:cNvPicPr/>
+                  </pic:nvPicPr>
+                  <pic:blipFill>
+                    <a:blip r:embed="rId26"/>
+                    <a:stretch>
+                      <a:fillRect/>
+                    </a:stretch>
+                  </pic:blipFill>
+                  <pic:spPr>
+                    <a:xfrm>
+                      <a:off x="0" y="0"/>
+                      <a:ext cx="5400040" cy="2064385"/>
+                    </a:xfrm>
+                    <a:prstGeom prst="rect">
+                      <a:avLst/>
+                    </a:prstGeom>
+                  </pic:spPr>
+                </pic:pic>
+              </a:graphicData>
+            </a:graphic>
+          </wp:inline>
+        </w:drawing>
+      </w:r>
+    </w:p>
+    <w:p>
+      <w:pPr>
+        <w:rPr>
+          <w:lang w:val="es-MX"/>
+        </w:rPr>
+      </w:pPr>
+    </w:p>
+    <w:p>
+      <w:pPr>
+        <w:rPr>
+          <w:lang w:val="es-MX"/>
+        </w:rPr>
+      </w:pPr>
+      <w:r>
+        <w:rPr>
+          <w:lang w:val="es-MX"/>
+        </w:rPr>
+        <w:t xml:space="preserve">Se verifica que archivos contienen cambios </w:t>
+      </w:r>
+    </w:p>
+    <w:p>
+      <w:pPr>
+        <w:rPr>
+          <w:lang w:val="es-MX"/>
+        </w:rPr>
+      </w:pPr>
+      <w:r>
+        <w:rPr>
+          <w:lang w:val="es-MX"/>
+        </w:rPr>
+        <w:drawing>
+          <wp:inline distT="0" distB="0" distL="0" distR="0" wp14:anchorId="2AC8B861" wp14:editId="71562113">
+            <wp:extent cx="5400040" cy="921385"/>
+            <wp:effectExtent l="0" t="0" r="0" b="0"/>
+            <wp:docPr id="1496249463" name="Imagen 1"/>
+            <wp:cNvGraphicFramePr>
+              <a:graphicFrameLocks xmlns:a="http://schemas.openxmlformats.org/drawingml/2006/main" noChangeAspect="1"/>
+            </wp:cNvGraphicFramePr>
+            <a:graphic xmlns:a="http://schemas.openxmlformats.org/drawingml/2006/main">
+              <a:graphicData uri="http://schemas.openxmlformats.org/drawingml/2006/picture">
+                <pic:pic xmlns:pic="http://schemas.openxmlformats.org/drawingml/2006/picture">
+                  <pic:nvPicPr>
+                    <pic:cNvPr id="1496249463" name=""/>
+                    <pic:cNvPicPr/>
+                  </pic:nvPicPr>
+                  <pic:blipFill>
+                    <a:blip r:embed="rId27"/>
+                    <a:stretch>
+                      <a:fillRect/>
+                    </a:stretch>
+                  </pic:blipFill>
+                  <pic:spPr>
+                    <a:xfrm>
+                      <a:off x="0" y="0"/>
+                      <a:ext cx="5400040" cy="921385"/>
+                    </a:xfrm>
+                    <a:prstGeom prst="rect">
+                      <a:avLst/>
+                    </a:prstGeom>
+                  </pic:spPr>
+                </pic:pic>
+              </a:graphicData>
+            </a:graphic>
+          </wp:inline>
+        </w:drawing>
+      </w:r>
+    </w:p>
+    <w:p>
+      <w:pPr>
+        <w:rPr>
+          <w:lang w:val="es-MX"/>
+        </w:rPr>
+      </w:pPr>
+    </w:p>
+    <w:p>
+      <w:r>
+        <w:t>Se procede a añadir los archivos modificados y subirlos en la rama</w:t>
+      </w:r>
+    </w:p>
+    <w:p/>
+    <w:p>
+      <w:pPr>
+        <w:pStyle w:val="TtuloApartado3"/>
+      </w:pPr>
+      <w:r>
+        <w:t>Rúbrica</w:t>
+      </w:r>
+    </w:p>
+    <w:p>
+      <w:pPr>
+        <w:pStyle w:val="Prrafodelista"/>
         <w:ind w:left="284"/>
       </w:pPr>
     </w:p>
@@ -3605,6 +3924,7 @@
                 <w:sz w:val="20"/>
                 <w:szCs w:val="20"/>
               </w:rPr>
+              <w:lastRenderedPageBreak/>
               <w:t>Criterio 1</w:t>
             </w:r>
           </w:p>
@@ -4234,8 +4554,8 @@
       </w:pPr>
     </w:p>
     <w:sectPr>
-      <w:headerReference w:type="default" r:id="rId23"/>
-      <w:footerReference w:type="default" r:id="rId24"/>
+      <w:headerReference w:type="default" r:id="rId28"/>
+      <w:footerReference w:type="default" r:id="rId29"/>
       <w:pgSz w:w="11906" w:h="16838" w:code="9"/>
       <w:pgMar w:top="1418" w:right="1843" w:bottom="1418" w:left="1843" w:header="1134" w:footer="397" w:gutter="0"/>
       <w:cols w:space="708"/>
@@ -4246,7 +4566,7 @@
 </file>
 
 <file path=word/endnotes.xml><?xml version="1.0" encoding="utf-8"?>
-<w:endnotes xmlns:wpc="http://schemas.microsoft.com/office/word/2010/wordprocessingCanvas" xmlns:cx="http://schemas.microsoft.com/office/drawing/2014/chartex" xmlns:cx1="http://schemas.microsoft.com/office/drawing/2015/9/8/chartex" xmlns:cx2="http://schemas.microsoft.com/office/drawing/2015/10/21/chartex" xmlns:cx3="http://schemas.microsoft.com/office/drawing/2016/5/9/chartex" xmlns:cx4="http://schemas.microsoft.com/office/drawing/2016/5/10/chartex" xmlns:cx5="http://schemas.microsoft.com/office/drawing/2016/5/11/chartex" xmlns:cx6="http://schemas.microsoft.com/office/drawing/2016/5/12/chartex" xmlns:cx7="http://schemas.microsoft.com/office/drawing/2016/5/13/chartex" xmlns:cx8="http://schemas.microsoft.com/office/drawing/2016/5/14/chartex" xmlns:mc="http://schemas.openxmlformats.org/markup-compatibility/2006" xmlns:aink="http://schemas.microsoft.com/office/drawing/2016/ink" xmlns:am3d="http://schemas.microsoft.com/office/drawing/2017/model3d" xmlns:o="urn:schemas-microsoft-com:office:office" xmlns:oel="http://schemas.microsoft.com/office/2019/extlst" xmlns:r="http://schemas.openxmlformats.org/officeDocument/2006/relationships" xmlns:m="http://schemas.openxmlformats.org/officeDocument/2006/math" xmlns:v="urn:schemas-microsoft-com:vml" xmlns:wp14="http://schemas.microsoft.com/office/word/2010/wordprocessingDrawing" xmlns:wp="http://schemas.openxmlformats.org/drawingml/2006/wordprocessingDrawing" xmlns:w10="urn:schemas-microsoft-com:office:word" xmlns:w="http://schemas.openxmlformats.org/wordprocessingml/2006/main" xmlns:w14="http://schemas.microsoft.com/office/word/2010/wordml" xmlns:w15="http://schemas.microsoft.com/office/word/2012/wordml" xmlns:w16cex="http://schemas.microsoft.com/office/word/2018/wordml/cex" xmlns:w16cid="http://schemas.microsoft.com/office/word/2016/wordml/cid" xmlns:w16="http://schemas.microsoft.com/office/word/2018/wordml" xmlns:w16du="http://schemas.microsoft.com/office/word/2023/wordml/word16du" xmlns:w16sdtdh="http://schemas.microsoft.com/office/word/2020/wordml/sdtdatahash" xmlns:w16se="http://schemas.microsoft.com/office/word/2015/wordml/symex" xmlns:wpg="http://schemas.microsoft.com/office/word/2010/wordprocessingGroup" xmlns:wpi="http://schemas.microsoft.com/office/word/2010/wordprocessingInk" xmlns:wne="http://schemas.microsoft.com/office/word/2006/wordml" xmlns:wps="http://schemas.microsoft.com/office/word/2010/wordprocessingShape" mc:Ignorable="w14 w15 w16se w16cid w16 w16cex w16sdtdh wp14">
+<w:endnotes xmlns:wpc="http://schemas.microsoft.com/office/word/2010/wordprocessingCanvas" xmlns:cx="http://schemas.microsoft.com/office/drawing/2014/chartex" xmlns:cx1="http://schemas.microsoft.com/office/drawing/2015/9/8/chartex" xmlns:cx2="http://schemas.microsoft.com/office/drawing/2015/10/21/chartex" xmlns:cx3="http://schemas.microsoft.com/office/drawing/2016/5/9/chartex" xmlns:cx4="http://schemas.microsoft.com/office/drawing/2016/5/10/chartex" xmlns:cx5="http://schemas.microsoft.com/office/drawing/2016/5/11/chartex" xmlns:cx6="http://schemas.microsoft.com/office/drawing/2016/5/12/chartex" xmlns:cx7="http://schemas.microsoft.com/office/drawing/2016/5/13/chartex" xmlns:cx8="http://schemas.microsoft.com/office/drawing/2016/5/14/chartex" xmlns:mc="http://schemas.openxmlformats.org/markup-compatibility/2006" xmlns:aink="http://schemas.microsoft.com/office/drawing/2016/ink" xmlns:am3d="http://schemas.microsoft.com/office/drawing/2017/model3d" xmlns:o="urn:schemas-microsoft-com:office:office" xmlns:oel="http://schemas.microsoft.com/office/2019/extlst" xmlns:r="http://schemas.openxmlformats.org/officeDocument/2006/relationships" xmlns:m="http://schemas.openxmlformats.org/officeDocument/2006/math" xmlns:v="urn:schemas-microsoft-com:vml" xmlns:wp14="http://schemas.microsoft.com/office/word/2010/wordprocessingDrawing" xmlns:wp="http://schemas.openxmlformats.org/drawingml/2006/wordprocessingDrawing" xmlns:w10="urn:schemas-microsoft-com:office:word" xmlns:w="http://schemas.openxmlformats.org/wordprocessingml/2006/main" xmlns:w14="http://schemas.microsoft.com/office/word/2010/wordml" xmlns:w15="http://schemas.microsoft.com/office/word/2012/wordml" xmlns:w16cex="http://schemas.microsoft.com/office/word/2018/wordml/cex" xmlns:w16cid="http://schemas.microsoft.com/office/word/2016/wordml/cid" xmlns:w16="http://schemas.microsoft.com/office/word/2018/wordml" xmlns:w16du="http://schemas.microsoft.com/office/word/2023/wordml/word16du" xmlns:w16sdtdh="http://schemas.microsoft.com/office/word/2020/wordml/sdtdatahash" xmlns:w16sdtfl="http://schemas.microsoft.com/office/word/2024/wordml/sdtformatlock" xmlns:w16se="http://schemas.microsoft.com/office/word/2015/wordml/symex" xmlns:wpg="http://schemas.microsoft.com/office/word/2010/wordprocessingGroup" xmlns:wpi="http://schemas.microsoft.com/office/word/2010/wordprocessingInk" xmlns:wne="http://schemas.microsoft.com/office/word/2006/wordml" xmlns:wps="http://schemas.microsoft.com/office/word/2010/wordprocessingShape" mc:Ignorable="w14 w15 w16se w16cid w16 w16cex w16sdtdh w16sdtfl w16du wp14">
   <w:endnote w:type="separator" w:id="-1">
     <w:p>
       <w:pPr>
@@ -4271,7 +4591,7 @@
 </file>
 
 <file path=word/footer1.xml><?xml version="1.0" encoding="utf-8"?>
-<w:ftr xmlns:wpc="http://schemas.microsoft.com/office/word/2010/wordprocessingCanvas" xmlns:cx="http://schemas.microsoft.com/office/drawing/2014/chartex" xmlns:cx1="http://schemas.microsoft.com/office/drawing/2015/9/8/chartex" xmlns:cx2="http://schemas.microsoft.com/office/drawing/2015/10/21/chartex" xmlns:cx3="http://schemas.microsoft.com/office/drawing/2016/5/9/chartex" xmlns:cx4="http://schemas.microsoft.com/office/drawing/2016/5/10/chartex" xmlns:cx5="http://schemas.microsoft.com/office/drawing/2016/5/11/chartex" xmlns:cx6="http://schemas.microsoft.com/office/drawing/2016/5/12/chartex" xmlns:cx7="http://schemas.microsoft.com/office/drawing/2016/5/13/chartex" xmlns:cx8="http://schemas.microsoft.com/office/drawing/2016/5/14/chartex" xmlns:mc="http://schemas.openxmlformats.org/markup-compatibility/2006" xmlns:aink="http://schemas.microsoft.com/office/drawing/2016/ink" xmlns:am3d="http://schemas.microsoft.com/office/drawing/2017/model3d" xmlns:o="urn:schemas-microsoft-com:office:office" xmlns:oel="http://schemas.microsoft.com/office/2019/extlst" xmlns:r="http://schemas.openxmlformats.org/officeDocument/2006/relationships" xmlns:m="http://schemas.openxmlformats.org/officeDocument/2006/math" xmlns:v="urn:schemas-microsoft-com:vml" xmlns:wp14="http://schemas.microsoft.com/office/word/2010/wordprocessingDrawing" xmlns:wp="http://schemas.openxmlformats.org/drawingml/2006/wordprocessingDrawing" xmlns:w10="urn:schemas-microsoft-com:office:word" xmlns:w="http://schemas.openxmlformats.org/wordprocessingml/2006/main" xmlns:w14="http://schemas.microsoft.com/office/word/2010/wordml" xmlns:w15="http://schemas.microsoft.com/office/word/2012/wordml" xmlns:w16cex="http://schemas.microsoft.com/office/word/2018/wordml/cex" xmlns:w16cid="http://schemas.microsoft.com/office/word/2016/wordml/cid" xmlns:w16="http://schemas.microsoft.com/office/word/2018/wordml" xmlns:w16du="http://schemas.microsoft.com/office/word/2023/wordml/word16du" xmlns:w16sdtdh="http://schemas.microsoft.com/office/word/2020/wordml/sdtdatahash" xmlns:w16se="http://schemas.microsoft.com/office/word/2015/wordml/symex" xmlns:wpg="http://schemas.microsoft.com/office/word/2010/wordprocessingGroup" xmlns:wpi="http://schemas.microsoft.com/office/word/2010/wordprocessingInk" xmlns:wne="http://schemas.microsoft.com/office/word/2006/wordml" xmlns:wps="http://schemas.microsoft.com/office/word/2010/wordprocessingShape" mc:Ignorable="w14 w15 w16se w16cid w16 w16cex w16sdtdh wp14">
+<w:ftr xmlns:wpc="http://schemas.microsoft.com/office/word/2010/wordprocessingCanvas" xmlns:cx="http://schemas.microsoft.com/office/drawing/2014/chartex" xmlns:cx1="http://schemas.microsoft.com/office/drawing/2015/9/8/chartex" xmlns:cx2="http://schemas.microsoft.com/office/drawing/2015/10/21/chartex" xmlns:cx3="http://schemas.microsoft.com/office/drawing/2016/5/9/chartex" xmlns:cx4="http://schemas.microsoft.com/office/drawing/2016/5/10/chartex" xmlns:cx5="http://schemas.microsoft.com/office/drawing/2016/5/11/chartex" xmlns:cx6="http://schemas.microsoft.com/office/drawing/2016/5/12/chartex" xmlns:cx7="http://schemas.microsoft.com/office/drawing/2016/5/13/chartex" xmlns:cx8="http://schemas.microsoft.com/office/drawing/2016/5/14/chartex" xmlns:mc="http://schemas.openxmlformats.org/markup-compatibility/2006" xmlns:aink="http://schemas.microsoft.com/office/drawing/2016/ink" xmlns:am3d="http://schemas.microsoft.com/office/drawing/2017/model3d" xmlns:o="urn:schemas-microsoft-com:office:office" xmlns:oel="http://schemas.microsoft.com/office/2019/extlst" xmlns:r="http://schemas.openxmlformats.org/officeDocument/2006/relationships" xmlns:m="http://schemas.openxmlformats.org/officeDocument/2006/math" xmlns:v="urn:schemas-microsoft-com:vml" xmlns:wp14="http://schemas.microsoft.com/office/word/2010/wordprocessingDrawing" xmlns:wp="http://schemas.openxmlformats.org/drawingml/2006/wordprocessingDrawing" xmlns:w10="urn:schemas-microsoft-com:office:word" xmlns:w="http://schemas.openxmlformats.org/wordprocessingml/2006/main" xmlns:w14="http://schemas.microsoft.com/office/word/2010/wordml" xmlns:w15="http://schemas.microsoft.com/office/word/2012/wordml" xmlns:w16cex="http://schemas.microsoft.com/office/word/2018/wordml/cex" xmlns:w16cid="http://schemas.microsoft.com/office/word/2016/wordml/cid" xmlns:w16="http://schemas.microsoft.com/office/word/2018/wordml" xmlns:w16du="http://schemas.microsoft.com/office/word/2023/wordml/word16du" xmlns:w16sdtdh="http://schemas.microsoft.com/office/word/2020/wordml/sdtdatahash" xmlns:w16sdtfl="http://schemas.microsoft.com/office/word/2024/wordml/sdtformatlock" xmlns:w16se="http://schemas.microsoft.com/office/word/2015/wordml/symex" xmlns:wpg="http://schemas.microsoft.com/office/word/2010/wordprocessingGroup" xmlns:wpi="http://schemas.microsoft.com/office/word/2010/wordprocessingInk" xmlns:wne="http://schemas.microsoft.com/office/word/2006/wordml" xmlns:wps="http://schemas.microsoft.com/office/word/2010/wordprocessingShape" mc:Ignorable="w14 w15 w16se w16cid w16 w16cex w16sdtdh w16sdtfl w16du wp14">
   <w:p>
     <w:pPr>
       <w:pStyle w:val="PiedepginaAsignatura"/>
@@ -4506,7 +4826,7 @@
 </file>
 
 <file path=word/footnotes.xml><?xml version="1.0" encoding="utf-8"?>
-<w:footnotes xmlns:wpc="http://schemas.microsoft.com/office/word/2010/wordprocessingCanvas" xmlns:cx="http://schemas.microsoft.com/office/drawing/2014/chartex" xmlns:cx1="http://schemas.microsoft.com/office/drawing/2015/9/8/chartex" xmlns:cx2="http://schemas.microsoft.com/office/drawing/2015/10/21/chartex" xmlns:cx3="http://schemas.microsoft.com/office/drawing/2016/5/9/chartex" xmlns:cx4="http://schemas.microsoft.com/office/drawing/2016/5/10/chartex" xmlns:cx5="http://schemas.microsoft.com/office/drawing/2016/5/11/chartex" xmlns:cx6="http://schemas.microsoft.com/office/drawing/2016/5/12/chartex" xmlns:cx7="http://schemas.microsoft.com/office/drawing/2016/5/13/chartex" xmlns:cx8="http://schemas.microsoft.com/office/drawing/2016/5/14/chartex" xmlns:mc="http://schemas.openxmlformats.org/markup-compatibility/2006" xmlns:aink="http://schemas.microsoft.com/office/drawing/2016/ink" xmlns:am3d="http://schemas.microsoft.com/office/drawing/2017/model3d" xmlns:o="urn:schemas-microsoft-com:office:office" xmlns:oel="http://schemas.microsoft.com/office/2019/extlst" xmlns:r="http://schemas.openxmlformats.org/officeDocument/2006/relationships" xmlns:m="http://schemas.openxmlformats.org/officeDocument/2006/math" xmlns:v="urn:schemas-microsoft-com:vml" xmlns:wp14="http://schemas.microsoft.com/office/word/2010/wordprocessingDrawing" xmlns:wp="http://schemas.openxmlformats.org/drawingml/2006/wordprocessingDrawing" xmlns:w10="urn:schemas-microsoft-com:office:word" xmlns:w="http://schemas.openxmlformats.org/wordprocessingml/2006/main" xmlns:w14="http://schemas.microsoft.com/office/word/2010/wordml" xmlns:w15="http://schemas.microsoft.com/office/word/2012/wordml" xmlns:w16cex="http://schemas.microsoft.com/office/word/2018/wordml/cex" xmlns:w16cid="http://schemas.microsoft.com/office/word/2016/wordml/cid" xmlns:w16="http://schemas.microsoft.com/office/word/2018/wordml" xmlns:w16du="http://schemas.microsoft.com/office/word/2023/wordml/word16du" xmlns:w16sdtdh="http://schemas.microsoft.com/office/word/2020/wordml/sdtdatahash" xmlns:w16se="http://schemas.microsoft.com/office/word/2015/wordml/symex" xmlns:wpg="http://schemas.microsoft.com/office/word/2010/wordprocessingGroup" xmlns:wpi="http://schemas.microsoft.com/office/word/2010/wordprocessingInk" xmlns:wne="http://schemas.microsoft.com/office/word/2006/wordml" xmlns:wps="http://schemas.microsoft.com/office/word/2010/wordprocessingShape" mc:Ignorable="w14 w15 w16se w16cid w16 w16cex w16sdtdh wp14">
+<w:footnotes xmlns:wpc="http://schemas.microsoft.com/office/word/2010/wordprocessingCanvas" xmlns:cx="http://schemas.microsoft.com/office/drawing/2014/chartex" xmlns:cx1="http://schemas.microsoft.com/office/drawing/2015/9/8/chartex" xmlns:cx2="http://schemas.microsoft.com/office/drawing/2015/10/21/chartex" xmlns:cx3="http://schemas.microsoft.com/office/drawing/2016/5/9/chartex" xmlns:cx4="http://schemas.microsoft.com/office/drawing/2016/5/10/chartex" xmlns:cx5="http://schemas.microsoft.com/office/drawing/2016/5/11/chartex" xmlns:cx6="http://schemas.microsoft.com/office/drawing/2016/5/12/chartex" xmlns:cx7="http://schemas.microsoft.com/office/drawing/2016/5/13/chartex" xmlns:cx8="http://schemas.microsoft.com/office/drawing/2016/5/14/chartex" xmlns:mc="http://schemas.openxmlformats.org/markup-compatibility/2006" xmlns:aink="http://schemas.microsoft.com/office/drawing/2016/ink" xmlns:am3d="http://schemas.microsoft.com/office/drawing/2017/model3d" xmlns:o="urn:schemas-microsoft-com:office:office" xmlns:oel="http://schemas.microsoft.com/office/2019/extlst" xmlns:r="http://schemas.openxmlformats.org/officeDocument/2006/relationships" xmlns:m="http://schemas.openxmlformats.org/officeDocument/2006/math" xmlns:v="urn:schemas-microsoft-com:vml" xmlns:wp14="http://schemas.microsoft.com/office/word/2010/wordprocessingDrawing" xmlns:wp="http://schemas.openxmlformats.org/drawingml/2006/wordprocessingDrawing" xmlns:w10="urn:schemas-microsoft-com:office:word" xmlns:w="http://schemas.openxmlformats.org/wordprocessingml/2006/main" xmlns:w14="http://schemas.microsoft.com/office/word/2010/wordml" xmlns:w15="http://schemas.microsoft.com/office/word/2012/wordml" xmlns:w16cex="http://schemas.microsoft.com/office/word/2018/wordml/cex" xmlns:w16cid="http://schemas.microsoft.com/office/word/2016/wordml/cid" xmlns:w16="http://schemas.microsoft.com/office/word/2018/wordml" xmlns:w16du="http://schemas.microsoft.com/office/word/2023/wordml/word16du" xmlns:w16sdtdh="http://schemas.microsoft.com/office/word/2020/wordml/sdtdatahash" xmlns:w16sdtfl="http://schemas.microsoft.com/office/word/2024/wordml/sdtformatlock" xmlns:w16se="http://schemas.microsoft.com/office/word/2015/wordml/symex" xmlns:wpg="http://schemas.microsoft.com/office/word/2010/wordprocessingGroup" xmlns:wpi="http://schemas.microsoft.com/office/word/2010/wordprocessingInk" xmlns:wne="http://schemas.microsoft.com/office/word/2006/wordml" xmlns:wps="http://schemas.microsoft.com/office/word/2010/wordprocessingShape" mc:Ignorable="w14 w15 w16se w16cid w16 w16cex w16sdtdh w16sdtfl w16du wp14">
   <w:footnote w:type="separator" w:id="-1">
     <w:p>
       <w:pPr>
@@ -4531,7 +4851,7 @@
 </file>
 
 <file path=word/header1.xml><?xml version="1.0" encoding="utf-8"?>
-<w:hdr xmlns:wpc="http://schemas.microsoft.com/office/word/2010/wordprocessingCanvas" xmlns:cx="http://schemas.microsoft.com/office/drawing/2014/chartex" xmlns:cx1="http://schemas.microsoft.com/office/drawing/2015/9/8/chartex" xmlns:cx2="http://schemas.microsoft.com/office/drawing/2015/10/21/chartex" xmlns:cx3="http://schemas.microsoft.com/office/drawing/2016/5/9/chartex" xmlns:cx4="http://schemas.microsoft.com/office/drawing/2016/5/10/chartex" xmlns:cx5="http://schemas.microsoft.com/office/drawing/2016/5/11/chartex" xmlns:cx6="http://schemas.microsoft.com/office/drawing/2016/5/12/chartex" xmlns:cx7="http://schemas.microsoft.com/office/drawing/2016/5/13/chartex" xmlns:cx8="http://schemas.microsoft.com/office/drawing/2016/5/14/chartex" xmlns:mc="http://schemas.openxmlformats.org/markup-compatibility/2006" xmlns:aink="http://schemas.microsoft.com/office/drawing/2016/ink" xmlns:am3d="http://schemas.microsoft.com/office/drawing/2017/model3d" xmlns:o="urn:schemas-microsoft-com:office:office" xmlns:oel="http://schemas.microsoft.com/office/2019/extlst" xmlns:r="http://schemas.openxmlformats.org/officeDocument/2006/relationships" xmlns:m="http://schemas.openxmlformats.org/officeDocument/2006/math" xmlns:v="urn:schemas-microsoft-com:vml" xmlns:wp14="http://schemas.microsoft.com/office/word/2010/wordprocessingDrawing" xmlns:wp="http://schemas.openxmlformats.org/drawingml/2006/wordprocessingDrawing" xmlns:w10="urn:schemas-microsoft-com:office:word" xmlns:w="http://schemas.openxmlformats.org/wordprocessingml/2006/main" xmlns:w14="http://schemas.microsoft.com/office/word/2010/wordml" xmlns:w15="http://schemas.microsoft.com/office/word/2012/wordml" xmlns:w16cex="http://schemas.microsoft.com/office/word/2018/wordml/cex" xmlns:w16cid="http://schemas.microsoft.com/office/word/2016/wordml/cid" xmlns:w16="http://schemas.microsoft.com/office/word/2018/wordml" xmlns:w16du="http://schemas.microsoft.com/office/word/2023/wordml/word16du" xmlns:w16sdtdh="http://schemas.microsoft.com/office/word/2020/wordml/sdtdatahash" xmlns:w16se="http://schemas.microsoft.com/office/word/2015/wordml/symex" xmlns:wpg="http://schemas.microsoft.com/office/word/2010/wordprocessingGroup" xmlns:wpi="http://schemas.microsoft.com/office/word/2010/wordprocessingInk" xmlns:wne="http://schemas.microsoft.com/office/word/2006/wordml" xmlns:wps="http://schemas.microsoft.com/office/word/2010/wordprocessingShape" mc:Ignorable="w14 w15 w16se w16cid w16 w16cex w16sdtdh wp14">
+<w:hdr xmlns:wpc="http://schemas.microsoft.com/office/word/2010/wordprocessingCanvas" xmlns:cx="http://schemas.microsoft.com/office/drawing/2014/chartex" xmlns:cx1="http://schemas.microsoft.com/office/drawing/2015/9/8/chartex" xmlns:cx2="http://schemas.microsoft.com/office/drawing/2015/10/21/chartex" xmlns:cx3="http://schemas.microsoft.com/office/drawing/2016/5/9/chartex" xmlns:cx4="http://schemas.microsoft.com/office/drawing/2016/5/10/chartex" xmlns:cx5="http://schemas.microsoft.com/office/drawing/2016/5/11/chartex" xmlns:cx6="http://schemas.microsoft.com/office/drawing/2016/5/12/chartex" xmlns:cx7="http://schemas.microsoft.com/office/drawing/2016/5/13/chartex" xmlns:cx8="http://schemas.microsoft.com/office/drawing/2016/5/14/chartex" xmlns:mc="http://schemas.openxmlformats.org/markup-compatibility/2006" xmlns:aink="http://schemas.microsoft.com/office/drawing/2016/ink" xmlns:am3d="http://schemas.microsoft.com/office/drawing/2017/model3d" xmlns:o="urn:schemas-microsoft-com:office:office" xmlns:oel="http://schemas.microsoft.com/office/2019/extlst" xmlns:r="http://schemas.openxmlformats.org/officeDocument/2006/relationships" xmlns:m="http://schemas.openxmlformats.org/officeDocument/2006/math" xmlns:v="urn:schemas-microsoft-com:vml" xmlns:wp14="http://schemas.microsoft.com/office/word/2010/wordprocessingDrawing" xmlns:wp="http://schemas.openxmlformats.org/drawingml/2006/wordprocessingDrawing" xmlns:w10="urn:schemas-microsoft-com:office:word" xmlns:w="http://schemas.openxmlformats.org/wordprocessingml/2006/main" xmlns:w14="http://schemas.microsoft.com/office/word/2010/wordml" xmlns:w15="http://schemas.microsoft.com/office/word/2012/wordml" xmlns:w16cex="http://schemas.microsoft.com/office/word/2018/wordml/cex" xmlns:w16cid="http://schemas.microsoft.com/office/word/2016/wordml/cid" xmlns:w16="http://schemas.microsoft.com/office/word/2018/wordml" xmlns:w16du="http://schemas.microsoft.com/office/word/2023/wordml/word16du" xmlns:w16sdtdh="http://schemas.microsoft.com/office/word/2020/wordml/sdtdatahash" xmlns:w16sdtfl="http://schemas.microsoft.com/office/word/2024/wordml/sdtformatlock" xmlns:w16se="http://schemas.microsoft.com/office/word/2015/wordml/symex" xmlns:wpg="http://schemas.microsoft.com/office/word/2010/wordprocessingGroup" xmlns:wpi="http://schemas.microsoft.com/office/word/2010/wordprocessingInk" xmlns:wne="http://schemas.microsoft.com/office/word/2006/wordml" xmlns:wps="http://schemas.microsoft.com/office/word/2010/wordprocessingShape" mc:Ignorable="w14 w15 w16se w16cid w16 w16cex w16sdtdh w16sdtfl w16du wp14">
   <w:tbl>
     <w:tblPr>
       <w:tblStyle w:val="TablaUNIR30"/>
@@ -4558,7 +4878,7 @@
         </w:tcPr>
         <w:p>
           <w:pPr>
-            <w:pStyle w:val="Header"/>
+            <w:pStyle w:val="Encabezado"/>
             <w:jc w:val="center"/>
             <w:rPr>
               <w:rFonts w:cs="UnitOT-Medi"/>
@@ -4584,7 +4904,7 @@
         </w:tcPr>
         <w:p>
           <w:pPr>
-            <w:pStyle w:val="Header"/>
+            <w:pStyle w:val="Encabezado"/>
             <w:jc w:val="center"/>
             <w:rPr>
               <w:rFonts w:cs="UnitOT-Medi"/>
@@ -4610,7 +4930,7 @@
         </w:tcPr>
         <w:p>
           <w:pPr>
-            <w:pStyle w:val="Header"/>
+            <w:pStyle w:val="Encabezado"/>
             <w:jc w:val="center"/>
             <w:rPr>
               <w:rFonts w:cs="UnitOT-Medi"/>
@@ -4655,7 +4975,7 @@
         </w:tcPr>
         <w:p>
           <w:pPr>
-            <w:pStyle w:val="Header"/>
+            <w:pStyle w:val="Encabezado"/>
             <w:rPr>
               <w:sz w:val="22"/>
               <w:szCs w:val="22"/>
@@ -4677,7 +4997,7 @@
         </w:tcPr>
         <w:p>
           <w:pPr>
-            <w:pStyle w:val="Header"/>
+            <w:pStyle w:val="Encabezado"/>
             <w:jc w:val="center"/>
             <w:rPr>
               <w:rFonts w:asciiTheme="minorHAnsi" w:hAnsiTheme="minorHAnsi"/>
@@ -4697,7 +5017,7 @@
         </w:tcPr>
         <w:p>
           <w:pPr>
-            <w:pStyle w:val="Header"/>
+            <w:pStyle w:val="Encabezado"/>
           </w:pPr>
         </w:p>
       </w:tc>
@@ -4707,7 +5027,7 @@
         </w:tcPr>
         <w:p>
           <w:pPr>
-            <w:pStyle w:val="Header"/>
+            <w:pStyle w:val="Encabezado"/>
             <w:rPr>
               <w:sz w:val="22"/>
               <w:szCs w:val="22"/>
@@ -4729,7 +5049,7 @@
         </w:tcPr>
         <w:p>
           <w:pPr>
-            <w:pStyle w:val="Header"/>
+            <w:pStyle w:val="Encabezado"/>
           </w:pPr>
         </w:p>
       </w:tc>
@@ -4737,14 +5057,14 @@
   </w:tbl>
   <w:p>
     <w:pPr>
-      <w:pStyle w:val="Header"/>
+      <w:pStyle w:val="Encabezado"/>
     </w:pPr>
   </w:p>
 </w:hdr>
 </file>
 
 <file path=word/numbering.xml><?xml version="1.0" encoding="utf-8"?>
-<w:numbering xmlns:wpc="http://schemas.microsoft.com/office/word/2010/wordprocessingCanvas" xmlns:cx="http://schemas.microsoft.com/office/drawing/2014/chartex" xmlns:cx1="http://schemas.microsoft.com/office/drawing/2015/9/8/chartex" xmlns:cx2="http://schemas.microsoft.com/office/drawing/2015/10/21/chartex" xmlns:cx3="http://schemas.microsoft.com/office/drawing/2016/5/9/chartex" xmlns:cx4="http://schemas.microsoft.com/office/drawing/2016/5/10/chartex" xmlns:cx5="http://schemas.microsoft.com/office/drawing/2016/5/11/chartex" xmlns:cx6="http://schemas.microsoft.com/office/drawing/2016/5/12/chartex" xmlns:cx7="http://schemas.microsoft.com/office/drawing/2016/5/13/chartex" xmlns:cx8="http://schemas.microsoft.com/office/drawing/2016/5/14/chartex" xmlns:mc="http://schemas.openxmlformats.org/markup-compatibility/2006" xmlns:aink="http://schemas.microsoft.com/office/drawing/2016/ink" xmlns:am3d="http://schemas.microsoft.com/office/drawing/2017/model3d" xmlns:o="urn:schemas-microsoft-com:office:office" xmlns:oel="http://schemas.microsoft.com/office/2019/extlst" xmlns:r="http://schemas.openxmlformats.org/officeDocument/2006/relationships" xmlns:m="http://schemas.openxmlformats.org/officeDocument/2006/math" xmlns:v="urn:schemas-microsoft-com:vml" xmlns:wp14="http://schemas.microsoft.com/office/word/2010/wordprocessingDrawing" xmlns:wp="http://schemas.openxmlformats.org/drawingml/2006/wordprocessingDrawing" xmlns:w10="urn:schemas-microsoft-com:office:word" xmlns:w="http://schemas.openxmlformats.org/wordprocessingml/2006/main" xmlns:w14="http://schemas.microsoft.com/office/word/2010/wordml" xmlns:w15="http://schemas.microsoft.com/office/word/2012/wordml" xmlns:w16cex="http://schemas.microsoft.com/office/word/2018/wordml/cex" xmlns:w16cid="http://schemas.microsoft.com/office/word/2016/wordml/cid" xmlns:w16="http://schemas.microsoft.com/office/word/2018/wordml" xmlns:w16du="http://schemas.microsoft.com/office/word/2023/wordml/word16du" xmlns:w16sdtdh="http://schemas.microsoft.com/office/word/2020/wordml/sdtdatahash" xmlns:w16se="http://schemas.microsoft.com/office/word/2015/wordml/symex" xmlns:wpg="http://schemas.microsoft.com/office/word/2010/wordprocessingGroup" xmlns:wpi="http://schemas.microsoft.com/office/word/2010/wordprocessingInk" xmlns:wne="http://schemas.microsoft.com/office/word/2006/wordml" xmlns:wps="http://schemas.microsoft.com/office/word/2010/wordprocessingShape" mc:Ignorable="w14 w15 w16se w16cid w16 w16cex w16sdtdh wp14">
+<w:numbering xmlns:wpc="http://schemas.microsoft.com/office/word/2010/wordprocessingCanvas" xmlns:cx="http://schemas.microsoft.com/office/drawing/2014/chartex" xmlns:cx1="http://schemas.microsoft.com/office/drawing/2015/9/8/chartex" xmlns:cx2="http://schemas.microsoft.com/office/drawing/2015/10/21/chartex" xmlns:cx3="http://schemas.microsoft.com/office/drawing/2016/5/9/chartex" xmlns:cx4="http://schemas.microsoft.com/office/drawing/2016/5/10/chartex" xmlns:cx5="http://schemas.microsoft.com/office/drawing/2016/5/11/chartex" xmlns:cx6="http://schemas.microsoft.com/office/drawing/2016/5/12/chartex" xmlns:cx7="http://schemas.microsoft.com/office/drawing/2016/5/13/chartex" xmlns:cx8="http://schemas.microsoft.com/office/drawing/2016/5/14/chartex" xmlns:mc="http://schemas.openxmlformats.org/markup-compatibility/2006" xmlns:aink="http://schemas.microsoft.com/office/drawing/2016/ink" xmlns:am3d="http://schemas.microsoft.com/office/drawing/2017/model3d" xmlns:o="urn:schemas-microsoft-com:office:office" xmlns:oel="http://schemas.microsoft.com/office/2019/extlst" xmlns:r="http://schemas.openxmlformats.org/officeDocument/2006/relationships" xmlns:m="http://schemas.openxmlformats.org/officeDocument/2006/math" xmlns:v="urn:schemas-microsoft-com:vml" xmlns:wp14="http://schemas.microsoft.com/office/word/2010/wordprocessingDrawing" xmlns:wp="http://schemas.openxmlformats.org/drawingml/2006/wordprocessingDrawing" xmlns:w10="urn:schemas-microsoft-com:office:word" xmlns:w="http://schemas.openxmlformats.org/wordprocessingml/2006/main" xmlns:w14="http://schemas.microsoft.com/office/word/2010/wordml" xmlns:w15="http://schemas.microsoft.com/office/word/2012/wordml" xmlns:w16cex="http://schemas.microsoft.com/office/word/2018/wordml/cex" xmlns:w16cid="http://schemas.microsoft.com/office/word/2016/wordml/cid" xmlns:w16="http://schemas.microsoft.com/office/word/2018/wordml" xmlns:w16du="http://schemas.microsoft.com/office/word/2023/wordml/word16du" xmlns:w16sdtdh="http://schemas.microsoft.com/office/word/2020/wordml/sdtdatahash" xmlns:w16sdtfl="http://schemas.microsoft.com/office/word/2024/wordml/sdtformatlock" xmlns:w16se="http://schemas.microsoft.com/office/word/2015/wordml/symex" xmlns:wpg="http://schemas.microsoft.com/office/word/2010/wordprocessingGroup" xmlns:wpi="http://schemas.microsoft.com/office/word/2010/wordprocessingInk" xmlns:wne="http://schemas.microsoft.com/office/word/2006/wordml" xmlns:wps="http://schemas.microsoft.com/office/word/2010/wordprocessingShape" mc:Ignorable="w14 w15 w16se w16cid w16 w16cex w16sdtdh w16sdtfl w16du wp14">
   <w:abstractNum w:abstractNumId="0" w15:restartNumberingAfterBreak="0">
     <w:nsid w:val="009C15F1"/>
     <w:multiLevelType w:val="hybridMultilevel"/>
@@ -7322,7 +7642,7 @@
 </file>
 
 <file path=word/styles.xml><?xml version="1.0" encoding="utf-8"?>
-<w:styles xmlns:mc="http://schemas.openxmlformats.org/markup-compatibility/2006" xmlns:r="http://schemas.openxmlformats.org/officeDocument/2006/relationships" xmlns:w="http://schemas.openxmlformats.org/wordprocessingml/2006/main" xmlns:w14="http://schemas.microsoft.com/office/word/2010/wordml" xmlns:w15="http://schemas.microsoft.com/office/word/2012/wordml" xmlns:w16cex="http://schemas.microsoft.com/office/word/2018/wordml/cex" xmlns:w16cid="http://schemas.microsoft.com/office/word/2016/wordml/cid" xmlns:w16="http://schemas.microsoft.com/office/word/2018/wordml" xmlns:w16sdtdh="http://schemas.microsoft.com/office/word/2020/wordml/sdtdatahash" xmlns:w16se="http://schemas.microsoft.com/office/word/2015/wordml/symex" mc:Ignorable="w14 w15 w16se w16cid w16 w16cex w16sdtdh">
+<w:styles xmlns:mc="http://schemas.openxmlformats.org/markup-compatibility/2006" xmlns:r="http://schemas.openxmlformats.org/officeDocument/2006/relationships" xmlns:w="http://schemas.openxmlformats.org/wordprocessingml/2006/main" xmlns:w14="http://schemas.microsoft.com/office/word/2010/wordml" xmlns:w15="http://schemas.microsoft.com/office/word/2012/wordml" xmlns:w16cex="http://schemas.microsoft.com/office/word/2018/wordml/cex" xmlns:w16cid="http://schemas.microsoft.com/office/word/2016/wordml/cid" xmlns:w16="http://schemas.microsoft.com/office/word/2018/wordml" xmlns:w16du="http://schemas.microsoft.com/office/word/2023/wordml/word16du" xmlns:w16sdtdh="http://schemas.microsoft.com/office/word/2020/wordml/sdtdatahash" xmlns:w16sdtfl="http://schemas.microsoft.com/office/word/2024/wordml/sdtformatlock" xmlns:w16se="http://schemas.microsoft.com/office/word/2015/wordml/symex" mc:Ignorable="w14 w15 w16se w16cid w16 w16cex w16sdtdh w16sdtfl w16du">
   <w:docDefaults>
     <w:rPrDefault>
       <w:rPr>
@@ -7732,10 +8052,10 @@
       <w:lang w:eastAsia="es-ES"/>
     </w:rPr>
   </w:style>
-  <w:style w:type="paragraph" w:styleId="Heading1">
+  <w:style w:type="paragraph" w:styleId="Ttulo1">
     <w:name w:val="heading 1"/>
     <w:next w:val="Normal"/>
-    <w:link w:val="Heading1Char"/>
+    <w:link w:val="Ttulo1Car"/>
     <w:uiPriority w:val="99"/>
     <w:semiHidden/>
     <w:rsid w:val="00507E5B"/>
@@ -7752,11 +8072,11 @@
       <w:lang w:eastAsia="es-ES"/>
     </w:rPr>
   </w:style>
-  <w:style w:type="paragraph" w:styleId="Heading2">
+  <w:style w:type="paragraph" w:styleId="Ttulo2">
     <w:name w:val="heading 2"/>
     <w:basedOn w:val="Normal"/>
     <w:next w:val="Normal"/>
-    <w:link w:val="Heading2Char"/>
+    <w:link w:val="Ttulo2Car"/>
     <w:uiPriority w:val="99"/>
     <w:semiHidden/>
     <w:rsid w:val="00507E5B"/>
@@ -7773,13 +8093,13 @@
       <w:szCs w:val="26"/>
     </w:rPr>
   </w:style>
-  <w:style w:type="character" w:default="1" w:styleId="DefaultParagraphFont">
+  <w:style w:type="character" w:default="1" w:styleId="Fuentedeprrafopredeter">
     <w:name w:val="Default Paragraph Font"/>
     <w:uiPriority w:val="1"/>
     <w:semiHidden/>
     <w:unhideWhenUsed/>
   </w:style>
-  <w:style w:type="table" w:default="1" w:styleId="TableNormal">
+  <w:style w:type="table" w:default="1" w:styleId="Tablanormal">
     <w:name w:val="Normal Table"/>
     <w:uiPriority w:val="99"/>
     <w:semiHidden/>
@@ -7794,7 +8114,7 @@
       </w:tblCellMar>
     </w:tblPr>
   </w:style>
-  <w:style w:type="numbering" w:default="1" w:styleId="NoList">
+  <w:style w:type="numbering" w:default="1" w:styleId="Sinlista">
     <w:name w:val="No List"/>
     <w:uiPriority w:val="99"/>
     <w:semiHidden/>
@@ -7868,9 +8188,9 @@
       <w:spacing w:line="240" w:lineRule="auto"/>
     </w:pPr>
   </w:style>
-  <w:style w:type="character" w:styleId="Hyperlink">
+  <w:style w:type="character" w:styleId="Hipervnculo">
     <w:name w:val="Hyperlink"/>
-    <w:basedOn w:val="DefaultParagraphFont"/>
+    <w:basedOn w:val="Fuentedeprrafopredeter"/>
     <w:uiPriority w:val="99"/>
     <w:unhideWhenUsed/>
     <w:rsid w:val="0058112D"/>
@@ -7894,7 +8214,7 @@
   </w:style>
   <w:style w:type="numbering" w:customStyle="1" w:styleId="VietasUNIR">
     <w:name w:val="ViñetasUNIR"/>
-    <w:basedOn w:val="NoList"/>
+    <w:basedOn w:val="Sinlista"/>
     <w:uiPriority w:val="99"/>
     <w:rsid w:val="00260B21"/>
     <w:pPr>
@@ -7923,10 +8243,10 @@
       <w:szCs w:val="18"/>
     </w:rPr>
   </w:style>
-  <w:style w:type="character" w:customStyle="1" w:styleId="Heading1Char">
-    <w:name w:val="Heading 1 Char"/>
-    <w:basedOn w:val="DefaultParagraphFont"/>
-    <w:link w:val="Heading1"/>
+  <w:style w:type="character" w:customStyle="1" w:styleId="Ttulo1Car">
+    <w:name w:val="Título 1 Car"/>
+    <w:basedOn w:val="Fuentedeprrafopredeter"/>
+    <w:link w:val="Ttulo1"/>
     <w:uiPriority w:val="99"/>
     <w:semiHidden/>
     <w:rsid w:val="00D511BC"/>
@@ -7937,7 +8257,7 @@
       <w:lang w:eastAsia="es-ES"/>
     </w:rPr>
   </w:style>
-  <w:style w:type="paragraph" w:styleId="ListParagraph">
+  <w:style w:type="paragraph" w:styleId="Prrafodelista">
     <w:name w:val="List Paragraph"/>
     <w:basedOn w:val="Normal"/>
     <w:uiPriority w:val="98"/>
@@ -7948,10 +8268,10 @@
       <w:contextualSpacing/>
     </w:pPr>
   </w:style>
-  <w:style w:type="character" w:customStyle="1" w:styleId="Heading2Char">
-    <w:name w:val="Heading 2 Char"/>
-    <w:basedOn w:val="DefaultParagraphFont"/>
-    <w:link w:val="Heading2"/>
+  <w:style w:type="character" w:customStyle="1" w:styleId="Ttulo2Car">
+    <w:name w:val="Título 2 Car"/>
+    <w:basedOn w:val="Fuentedeprrafopredeter"/>
+    <w:link w:val="Ttulo2"/>
     <w:uiPriority w:val="99"/>
     <w:semiHidden/>
     <w:rsid w:val="00D511BC"/>
@@ -7979,7 +8299,7 @@
       <w:szCs w:val="22"/>
     </w:rPr>
   </w:style>
-  <w:style w:type="paragraph" w:styleId="Caption">
+  <w:style w:type="paragraph" w:styleId="Descripcin">
     <w:name w:val="caption"/>
     <w:basedOn w:val="Normal"/>
     <w:next w:val="Normal"/>
@@ -7999,9 +8319,9 @@
       <w:szCs w:val="18"/>
     </w:rPr>
   </w:style>
-  <w:style w:type="table" w:styleId="TableGrid">
+  <w:style w:type="table" w:styleId="Tablaconcuadrcula">
     <w:name w:val="Table Grid"/>
-    <w:basedOn w:val="TableNormal"/>
+    <w:basedOn w:val="Tablanormal"/>
     <w:uiPriority w:val="39"/>
     <w:rsid w:val="007E4840"/>
     <w:pPr>
@@ -8200,7 +8520,7 @@
       <w:szCs w:val="22"/>
     </w:rPr>
   </w:style>
-  <w:style w:type="paragraph" w:styleId="TOC1">
+  <w:style w:type="paragraph" w:styleId="TDC1">
     <w:name w:val="toc 1"/>
     <w:basedOn w:val="Normal"/>
     <w:next w:val="Normal"/>
@@ -8221,7 +8541,7 @@
       <w:color w:val="008FBE"/>
     </w:rPr>
   </w:style>
-  <w:style w:type="paragraph" w:styleId="TOC2">
+  <w:style w:type="paragraph" w:styleId="TDC2">
     <w:name w:val="toc 2"/>
     <w:basedOn w:val="Normal"/>
     <w:next w:val="Normal"/>
@@ -8288,7 +8608,7 @@
   </w:style>
   <w:style w:type="table" w:customStyle="1" w:styleId="TablaUNIR2">
     <w:name w:val="TablaUNIR_2"/>
-    <w:basedOn w:val="TableNormal"/>
+    <w:basedOn w:val="Tablanormal"/>
     <w:uiPriority w:val="99"/>
     <w:rsid w:val="007E4840"/>
     <w:pPr>
@@ -8351,7 +8671,7 @@
   </w:style>
   <w:style w:type="table" w:customStyle="1" w:styleId="TablaUNIR3">
     <w:name w:val="TablaUNIR_3"/>
-    <w:basedOn w:val="TableNormal"/>
+    <w:basedOn w:val="Tablanormal"/>
     <w:uiPriority w:val="99"/>
     <w:rsid w:val="001E737A"/>
     <w:pPr>
@@ -8402,7 +8722,7 @@
   </w:style>
   <w:style w:type="table" w:customStyle="1" w:styleId="TablaUNIR4">
     <w:name w:val="TablaUNIR_4"/>
-    <w:basedOn w:val="TableNormal"/>
+    <w:basedOn w:val="Tablanormal"/>
     <w:uiPriority w:val="99"/>
     <w:rsid w:val="001E737A"/>
     <w:pPr>
@@ -8472,7 +8792,7 @@
   </w:style>
   <w:style w:type="table" w:customStyle="1" w:styleId="TablaejemplosUNIR">
     <w:name w:val="Tabla ejemplos UNIR"/>
-    <w:basedOn w:val="TableNormal"/>
+    <w:basedOn w:val="Tablanormal"/>
     <w:uiPriority w:val="99"/>
     <w:rsid w:val="001E737A"/>
     <w:pPr>
@@ -8503,10 +8823,10 @@
       </w:numPr>
     </w:pPr>
   </w:style>
-  <w:style w:type="paragraph" w:styleId="Header">
+  <w:style w:type="paragraph" w:styleId="Encabezado">
     <w:name w:val="header"/>
     <w:basedOn w:val="Normal"/>
-    <w:link w:val="HeaderChar"/>
+    <w:link w:val="EncabezadoCar"/>
     <w:uiPriority w:val="99"/>
     <w:qFormat/>
     <w:rsid w:val="00D30434"/>
@@ -8518,10 +8838,10 @@
       <w:spacing w:line="240" w:lineRule="auto"/>
     </w:pPr>
   </w:style>
-  <w:style w:type="character" w:customStyle="1" w:styleId="HeaderChar">
-    <w:name w:val="Header Char"/>
-    <w:basedOn w:val="DefaultParagraphFont"/>
-    <w:link w:val="Header"/>
+  <w:style w:type="character" w:customStyle="1" w:styleId="EncabezadoCar">
+    <w:name w:val="Encabezado Car"/>
+    <w:basedOn w:val="Fuentedeprrafopredeter"/>
+    <w:link w:val="Encabezado"/>
     <w:uiPriority w:val="99"/>
     <w:rsid w:val="00D30434"/>
     <w:rPr>
@@ -8531,10 +8851,10 @@
       <w:lang w:eastAsia="es-ES"/>
     </w:rPr>
   </w:style>
-  <w:style w:type="paragraph" w:styleId="Footer">
+  <w:style w:type="paragraph" w:styleId="Piedepgina">
     <w:name w:val="footer"/>
     <w:basedOn w:val="Normal"/>
-    <w:link w:val="FooterChar"/>
+    <w:link w:val="PiedepginaCar"/>
     <w:uiPriority w:val="24"/>
     <w:unhideWhenUsed/>
     <w:qFormat/>
@@ -8547,10 +8867,10 @@
       <w:spacing w:line="240" w:lineRule="auto"/>
     </w:pPr>
   </w:style>
-  <w:style w:type="character" w:customStyle="1" w:styleId="FooterChar">
-    <w:name w:val="Footer Char"/>
-    <w:basedOn w:val="DefaultParagraphFont"/>
-    <w:link w:val="Footer"/>
+  <w:style w:type="character" w:customStyle="1" w:styleId="PiedepginaCar">
+    <w:name w:val="Pie de página Car"/>
+    <w:basedOn w:val="Fuentedeprrafopredeter"/>
+    <w:link w:val="Piedepgina"/>
     <w:uiPriority w:val="24"/>
     <w:rsid w:val="00E7167D"/>
     <w:rPr>
@@ -8561,10 +8881,10 @@
       <w:lang w:eastAsia="es-ES"/>
     </w:rPr>
   </w:style>
-  <w:style w:type="paragraph" w:styleId="BalloonText">
+  <w:style w:type="paragraph" w:styleId="Textodeglobo">
     <w:name w:val="Balloon Text"/>
     <w:basedOn w:val="Normal"/>
-    <w:link w:val="BalloonTextChar"/>
+    <w:link w:val="TextodegloboCar"/>
     <w:uiPriority w:val="99"/>
     <w:semiHidden/>
     <w:unhideWhenUsed/>
@@ -8578,10 +8898,10 @@
       <w:szCs w:val="18"/>
     </w:rPr>
   </w:style>
-  <w:style w:type="character" w:customStyle="1" w:styleId="BalloonTextChar">
-    <w:name w:val="Balloon Text Char"/>
-    <w:basedOn w:val="DefaultParagraphFont"/>
-    <w:link w:val="BalloonText"/>
+  <w:style w:type="character" w:customStyle="1" w:styleId="TextodegloboCar">
+    <w:name w:val="Texto de globo Car"/>
+    <w:basedOn w:val="Fuentedeprrafopredeter"/>
+    <w:link w:val="Textodeglobo"/>
     <w:uiPriority w:val="99"/>
     <w:semiHidden/>
     <w:rsid w:val="00C446B8"/>
@@ -8595,7 +8915,7 @@
   </w:style>
   <w:style w:type="table" w:customStyle="1" w:styleId="UNIR">
     <w:name w:val="UNIR"/>
-    <w:basedOn w:val="TableNormal"/>
+    <w:basedOn w:val="Tablanormal"/>
     <w:uiPriority w:val="99"/>
     <w:rsid w:val="007E4840"/>
     <w:pPr>
@@ -8617,10 +8937,10 @@
       </w:tblBorders>
     </w:tblPr>
   </w:style>
-  <w:style w:type="paragraph" w:styleId="CommentText">
+  <w:style w:type="paragraph" w:styleId="Textocomentario">
     <w:name w:val="annotation text"/>
     <w:basedOn w:val="Normal"/>
-    <w:link w:val="CommentTextChar"/>
+    <w:link w:val="TextocomentarioCar"/>
     <w:uiPriority w:val="99"/>
     <w:semiHidden/>
     <w:unhideWhenUsed/>
@@ -8633,10 +8953,10 @@
       <w:szCs w:val="20"/>
     </w:rPr>
   </w:style>
-  <w:style w:type="character" w:customStyle="1" w:styleId="CommentTextChar">
-    <w:name w:val="Comment Text Char"/>
-    <w:basedOn w:val="DefaultParagraphFont"/>
-    <w:link w:val="CommentText"/>
+  <w:style w:type="character" w:customStyle="1" w:styleId="TextocomentarioCar">
+    <w:name w:val="Texto comentario Car"/>
+    <w:basedOn w:val="Fuentedeprrafopredeter"/>
+    <w:link w:val="Textocomentario"/>
     <w:uiPriority w:val="99"/>
     <w:semiHidden/>
     <w:rsid w:val="009400C5"/>
@@ -8650,7 +8970,7 @@
   </w:style>
   <w:style w:type="table" w:customStyle="1" w:styleId="TablaUNIR30">
     <w:name w:val="Tabla UNIR 3"/>
-    <w:basedOn w:val="TableNormal"/>
+    <w:basedOn w:val="Tablanormal"/>
     <w:uiPriority w:val="99"/>
     <w:rsid w:val="00472B27"/>
     <w:pPr>
@@ -8714,9 +9034,9 @@
       <w:szCs w:val="22"/>
     </w:rPr>
   </w:style>
-  <w:style w:type="character" w:styleId="UnresolvedMention">
+  <w:style w:type="character" w:styleId="Mencinsinresolver">
     <w:name w:val="Unresolved Mention"/>
-    <w:basedOn w:val="DefaultParagraphFont"/>
+    <w:basedOn w:val="Fuentedeprrafopredeter"/>
     <w:uiPriority w:val="99"/>
     <w:semiHidden/>
     <w:unhideWhenUsed/>
@@ -8728,7 +9048,7 @@
   </w:style>
   <w:style w:type="table" w:customStyle="1" w:styleId="Tabladecuadrcula5oscura-nfasis5111">
     <w:name w:val="Tabla de cuadrícula 5 oscura - Énfasis 5111"/>
-    <w:basedOn w:val="TableNormal"/>
+    <w:basedOn w:val="Tablanormal"/>
     <w:uiPriority w:val="50"/>
     <w:rsid w:val="008A2D1A"/>
     <w:pPr>
@@ -8829,7 +9149,7 @@
   </w:style>
   <w:style w:type="table" w:customStyle="1" w:styleId="Tabladecuadrcula5oscura-nfasis51">
     <w:name w:val="Tabla de cuadrícula 5 oscura - Énfasis 51"/>
-    <w:basedOn w:val="TableNormal"/>
+    <w:basedOn w:val="Tablanormal"/>
     <w:uiPriority w:val="50"/>
     <w:rsid w:val="008A2D1A"/>
     <w:pPr>
@@ -8933,9 +9253,9 @@
       </w:tcPr>
     </w:tblStylePr>
   </w:style>
-  <w:style w:type="character" w:styleId="FollowedHyperlink">
+  <w:style w:type="character" w:styleId="Hipervnculovisitado">
     <w:name w:val="FollowedHyperlink"/>
-    <w:basedOn w:val="DefaultParagraphFont"/>
+    <w:basedOn w:val="Fuentedeprrafopredeter"/>
     <w:uiPriority w:val="99"/>
     <w:semiHidden/>
     <w:unhideWhenUsed/>
@@ -8945,9 +9265,9 @@
       <w:u w:val="single"/>
     </w:rPr>
   </w:style>
-  <w:style w:type="character" w:styleId="CommentReference">
+  <w:style w:type="character" w:styleId="Refdecomentario">
     <w:name w:val="annotation reference"/>
-    <w:basedOn w:val="DefaultParagraphFont"/>
+    <w:basedOn w:val="Fuentedeprrafopredeter"/>
     <w:uiPriority w:val="99"/>
     <w:semiHidden/>
     <w:unhideWhenUsed/>
@@ -8957,11 +9277,11 @@
       <w:szCs w:val="16"/>
     </w:rPr>
   </w:style>
-  <w:style w:type="paragraph" w:styleId="CommentSubject">
+  <w:style w:type="paragraph" w:styleId="Asuntodelcomentario">
     <w:name w:val="annotation subject"/>
-    <w:basedOn w:val="CommentText"/>
-    <w:next w:val="CommentText"/>
-    <w:link w:val="CommentSubjectChar"/>
+    <w:basedOn w:val="Textocomentario"/>
+    <w:next w:val="Textocomentario"/>
+    <w:link w:val="AsuntodelcomentarioCar"/>
     <w:uiPriority w:val="99"/>
     <w:semiHidden/>
     <w:unhideWhenUsed/>
@@ -8971,10 +9291,10 @@
       <w:bCs/>
     </w:rPr>
   </w:style>
-  <w:style w:type="character" w:customStyle="1" w:styleId="CommentSubjectChar">
-    <w:name w:val="Comment Subject Char"/>
-    <w:basedOn w:val="CommentTextChar"/>
-    <w:link w:val="CommentSubject"/>
+  <w:style w:type="character" w:customStyle="1" w:styleId="AsuntodelcomentarioCar">
+    <w:name w:val="Asunto del comentario Car"/>
+    <w:basedOn w:val="TextocomentarioCar"/>
+    <w:link w:val="Asuntodelcomentario"/>
     <w:uiPriority w:val="99"/>
     <w:semiHidden/>
     <w:rsid w:val="00E916AC"/>
@@ -8990,8 +9310,8 @@
   </w:style>
   <w:style w:type="table" w:customStyle="1" w:styleId="Tablaconcuadrcula1">
     <w:name w:val="Tabla con cuadrícula1"/>
-    <w:basedOn w:val="TableNormal"/>
-    <w:next w:val="TableGrid"/>
+    <w:basedOn w:val="Tablanormal"/>
+    <w:next w:val="Tablaconcuadrcula"/>
     <w:rsid w:val="00232F75"/>
     <w:pPr>
       <w:spacing w:after="0" w:line="240" w:lineRule="auto"/>
@@ -9287,6 +9607,19 @@
 </file>
 
 <file path=customXml/item1.xml><?xml version="1.0" encoding="utf-8"?>
+<b:Sources xmlns:b="http://schemas.openxmlformats.org/officeDocument/2006/bibliography" xmlns="http://schemas.openxmlformats.org/officeDocument/2006/bibliography" SelectedStyle="\APASixthEditionOfficeOnline.xsl" StyleName="APA" Version="6"/>
+</file>
+
+<file path=customXml/item2.xml><?xml version="1.0" encoding="utf-8"?>
+<?mso-contentType ?>
+<FormTemplates xmlns="http://schemas.microsoft.com/sharepoint/v3/contenttype/forms">
+  <Display>DocumentLibraryForm</Display>
+  <Edit>DocumentLibraryForm</Edit>
+  <New>DocumentLibraryForm</New>
+</FormTemplates>
+</file>
+
+<file path=customXml/item3.xml><?xml version="1.0" encoding="utf-8"?>
 <ct:contentTypeSchema xmlns:ct="http://schemas.microsoft.com/office/2006/metadata/contentType" xmlns:ma="http://schemas.microsoft.com/office/2006/metadata/properties/metaAttributes" ct:_="" ma:_="" ma:contentTypeName="Documento" ma:contentTypeID="0x010100DF3D7C797EA12745A270EF30E38719B9" ma:contentTypeVersion="19" ma:contentTypeDescription="Crear nuevo documento." ma:contentTypeScope="" ma:versionID="9b3f85d10149739ebc40127471298f58">
   <xsd:schema xmlns:xsd="http://www.w3.org/2001/XMLSchema" xmlns:xs="http://www.w3.org/2001/XMLSchema" xmlns:p="http://schemas.microsoft.com/office/2006/metadata/properties" xmlns:ns2="0a70e875-3d35-4be2-921f-7117c31bab9b" xmlns:ns3="27c1adeb-3674-457c-b08c-8a73f31b6e23" targetNamespace="http://schemas.microsoft.com/office/2006/metadata/properties" ma:root="true" ma:fieldsID="0559bebde66b072b3ad70ef2676e7a86" ns2:_="" ns3:_="">
     <xsd:import namespace="0a70e875-3d35-4be2-921f-7117c31bab9b"/>
@@ -9547,19 +9880,6 @@
 </ct:contentTypeSchema>
 </file>
 
-<file path=customXml/item2.xml><?xml version="1.0" encoding="utf-8"?>
-<?mso-contentType ?>
-<FormTemplates xmlns="http://schemas.microsoft.com/sharepoint/v3/contenttype/forms">
-  <Display>DocumentLibraryForm</Display>
-  <Edit>DocumentLibraryForm</Edit>
-  <New>DocumentLibraryForm</New>
-</FormTemplates>
-</file>
-
-<file path=customXml/item3.xml><?xml version="1.0" encoding="utf-8"?>
-<b:Sources xmlns:b="http://schemas.openxmlformats.org/officeDocument/2006/bibliography" xmlns="http://schemas.openxmlformats.org/officeDocument/2006/bibliography" SelectedStyle="\APASixthEditionOfficeOnline.xsl" StyleName="APA" Version="6"/>
-</file>
-
 <file path=customXml/item4.xml><?xml version="1.0" encoding="utf-8"?>
 <p:properties xmlns:p="http://schemas.microsoft.com/office/2006/metadata/properties" xmlns:xsi="http://www.w3.org/2001/XMLSchema-instance" xmlns:pc="http://schemas.microsoft.com/office/infopath/2007/PartnerControls">
   <documentManagement>
@@ -9573,6 +9893,22 @@
 </file>
 
 <file path=customXml/itemProps1.xml><?xml version="1.0" encoding="utf-8"?>
+<ds:datastoreItem xmlns:ds="http://schemas.openxmlformats.org/officeDocument/2006/customXml" ds:itemID="{68EF0881-AFE3-44EB-8834-1E31251C8A76}">
+  <ds:schemaRefs>
+    <ds:schemaRef ds:uri="http://schemas.openxmlformats.org/officeDocument/2006/bibliography"/>
+  </ds:schemaRefs>
+</ds:datastoreItem>
+</file>
+
+<file path=customXml/itemProps2.xml><?xml version="1.0" encoding="utf-8"?>
+<ds:datastoreItem xmlns:ds="http://schemas.openxmlformats.org/officeDocument/2006/customXml" ds:itemID="{DADA22EA-30AF-48ED-8DC0-06AFFED52517}">
+  <ds:schemaRefs>
+    <ds:schemaRef ds:uri="http://schemas.microsoft.com/sharepoint/v3/contenttype/forms"/>
+  </ds:schemaRefs>
+</ds:datastoreItem>
+</file>
+
+<file path=customXml/itemProps3.xml><?xml version="1.0" encoding="utf-8"?>
 <ds:datastoreItem xmlns:ds="http://schemas.openxmlformats.org/officeDocument/2006/customXml" ds:itemID="{77FFC1A5-44DD-4B3F-AE9D-FA35F4DCEA49}">
   <ds:schemaRefs>
     <ds:schemaRef ds:uri="http://schemas.microsoft.com/office/2006/metadata/contentType"/>
@@ -9591,22 +9927,6 @@
 </ds:datastoreItem>
 </file>
 
-<file path=customXml/itemProps2.xml><?xml version="1.0" encoding="utf-8"?>
-<ds:datastoreItem xmlns:ds="http://schemas.openxmlformats.org/officeDocument/2006/customXml" ds:itemID="{DADA22EA-30AF-48ED-8DC0-06AFFED52517}">
-  <ds:schemaRefs>
-    <ds:schemaRef ds:uri="http://schemas.microsoft.com/sharepoint/v3/contenttype/forms"/>
-  </ds:schemaRefs>
-</ds:datastoreItem>
-</file>
-
-<file path=customXml/itemProps3.xml><?xml version="1.0" encoding="utf-8"?>
-<ds:datastoreItem xmlns:ds="http://schemas.openxmlformats.org/officeDocument/2006/customXml" ds:itemID="{68EF0881-AFE3-44EB-8834-1E31251C8A76}">
-  <ds:schemaRefs>
-    <ds:schemaRef ds:uri="http://schemas.openxmlformats.org/officeDocument/2006/bibliography"/>
-  </ds:schemaRefs>
-</ds:datastoreItem>
-</file>
-
 <file path=customXml/itemProps4.xml><?xml version="1.0" encoding="utf-8"?>
 <ds:datastoreItem xmlns:ds="http://schemas.openxmlformats.org/officeDocument/2006/customXml" ds:itemID="{5DA6F32C-6FAE-4705-8722-B42C5F1E24E2}">
   <ds:schemaRefs>

</xml_diff>

<commit_message>
Solucionado conflicto usando la versión remota
</commit_message>
<xml_diff>
--- a/mudevops07_act1_GRUPAL - Evidencias.docx
+++ b/mudevops07_act1_GRUPAL - Evidencias.docx
@@ -1,6 +1,6 @@
 
 <file path=word/document.xml><?xml version="1.0" encoding="utf-8"?>
-<w:document xmlns:wpc="http://schemas.microsoft.com/office/word/2010/wordprocessingCanvas" xmlns:cx="http://schemas.microsoft.com/office/drawing/2014/chartex" xmlns:cx1="http://schemas.microsoft.com/office/drawing/2015/9/8/chartex" xmlns:cx2="http://schemas.microsoft.com/office/drawing/2015/10/21/chartex" xmlns:cx3="http://schemas.microsoft.com/office/drawing/2016/5/9/chartex" xmlns:cx4="http://schemas.microsoft.com/office/drawing/2016/5/10/chartex" xmlns:cx5="http://schemas.microsoft.com/office/drawing/2016/5/11/chartex" xmlns:cx6="http://schemas.microsoft.com/office/drawing/2016/5/12/chartex" xmlns:cx7="http://schemas.microsoft.com/office/drawing/2016/5/13/chartex" xmlns:cx8="http://schemas.microsoft.com/office/drawing/2016/5/14/chartex" xmlns:mc="http://schemas.openxmlformats.org/markup-compatibility/2006" xmlns:aink="http://schemas.microsoft.com/office/drawing/2016/ink" xmlns:am3d="http://schemas.microsoft.com/office/drawing/2017/model3d" xmlns:o="urn:schemas-microsoft-com:office:office" xmlns:oel="http://schemas.microsoft.com/office/2019/extlst" xmlns:r="http://schemas.openxmlformats.org/officeDocument/2006/relationships" xmlns:m="http://schemas.openxmlformats.org/officeDocument/2006/math" xmlns:v="urn:schemas-microsoft-com:vml" xmlns:wp14="http://schemas.microsoft.com/office/word/2010/wordprocessingDrawing" xmlns:wp="http://schemas.openxmlformats.org/drawingml/2006/wordprocessingDrawing" xmlns:w10="urn:schemas-microsoft-com:office:word" xmlns:w="http://schemas.openxmlformats.org/wordprocessingml/2006/main" xmlns:w14="http://schemas.microsoft.com/office/word/2010/wordml" xmlns:w15="http://schemas.microsoft.com/office/word/2012/wordml" xmlns:w16cex="http://schemas.microsoft.com/office/word/2018/wordml/cex" xmlns:w16cid="http://schemas.microsoft.com/office/word/2016/wordml/cid" xmlns:w16="http://schemas.microsoft.com/office/word/2018/wordml" xmlns:w16du="http://schemas.microsoft.com/office/word/2023/wordml/word16du" xmlns:w16sdtdh="http://schemas.microsoft.com/office/word/2020/wordml/sdtdatahash" xmlns:w16sdtfl="http://schemas.microsoft.com/office/word/2024/wordml/sdtformatlock" xmlns:w16se="http://schemas.microsoft.com/office/word/2015/wordml/symex" xmlns:wpg="http://schemas.microsoft.com/office/word/2010/wordprocessingGroup" xmlns:wpi="http://schemas.microsoft.com/office/word/2010/wordprocessingInk" xmlns:wne="http://schemas.microsoft.com/office/word/2006/wordml" xmlns:wps="http://schemas.microsoft.com/office/word/2010/wordprocessingShape" mc:Ignorable="w14 w15 w16se w16cid w16 w16cex w16sdtdh w16sdtfl w16du wp14">
+<w:document xmlns:wpc="http://schemas.microsoft.com/office/word/2010/wordprocessingCanvas" xmlns:cx="http://schemas.microsoft.com/office/drawing/2014/chartex" xmlns:cx1="http://schemas.microsoft.com/office/drawing/2015/9/8/chartex" xmlns:cx2="http://schemas.microsoft.com/office/drawing/2015/10/21/chartex" xmlns:cx3="http://schemas.microsoft.com/office/drawing/2016/5/9/chartex" xmlns:cx4="http://schemas.microsoft.com/office/drawing/2016/5/10/chartex" xmlns:cx5="http://schemas.microsoft.com/office/drawing/2016/5/11/chartex" xmlns:cx6="http://schemas.microsoft.com/office/drawing/2016/5/12/chartex" xmlns:cx7="http://schemas.microsoft.com/office/drawing/2016/5/13/chartex" xmlns:cx8="http://schemas.microsoft.com/office/drawing/2016/5/14/chartex" xmlns:mc="http://schemas.openxmlformats.org/markup-compatibility/2006" xmlns:aink="http://schemas.microsoft.com/office/drawing/2016/ink" xmlns:am3d="http://schemas.microsoft.com/office/drawing/2017/model3d" xmlns:o="urn:schemas-microsoft-com:office:office" xmlns:oel="http://schemas.microsoft.com/office/2019/extlst" xmlns:r="http://schemas.openxmlformats.org/officeDocument/2006/relationships" xmlns:m="http://schemas.openxmlformats.org/officeDocument/2006/math" xmlns:v="urn:schemas-microsoft-com:vml" xmlns:wp14="http://schemas.microsoft.com/office/word/2010/wordprocessingDrawing" xmlns:wp="http://schemas.openxmlformats.org/drawingml/2006/wordprocessingDrawing" xmlns:w10="urn:schemas-microsoft-com:office:word" xmlns:w="http://schemas.openxmlformats.org/wordprocessingml/2006/main" xmlns:w14="http://schemas.microsoft.com/office/word/2010/wordml" xmlns:w15="http://schemas.microsoft.com/office/word/2012/wordml" xmlns:w16cex="http://schemas.microsoft.com/office/word/2018/wordml/cex" xmlns:w16cid="http://schemas.microsoft.com/office/word/2016/wordml/cid" xmlns:w16="http://schemas.microsoft.com/office/word/2018/wordml" xmlns:w16du="http://schemas.microsoft.com/office/word/2023/wordml/word16du" xmlns:w16sdtdh="http://schemas.microsoft.com/office/word/2020/wordml/sdtdatahash" xmlns:w16se="http://schemas.microsoft.com/office/word/2015/wordml/symex" xmlns:wpg="http://schemas.microsoft.com/office/word/2010/wordprocessingGroup" xmlns:wpi="http://schemas.microsoft.com/office/word/2010/wordprocessingInk" xmlns:wne="http://schemas.microsoft.com/office/word/2006/wordml" xmlns:wps="http://schemas.microsoft.com/office/word/2010/wordprocessingShape" mc:Ignorable="w14 w15 w16se w16cid w16 w16cex w16sdtdh wp14">
   <w:body>
     <w:p>
       <w:pPr>
@@ -174,7 +174,7 @@
       <w:hyperlink r:id="rId11" w:history="1">
         <w:r>
           <w:rPr>
-            <w:rStyle w:val="Hipervnculo"/>
+            <w:rStyle w:val="Hyperlink"/>
             <w:sz w:val="24"/>
           </w:rPr>
           <w:t>GitHub</w:t>
@@ -268,7 +268,7 @@
     <w:p/>
     <w:p>
       <w:pPr>
-        <w:pStyle w:val="Prrafodelista"/>
+        <w:pStyle w:val="ListParagraph"/>
         <w:numPr>
           <w:ilvl w:val="0"/>
           <w:numId w:val="29"/>
@@ -335,7 +335,7 @@
     </w:p>
     <w:p>
       <w:pPr>
-        <w:pStyle w:val="Prrafodelista"/>
+        <w:pStyle w:val="ListParagraph"/>
         <w:numPr>
           <w:ilvl w:val="0"/>
           <w:numId w:val="29"/>
@@ -361,7 +361,7 @@
     </w:p>
     <w:p>
       <w:pPr>
-        <w:pStyle w:val="Prrafodelista"/>
+        <w:pStyle w:val="ListParagraph"/>
         <w:numPr>
           <w:ilvl w:val="0"/>
           <w:numId w:val="29"/>
@@ -382,7 +382,7 @@
       <w:hyperlink r:id="rId12" w:history="1">
         <w:r>
           <w:rPr>
-            <w:rStyle w:val="Hipervnculo"/>
+            <w:rStyle w:val="Hyperlink"/>
             <w:sz w:val="24"/>
           </w:rPr>
           <w:t>Github</w:t>
@@ -409,7 +409,7 @@
     </w:p>
     <w:p>
       <w:pPr>
-        <w:pStyle w:val="Prrafodelista"/>
+        <w:pStyle w:val="ListParagraph"/>
         <w:numPr>
           <w:ilvl w:val="0"/>
           <w:numId w:val="29"/>
@@ -474,7 +474,7 @@
     </w:p>
     <w:p>
       <w:pPr>
-        <w:pStyle w:val="Prrafodelista"/>
+        <w:pStyle w:val="ListParagraph"/>
         <w:numPr>
           <w:ilvl w:val="0"/>
           <w:numId w:val="29"/>
@@ -560,7 +560,7 @@
     <w:p/>
     <w:p>
       <w:pPr>
-        <w:pStyle w:val="Prrafodelista"/>
+        <w:pStyle w:val="ListParagraph"/>
         <w:numPr>
           <w:ilvl w:val="0"/>
           <w:numId w:val="30"/>
@@ -582,7 +582,7 @@
     </w:p>
     <w:p>
       <w:pPr>
-        <w:pStyle w:val="Prrafodelista"/>
+        <w:pStyle w:val="ListParagraph"/>
         <w:numPr>
           <w:ilvl w:val="0"/>
           <w:numId w:val="30"/>
@@ -654,7 +654,7 @@
     </w:p>
     <w:p>
       <w:pPr>
-        <w:pStyle w:val="Prrafodelista"/>
+        <w:pStyle w:val="ListParagraph"/>
         <w:numPr>
           <w:ilvl w:val="0"/>
           <w:numId w:val="30"/>
@@ -720,7 +720,7 @@
     <w:p/>
     <w:p>
       <w:pPr>
-        <w:pStyle w:val="Prrafodelista"/>
+        <w:pStyle w:val="ListParagraph"/>
         <w:numPr>
           <w:ilvl w:val="0"/>
           <w:numId w:val="31"/>
@@ -749,7 +749,7 @@
     </w:p>
     <w:p>
       <w:pPr>
-        <w:pStyle w:val="Prrafodelista"/>
+        <w:pStyle w:val="ListParagraph"/>
         <w:numPr>
           <w:ilvl w:val="0"/>
           <w:numId w:val="31"/>
@@ -767,7 +767,7 @@
     </w:p>
     <w:p>
       <w:pPr>
-        <w:pStyle w:val="Prrafodelista"/>
+        <w:pStyle w:val="ListParagraph"/>
         <w:numPr>
           <w:ilvl w:val="0"/>
           <w:numId w:val="31"/>
@@ -785,7 +785,7 @@
     </w:p>
     <w:p>
       <w:pPr>
-        <w:pStyle w:val="Prrafodelista"/>
+        <w:pStyle w:val="ListParagraph"/>
         <w:numPr>
           <w:ilvl w:val="0"/>
           <w:numId w:val="31"/>
@@ -814,7 +814,7 @@
     </w:p>
     <w:p>
       <w:pPr>
-        <w:pStyle w:val="Prrafodelista"/>
+        <w:pStyle w:val="ListParagraph"/>
         <w:numPr>
           <w:ilvl w:val="0"/>
           <w:numId w:val="31"/>
@@ -840,7 +840,7 @@
     </w:p>
     <w:p>
       <w:pPr>
-        <w:pStyle w:val="Prrafodelista"/>
+        <w:pStyle w:val="ListParagraph"/>
         <w:numPr>
           <w:ilvl w:val="0"/>
           <w:numId w:val="31"/>
@@ -1325,7 +1325,7 @@
       <w:hyperlink r:id="rId13" w:history="1">
         <w:r>
           <w:rPr>
-            <w:rStyle w:val="Hipervnculo"/>
+            <w:rStyle w:val="Hyperlink"/>
             <w:sz w:val="24"/>
           </w:rPr>
           <w:t>Tutoriales de trabajo en grupo.</w:t>
@@ -2736,7 +2736,7 @@
       <w:hyperlink r:id="rId18" w:history="1">
         <w:r>
           <w:rPr>
-            <w:rStyle w:val="Hipervnculo"/>
+            <w:rStyle w:val="Hyperlink"/>
             <w:sz w:val="24"/>
           </w:rPr>
           <w:t>https://github.com/MayraABC/CiCd-Act01</w:t>
@@ -2754,7 +2754,7 @@
           <w:numId w:val="39"/>
         </w:numPr>
         <w:rPr>
-          <w:rStyle w:val="Hipervnculo"/>
+          <w:rStyle w:val="Hyperlink"/>
           <w:color w:val="333333"/>
           <w:sz w:val="24"/>
           <w:u w:val="none"/>
@@ -2763,7 +2763,7 @@
       <w:hyperlink r:id="rId19" w:history="1">
         <w:r>
           <w:rPr>
-            <w:rStyle w:val="Hipervnculo"/>
+            <w:rStyle w:val="Hyperlink"/>
             <w:sz w:val="24"/>
           </w:rPr>
           <w:t>https://github.com/MayraABC/CiCd-Act01.git</w:t>
@@ -2779,7 +2779,7 @@
         </w:numPr>
         <w:ind w:left="284" w:hanging="284"/>
         <w:rPr>
-          <w:rStyle w:val="Hipervnculo"/>
+          <w:rStyle w:val="Hyperlink"/>
           <w:color w:val="auto"/>
           <w:sz w:val="24"/>
           <w:u w:val="none"/>
@@ -2795,7 +2795,7 @@
         </w:numPr>
         <w:ind w:left="284" w:hanging="284"/>
         <w:rPr>
-          <w:rStyle w:val="Hipervnculo"/>
+          <w:rStyle w:val="Hyperlink"/>
           <w:color w:val="auto"/>
           <w:sz w:val="24"/>
           <w:u w:val="none"/>
@@ -2811,7 +2811,7 @@
         </w:numPr>
         <w:ind w:left="284" w:hanging="284"/>
         <w:rPr>
-          <w:rStyle w:val="Hipervnculo"/>
+          <w:rStyle w:val="Hyperlink"/>
           <w:color w:val="auto"/>
           <w:sz w:val="24"/>
           <w:u w:val="none"/>
@@ -2827,7 +2827,7 @@
         </w:numPr>
         <w:ind w:left="284" w:hanging="284"/>
         <w:rPr>
-          <w:rStyle w:val="Hipervnculo"/>
+          <w:rStyle w:val="Hyperlink"/>
           <w:color w:val="auto"/>
           <w:sz w:val="24"/>
           <w:u w:val="none"/>
@@ -2843,7 +2843,7 @@
         </w:numPr>
         <w:ind w:left="284" w:hanging="284"/>
         <w:rPr>
-          <w:rStyle w:val="Hipervnculo"/>
+          <w:rStyle w:val="Hyperlink"/>
           <w:b/>
           <w:bCs/>
           <w:color w:val="auto"/>
@@ -2853,7 +2853,7 @@
       </w:pPr>
       <w:r>
         <w:rPr>
-          <w:rStyle w:val="Hipervnculo"/>
+          <w:rStyle w:val="Hyperlink"/>
           <w:b/>
           <w:bCs/>
           <w:color w:val="auto"/>
@@ -2881,7 +2881,7 @@
           <w:noProof/>
         </w:rPr>
         <w:drawing>
-          <wp:anchor distT="0" distB="0" distL="114300" distR="114300" simplePos="0" relativeHeight="251658240" behindDoc="0" locked="0" layoutInCell="1" allowOverlap="1" wp14:anchorId="67A1646B" wp14:editId="3BC34A81">
+          <wp:anchor distT="0" distB="0" distL="114300" distR="114300" simplePos="0" relativeHeight="251658240" behindDoc="0" locked="0" layoutInCell="1" allowOverlap="1" wp14:anchorId="67A1646B" wp14:editId="39AABAF4">
             <wp:simplePos x="0" y="0"/>
             <wp:positionH relativeFrom="column">
               <wp:posOffset>3175</wp:posOffset>
@@ -3330,334 +3330,15 @@
     <w:p/>
     <w:p>
       <w:pPr>
-        <w:rPr>
-          <w:b/>
-          <w:bCs/>
-        </w:rPr>
-      </w:pPr>
-      <w:r>
-        <w:rPr>
-          <w:b/>
-          <w:bCs/>
-        </w:rPr>
-        <w:t>Cambio en el archivo Makefile</w:t>
+        <w:pStyle w:val="TtuloApartado3"/>
+      </w:pPr>
+      <w:r>
+        <w:t>Rúbrica</w:t>
       </w:r>
     </w:p>
     <w:p>
-      <w:r>
-        <w:t>Se procede a realizar un fork del repositorio</w:t>
-      </w:r>
-    </w:p>
-    <w:p>
-      <w:r>
-        <w:drawing>
-          <wp:inline distT="0" distB="0" distL="0" distR="0" wp14:anchorId="3A30CA8F" wp14:editId="6C592A6A">
-            <wp:extent cx="5219700" cy="2930525"/>
-            <wp:effectExtent l="0" t="0" r="0" b="3175"/>
-            <wp:docPr id="1726507763" name="Imagen 1"/>
-            <wp:cNvGraphicFramePr>
-              <a:graphicFrameLocks xmlns:a="http://schemas.openxmlformats.org/drawingml/2006/main" noChangeAspect="1"/>
-            </wp:cNvGraphicFramePr>
-            <a:graphic xmlns:a="http://schemas.openxmlformats.org/drawingml/2006/main">
-              <a:graphicData uri="http://schemas.openxmlformats.org/drawingml/2006/picture">
-                <pic:pic xmlns:pic="http://schemas.openxmlformats.org/drawingml/2006/picture">
-                  <pic:nvPicPr>
-                    <pic:cNvPr id="1726507763" name=""/>
-                    <pic:cNvPicPr/>
-                  </pic:nvPicPr>
-                  <pic:blipFill>
-                    <a:blip r:embed="rId23"/>
-                    <a:stretch>
-                      <a:fillRect/>
-                    </a:stretch>
-                  </pic:blipFill>
-                  <pic:spPr>
-                    <a:xfrm>
-                      <a:off x="0" y="0"/>
-                      <a:ext cx="5219700" cy="2930525"/>
-                    </a:xfrm>
-                    <a:prstGeom prst="rect">
-                      <a:avLst/>
-                    </a:prstGeom>
-                  </pic:spPr>
-                </pic:pic>
-              </a:graphicData>
-            </a:graphic>
-          </wp:inline>
-        </w:drawing>
-      </w:r>
-    </w:p>
-    <w:p/>
-    <w:p>
-      <w:r>
-        <w:t>Se realiza el clonado del repositorio a una carpeta local</w:t>
-      </w:r>
-    </w:p>
-    <w:p>
-      <w:r>
-        <w:drawing>
-          <wp:inline distT="0" distB="0" distL="0" distR="0" wp14:anchorId="11CA6AAA" wp14:editId="58744E54">
-            <wp:extent cx="5219700" cy="852170"/>
-            <wp:effectExtent l="0" t="0" r="0" b="5080"/>
-            <wp:docPr id="1957572857" name="Imagen 1"/>
-            <wp:cNvGraphicFramePr>
-              <a:graphicFrameLocks xmlns:a="http://schemas.openxmlformats.org/drawingml/2006/main" noChangeAspect="1"/>
-            </wp:cNvGraphicFramePr>
-            <a:graphic xmlns:a="http://schemas.openxmlformats.org/drawingml/2006/main">
-              <a:graphicData uri="http://schemas.openxmlformats.org/drawingml/2006/picture">
-                <pic:pic xmlns:pic="http://schemas.openxmlformats.org/drawingml/2006/picture">
-                  <pic:nvPicPr>
-                    <pic:cNvPr id="1957572857" name=""/>
-                    <pic:cNvPicPr/>
-                  </pic:nvPicPr>
-                  <pic:blipFill>
-                    <a:blip r:embed="rId24"/>
-                    <a:stretch>
-                      <a:fillRect/>
-                    </a:stretch>
-                  </pic:blipFill>
-                  <pic:spPr>
-                    <a:xfrm>
-                      <a:off x="0" y="0"/>
-                      <a:ext cx="5219700" cy="852170"/>
-                    </a:xfrm>
-                    <a:prstGeom prst="rect">
-                      <a:avLst/>
-                    </a:prstGeom>
-                  </pic:spPr>
-                </pic:pic>
-              </a:graphicData>
-            </a:graphic>
-          </wp:inline>
-        </w:drawing>
-      </w:r>
-    </w:p>
-    <w:p/>
-    <w:p>
-      <w:pPr>
-        <w:rPr>
-          <w:lang w:val="es-MX"/>
-        </w:rPr>
-      </w:pPr>
-      <w:r>
-        <w:rPr>
-          <w:lang w:val="es-MX"/>
-        </w:rPr>
-        <w:t>S</w:t>
-      </w:r>
-      <w:r>
-        <w:rPr>
-          <w:lang w:val="es-MX"/>
-        </w:rPr>
-        <w:t>e procede a crear una nueva rama llamada “miguel-branch”</w:t>
-      </w:r>
-    </w:p>
-    <w:p>
-      <w:pPr>
-        <w:rPr>
-          <w:lang w:val="es-MX"/>
-        </w:rPr>
-      </w:pPr>
-      <w:r>
-        <w:rPr>
-          <w:lang w:val="es-MX"/>
-        </w:rPr>
-        <w:lastRenderedPageBreak/>
-        <w:drawing>
-          <wp:inline distT="0" distB="0" distL="0" distR="0" wp14:anchorId="7F0E2135" wp14:editId="1C0E072F">
-            <wp:extent cx="5219700" cy="985752"/>
-            <wp:effectExtent l="0" t="0" r="0" b="5080"/>
-            <wp:docPr id="138827818" name="Imagen 1"/>
-            <wp:cNvGraphicFramePr>
-              <a:graphicFrameLocks xmlns:a="http://schemas.openxmlformats.org/drawingml/2006/main" noChangeAspect="1"/>
-            </wp:cNvGraphicFramePr>
-            <a:graphic xmlns:a="http://schemas.openxmlformats.org/drawingml/2006/main">
-              <a:graphicData uri="http://schemas.openxmlformats.org/drawingml/2006/picture">
-                <pic:pic xmlns:pic="http://schemas.openxmlformats.org/drawingml/2006/picture">
-                  <pic:nvPicPr>
-                    <pic:cNvPr id="138827818" name=""/>
-                    <pic:cNvPicPr/>
-                  </pic:nvPicPr>
-                  <pic:blipFill>
-                    <a:blip r:embed="rId25"/>
-                    <a:stretch>
-                      <a:fillRect/>
-                    </a:stretch>
-                  </pic:blipFill>
-                  <pic:spPr>
-                    <a:xfrm>
-                      <a:off x="0" y="0"/>
-                      <a:ext cx="5219700" cy="985752"/>
-                    </a:xfrm>
-                    <a:prstGeom prst="rect">
-                      <a:avLst/>
-                    </a:prstGeom>
-                  </pic:spPr>
-                </pic:pic>
-              </a:graphicData>
-            </a:graphic>
-          </wp:inline>
-        </w:drawing>
-      </w:r>
-    </w:p>
-    <w:p>
-      <w:pPr>
-        <w:rPr>
-          <w:lang w:val="es-MX"/>
-        </w:rPr>
-      </w:pPr>
-    </w:p>
-    <w:p>
-      <w:pPr>
-        <w:rPr>
-          <w:lang w:val="es-MX"/>
-        </w:rPr>
-      </w:pPr>
-      <w:r>
-        <w:rPr>
-          <w:lang w:val="es-MX"/>
-        </w:rPr>
-        <w:t>Se realiza un cambio en el archivo Makefile, se quita el código que tenía por defecto. Se crea variables globales para tener el nombre del archivo y el valor de dup para la validación, y se invoca el python3 para la ejecución local del proyecto.</w:t>
-      </w:r>
-    </w:p>
-    <w:p>
-      <w:pPr>
-        <w:rPr>
-          <w:lang w:val="es-MX"/>
-        </w:rPr>
-      </w:pPr>
-      <w:r>
-        <w:rPr>
-          <w:lang w:val="es-MX"/>
-        </w:rPr>
-        <w:drawing>
-          <wp:inline distT="0" distB="0" distL="0" distR="0" wp14:anchorId="26F3634C" wp14:editId="62351DE5">
-            <wp:extent cx="5400040" cy="2064385"/>
-            <wp:effectExtent l="0" t="0" r="0" b="0"/>
-            <wp:docPr id="281845360" name="Imagen 1"/>
-            <wp:cNvGraphicFramePr>
-              <a:graphicFrameLocks xmlns:a="http://schemas.openxmlformats.org/drawingml/2006/main" noChangeAspect="1"/>
-            </wp:cNvGraphicFramePr>
-            <a:graphic xmlns:a="http://schemas.openxmlformats.org/drawingml/2006/main">
-              <a:graphicData uri="http://schemas.openxmlformats.org/drawingml/2006/picture">
-                <pic:pic xmlns:pic="http://schemas.openxmlformats.org/drawingml/2006/picture">
-                  <pic:nvPicPr>
-                    <pic:cNvPr id="281845360" name=""/>
-                    <pic:cNvPicPr/>
-                  </pic:nvPicPr>
-                  <pic:blipFill>
-                    <a:blip r:embed="rId26"/>
-                    <a:stretch>
-                      <a:fillRect/>
-                    </a:stretch>
-                  </pic:blipFill>
-                  <pic:spPr>
-                    <a:xfrm>
-                      <a:off x="0" y="0"/>
-                      <a:ext cx="5400040" cy="2064385"/>
-                    </a:xfrm>
-                    <a:prstGeom prst="rect">
-                      <a:avLst/>
-                    </a:prstGeom>
-                  </pic:spPr>
-                </pic:pic>
-              </a:graphicData>
-            </a:graphic>
-          </wp:inline>
-        </w:drawing>
-      </w:r>
-    </w:p>
-    <w:p>
-      <w:pPr>
-        <w:rPr>
-          <w:lang w:val="es-MX"/>
-        </w:rPr>
-      </w:pPr>
-    </w:p>
-    <w:p>
-      <w:pPr>
-        <w:rPr>
-          <w:lang w:val="es-MX"/>
-        </w:rPr>
-      </w:pPr>
-      <w:r>
-        <w:rPr>
-          <w:lang w:val="es-MX"/>
-        </w:rPr>
-        <w:t xml:space="preserve">Se verifica que archivos contienen cambios </w:t>
-      </w:r>
-    </w:p>
-    <w:p>
-      <w:pPr>
-        <w:rPr>
-          <w:lang w:val="es-MX"/>
-        </w:rPr>
-      </w:pPr>
-      <w:r>
-        <w:rPr>
-          <w:lang w:val="es-MX"/>
-        </w:rPr>
-        <w:drawing>
-          <wp:inline distT="0" distB="0" distL="0" distR="0" wp14:anchorId="2AC8B861" wp14:editId="71562113">
-            <wp:extent cx="5400040" cy="921385"/>
-            <wp:effectExtent l="0" t="0" r="0" b="0"/>
-            <wp:docPr id="1496249463" name="Imagen 1"/>
-            <wp:cNvGraphicFramePr>
-              <a:graphicFrameLocks xmlns:a="http://schemas.openxmlformats.org/drawingml/2006/main" noChangeAspect="1"/>
-            </wp:cNvGraphicFramePr>
-            <a:graphic xmlns:a="http://schemas.openxmlformats.org/drawingml/2006/main">
-              <a:graphicData uri="http://schemas.openxmlformats.org/drawingml/2006/picture">
-                <pic:pic xmlns:pic="http://schemas.openxmlformats.org/drawingml/2006/picture">
-                  <pic:nvPicPr>
-                    <pic:cNvPr id="1496249463" name=""/>
-                    <pic:cNvPicPr/>
-                  </pic:nvPicPr>
-                  <pic:blipFill>
-                    <a:blip r:embed="rId27"/>
-                    <a:stretch>
-                      <a:fillRect/>
-                    </a:stretch>
-                  </pic:blipFill>
-                  <pic:spPr>
-                    <a:xfrm>
-                      <a:off x="0" y="0"/>
-                      <a:ext cx="5400040" cy="921385"/>
-                    </a:xfrm>
-                    <a:prstGeom prst="rect">
-                      <a:avLst/>
-                    </a:prstGeom>
-                  </pic:spPr>
-                </pic:pic>
-              </a:graphicData>
-            </a:graphic>
-          </wp:inline>
-        </w:drawing>
-      </w:r>
-    </w:p>
-    <w:p>
-      <w:pPr>
-        <w:rPr>
-          <w:lang w:val="es-MX"/>
-        </w:rPr>
-      </w:pPr>
-    </w:p>
-    <w:p>
-      <w:r>
-        <w:t>Se procede a añadir los archivos modificados y subirlos en la rama</w:t>
-      </w:r>
-    </w:p>
-    <w:p/>
-    <w:p>
-      <w:pPr>
-        <w:pStyle w:val="TtuloApartado3"/>
-      </w:pPr>
-      <w:r>
-        <w:t>Rúbrica</w:t>
-      </w:r>
-    </w:p>
-    <w:p>
-      <w:pPr>
-        <w:pStyle w:val="Prrafodelista"/>
+      <w:pPr>
+        <w:pStyle w:val="ListParagraph"/>
         <w:ind w:left="284"/>
       </w:pPr>
     </w:p>
@@ -3924,7 +3605,6 @@
                 <w:sz w:val="20"/>
                 <w:szCs w:val="20"/>
               </w:rPr>
-              <w:lastRenderedPageBreak/>
               <w:t>Criterio 1</w:t>
             </w:r>
           </w:p>
@@ -4554,8 +4234,8 @@
       </w:pPr>
     </w:p>
     <w:sectPr>
-      <w:headerReference w:type="default" r:id="rId28"/>
-      <w:footerReference w:type="default" r:id="rId29"/>
+      <w:headerReference w:type="default" r:id="rId23"/>
+      <w:footerReference w:type="default" r:id="rId24"/>
       <w:pgSz w:w="11906" w:h="16838" w:code="9"/>
       <w:pgMar w:top="1418" w:right="1843" w:bottom="1418" w:left="1843" w:header="1134" w:footer="397" w:gutter="0"/>
       <w:cols w:space="708"/>
@@ -4566,7 +4246,7 @@
 </file>
 
 <file path=word/endnotes.xml><?xml version="1.0" encoding="utf-8"?>
-<w:endnotes xmlns:wpc="http://schemas.microsoft.com/office/word/2010/wordprocessingCanvas" xmlns:cx="http://schemas.microsoft.com/office/drawing/2014/chartex" xmlns:cx1="http://schemas.microsoft.com/office/drawing/2015/9/8/chartex" xmlns:cx2="http://schemas.microsoft.com/office/drawing/2015/10/21/chartex" xmlns:cx3="http://schemas.microsoft.com/office/drawing/2016/5/9/chartex" xmlns:cx4="http://schemas.microsoft.com/office/drawing/2016/5/10/chartex" xmlns:cx5="http://schemas.microsoft.com/office/drawing/2016/5/11/chartex" xmlns:cx6="http://schemas.microsoft.com/office/drawing/2016/5/12/chartex" xmlns:cx7="http://schemas.microsoft.com/office/drawing/2016/5/13/chartex" xmlns:cx8="http://schemas.microsoft.com/office/drawing/2016/5/14/chartex" xmlns:mc="http://schemas.openxmlformats.org/markup-compatibility/2006" xmlns:aink="http://schemas.microsoft.com/office/drawing/2016/ink" xmlns:am3d="http://schemas.microsoft.com/office/drawing/2017/model3d" xmlns:o="urn:schemas-microsoft-com:office:office" xmlns:oel="http://schemas.microsoft.com/office/2019/extlst" xmlns:r="http://schemas.openxmlformats.org/officeDocument/2006/relationships" xmlns:m="http://schemas.openxmlformats.org/officeDocument/2006/math" xmlns:v="urn:schemas-microsoft-com:vml" xmlns:wp14="http://schemas.microsoft.com/office/word/2010/wordprocessingDrawing" xmlns:wp="http://schemas.openxmlformats.org/drawingml/2006/wordprocessingDrawing" xmlns:w10="urn:schemas-microsoft-com:office:word" xmlns:w="http://schemas.openxmlformats.org/wordprocessingml/2006/main" xmlns:w14="http://schemas.microsoft.com/office/word/2010/wordml" xmlns:w15="http://schemas.microsoft.com/office/word/2012/wordml" xmlns:w16cex="http://schemas.microsoft.com/office/word/2018/wordml/cex" xmlns:w16cid="http://schemas.microsoft.com/office/word/2016/wordml/cid" xmlns:w16="http://schemas.microsoft.com/office/word/2018/wordml" xmlns:w16du="http://schemas.microsoft.com/office/word/2023/wordml/word16du" xmlns:w16sdtdh="http://schemas.microsoft.com/office/word/2020/wordml/sdtdatahash" xmlns:w16sdtfl="http://schemas.microsoft.com/office/word/2024/wordml/sdtformatlock" xmlns:w16se="http://schemas.microsoft.com/office/word/2015/wordml/symex" xmlns:wpg="http://schemas.microsoft.com/office/word/2010/wordprocessingGroup" xmlns:wpi="http://schemas.microsoft.com/office/word/2010/wordprocessingInk" xmlns:wne="http://schemas.microsoft.com/office/word/2006/wordml" xmlns:wps="http://schemas.microsoft.com/office/word/2010/wordprocessingShape" mc:Ignorable="w14 w15 w16se w16cid w16 w16cex w16sdtdh w16sdtfl w16du wp14">
+<w:endnotes xmlns:wpc="http://schemas.microsoft.com/office/word/2010/wordprocessingCanvas" xmlns:cx="http://schemas.microsoft.com/office/drawing/2014/chartex" xmlns:cx1="http://schemas.microsoft.com/office/drawing/2015/9/8/chartex" xmlns:cx2="http://schemas.microsoft.com/office/drawing/2015/10/21/chartex" xmlns:cx3="http://schemas.microsoft.com/office/drawing/2016/5/9/chartex" xmlns:cx4="http://schemas.microsoft.com/office/drawing/2016/5/10/chartex" xmlns:cx5="http://schemas.microsoft.com/office/drawing/2016/5/11/chartex" xmlns:cx6="http://schemas.microsoft.com/office/drawing/2016/5/12/chartex" xmlns:cx7="http://schemas.microsoft.com/office/drawing/2016/5/13/chartex" xmlns:cx8="http://schemas.microsoft.com/office/drawing/2016/5/14/chartex" xmlns:mc="http://schemas.openxmlformats.org/markup-compatibility/2006" xmlns:aink="http://schemas.microsoft.com/office/drawing/2016/ink" xmlns:am3d="http://schemas.microsoft.com/office/drawing/2017/model3d" xmlns:o="urn:schemas-microsoft-com:office:office" xmlns:oel="http://schemas.microsoft.com/office/2019/extlst" xmlns:r="http://schemas.openxmlformats.org/officeDocument/2006/relationships" xmlns:m="http://schemas.openxmlformats.org/officeDocument/2006/math" xmlns:v="urn:schemas-microsoft-com:vml" xmlns:wp14="http://schemas.microsoft.com/office/word/2010/wordprocessingDrawing" xmlns:wp="http://schemas.openxmlformats.org/drawingml/2006/wordprocessingDrawing" xmlns:w10="urn:schemas-microsoft-com:office:word" xmlns:w="http://schemas.openxmlformats.org/wordprocessingml/2006/main" xmlns:w14="http://schemas.microsoft.com/office/word/2010/wordml" xmlns:w15="http://schemas.microsoft.com/office/word/2012/wordml" xmlns:w16cex="http://schemas.microsoft.com/office/word/2018/wordml/cex" xmlns:w16cid="http://schemas.microsoft.com/office/word/2016/wordml/cid" xmlns:w16="http://schemas.microsoft.com/office/word/2018/wordml" xmlns:w16du="http://schemas.microsoft.com/office/word/2023/wordml/word16du" xmlns:w16sdtdh="http://schemas.microsoft.com/office/word/2020/wordml/sdtdatahash" xmlns:w16se="http://schemas.microsoft.com/office/word/2015/wordml/symex" xmlns:wpg="http://schemas.microsoft.com/office/word/2010/wordprocessingGroup" xmlns:wpi="http://schemas.microsoft.com/office/word/2010/wordprocessingInk" xmlns:wne="http://schemas.microsoft.com/office/word/2006/wordml" xmlns:wps="http://schemas.microsoft.com/office/word/2010/wordprocessingShape" mc:Ignorable="w14 w15 w16se w16cid w16 w16cex w16sdtdh wp14">
   <w:endnote w:type="separator" w:id="-1">
     <w:p>
       <w:pPr>
@@ -4591,7 +4271,7 @@
 </file>
 
 <file path=word/footer1.xml><?xml version="1.0" encoding="utf-8"?>
-<w:ftr xmlns:wpc="http://schemas.microsoft.com/office/word/2010/wordprocessingCanvas" xmlns:cx="http://schemas.microsoft.com/office/drawing/2014/chartex" xmlns:cx1="http://schemas.microsoft.com/office/drawing/2015/9/8/chartex" xmlns:cx2="http://schemas.microsoft.com/office/drawing/2015/10/21/chartex" xmlns:cx3="http://schemas.microsoft.com/office/drawing/2016/5/9/chartex" xmlns:cx4="http://schemas.microsoft.com/office/drawing/2016/5/10/chartex" xmlns:cx5="http://schemas.microsoft.com/office/drawing/2016/5/11/chartex" xmlns:cx6="http://schemas.microsoft.com/office/drawing/2016/5/12/chartex" xmlns:cx7="http://schemas.microsoft.com/office/drawing/2016/5/13/chartex" xmlns:cx8="http://schemas.microsoft.com/office/drawing/2016/5/14/chartex" xmlns:mc="http://schemas.openxmlformats.org/markup-compatibility/2006" xmlns:aink="http://schemas.microsoft.com/office/drawing/2016/ink" xmlns:am3d="http://schemas.microsoft.com/office/drawing/2017/model3d" xmlns:o="urn:schemas-microsoft-com:office:office" xmlns:oel="http://schemas.microsoft.com/office/2019/extlst" xmlns:r="http://schemas.openxmlformats.org/officeDocument/2006/relationships" xmlns:m="http://schemas.openxmlformats.org/officeDocument/2006/math" xmlns:v="urn:schemas-microsoft-com:vml" xmlns:wp14="http://schemas.microsoft.com/office/word/2010/wordprocessingDrawing" xmlns:wp="http://schemas.openxmlformats.org/drawingml/2006/wordprocessingDrawing" xmlns:w10="urn:schemas-microsoft-com:office:word" xmlns:w="http://schemas.openxmlformats.org/wordprocessingml/2006/main" xmlns:w14="http://schemas.microsoft.com/office/word/2010/wordml" xmlns:w15="http://schemas.microsoft.com/office/word/2012/wordml" xmlns:w16cex="http://schemas.microsoft.com/office/word/2018/wordml/cex" xmlns:w16cid="http://schemas.microsoft.com/office/word/2016/wordml/cid" xmlns:w16="http://schemas.microsoft.com/office/word/2018/wordml" xmlns:w16du="http://schemas.microsoft.com/office/word/2023/wordml/word16du" xmlns:w16sdtdh="http://schemas.microsoft.com/office/word/2020/wordml/sdtdatahash" xmlns:w16sdtfl="http://schemas.microsoft.com/office/word/2024/wordml/sdtformatlock" xmlns:w16se="http://schemas.microsoft.com/office/word/2015/wordml/symex" xmlns:wpg="http://schemas.microsoft.com/office/word/2010/wordprocessingGroup" xmlns:wpi="http://schemas.microsoft.com/office/word/2010/wordprocessingInk" xmlns:wne="http://schemas.microsoft.com/office/word/2006/wordml" xmlns:wps="http://schemas.microsoft.com/office/word/2010/wordprocessingShape" mc:Ignorable="w14 w15 w16se w16cid w16 w16cex w16sdtdh w16sdtfl w16du wp14">
+<w:ftr xmlns:wpc="http://schemas.microsoft.com/office/word/2010/wordprocessingCanvas" xmlns:cx="http://schemas.microsoft.com/office/drawing/2014/chartex" xmlns:cx1="http://schemas.microsoft.com/office/drawing/2015/9/8/chartex" xmlns:cx2="http://schemas.microsoft.com/office/drawing/2015/10/21/chartex" xmlns:cx3="http://schemas.microsoft.com/office/drawing/2016/5/9/chartex" xmlns:cx4="http://schemas.microsoft.com/office/drawing/2016/5/10/chartex" xmlns:cx5="http://schemas.microsoft.com/office/drawing/2016/5/11/chartex" xmlns:cx6="http://schemas.microsoft.com/office/drawing/2016/5/12/chartex" xmlns:cx7="http://schemas.microsoft.com/office/drawing/2016/5/13/chartex" xmlns:cx8="http://schemas.microsoft.com/office/drawing/2016/5/14/chartex" xmlns:mc="http://schemas.openxmlformats.org/markup-compatibility/2006" xmlns:aink="http://schemas.microsoft.com/office/drawing/2016/ink" xmlns:am3d="http://schemas.microsoft.com/office/drawing/2017/model3d" xmlns:o="urn:schemas-microsoft-com:office:office" xmlns:oel="http://schemas.microsoft.com/office/2019/extlst" xmlns:r="http://schemas.openxmlformats.org/officeDocument/2006/relationships" xmlns:m="http://schemas.openxmlformats.org/officeDocument/2006/math" xmlns:v="urn:schemas-microsoft-com:vml" xmlns:wp14="http://schemas.microsoft.com/office/word/2010/wordprocessingDrawing" xmlns:wp="http://schemas.openxmlformats.org/drawingml/2006/wordprocessingDrawing" xmlns:w10="urn:schemas-microsoft-com:office:word" xmlns:w="http://schemas.openxmlformats.org/wordprocessingml/2006/main" xmlns:w14="http://schemas.microsoft.com/office/word/2010/wordml" xmlns:w15="http://schemas.microsoft.com/office/word/2012/wordml" xmlns:w16cex="http://schemas.microsoft.com/office/word/2018/wordml/cex" xmlns:w16cid="http://schemas.microsoft.com/office/word/2016/wordml/cid" xmlns:w16="http://schemas.microsoft.com/office/word/2018/wordml" xmlns:w16du="http://schemas.microsoft.com/office/word/2023/wordml/word16du" xmlns:w16sdtdh="http://schemas.microsoft.com/office/word/2020/wordml/sdtdatahash" xmlns:w16se="http://schemas.microsoft.com/office/word/2015/wordml/symex" xmlns:wpg="http://schemas.microsoft.com/office/word/2010/wordprocessingGroup" xmlns:wpi="http://schemas.microsoft.com/office/word/2010/wordprocessingInk" xmlns:wne="http://schemas.microsoft.com/office/word/2006/wordml" xmlns:wps="http://schemas.microsoft.com/office/word/2010/wordprocessingShape" mc:Ignorable="w14 w15 w16se w16cid w16 w16cex w16sdtdh wp14">
   <w:p>
     <w:pPr>
       <w:pStyle w:val="PiedepginaAsignatura"/>
@@ -4826,7 +4506,7 @@
 </file>
 
 <file path=word/footnotes.xml><?xml version="1.0" encoding="utf-8"?>
-<w:footnotes xmlns:wpc="http://schemas.microsoft.com/office/word/2010/wordprocessingCanvas" xmlns:cx="http://schemas.microsoft.com/office/drawing/2014/chartex" xmlns:cx1="http://schemas.microsoft.com/office/drawing/2015/9/8/chartex" xmlns:cx2="http://schemas.microsoft.com/office/drawing/2015/10/21/chartex" xmlns:cx3="http://schemas.microsoft.com/office/drawing/2016/5/9/chartex" xmlns:cx4="http://schemas.microsoft.com/office/drawing/2016/5/10/chartex" xmlns:cx5="http://schemas.microsoft.com/office/drawing/2016/5/11/chartex" xmlns:cx6="http://schemas.microsoft.com/office/drawing/2016/5/12/chartex" xmlns:cx7="http://schemas.microsoft.com/office/drawing/2016/5/13/chartex" xmlns:cx8="http://schemas.microsoft.com/office/drawing/2016/5/14/chartex" xmlns:mc="http://schemas.openxmlformats.org/markup-compatibility/2006" xmlns:aink="http://schemas.microsoft.com/office/drawing/2016/ink" xmlns:am3d="http://schemas.microsoft.com/office/drawing/2017/model3d" xmlns:o="urn:schemas-microsoft-com:office:office" xmlns:oel="http://schemas.microsoft.com/office/2019/extlst" xmlns:r="http://schemas.openxmlformats.org/officeDocument/2006/relationships" xmlns:m="http://schemas.openxmlformats.org/officeDocument/2006/math" xmlns:v="urn:schemas-microsoft-com:vml" xmlns:wp14="http://schemas.microsoft.com/office/word/2010/wordprocessingDrawing" xmlns:wp="http://schemas.openxmlformats.org/drawingml/2006/wordprocessingDrawing" xmlns:w10="urn:schemas-microsoft-com:office:word" xmlns:w="http://schemas.openxmlformats.org/wordprocessingml/2006/main" xmlns:w14="http://schemas.microsoft.com/office/word/2010/wordml" xmlns:w15="http://schemas.microsoft.com/office/word/2012/wordml" xmlns:w16cex="http://schemas.microsoft.com/office/word/2018/wordml/cex" xmlns:w16cid="http://schemas.microsoft.com/office/word/2016/wordml/cid" xmlns:w16="http://schemas.microsoft.com/office/word/2018/wordml" xmlns:w16du="http://schemas.microsoft.com/office/word/2023/wordml/word16du" xmlns:w16sdtdh="http://schemas.microsoft.com/office/word/2020/wordml/sdtdatahash" xmlns:w16sdtfl="http://schemas.microsoft.com/office/word/2024/wordml/sdtformatlock" xmlns:w16se="http://schemas.microsoft.com/office/word/2015/wordml/symex" xmlns:wpg="http://schemas.microsoft.com/office/word/2010/wordprocessingGroup" xmlns:wpi="http://schemas.microsoft.com/office/word/2010/wordprocessingInk" xmlns:wne="http://schemas.microsoft.com/office/word/2006/wordml" xmlns:wps="http://schemas.microsoft.com/office/word/2010/wordprocessingShape" mc:Ignorable="w14 w15 w16se w16cid w16 w16cex w16sdtdh w16sdtfl w16du wp14">
+<w:footnotes xmlns:wpc="http://schemas.microsoft.com/office/word/2010/wordprocessingCanvas" xmlns:cx="http://schemas.microsoft.com/office/drawing/2014/chartex" xmlns:cx1="http://schemas.microsoft.com/office/drawing/2015/9/8/chartex" xmlns:cx2="http://schemas.microsoft.com/office/drawing/2015/10/21/chartex" xmlns:cx3="http://schemas.microsoft.com/office/drawing/2016/5/9/chartex" xmlns:cx4="http://schemas.microsoft.com/office/drawing/2016/5/10/chartex" xmlns:cx5="http://schemas.microsoft.com/office/drawing/2016/5/11/chartex" xmlns:cx6="http://schemas.microsoft.com/office/drawing/2016/5/12/chartex" xmlns:cx7="http://schemas.microsoft.com/office/drawing/2016/5/13/chartex" xmlns:cx8="http://schemas.microsoft.com/office/drawing/2016/5/14/chartex" xmlns:mc="http://schemas.openxmlformats.org/markup-compatibility/2006" xmlns:aink="http://schemas.microsoft.com/office/drawing/2016/ink" xmlns:am3d="http://schemas.microsoft.com/office/drawing/2017/model3d" xmlns:o="urn:schemas-microsoft-com:office:office" xmlns:oel="http://schemas.microsoft.com/office/2019/extlst" xmlns:r="http://schemas.openxmlformats.org/officeDocument/2006/relationships" xmlns:m="http://schemas.openxmlformats.org/officeDocument/2006/math" xmlns:v="urn:schemas-microsoft-com:vml" xmlns:wp14="http://schemas.microsoft.com/office/word/2010/wordprocessingDrawing" xmlns:wp="http://schemas.openxmlformats.org/drawingml/2006/wordprocessingDrawing" xmlns:w10="urn:schemas-microsoft-com:office:word" xmlns:w="http://schemas.openxmlformats.org/wordprocessingml/2006/main" xmlns:w14="http://schemas.microsoft.com/office/word/2010/wordml" xmlns:w15="http://schemas.microsoft.com/office/word/2012/wordml" xmlns:w16cex="http://schemas.microsoft.com/office/word/2018/wordml/cex" xmlns:w16cid="http://schemas.microsoft.com/office/word/2016/wordml/cid" xmlns:w16="http://schemas.microsoft.com/office/word/2018/wordml" xmlns:w16du="http://schemas.microsoft.com/office/word/2023/wordml/word16du" xmlns:w16sdtdh="http://schemas.microsoft.com/office/word/2020/wordml/sdtdatahash" xmlns:w16se="http://schemas.microsoft.com/office/word/2015/wordml/symex" xmlns:wpg="http://schemas.microsoft.com/office/word/2010/wordprocessingGroup" xmlns:wpi="http://schemas.microsoft.com/office/word/2010/wordprocessingInk" xmlns:wne="http://schemas.microsoft.com/office/word/2006/wordml" xmlns:wps="http://schemas.microsoft.com/office/word/2010/wordprocessingShape" mc:Ignorable="w14 w15 w16se w16cid w16 w16cex w16sdtdh wp14">
   <w:footnote w:type="separator" w:id="-1">
     <w:p>
       <w:pPr>
@@ -4851,7 +4531,7 @@
 </file>
 
 <file path=word/header1.xml><?xml version="1.0" encoding="utf-8"?>
-<w:hdr xmlns:wpc="http://schemas.microsoft.com/office/word/2010/wordprocessingCanvas" xmlns:cx="http://schemas.microsoft.com/office/drawing/2014/chartex" xmlns:cx1="http://schemas.microsoft.com/office/drawing/2015/9/8/chartex" xmlns:cx2="http://schemas.microsoft.com/office/drawing/2015/10/21/chartex" xmlns:cx3="http://schemas.microsoft.com/office/drawing/2016/5/9/chartex" xmlns:cx4="http://schemas.microsoft.com/office/drawing/2016/5/10/chartex" xmlns:cx5="http://schemas.microsoft.com/office/drawing/2016/5/11/chartex" xmlns:cx6="http://schemas.microsoft.com/office/drawing/2016/5/12/chartex" xmlns:cx7="http://schemas.microsoft.com/office/drawing/2016/5/13/chartex" xmlns:cx8="http://schemas.microsoft.com/office/drawing/2016/5/14/chartex" xmlns:mc="http://schemas.openxmlformats.org/markup-compatibility/2006" xmlns:aink="http://schemas.microsoft.com/office/drawing/2016/ink" xmlns:am3d="http://schemas.microsoft.com/office/drawing/2017/model3d" xmlns:o="urn:schemas-microsoft-com:office:office" xmlns:oel="http://schemas.microsoft.com/office/2019/extlst" xmlns:r="http://schemas.openxmlformats.org/officeDocument/2006/relationships" xmlns:m="http://schemas.openxmlformats.org/officeDocument/2006/math" xmlns:v="urn:schemas-microsoft-com:vml" xmlns:wp14="http://schemas.microsoft.com/office/word/2010/wordprocessingDrawing" xmlns:wp="http://schemas.openxmlformats.org/drawingml/2006/wordprocessingDrawing" xmlns:w10="urn:schemas-microsoft-com:office:word" xmlns:w="http://schemas.openxmlformats.org/wordprocessingml/2006/main" xmlns:w14="http://schemas.microsoft.com/office/word/2010/wordml" xmlns:w15="http://schemas.microsoft.com/office/word/2012/wordml" xmlns:w16cex="http://schemas.microsoft.com/office/word/2018/wordml/cex" xmlns:w16cid="http://schemas.microsoft.com/office/word/2016/wordml/cid" xmlns:w16="http://schemas.microsoft.com/office/word/2018/wordml" xmlns:w16du="http://schemas.microsoft.com/office/word/2023/wordml/word16du" xmlns:w16sdtdh="http://schemas.microsoft.com/office/word/2020/wordml/sdtdatahash" xmlns:w16sdtfl="http://schemas.microsoft.com/office/word/2024/wordml/sdtformatlock" xmlns:w16se="http://schemas.microsoft.com/office/word/2015/wordml/symex" xmlns:wpg="http://schemas.microsoft.com/office/word/2010/wordprocessingGroup" xmlns:wpi="http://schemas.microsoft.com/office/word/2010/wordprocessingInk" xmlns:wne="http://schemas.microsoft.com/office/word/2006/wordml" xmlns:wps="http://schemas.microsoft.com/office/word/2010/wordprocessingShape" mc:Ignorable="w14 w15 w16se w16cid w16 w16cex w16sdtdh w16sdtfl w16du wp14">
+<w:hdr xmlns:wpc="http://schemas.microsoft.com/office/word/2010/wordprocessingCanvas" xmlns:cx="http://schemas.microsoft.com/office/drawing/2014/chartex" xmlns:cx1="http://schemas.microsoft.com/office/drawing/2015/9/8/chartex" xmlns:cx2="http://schemas.microsoft.com/office/drawing/2015/10/21/chartex" xmlns:cx3="http://schemas.microsoft.com/office/drawing/2016/5/9/chartex" xmlns:cx4="http://schemas.microsoft.com/office/drawing/2016/5/10/chartex" xmlns:cx5="http://schemas.microsoft.com/office/drawing/2016/5/11/chartex" xmlns:cx6="http://schemas.microsoft.com/office/drawing/2016/5/12/chartex" xmlns:cx7="http://schemas.microsoft.com/office/drawing/2016/5/13/chartex" xmlns:cx8="http://schemas.microsoft.com/office/drawing/2016/5/14/chartex" xmlns:mc="http://schemas.openxmlformats.org/markup-compatibility/2006" xmlns:aink="http://schemas.microsoft.com/office/drawing/2016/ink" xmlns:am3d="http://schemas.microsoft.com/office/drawing/2017/model3d" xmlns:o="urn:schemas-microsoft-com:office:office" xmlns:oel="http://schemas.microsoft.com/office/2019/extlst" xmlns:r="http://schemas.openxmlformats.org/officeDocument/2006/relationships" xmlns:m="http://schemas.openxmlformats.org/officeDocument/2006/math" xmlns:v="urn:schemas-microsoft-com:vml" xmlns:wp14="http://schemas.microsoft.com/office/word/2010/wordprocessingDrawing" xmlns:wp="http://schemas.openxmlformats.org/drawingml/2006/wordprocessingDrawing" xmlns:w10="urn:schemas-microsoft-com:office:word" xmlns:w="http://schemas.openxmlformats.org/wordprocessingml/2006/main" xmlns:w14="http://schemas.microsoft.com/office/word/2010/wordml" xmlns:w15="http://schemas.microsoft.com/office/word/2012/wordml" xmlns:w16cex="http://schemas.microsoft.com/office/word/2018/wordml/cex" xmlns:w16cid="http://schemas.microsoft.com/office/word/2016/wordml/cid" xmlns:w16="http://schemas.microsoft.com/office/word/2018/wordml" xmlns:w16du="http://schemas.microsoft.com/office/word/2023/wordml/word16du" xmlns:w16sdtdh="http://schemas.microsoft.com/office/word/2020/wordml/sdtdatahash" xmlns:w16se="http://schemas.microsoft.com/office/word/2015/wordml/symex" xmlns:wpg="http://schemas.microsoft.com/office/word/2010/wordprocessingGroup" xmlns:wpi="http://schemas.microsoft.com/office/word/2010/wordprocessingInk" xmlns:wne="http://schemas.microsoft.com/office/word/2006/wordml" xmlns:wps="http://schemas.microsoft.com/office/word/2010/wordprocessingShape" mc:Ignorable="w14 w15 w16se w16cid w16 w16cex w16sdtdh wp14">
   <w:tbl>
     <w:tblPr>
       <w:tblStyle w:val="TablaUNIR30"/>
@@ -4878,7 +4558,7 @@
         </w:tcPr>
         <w:p>
           <w:pPr>
-            <w:pStyle w:val="Encabezado"/>
+            <w:pStyle w:val="Header"/>
             <w:jc w:val="center"/>
             <w:rPr>
               <w:rFonts w:cs="UnitOT-Medi"/>
@@ -4904,7 +4584,7 @@
         </w:tcPr>
         <w:p>
           <w:pPr>
-            <w:pStyle w:val="Encabezado"/>
+            <w:pStyle w:val="Header"/>
             <w:jc w:val="center"/>
             <w:rPr>
               <w:rFonts w:cs="UnitOT-Medi"/>
@@ -4930,7 +4610,7 @@
         </w:tcPr>
         <w:p>
           <w:pPr>
-            <w:pStyle w:val="Encabezado"/>
+            <w:pStyle w:val="Header"/>
             <w:jc w:val="center"/>
             <w:rPr>
               <w:rFonts w:cs="UnitOT-Medi"/>
@@ -4975,7 +4655,7 @@
         </w:tcPr>
         <w:p>
           <w:pPr>
-            <w:pStyle w:val="Encabezado"/>
+            <w:pStyle w:val="Header"/>
             <w:rPr>
               <w:sz w:val="22"/>
               <w:szCs w:val="22"/>
@@ -4997,7 +4677,7 @@
         </w:tcPr>
         <w:p>
           <w:pPr>
-            <w:pStyle w:val="Encabezado"/>
+            <w:pStyle w:val="Header"/>
             <w:jc w:val="center"/>
             <w:rPr>
               <w:rFonts w:asciiTheme="minorHAnsi" w:hAnsiTheme="minorHAnsi"/>
@@ -5017,7 +4697,7 @@
         </w:tcPr>
         <w:p>
           <w:pPr>
-            <w:pStyle w:val="Encabezado"/>
+            <w:pStyle w:val="Header"/>
           </w:pPr>
         </w:p>
       </w:tc>
@@ -5027,7 +4707,7 @@
         </w:tcPr>
         <w:p>
           <w:pPr>
-            <w:pStyle w:val="Encabezado"/>
+            <w:pStyle w:val="Header"/>
             <w:rPr>
               <w:sz w:val="22"/>
               <w:szCs w:val="22"/>
@@ -5049,7 +4729,7 @@
         </w:tcPr>
         <w:p>
           <w:pPr>
-            <w:pStyle w:val="Encabezado"/>
+            <w:pStyle w:val="Header"/>
           </w:pPr>
         </w:p>
       </w:tc>
@@ -5057,14 +4737,14 @@
   </w:tbl>
   <w:p>
     <w:pPr>
-      <w:pStyle w:val="Encabezado"/>
+      <w:pStyle w:val="Header"/>
     </w:pPr>
   </w:p>
 </w:hdr>
 </file>
 
 <file path=word/numbering.xml><?xml version="1.0" encoding="utf-8"?>
-<w:numbering xmlns:wpc="http://schemas.microsoft.com/office/word/2010/wordprocessingCanvas" xmlns:cx="http://schemas.microsoft.com/office/drawing/2014/chartex" xmlns:cx1="http://schemas.microsoft.com/office/drawing/2015/9/8/chartex" xmlns:cx2="http://schemas.microsoft.com/office/drawing/2015/10/21/chartex" xmlns:cx3="http://schemas.microsoft.com/office/drawing/2016/5/9/chartex" xmlns:cx4="http://schemas.microsoft.com/office/drawing/2016/5/10/chartex" xmlns:cx5="http://schemas.microsoft.com/office/drawing/2016/5/11/chartex" xmlns:cx6="http://schemas.microsoft.com/office/drawing/2016/5/12/chartex" xmlns:cx7="http://schemas.microsoft.com/office/drawing/2016/5/13/chartex" xmlns:cx8="http://schemas.microsoft.com/office/drawing/2016/5/14/chartex" xmlns:mc="http://schemas.openxmlformats.org/markup-compatibility/2006" xmlns:aink="http://schemas.microsoft.com/office/drawing/2016/ink" xmlns:am3d="http://schemas.microsoft.com/office/drawing/2017/model3d" xmlns:o="urn:schemas-microsoft-com:office:office" xmlns:oel="http://schemas.microsoft.com/office/2019/extlst" xmlns:r="http://schemas.openxmlformats.org/officeDocument/2006/relationships" xmlns:m="http://schemas.openxmlformats.org/officeDocument/2006/math" xmlns:v="urn:schemas-microsoft-com:vml" xmlns:wp14="http://schemas.microsoft.com/office/word/2010/wordprocessingDrawing" xmlns:wp="http://schemas.openxmlformats.org/drawingml/2006/wordprocessingDrawing" xmlns:w10="urn:schemas-microsoft-com:office:word" xmlns:w="http://schemas.openxmlformats.org/wordprocessingml/2006/main" xmlns:w14="http://schemas.microsoft.com/office/word/2010/wordml" xmlns:w15="http://schemas.microsoft.com/office/word/2012/wordml" xmlns:w16cex="http://schemas.microsoft.com/office/word/2018/wordml/cex" xmlns:w16cid="http://schemas.microsoft.com/office/word/2016/wordml/cid" xmlns:w16="http://schemas.microsoft.com/office/word/2018/wordml" xmlns:w16du="http://schemas.microsoft.com/office/word/2023/wordml/word16du" xmlns:w16sdtdh="http://schemas.microsoft.com/office/word/2020/wordml/sdtdatahash" xmlns:w16sdtfl="http://schemas.microsoft.com/office/word/2024/wordml/sdtformatlock" xmlns:w16se="http://schemas.microsoft.com/office/word/2015/wordml/symex" xmlns:wpg="http://schemas.microsoft.com/office/word/2010/wordprocessingGroup" xmlns:wpi="http://schemas.microsoft.com/office/word/2010/wordprocessingInk" xmlns:wne="http://schemas.microsoft.com/office/word/2006/wordml" xmlns:wps="http://schemas.microsoft.com/office/word/2010/wordprocessingShape" mc:Ignorable="w14 w15 w16se w16cid w16 w16cex w16sdtdh w16sdtfl w16du wp14">
+<w:numbering xmlns:wpc="http://schemas.microsoft.com/office/word/2010/wordprocessingCanvas" xmlns:cx="http://schemas.microsoft.com/office/drawing/2014/chartex" xmlns:cx1="http://schemas.microsoft.com/office/drawing/2015/9/8/chartex" xmlns:cx2="http://schemas.microsoft.com/office/drawing/2015/10/21/chartex" xmlns:cx3="http://schemas.microsoft.com/office/drawing/2016/5/9/chartex" xmlns:cx4="http://schemas.microsoft.com/office/drawing/2016/5/10/chartex" xmlns:cx5="http://schemas.microsoft.com/office/drawing/2016/5/11/chartex" xmlns:cx6="http://schemas.microsoft.com/office/drawing/2016/5/12/chartex" xmlns:cx7="http://schemas.microsoft.com/office/drawing/2016/5/13/chartex" xmlns:cx8="http://schemas.microsoft.com/office/drawing/2016/5/14/chartex" xmlns:mc="http://schemas.openxmlformats.org/markup-compatibility/2006" xmlns:aink="http://schemas.microsoft.com/office/drawing/2016/ink" xmlns:am3d="http://schemas.microsoft.com/office/drawing/2017/model3d" xmlns:o="urn:schemas-microsoft-com:office:office" xmlns:oel="http://schemas.microsoft.com/office/2019/extlst" xmlns:r="http://schemas.openxmlformats.org/officeDocument/2006/relationships" xmlns:m="http://schemas.openxmlformats.org/officeDocument/2006/math" xmlns:v="urn:schemas-microsoft-com:vml" xmlns:wp14="http://schemas.microsoft.com/office/word/2010/wordprocessingDrawing" xmlns:wp="http://schemas.openxmlformats.org/drawingml/2006/wordprocessingDrawing" xmlns:w10="urn:schemas-microsoft-com:office:word" xmlns:w="http://schemas.openxmlformats.org/wordprocessingml/2006/main" xmlns:w14="http://schemas.microsoft.com/office/word/2010/wordml" xmlns:w15="http://schemas.microsoft.com/office/word/2012/wordml" xmlns:w16cex="http://schemas.microsoft.com/office/word/2018/wordml/cex" xmlns:w16cid="http://schemas.microsoft.com/office/word/2016/wordml/cid" xmlns:w16="http://schemas.microsoft.com/office/word/2018/wordml" xmlns:w16du="http://schemas.microsoft.com/office/word/2023/wordml/word16du" xmlns:w16sdtdh="http://schemas.microsoft.com/office/word/2020/wordml/sdtdatahash" xmlns:w16se="http://schemas.microsoft.com/office/word/2015/wordml/symex" xmlns:wpg="http://schemas.microsoft.com/office/word/2010/wordprocessingGroup" xmlns:wpi="http://schemas.microsoft.com/office/word/2010/wordprocessingInk" xmlns:wne="http://schemas.microsoft.com/office/word/2006/wordml" xmlns:wps="http://schemas.microsoft.com/office/word/2010/wordprocessingShape" mc:Ignorable="w14 w15 w16se w16cid w16 w16cex w16sdtdh wp14">
   <w:abstractNum w:abstractNumId="0" w15:restartNumberingAfterBreak="0">
     <w:nsid w:val="009C15F1"/>
     <w:multiLevelType w:val="hybridMultilevel"/>
@@ -7642,7 +7322,7 @@
 </file>
 
 <file path=word/styles.xml><?xml version="1.0" encoding="utf-8"?>
-<w:styles xmlns:mc="http://schemas.openxmlformats.org/markup-compatibility/2006" xmlns:r="http://schemas.openxmlformats.org/officeDocument/2006/relationships" xmlns:w="http://schemas.openxmlformats.org/wordprocessingml/2006/main" xmlns:w14="http://schemas.microsoft.com/office/word/2010/wordml" xmlns:w15="http://schemas.microsoft.com/office/word/2012/wordml" xmlns:w16cex="http://schemas.microsoft.com/office/word/2018/wordml/cex" xmlns:w16cid="http://schemas.microsoft.com/office/word/2016/wordml/cid" xmlns:w16="http://schemas.microsoft.com/office/word/2018/wordml" xmlns:w16du="http://schemas.microsoft.com/office/word/2023/wordml/word16du" xmlns:w16sdtdh="http://schemas.microsoft.com/office/word/2020/wordml/sdtdatahash" xmlns:w16sdtfl="http://schemas.microsoft.com/office/word/2024/wordml/sdtformatlock" xmlns:w16se="http://schemas.microsoft.com/office/word/2015/wordml/symex" mc:Ignorable="w14 w15 w16se w16cid w16 w16cex w16sdtdh w16sdtfl w16du">
+<w:styles xmlns:mc="http://schemas.openxmlformats.org/markup-compatibility/2006" xmlns:r="http://schemas.openxmlformats.org/officeDocument/2006/relationships" xmlns:w="http://schemas.openxmlformats.org/wordprocessingml/2006/main" xmlns:w14="http://schemas.microsoft.com/office/word/2010/wordml" xmlns:w15="http://schemas.microsoft.com/office/word/2012/wordml" xmlns:w16cex="http://schemas.microsoft.com/office/word/2018/wordml/cex" xmlns:w16cid="http://schemas.microsoft.com/office/word/2016/wordml/cid" xmlns:w16="http://schemas.microsoft.com/office/word/2018/wordml" xmlns:w16sdtdh="http://schemas.microsoft.com/office/word/2020/wordml/sdtdatahash" xmlns:w16se="http://schemas.microsoft.com/office/word/2015/wordml/symex" mc:Ignorable="w14 w15 w16se w16cid w16 w16cex w16sdtdh">
   <w:docDefaults>
     <w:rPrDefault>
       <w:rPr>
@@ -8052,10 +7732,10 @@
       <w:lang w:eastAsia="es-ES"/>
     </w:rPr>
   </w:style>
-  <w:style w:type="paragraph" w:styleId="Ttulo1">
+  <w:style w:type="paragraph" w:styleId="Heading1">
     <w:name w:val="heading 1"/>
     <w:next w:val="Normal"/>
-    <w:link w:val="Ttulo1Car"/>
+    <w:link w:val="Heading1Char"/>
     <w:uiPriority w:val="99"/>
     <w:semiHidden/>
     <w:rsid w:val="00507E5B"/>
@@ -8072,11 +7752,11 @@
       <w:lang w:eastAsia="es-ES"/>
     </w:rPr>
   </w:style>
-  <w:style w:type="paragraph" w:styleId="Ttulo2">
+  <w:style w:type="paragraph" w:styleId="Heading2">
     <w:name w:val="heading 2"/>
     <w:basedOn w:val="Normal"/>
     <w:next w:val="Normal"/>
-    <w:link w:val="Ttulo2Car"/>
+    <w:link w:val="Heading2Char"/>
     <w:uiPriority w:val="99"/>
     <w:semiHidden/>
     <w:rsid w:val="00507E5B"/>
@@ -8093,13 +7773,13 @@
       <w:szCs w:val="26"/>
     </w:rPr>
   </w:style>
-  <w:style w:type="character" w:default="1" w:styleId="Fuentedeprrafopredeter">
+  <w:style w:type="character" w:default="1" w:styleId="DefaultParagraphFont">
     <w:name w:val="Default Paragraph Font"/>
     <w:uiPriority w:val="1"/>
     <w:semiHidden/>
     <w:unhideWhenUsed/>
   </w:style>
-  <w:style w:type="table" w:default="1" w:styleId="Tablanormal">
+  <w:style w:type="table" w:default="1" w:styleId="TableNormal">
     <w:name w:val="Normal Table"/>
     <w:uiPriority w:val="99"/>
     <w:semiHidden/>
@@ -8114,7 +7794,7 @@
       </w:tblCellMar>
     </w:tblPr>
   </w:style>
-  <w:style w:type="numbering" w:default="1" w:styleId="Sinlista">
+  <w:style w:type="numbering" w:default="1" w:styleId="NoList">
     <w:name w:val="No List"/>
     <w:uiPriority w:val="99"/>
     <w:semiHidden/>
@@ -8188,9 +7868,9 @@
       <w:spacing w:line="240" w:lineRule="auto"/>
     </w:pPr>
   </w:style>
-  <w:style w:type="character" w:styleId="Hipervnculo">
+  <w:style w:type="character" w:styleId="Hyperlink">
     <w:name w:val="Hyperlink"/>
-    <w:basedOn w:val="Fuentedeprrafopredeter"/>
+    <w:basedOn w:val="DefaultParagraphFont"/>
     <w:uiPriority w:val="99"/>
     <w:unhideWhenUsed/>
     <w:rsid w:val="0058112D"/>
@@ -8214,7 +7894,7 @@
   </w:style>
   <w:style w:type="numbering" w:customStyle="1" w:styleId="VietasUNIR">
     <w:name w:val="ViñetasUNIR"/>
-    <w:basedOn w:val="Sinlista"/>
+    <w:basedOn w:val="NoList"/>
     <w:uiPriority w:val="99"/>
     <w:rsid w:val="00260B21"/>
     <w:pPr>
@@ -8243,10 +7923,10 @@
       <w:szCs w:val="18"/>
     </w:rPr>
   </w:style>
-  <w:style w:type="character" w:customStyle="1" w:styleId="Ttulo1Car">
-    <w:name w:val="Título 1 Car"/>
-    <w:basedOn w:val="Fuentedeprrafopredeter"/>
-    <w:link w:val="Ttulo1"/>
+  <w:style w:type="character" w:customStyle="1" w:styleId="Heading1Char">
+    <w:name w:val="Heading 1 Char"/>
+    <w:basedOn w:val="DefaultParagraphFont"/>
+    <w:link w:val="Heading1"/>
     <w:uiPriority w:val="99"/>
     <w:semiHidden/>
     <w:rsid w:val="00D511BC"/>
@@ -8257,7 +7937,7 @@
       <w:lang w:eastAsia="es-ES"/>
     </w:rPr>
   </w:style>
-  <w:style w:type="paragraph" w:styleId="Prrafodelista">
+  <w:style w:type="paragraph" w:styleId="ListParagraph">
     <w:name w:val="List Paragraph"/>
     <w:basedOn w:val="Normal"/>
     <w:uiPriority w:val="98"/>
@@ -8268,10 +7948,10 @@
       <w:contextualSpacing/>
     </w:pPr>
   </w:style>
-  <w:style w:type="character" w:customStyle="1" w:styleId="Ttulo2Car">
-    <w:name w:val="Título 2 Car"/>
-    <w:basedOn w:val="Fuentedeprrafopredeter"/>
-    <w:link w:val="Ttulo2"/>
+  <w:style w:type="character" w:customStyle="1" w:styleId="Heading2Char">
+    <w:name w:val="Heading 2 Char"/>
+    <w:basedOn w:val="DefaultParagraphFont"/>
+    <w:link w:val="Heading2"/>
     <w:uiPriority w:val="99"/>
     <w:semiHidden/>
     <w:rsid w:val="00D511BC"/>
@@ -8299,7 +7979,7 @@
       <w:szCs w:val="22"/>
     </w:rPr>
   </w:style>
-  <w:style w:type="paragraph" w:styleId="Descripcin">
+  <w:style w:type="paragraph" w:styleId="Caption">
     <w:name w:val="caption"/>
     <w:basedOn w:val="Normal"/>
     <w:next w:val="Normal"/>
@@ -8319,9 +7999,9 @@
       <w:szCs w:val="18"/>
     </w:rPr>
   </w:style>
-  <w:style w:type="table" w:styleId="Tablaconcuadrcula">
+  <w:style w:type="table" w:styleId="TableGrid">
     <w:name w:val="Table Grid"/>
-    <w:basedOn w:val="Tablanormal"/>
+    <w:basedOn w:val="TableNormal"/>
     <w:uiPriority w:val="39"/>
     <w:rsid w:val="007E4840"/>
     <w:pPr>
@@ -8520,7 +8200,7 @@
       <w:szCs w:val="22"/>
     </w:rPr>
   </w:style>
-  <w:style w:type="paragraph" w:styleId="TDC1">
+  <w:style w:type="paragraph" w:styleId="TOC1">
     <w:name w:val="toc 1"/>
     <w:basedOn w:val="Normal"/>
     <w:next w:val="Normal"/>
@@ -8541,7 +8221,7 @@
       <w:color w:val="008FBE"/>
     </w:rPr>
   </w:style>
-  <w:style w:type="paragraph" w:styleId="TDC2">
+  <w:style w:type="paragraph" w:styleId="TOC2">
     <w:name w:val="toc 2"/>
     <w:basedOn w:val="Normal"/>
     <w:next w:val="Normal"/>
@@ -8608,7 +8288,7 @@
   </w:style>
   <w:style w:type="table" w:customStyle="1" w:styleId="TablaUNIR2">
     <w:name w:val="TablaUNIR_2"/>
-    <w:basedOn w:val="Tablanormal"/>
+    <w:basedOn w:val="TableNormal"/>
     <w:uiPriority w:val="99"/>
     <w:rsid w:val="007E4840"/>
     <w:pPr>
@@ -8671,7 +8351,7 @@
   </w:style>
   <w:style w:type="table" w:customStyle="1" w:styleId="TablaUNIR3">
     <w:name w:val="TablaUNIR_3"/>
-    <w:basedOn w:val="Tablanormal"/>
+    <w:basedOn w:val="TableNormal"/>
     <w:uiPriority w:val="99"/>
     <w:rsid w:val="001E737A"/>
     <w:pPr>
@@ -8722,7 +8402,7 @@
   </w:style>
   <w:style w:type="table" w:customStyle="1" w:styleId="TablaUNIR4">
     <w:name w:val="TablaUNIR_4"/>
-    <w:basedOn w:val="Tablanormal"/>
+    <w:basedOn w:val="TableNormal"/>
     <w:uiPriority w:val="99"/>
     <w:rsid w:val="001E737A"/>
     <w:pPr>
@@ -8792,7 +8472,7 @@
   </w:style>
   <w:style w:type="table" w:customStyle="1" w:styleId="TablaejemplosUNIR">
     <w:name w:val="Tabla ejemplos UNIR"/>
-    <w:basedOn w:val="Tablanormal"/>
+    <w:basedOn w:val="TableNormal"/>
     <w:uiPriority w:val="99"/>
     <w:rsid w:val="001E737A"/>
     <w:pPr>
@@ -8823,10 +8503,10 @@
       </w:numPr>
     </w:pPr>
   </w:style>
-  <w:style w:type="paragraph" w:styleId="Encabezado">
+  <w:style w:type="paragraph" w:styleId="Header">
     <w:name w:val="header"/>
     <w:basedOn w:val="Normal"/>
-    <w:link w:val="EncabezadoCar"/>
+    <w:link w:val="HeaderChar"/>
     <w:uiPriority w:val="99"/>
     <w:qFormat/>
     <w:rsid w:val="00D30434"/>
@@ -8838,10 +8518,10 @@
       <w:spacing w:line="240" w:lineRule="auto"/>
     </w:pPr>
   </w:style>
-  <w:style w:type="character" w:customStyle="1" w:styleId="EncabezadoCar">
-    <w:name w:val="Encabezado Car"/>
-    <w:basedOn w:val="Fuentedeprrafopredeter"/>
-    <w:link w:val="Encabezado"/>
+  <w:style w:type="character" w:customStyle="1" w:styleId="HeaderChar">
+    <w:name w:val="Header Char"/>
+    <w:basedOn w:val="DefaultParagraphFont"/>
+    <w:link w:val="Header"/>
     <w:uiPriority w:val="99"/>
     <w:rsid w:val="00D30434"/>
     <w:rPr>
@@ -8851,10 +8531,10 @@
       <w:lang w:eastAsia="es-ES"/>
     </w:rPr>
   </w:style>
-  <w:style w:type="paragraph" w:styleId="Piedepgina">
+  <w:style w:type="paragraph" w:styleId="Footer">
     <w:name w:val="footer"/>
     <w:basedOn w:val="Normal"/>
-    <w:link w:val="PiedepginaCar"/>
+    <w:link w:val="FooterChar"/>
     <w:uiPriority w:val="24"/>
     <w:unhideWhenUsed/>
     <w:qFormat/>
@@ -8867,10 +8547,10 @@
       <w:spacing w:line="240" w:lineRule="auto"/>
     </w:pPr>
   </w:style>
-  <w:style w:type="character" w:customStyle="1" w:styleId="PiedepginaCar">
-    <w:name w:val="Pie de página Car"/>
-    <w:basedOn w:val="Fuentedeprrafopredeter"/>
-    <w:link w:val="Piedepgina"/>
+  <w:style w:type="character" w:customStyle="1" w:styleId="FooterChar">
+    <w:name w:val="Footer Char"/>
+    <w:basedOn w:val="DefaultParagraphFont"/>
+    <w:link w:val="Footer"/>
     <w:uiPriority w:val="24"/>
     <w:rsid w:val="00E7167D"/>
     <w:rPr>
@@ -8881,10 +8561,10 @@
       <w:lang w:eastAsia="es-ES"/>
     </w:rPr>
   </w:style>
-  <w:style w:type="paragraph" w:styleId="Textodeglobo">
+  <w:style w:type="paragraph" w:styleId="BalloonText">
     <w:name w:val="Balloon Text"/>
     <w:basedOn w:val="Normal"/>
-    <w:link w:val="TextodegloboCar"/>
+    <w:link w:val="BalloonTextChar"/>
     <w:uiPriority w:val="99"/>
     <w:semiHidden/>
     <w:unhideWhenUsed/>
@@ -8898,10 +8578,10 @@
       <w:szCs w:val="18"/>
     </w:rPr>
   </w:style>
-  <w:style w:type="character" w:customStyle="1" w:styleId="TextodegloboCar">
-    <w:name w:val="Texto de globo Car"/>
-    <w:basedOn w:val="Fuentedeprrafopredeter"/>
-    <w:link w:val="Textodeglobo"/>
+  <w:style w:type="character" w:customStyle="1" w:styleId="BalloonTextChar">
+    <w:name w:val="Balloon Text Char"/>
+    <w:basedOn w:val="DefaultParagraphFont"/>
+    <w:link w:val="BalloonText"/>
     <w:uiPriority w:val="99"/>
     <w:semiHidden/>
     <w:rsid w:val="00C446B8"/>
@@ -8915,7 +8595,7 @@
   </w:style>
   <w:style w:type="table" w:customStyle="1" w:styleId="UNIR">
     <w:name w:val="UNIR"/>
-    <w:basedOn w:val="Tablanormal"/>
+    <w:basedOn w:val="TableNormal"/>
     <w:uiPriority w:val="99"/>
     <w:rsid w:val="007E4840"/>
     <w:pPr>
@@ -8937,10 +8617,10 @@
       </w:tblBorders>
     </w:tblPr>
   </w:style>
-  <w:style w:type="paragraph" w:styleId="Textocomentario">
+  <w:style w:type="paragraph" w:styleId="CommentText">
     <w:name w:val="annotation text"/>
     <w:basedOn w:val="Normal"/>
-    <w:link w:val="TextocomentarioCar"/>
+    <w:link w:val="CommentTextChar"/>
     <w:uiPriority w:val="99"/>
     <w:semiHidden/>
     <w:unhideWhenUsed/>
@@ -8953,10 +8633,10 @@
       <w:szCs w:val="20"/>
     </w:rPr>
   </w:style>
-  <w:style w:type="character" w:customStyle="1" w:styleId="TextocomentarioCar">
-    <w:name w:val="Texto comentario Car"/>
-    <w:basedOn w:val="Fuentedeprrafopredeter"/>
-    <w:link w:val="Textocomentario"/>
+  <w:style w:type="character" w:customStyle="1" w:styleId="CommentTextChar">
+    <w:name w:val="Comment Text Char"/>
+    <w:basedOn w:val="DefaultParagraphFont"/>
+    <w:link w:val="CommentText"/>
     <w:uiPriority w:val="99"/>
     <w:semiHidden/>
     <w:rsid w:val="009400C5"/>
@@ -8970,7 +8650,7 @@
   </w:style>
   <w:style w:type="table" w:customStyle="1" w:styleId="TablaUNIR30">
     <w:name w:val="Tabla UNIR 3"/>
-    <w:basedOn w:val="Tablanormal"/>
+    <w:basedOn w:val="TableNormal"/>
     <w:uiPriority w:val="99"/>
     <w:rsid w:val="00472B27"/>
     <w:pPr>
@@ -9034,9 +8714,9 @@
       <w:szCs w:val="22"/>
     </w:rPr>
   </w:style>
-  <w:style w:type="character" w:styleId="Mencinsinresolver">
+  <w:style w:type="character" w:styleId="UnresolvedMention">
     <w:name w:val="Unresolved Mention"/>
-    <w:basedOn w:val="Fuentedeprrafopredeter"/>
+    <w:basedOn w:val="DefaultParagraphFont"/>
     <w:uiPriority w:val="99"/>
     <w:semiHidden/>
     <w:unhideWhenUsed/>
@@ -9048,7 +8728,7 @@
   </w:style>
   <w:style w:type="table" w:customStyle="1" w:styleId="Tabladecuadrcula5oscura-nfasis5111">
     <w:name w:val="Tabla de cuadrícula 5 oscura - Énfasis 5111"/>
-    <w:basedOn w:val="Tablanormal"/>
+    <w:basedOn w:val="TableNormal"/>
     <w:uiPriority w:val="50"/>
     <w:rsid w:val="008A2D1A"/>
     <w:pPr>
@@ -9149,7 +8829,7 @@
   </w:style>
   <w:style w:type="table" w:customStyle="1" w:styleId="Tabladecuadrcula5oscura-nfasis51">
     <w:name w:val="Tabla de cuadrícula 5 oscura - Énfasis 51"/>
-    <w:basedOn w:val="Tablanormal"/>
+    <w:basedOn w:val="TableNormal"/>
     <w:uiPriority w:val="50"/>
     <w:rsid w:val="008A2D1A"/>
     <w:pPr>
@@ -9253,9 +8933,9 @@
       </w:tcPr>
     </w:tblStylePr>
   </w:style>
-  <w:style w:type="character" w:styleId="Hipervnculovisitado">
+  <w:style w:type="character" w:styleId="FollowedHyperlink">
     <w:name w:val="FollowedHyperlink"/>
-    <w:basedOn w:val="Fuentedeprrafopredeter"/>
+    <w:basedOn w:val="DefaultParagraphFont"/>
     <w:uiPriority w:val="99"/>
     <w:semiHidden/>
     <w:unhideWhenUsed/>
@@ -9265,9 +8945,9 @@
       <w:u w:val="single"/>
     </w:rPr>
   </w:style>
-  <w:style w:type="character" w:styleId="Refdecomentario">
+  <w:style w:type="character" w:styleId="CommentReference">
     <w:name w:val="annotation reference"/>
-    <w:basedOn w:val="Fuentedeprrafopredeter"/>
+    <w:basedOn w:val="DefaultParagraphFont"/>
     <w:uiPriority w:val="99"/>
     <w:semiHidden/>
     <w:unhideWhenUsed/>
@@ -9277,11 +8957,11 @@
       <w:szCs w:val="16"/>
     </w:rPr>
   </w:style>
-  <w:style w:type="paragraph" w:styleId="Asuntodelcomentario">
+  <w:style w:type="paragraph" w:styleId="CommentSubject">
     <w:name w:val="annotation subject"/>
-    <w:basedOn w:val="Textocomentario"/>
-    <w:next w:val="Textocomentario"/>
-    <w:link w:val="AsuntodelcomentarioCar"/>
+    <w:basedOn w:val="CommentText"/>
+    <w:next w:val="CommentText"/>
+    <w:link w:val="CommentSubjectChar"/>
     <w:uiPriority w:val="99"/>
     <w:semiHidden/>
     <w:unhideWhenUsed/>
@@ -9291,10 +8971,10 @@
       <w:bCs/>
     </w:rPr>
   </w:style>
-  <w:style w:type="character" w:customStyle="1" w:styleId="AsuntodelcomentarioCar">
-    <w:name w:val="Asunto del comentario Car"/>
-    <w:basedOn w:val="TextocomentarioCar"/>
-    <w:link w:val="Asuntodelcomentario"/>
+  <w:style w:type="character" w:customStyle="1" w:styleId="CommentSubjectChar">
+    <w:name w:val="Comment Subject Char"/>
+    <w:basedOn w:val="CommentTextChar"/>
+    <w:link w:val="CommentSubject"/>
     <w:uiPriority w:val="99"/>
     <w:semiHidden/>
     <w:rsid w:val="00E916AC"/>
@@ -9310,8 +8990,8 @@
   </w:style>
   <w:style w:type="table" w:customStyle="1" w:styleId="Tablaconcuadrcula1">
     <w:name w:val="Tabla con cuadrícula1"/>
-    <w:basedOn w:val="Tablanormal"/>
-    <w:next w:val="Tablaconcuadrcula"/>
+    <w:basedOn w:val="TableNormal"/>
+    <w:next w:val="TableGrid"/>
     <w:rsid w:val="00232F75"/>
     <w:pPr>
       <w:spacing w:after="0" w:line="240" w:lineRule="auto"/>
@@ -9607,19 +9287,6 @@
 </file>
 
 <file path=customXml/item1.xml><?xml version="1.0" encoding="utf-8"?>
-<b:Sources xmlns:b="http://schemas.openxmlformats.org/officeDocument/2006/bibliography" xmlns="http://schemas.openxmlformats.org/officeDocument/2006/bibliography" SelectedStyle="\APASixthEditionOfficeOnline.xsl" StyleName="APA" Version="6"/>
-</file>
-
-<file path=customXml/item2.xml><?xml version="1.0" encoding="utf-8"?>
-<?mso-contentType ?>
-<FormTemplates xmlns="http://schemas.microsoft.com/sharepoint/v3/contenttype/forms">
-  <Display>DocumentLibraryForm</Display>
-  <Edit>DocumentLibraryForm</Edit>
-  <New>DocumentLibraryForm</New>
-</FormTemplates>
-</file>
-
-<file path=customXml/item3.xml><?xml version="1.0" encoding="utf-8"?>
 <ct:contentTypeSchema xmlns:ct="http://schemas.microsoft.com/office/2006/metadata/contentType" xmlns:ma="http://schemas.microsoft.com/office/2006/metadata/properties/metaAttributes" ct:_="" ma:_="" ma:contentTypeName="Documento" ma:contentTypeID="0x010100DF3D7C797EA12745A270EF30E38719B9" ma:contentTypeVersion="19" ma:contentTypeDescription="Crear nuevo documento." ma:contentTypeScope="" ma:versionID="9b3f85d10149739ebc40127471298f58">
   <xsd:schema xmlns:xsd="http://www.w3.org/2001/XMLSchema" xmlns:xs="http://www.w3.org/2001/XMLSchema" xmlns:p="http://schemas.microsoft.com/office/2006/metadata/properties" xmlns:ns2="0a70e875-3d35-4be2-921f-7117c31bab9b" xmlns:ns3="27c1adeb-3674-457c-b08c-8a73f31b6e23" targetNamespace="http://schemas.microsoft.com/office/2006/metadata/properties" ma:root="true" ma:fieldsID="0559bebde66b072b3ad70ef2676e7a86" ns2:_="" ns3:_="">
     <xsd:import namespace="0a70e875-3d35-4be2-921f-7117c31bab9b"/>
@@ -9880,6 +9547,19 @@
 </ct:contentTypeSchema>
 </file>
 
+<file path=customXml/item2.xml><?xml version="1.0" encoding="utf-8"?>
+<?mso-contentType ?>
+<FormTemplates xmlns="http://schemas.microsoft.com/sharepoint/v3/contenttype/forms">
+  <Display>DocumentLibraryForm</Display>
+  <Edit>DocumentLibraryForm</Edit>
+  <New>DocumentLibraryForm</New>
+</FormTemplates>
+</file>
+
+<file path=customXml/item3.xml><?xml version="1.0" encoding="utf-8"?>
+<b:Sources xmlns:b="http://schemas.openxmlformats.org/officeDocument/2006/bibliography" xmlns="http://schemas.openxmlformats.org/officeDocument/2006/bibliography" SelectedStyle="\APASixthEditionOfficeOnline.xsl" StyleName="APA" Version="6"/>
+</file>
+
 <file path=customXml/item4.xml><?xml version="1.0" encoding="utf-8"?>
 <p:properties xmlns:p="http://schemas.microsoft.com/office/2006/metadata/properties" xmlns:xsi="http://www.w3.org/2001/XMLSchema-instance" xmlns:pc="http://schemas.microsoft.com/office/infopath/2007/PartnerControls">
   <documentManagement>
@@ -9893,22 +9573,6 @@
 </file>
 
 <file path=customXml/itemProps1.xml><?xml version="1.0" encoding="utf-8"?>
-<ds:datastoreItem xmlns:ds="http://schemas.openxmlformats.org/officeDocument/2006/customXml" ds:itemID="{68EF0881-AFE3-44EB-8834-1E31251C8A76}">
-  <ds:schemaRefs>
-    <ds:schemaRef ds:uri="http://schemas.openxmlformats.org/officeDocument/2006/bibliography"/>
-  </ds:schemaRefs>
-</ds:datastoreItem>
-</file>
-
-<file path=customXml/itemProps2.xml><?xml version="1.0" encoding="utf-8"?>
-<ds:datastoreItem xmlns:ds="http://schemas.openxmlformats.org/officeDocument/2006/customXml" ds:itemID="{DADA22EA-30AF-48ED-8DC0-06AFFED52517}">
-  <ds:schemaRefs>
-    <ds:schemaRef ds:uri="http://schemas.microsoft.com/sharepoint/v3/contenttype/forms"/>
-  </ds:schemaRefs>
-</ds:datastoreItem>
-</file>
-
-<file path=customXml/itemProps3.xml><?xml version="1.0" encoding="utf-8"?>
 <ds:datastoreItem xmlns:ds="http://schemas.openxmlformats.org/officeDocument/2006/customXml" ds:itemID="{77FFC1A5-44DD-4B3F-AE9D-FA35F4DCEA49}">
   <ds:schemaRefs>
     <ds:schemaRef ds:uri="http://schemas.microsoft.com/office/2006/metadata/contentType"/>
@@ -9927,6 +9591,22 @@
 </ds:datastoreItem>
 </file>
 
+<file path=customXml/itemProps2.xml><?xml version="1.0" encoding="utf-8"?>
+<ds:datastoreItem xmlns:ds="http://schemas.openxmlformats.org/officeDocument/2006/customXml" ds:itemID="{DADA22EA-30AF-48ED-8DC0-06AFFED52517}">
+  <ds:schemaRefs>
+    <ds:schemaRef ds:uri="http://schemas.microsoft.com/sharepoint/v3/contenttype/forms"/>
+  </ds:schemaRefs>
+</ds:datastoreItem>
+</file>
+
+<file path=customXml/itemProps3.xml><?xml version="1.0" encoding="utf-8"?>
+<ds:datastoreItem xmlns:ds="http://schemas.openxmlformats.org/officeDocument/2006/customXml" ds:itemID="{68EF0881-AFE3-44EB-8834-1E31251C8A76}">
+  <ds:schemaRefs>
+    <ds:schemaRef ds:uri="http://schemas.openxmlformats.org/officeDocument/2006/bibliography"/>
+  </ds:schemaRefs>
+</ds:datastoreItem>
+</file>
+
 <file path=customXml/itemProps4.xml><?xml version="1.0" encoding="utf-8"?>
 <ds:datastoreItem xmlns:ds="http://schemas.openxmlformats.org/officeDocument/2006/customXml" ds:itemID="{5DA6F32C-6FAE-4705-8722-B42C5F1E24E2}">
   <ds:schemaRefs>

</xml_diff>

<commit_message>
Revert "Agrego capturas Guaillas"
This reverts commit d289fe02cefebefe53cec620865277c2de6da3c6.
</commit_message>
<xml_diff>
--- a/mudevops07_act1_GRUPAL - Evidencias.docx
+++ b/mudevops07_act1_GRUPAL - Evidencias.docx
@@ -1,6 +1,6 @@
 
 <file path=word/document.xml><?xml version="1.0" encoding="utf-8"?>
-<w:document xmlns:wpc="http://schemas.microsoft.com/office/word/2010/wordprocessingCanvas" xmlns:cx="http://schemas.microsoft.com/office/drawing/2014/chartex" xmlns:cx1="http://schemas.microsoft.com/office/drawing/2015/9/8/chartex" xmlns:cx2="http://schemas.microsoft.com/office/drawing/2015/10/21/chartex" xmlns:cx3="http://schemas.microsoft.com/office/drawing/2016/5/9/chartex" xmlns:cx4="http://schemas.microsoft.com/office/drawing/2016/5/10/chartex" xmlns:cx5="http://schemas.microsoft.com/office/drawing/2016/5/11/chartex" xmlns:cx6="http://schemas.microsoft.com/office/drawing/2016/5/12/chartex" xmlns:cx7="http://schemas.microsoft.com/office/drawing/2016/5/13/chartex" xmlns:cx8="http://schemas.microsoft.com/office/drawing/2016/5/14/chartex" xmlns:mc="http://schemas.openxmlformats.org/markup-compatibility/2006" xmlns:aink="http://schemas.microsoft.com/office/drawing/2016/ink" xmlns:am3d="http://schemas.microsoft.com/office/drawing/2017/model3d" xmlns:o="urn:schemas-microsoft-com:office:office" xmlns:r="http://schemas.openxmlformats.org/officeDocument/2006/relationships" xmlns:m="http://schemas.openxmlformats.org/officeDocument/2006/math" xmlns:v="urn:schemas-microsoft-com:vml" xmlns:wp14="http://schemas.microsoft.com/office/word/2010/wordprocessingDrawing" xmlns:wp="http://schemas.openxmlformats.org/drawingml/2006/wordprocessingDrawing" xmlns:w10="urn:schemas-microsoft-com:office:word" xmlns:w="http://schemas.openxmlformats.org/wordprocessingml/2006/main" xmlns:w14="http://schemas.microsoft.com/office/word/2010/wordml" xmlns:w15="http://schemas.microsoft.com/office/word/2012/wordml" xmlns:w16cex="http://schemas.microsoft.com/office/word/2018/wordml/cex" xmlns:w16cid="http://schemas.microsoft.com/office/word/2016/wordml/cid" xmlns:w16="http://schemas.microsoft.com/office/word/2018/wordml" xmlns:w16sdtdh="http://schemas.microsoft.com/office/word/2020/wordml/sdtdatahash" xmlns:w16se="http://schemas.microsoft.com/office/word/2015/wordml/symex" xmlns:wpg="http://schemas.microsoft.com/office/word/2010/wordprocessingGroup" xmlns:wpi="http://schemas.microsoft.com/office/word/2010/wordprocessingInk" xmlns:wne="http://schemas.microsoft.com/office/word/2006/wordml" xmlns:wps="http://schemas.microsoft.com/office/word/2010/wordprocessingShape" mc:Ignorable="w14 w15 w16se w16cid w16 w16cex w16sdtdh wp14">
+<w:document xmlns:wpc="http://schemas.microsoft.com/office/word/2010/wordprocessingCanvas" xmlns:cx="http://schemas.microsoft.com/office/drawing/2014/chartex" xmlns:cx1="http://schemas.microsoft.com/office/drawing/2015/9/8/chartex" xmlns:cx2="http://schemas.microsoft.com/office/drawing/2015/10/21/chartex" xmlns:cx3="http://schemas.microsoft.com/office/drawing/2016/5/9/chartex" xmlns:cx4="http://schemas.microsoft.com/office/drawing/2016/5/10/chartex" xmlns:cx5="http://schemas.microsoft.com/office/drawing/2016/5/11/chartex" xmlns:cx6="http://schemas.microsoft.com/office/drawing/2016/5/12/chartex" xmlns:cx7="http://schemas.microsoft.com/office/drawing/2016/5/13/chartex" xmlns:cx8="http://schemas.microsoft.com/office/drawing/2016/5/14/chartex" xmlns:mc="http://schemas.openxmlformats.org/markup-compatibility/2006" xmlns:aink="http://schemas.microsoft.com/office/drawing/2016/ink" xmlns:am3d="http://schemas.microsoft.com/office/drawing/2017/model3d" xmlns:o="urn:schemas-microsoft-com:office:office" xmlns:oel="http://schemas.microsoft.com/office/2019/extlst" xmlns:r="http://schemas.openxmlformats.org/officeDocument/2006/relationships" xmlns:m="http://schemas.openxmlformats.org/officeDocument/2006/math" xmlns:v="urn:schemas-microsoft-com:vml" xmlns:wp14="http://schemas.microsoft.com/office/word/2010/wordprocessingDrawing" xmlns:wp="http://schemas.openxmlformats.org/drawingml/2006/wordprocessingDrawing" xmlns:w10="urn:schemas-microsoft-com:office:word" xmlns:w="http://schemas.openxmlformats.org/wordprocessingml/2006/main" xmlns:w14="http://schemas.microsoft.com/office/word/2010/wordml" xmlns:w15="http://schemas.microsoft.com/office/word/2012/wordml" xmlns:w16cex="http://schemas.microsoft.com/office/word/2018/wordml/cex" xmlns:w16cid="http://schemas.microsoft.com/office/word/2016/wordml/cid" xmlns:w16="http://schemas.microsoft.com/office/word/2018/wordml" xmlns:w16du="http://schemas.microsoft.com/office/word/2023/wordml/word16du" xmlns:w16sdtdh="http://schemas.microsoft.com/office/word/2020/wordml/sdtdatahash" xmlns:w16se="http://schemas.microsoft.com/office/word/2015/wordml/symex" xmlns:wpg="http://schemas.microsoft.com/office/word/2010/wordprocessingGroup" xmlns:wpi="http://schemas.microsoft.com/office/word/2010/wordprocessingInk" xmlns:wne="http://schemas.microsoft.com/office/word/2006/wordml" xmlns:wps="http://schemas.microsoft.com/office/word/2010/wordprocessingShape" mc:Ignorable="w14 w15 w16se w16cid w16 w16cex w16sdtdh wp14">
   <w:body>
     <w:p>
       <w:pPr>
@@ -4228,553 +4228,14 @@
     </w:tbl>
     <w:p>
       <w:pPr>
-        <w:pStyle w:val="Vietaprimernivel"/>
-        <w:numPr>
-          <w:ilvl w:val="0"/>
-          <w:numId w:val="0"/>
-        </w:numPr>
-        <w:ind w:left="284" w:hanging="284"/>
-      </w:pPr>
-      <w:r>
-        <w:t>Nathaly Guaillas</w:t>
-      </w:r>
-    </w:p>
-    <w:p>
-      <w:pPr>
-        <w:pStyle w:val="Vietaprimernivel"/>
-        <w:numPr>
-          <w:ilvl w:val="0"/>
-          <w:numId w:val="0"/>
-        </w:numPr>
-        <w:ind w:left="284" w:hanging="284"/>
-      </w:pPr>
-      <w:r>
-        <w:t>Fork</w:t>
-      </w:r>
-    </w:p>
-    <w:p>
-      <w:pPr>
-        <w:pStyle w:val="Vietaprimernivel"/>
-        <w:numPr>
-          <w:ilvl w:val="0"/>
-          <w:numId w:val="0"/>
-        </w:numPr>
-        <w:ind w:left="284" w:hanging="284"/>
-      </w:pPr>
-      <w:r>
-        <w:rPr>
-          <w:noProof/>
-        </w:rPr>
-        <w:lastRenderedPageBreak/>
-        <w:drawing>
-          <wp:inline distT="0" distB="0" distL="0" distR="0" wp14:anchorId="089B0620" wp14:editId="013BE15B">
-            <wp:extent cx="1934703" cy="3276600"/>
-            <wp:effectExtent l="0" t="0" r="8890" b="0"/>
-            <wp:docPr id="8" name="Picture 8"/>
-            <wp:cNvGraphicFramePr>
-              <a:graphicFrameLocks xmlns:a="http://schemas.openxmlformats.org/drawingml/2006/main" noChangeAspect="1"/>
-            </wp:cNvGraphicFramePr>
-            <a:graphic xmlns:a="http://schemas.openxmlformats.org/drawingml/2006/main">
-              <a:graphicData uri="http://schemas.openxmlformats.org/drawingml/2006/picture">
-                <pic:pic xmlns:pic="http://schemas.openxmlformats.org/drawingml/2006/picture">
-                  <pic:nvPicPr>
-                    <pic:cNvPr id="1" name=""/>
-                    <pic:cNvPicPr/>
-                  </pic:nvPicPr>
-                  <pic:blipFill rotWithShape="1">
-                    <a:blip r:embed="rId23"/>
-                    <a:srcRect t="16026" b="5813"/>
-                    <a:stretch/>
-                  </pic:blipFill>
-                  <pic:spPr bwMode="auto">
-                    <a:xfrm>
-                      <a:off x="0" y="0"/>
-                      <a:ext cx="1936534" cy="3279702"/>
-                    </a:xfrm>
-                    <a:prstGeom prst="rect">
-                      <a:avLst/>
-                    </a:prstGeom>
-                    <a:ln>
-                      <a:noFill/>
-                    </a:ln>
-                    <a:extLst>
-                      <a:ext uri="{53640926-AAD7-44D8-BBD7-CCE9431645EC}">
-                        <a14:shadowObscured xmlns:a14="http://schemas.microsoft.com/office/drawing/2010/main"/>
-                      </a:ext>
-                    </a:extLst>
-                  </pic:spPr>
-                </pic:pic>
-              </a:graphicData>
-            </a:graphic>
-          </wp:inline>
-        </w:drawing>
-      </w:r>
-    </w:p>
-    <w:p>
-      <w:pPr>
-        <w:pStyle w:val="Vietaprimernivel"/>
-        <w:numPr>
-          <w:ilvl w:val="0"/>
-          <w:numId w:val="0"/>
-        </w:numPr>
-        <w:ind w:left="284" w:hanging="284"/>
-      </w:pPr>
-      <w:r>
-        <w:t>Clonación de repositorio</w:t>
-      </w:r>
-    </w:p>
-    <w:p>
-      <w:pPr>
-        <w:pStyle w:val="Vietaprimernivel"/>
-        <w:numPr>
-          <w:ilvl w:val="0"/>
-          <w:numId w:val="0"/>
-        </w:numPr>
-        <w:ind w:left="284" w:hanging="284"/>
-      </w:pPr>
-      <w:r>
-        <w:rPr>
-          <w:noProof/>
-        </w:rPr>
-        <w:drawing>
-          <wp:inline distT="0" distB="0" distL="0" distR="0" wp14:anchorId="16C822CF" wp14:editId="0F24719E">
-            <wp:extent cx="5219700" cy="1173480"/>
-            <wp:effectExtent l="0" t="0" r="0" b="7620"/>
-            <wp:docPr id="7" name="Picture 7"/>
-            <wp:cNvGraphicFramePr>
-              <a:graphicFrameLocks xmlns:a="http://schemas.openxmlformats.org/drawingml/2006/main" noChangeAspect="1"/>
-            </wp:cNvGraphicFramePr>
-            <a:graphic xmlns:a="http://schemas.openxmlformats.org/drawingml/2006/main">
-              <a:graphicData uri="http://schemas.openxmlformats.org/drawingml/2006/picture">
-                <pic:pic xmlns:pic="http://schemas.openxmlformats.org/drawingml/2006/picture">
-                  <pic:nvPicPr>
-                    <pic:cNvPr id="0" name="Picture 1"/>
-                    <pic:cNvPicPr>
-                      <a:picLocks noChangeAspect="1" noChangeArrowheads="1"/>
-                    </pic:cNvPicPr>
-                  </pic:nvPicPr>
-                  <pic:blipFill>
-                    <a:blip r:embed="rId24">
-                      <a:extLst>
-                        <a:ext uri="{28A0092B-C50C-407E-A947-70E740481C1C}">
-                          <a14:useLocalDpi xmlns:a14="http://schemas.microsoft.com/office/drawing/2010/main" val="0"/>
-                        </a:ext>
-                      </a:extLst>
-                    </a:blip>
-                    <a:srcRect/>
-                    <a:stretch>
-                      <a:fillRect/>
-                    </a:stretch>
-                  </pic:blipFill>
-                  <pic:spPr bwMode="auto">
-                    <a:xfrm>
-                      <a:off x="0" y="0"/>
-                      <a:ext cx="5219700" cy="1173480"/>
-                    </a:xfrm>
-                    <a:prstGeom prst="rect">
-                      <a:avLst/>
-                    </a:prstGeom>
-                    <a:noFill/>
-                    <a:ln>
-                      <a:noFill/>
-                    </a:ln>
-                  </pic:spPr>
-                </pic:pic>
-              </a:graphicData>
-            </a:graphic>
-          </wp:inline>
-        </w:drawing>
-      </w:r>
-    </w:p>
-    <w:p>
-      <w:r>
-        <w:t xml:space="preserve">Creación rama </w:t>
-      </w:r>
-    </w:p>
-    <w:p>
-      <w:r>
-        <w:rPr>
-          <w:noProof/>
-        </w:rPr>
-        <w:drawing>
-          <wp:inline distT="0" distB="0" distL="0" distR="0" wp14:anchorId="16EC1680" wp14:editId="2C94394E">
-            <wp:extent cx="5219700" cy="967740"/>
-            <wp:effectExtent l="0" t="0" r="0" b="3810"/>
-            <wp:docPr id="6" name="Picture 6"/>
-            <wp:cNvGraphicFramePr>
-              <a:graphicFrameLocks xmlns:a="http://schemas.openxmlformats.org/drawingml/2006/main" noChangeAspect="1"/>
-            </wp:cNvGraphicFramePr>
-            <a:graphic xmlns:a="http://schemas.openxmlformats.org/drawingml/2006/main">
-              <a:graphicData uri="http://schemas.openxmlformats.org/drawingml/2006/picture">
-                <pic:pic xmlns:pic="http://schemas.openxmlformats.org/drawingml/2006/picture">
-                  <pic:nvPicPr>
-                    <pic:cNvPr id="0" name="Picture 2"/>
-                    <pic:cNvPicPr>
-                      <a:picLocks noChangeAspect="1" noChangeArrowheads="1"/>
-                    </pic:cNvPicPr>
-                  </pic:nvPicPr>
-                  <pic:blipFill>
-                    <a:blip r:embed="rId25">
-                      <a:extLst>
-                        <a:ext uri="{28A0092B-C50C-407E-A947-70E740481C1C}">
-                          <a14:useLocalDpi xmlns:a14="http://schemas.microsoft.com/office/drawing/2010/main" val="0"/>
-                        </a:ext>
-                      </a:extLst>
-                    </a:blip>
-                    <a:srcRect/>
-                    <a:stretch>
-                      <a:fillRect/>
-                    </a:stretch>
-                  </pic:blipFill>
-                  <pic:spPr bwMode="auto">
-                    <a:xfrm>
-                      <a:off x="0" y="0"/>
-                      <a:ext cx="5219700" cy="967740"/>
-                    </a:xfrm>
-                    <a:prstGeom prst="rect">
-                      <a:avLst/>
-                    </a:prstGeom>
-                    <a:noFill/>
-                    <a:ln>
-                      <a:noFill/>
-                    </a:ln>
-                  </pic:spPr>
-                </pic:pic>
-              </a:graphicData>
-            </a:graphic>
-          </wp:inline>
-        </w:drawing>
-      </w:r>
-    </w:p>
-    <w:p/>
-    <w:p>
-      <w:r>
-        <w:t>Archivo creado</w:t>
-      </w:r>
-    </w:p>
-    <w:p>
-      <w:r>
-        <w:rPr>
-          <w:noProof/>
-        </w:rPr>
-        <w:lastRenderedPageBreak/>
-        <w:drawing>
-          <wp:inline distT="0" distB="0" distL="0" distR="0" wp14:anchorId="7A27E1EC" wp14:editId="4EC9EE79">
-            <wp:extent cx="5219700" cy="2842260"/>
-            <wp:effectExtent l="0" t="0" r="0" b="0"/>
-            <wp:docPr id="5" name="Picture 5"/>
-            <wp:cNvGraphicFramePr>
-              <a:graphicFrameLocks xmlns:a="http://schemas.openxmlformats.org/drawingml/2006/main" noChangeAspect="1"/>
-            </wp:cNvGraphicFramePr>
-            <a:graphic xmlns:a="http://schemas.openxmlformats.org/drawingml/2006/main">
-              <a:graphicData uri="http://schemas.openxmlformats.org/drawingml/2006/picture">
-                <pic:pic xmlns:pic="http://schemas.openxmlformats.org/drawingml/2006/picture">
-                  <pic:nvPicPr>
-                    <pic:cNvPr id="0" name="Picture 3"/>
-                    <pic:cNvPicPr>
-                      <a:picLocks noChangeAspect="1" noChangeArrowheads="1"/>
-                    </pic:cNvPicPr>
-                  </pic:nvPicPr>
-                  <pic:blipFill>
-                    <a:blip r:embed="rId26">
-                      <a:extLst>
-                        <a:ext uri="{28A0092B-C50C-407E-A947-70E740481C1C}">
-                          <a14:useLocalDpi xmlns:a14="http://schemas.microsoft.com/office/drawing/2010/main" val="0"/>
-                        </a:ext>
-                      </a:extLst>
-                    </a:blip>
-                    <a:srcRect/>
-                    <a:stretch>
-                      <a:fillRect/>
-                    </a:stretch>
-                  </pic:blipFill>
-                  <pic:spPr bwMode="auto">
-                    <a:xfrm>
-                      <a:off x="0" y="0"/>
-                      <a:ext cx="5219700" cy="2842260"/>
-                    </a:xfrm>
-                    <a:prstGeom prst="rect">
-                      <a:avLst/>
-                    </a:prstGeom>
-                    <a:noFill/>
-                    <a:ln>
-                      <a:noFill/>
-                    </a:ln>
-                  </pic:spPr>
-                </pic:pic>
-              </a:graphicData>
-            </a:graphic>
-          </wp:inline>
-        </w:drawing>
-      </w:r>
-    </w:p>
-    <w:p>
-      <w:pPr>
-        <w:rPr>
-          <w:lang w:val="en-US"/>
-        </w:rPr>
-      </w:pPr>
-      <w:r>
-        <w:rPr>
-          <w:lang w:val="en-US"/>
-        </w:rPr>
-        <w:t>Git status, git add . y git commit</w:t>
-      </w:r>
-    </w:p>
-    <w:p>
-      <w:r>
-        <w:rPr>
-          <w:noProof/>
-        </w:rPr>
-        <w:drawing>
-          <wp:inline distT="0" distB="0" distL="0" distR="0" wp14:anchorId="67130821" wp14:editId="4A7F54DF">
-            <wp:extent cx="5219700" cy="2346960"/>
-            <wp:effectExtent l="0" t="0" r="0" b="0"/>
-            <wp:docPr id="4" name="Picture 4"/>
-            <wp:cNvGraphicFramePr>
-              <a:graphicFrameLocks xmlns:a="http://schemas.openxmlformats.org/drawingml/2006/main" noChangeAspect="1"/>
-            </wp:cNvGraphicFramePr>
-            <a:graphic xmlns:a="http://schemas.openxmlformats.org/drawingml/2006/main">
-              <a:graphicData uri="http://schemas.openxmlformats.org/drawingml/2006/picture">
-                <pic:pic xmlns:pic="http://schemas.openxmlformats.org/drawingml/2006/picture">
-                  <pic:nvPicPr>
-                    <pic:cNvPr id="0" name="Picture 4"/>
-                    <pic:cNvPicPr>
-                      <a:picLocks noChangeAspect="1" noChangeArrowheads="1"/>
-                    </pic:cNvPicPr>
-                  </pic:nvPicPr>
-                  <pic:blipFill>
-                    <a:blip r:embed="rId27">
-                      <a:extLst>
-                        <a:ext uri="{28A0092B-C50C-407E-A947-70E740481C1C}">
-                          <a14:useLocalDpi xmlns:a14="http://schemas.microsoft.com/office/drawing/2010/main" val="0"/>
-                        </a:ext>
-                      </a:extLst>
-                    </a:blip>
-                    <a:srcRect/>
-                    <a:stretch>
-                      <a:fillRect/>
-                    </a:stretch>
-                  </pic:blipFill>
-                  <pic:spPr bwMode="auto">
-                    <a:xfrm>
-                      <a:off x="0" y="0"/>
-                      <a:ext cx="5219700" cy="2346960"/>
-                    </a:xfrm>
-                    <a:prstGeom prst="rect">
-                      <a:avLst/>
-                    </a:prstGeom>
-                    <a:noFill/>
-                    <a:ln>
-                      <a:noFill/>
-                    </a:ln>
-                  </pic:spPr>
-                </pic:pic>
-              </a:graphicData>
-            </a:graphic>
-          </wp:inline>
-        </w:drawing>
-      </w:r>
-    </w:p>
-    <w:p>
-      <w:r>
-        <w:t xml:space="preserve">Git push </w:t>
-      </w:r>
-    </w:p>
-    <w:p>
-      <w:r>
-        <w:rPr>
-          <w:noProof/>
-        </w:rPr>
-        <w:lastRenderedPageBreak/>
-        <w:drawing>
-          <wp:inline distT="0" distB="0" distL="0" distR="0" wp14:anchorId="602BBB52" wp14:editId="09A34EF2">
-            <wp:extent cx="5219700" cy="2354580"/>
-            <wp:effectExtent l="0" t="0" r="0" b="7620"/>
-            <wp:docPr id="3" name="Picture 3"/>
-            <wp:cNvGraphicFramePr>
-              <a:graphicFrameLocks xmlns:a="http://schemas.openxmlformats.org/drawingml/2006/main" noChangeAspect="1"/>
-            </wp:cNvGraphicFramePr>
-            <a:graphic xmlns:a="http://schemas.openxmlformats.org/drawingml/2006/main">
-              <a:graphicData uri="http://schemas.openxmlformats.org/drawingml/2006/picture">
-                <pic:pic xmlns:pic="http://schemas.openxmlformats.org/drawingml/2006/picture">
-                  <pic:nvPicPr>
-                    <pic:cNvPr id="0" name="Picture 5"/>
-                    <pic:cNvPicPr>
-                      <a:picLocks noChangeAspect="1" noChangeArrowheads="1"/>
-                    </pic:cNvPicPr>
-                  </pic:nvPicPr>
-                  <pic:blipFill>
-                    <a:blip r:embed="rId28">
-                      <a:extLst>
-                        <a:ext uri="{28A0092B-C50C-407E-A947-70E740481C1C}">
-                          <a14:useLocalDpi xmlns:a14="http://schemas.microsoft.com/office/drawing/2010/main" val="0"/>
-                        </a:ext>
-                      </a:extLst>
-                    </a:blip>
-                    <a:srcRect/>
-                    <a:stretch>
-                      <a:fillRect/>
-                    </a:stretch>
-                  </pic:blipFill>
-                  <pic:spPr bwMode="auto">
-                    <a:xfrm>
-                      <a:off x="0" y="0"/>
-                      <a:ext cx="5219700" cy="2354580"/>
-                    </a:xfrm>
-                    <a:prstGeom prst="rect">
-                      <a:avLst/>
-                    </a:prstGeom>
-                    <a:noFill/>
-                    <a:ln>
-                      <a:noFill/>
-                    </a:ln>
-                  </pic:spPr>
-                </pic:pic>
-              </a:graphicData>
-            </a:graphic>
-          </wp:inline>
-        </w:drawing>
-      </w:r>
-    </w:p>
-    <w:p/>
-    <w:p>
-      <w:r>
-        <w:t>Pull request</w:t>
-      </w:r>
-    </w:p>
-    <w:p>
-      <w:r>
-        <w:rPr>
-          <w:noProof/>
-        </w:rPr>
-        <w:drawing>
-          <wp:inline distT="0" distB="0" distL="0" distR="0" wp14:anchorId="08BE10C2" wp14:editId="7CF96316">
-            <wp:extent cx="5212080" cy="2865120"/>
-            <wp:effectExtent l="0" t="0" r="7620" b="0"/>
-            <wp:docPr id="2" name="Picture 2"/>
-            <wp:cNvGraphicFramePr>
-              <a:graphicFrameLocks xmlns:a="http://schemas.openxmlformats.org/drawingml/2006/main" noChangeAspect="1"/>
-            </wp:cNvGraphicFramePr>
-            <a:graphic xmlns:a="http://schemas.openxmlformats.org/drawingml/2006/main">
-              <a:graphicData uri="http://schemas.openxmlformats.org/drawingml/2006/picture">
-                <pic:pic xmlns:pic="http://schemas.openxmlformats.org/drawingml/2006/picture">
-                  <pic:nvPicPr>
-                    <pic:cNvPr id="0" name="Picture 6"/>
-                    <pic:cNvPicPr>
-                      <a:picLocks noChangeAspect="1" noChangeArrowheads="1"/>
-                    </pic:cNvPicPr>
-                  </pic:nvPicPr>
-                  <pic:blipFill>
-                    <a:blip r:embed="rId29" cstate="print">
-                      <a:extLst>
-                        <a:ext uri="{28A0092B-C50C-407E-A947-70E740481C1C}">
-                          <a14:useLocalDpi xmlns:a14="http://schemas.microsoft.com/office/drawing/2010/main" val="0"/>
-                        </a:ext>
-                      </a:extLst>
-                    </a:blip>
-                    <a:srcRect/>
-                    <a:stretch>
-                      <a:fillRect/>
-                    </a:stretch>
-                  </pic:blipFill>
-                  <pic:spPr bwMode="auto">
-                    <a:xfrm>
-                      <a:off x="0" y="0"/>
-                      <a:ext cx="5212080" cy="2865120"/>
-                    </a:xfrm>
-                    <a:prstGeom prst="rect">
-                      <a:avLst/>
-                    </a:prstGeom>
-                    <a:noFill/>
-                    <a:ln>
-                      <a:noFill/>
-                    </a:ln>
-                  </pic:spPr>
-                </pic:pic>
-              </a:graphicData>
-            </a:graphic>
-          </wp:inline>
-        </w:drawing>
-      </w:r>
-    </w:p>
-    <w:p>
-      <w:r>
-        <w:t>Commits realizados</w:t>
-      </w:r>
-    </w:p>
-    <w:p>
-      <w:r>
-        <w:rPr>
-          <w:noProof/>
-        </w:rPr>
-        <w:lastRenderedPageBreak/>
-        <w:drawing>
-          <wp:inline distT="0" distB="0" distL="0" distR="0" wp14:anchorId="7E959F64" wp14:editId="5441BD6C">
-            <wp:extent cx="5219700" cy="3162300"/>
-            <wp:effectExtent l="0" t="0" r="0" b="0"/>
-            <wp:docPr id="1" name="Picture 1"/>
-            <wp:cNvGraphicFramePr>
-              <a:graphicFrameLocks xmlns:a="http://schemas.openxmlformats.org/drawingml/2006/main" noChangeAspect="1"/>
-            </wp:cNvGraphicFramePr>
-            <a:graphic xmlns:a="http://schemas.openxmlformats.org/drawingml/2006/main">
-              <a:graphicData uri="http://schemas.openxmlformats.org/drawingml/2006/picture">
-                <pic:pic xmlns:pic="http://schemas.openxmlformats.org/drawingml/2006/picture">
-                  <pic:nvPicPr>
-                    <pic:cNvPr id="0" name="Picture 7"/>
-                    <pic:cNvPicPr>
-                      <a:picLocks noChangeAspect="1" noChangeArrowheads="1"/>
-                    </pic:cNvPicPr>
-                  </pic:nvPicPr>
-                  <pic:blipFill>
-                    <a:blip r:embed="rId30" cstate="print">
-                      <a:extLst>
-                        <a:ext uri="{28A0092B-C50C-407E-A947-70E740481C1C}">
-                          <a14:useLocalDpi xmlns:a14="http://schemas.microsoft.com/office/drawing/2010/main" val="0"/>
-                        </a:ext>
-                      </a:extLst>
-                    </a:blip>
-                    <a:srcRect/>
-                    <a:stretch>
-                      <a:fillRect/>
-                    </a:stretch>
-                  </pic:blipFill>
-                  <pic:spPr bwMode="auto">
-                    <a:xfrm>
-                      <a:off x="0" y="0"/>
-                      <a:ext cx="5219700" cy="3162300"/>
-                    </a:xfrm>
-                    <a:prstGeom prst="rect">
-                      <a:avLst/>
-                    </a:prstGeom>
-                    <a:noFill/>
-                    <a:ln>
-                      <a:noFill/>
-                    </a:ln>
-                  </pic:spPr>
-                </pic:pic>
-              </a:graphicData>
-            </a:graphic>
-          </wp:inline>
-        </w:drawing>
-      </w:r>
-    </w:p>
-    <w:p/>
-    <w:p>
-      <w:r>
-        <w:t>Pull request y merge bloqueado</w:t>
-      </w:r>
-    </w:p>
-    <w:p>
-      <w:pPr>
         <w:pStyle w:val="Piedefoto-tabla"/>
         <w:ind w:left="0"/>
         <w:jc w:val="both"/>
       </w:pPr>
     </w:p>
     <w:sectPr>
-      <w:headerReference w:type="default" r:id="rId31"/>
-      <w:footerReference w:type="default" r:id="rId32"/>
+      <w:headerReference w:type="default" r:id="rId23"/>
+      <w:footerReference w:type="default" r:id="rId24"/>
       <w:pgSz w:w="11906" w:h="16838" w:code="9"/>
       <w:pgMar w:top="1418" w:right="1843" w:bottom="1418" w:left="1843" w:header="1134" w:footer="397" w:gutter="0"/>
       <w:cols w:space="708"/>
@@ -4785,7 +4246,7 @@
 </file>
 
 <file path=word/endnotes.xml><?xml version="1.0" encoding="utf-8"?>
-<w:endnotes xmlns:wpc="http://schemas.microsoft.com/office/word/2010/wordprocessingCanvas" xmlns:cx="http://schemas.microsoft.com/office/drawing/2014/chartex" xmlns:cx1="http://schemas.microsoft.com/office/drawing/2015/9/8/chartex" xmlns:cx2="http://schemas.microsoft.com/office/drawing/2015/10/21/chartex" xmlns:cx3="http://schemas.microsoft.com/office/drawing/2016/5/9/chartex" xmlns:cx4="http://schemas.microsoft.com/office/drawing/2016/5/10/chartex" xmlns:cx5="http://schemas.microsoft.com/office/drawing/2016/5/11/chartex" xmlns:cx6="http://schemas.microsoft.com/office/drawing/2016/5/12/chartex" xmlns:cx7="http://schemas.microsoft.com/office/drawing/2016/5/13/chartex" xmlns:cx8="http://schemas.microsoft.com/office/drawing/2016/5/14/chartex" xmlns:mc="http://schemas.openxmlformats.org/markup-compatibility/2006" xmlns:aink="http://schemas.microsoft.com/office/drawing/2016/ink" xmlns:am3d="http://schemas.microsoft.com/office/drawing/2017/model3d" xmlns:o="urn:schemas-microsoft-com:office:office" xmlns:r="http://schemas.openxmlformats.org/officeDocument/2006/relationships" xmlns:m="http://schemas.openxmlformats.org/officeDocument/2006/math" xmlns:v="urn:schemas-microsoft-com:vml" xmlns:wp14="http://schemas.microsoft.com/office/word/2010/wordprocessingDrawing" xmlns:wp="http://schemas.openxmlformats.org/drawingml/2006/wordprocessingDrawing" xmlns:w10="urn:schemas-microsoft-com:office:word" xmlns:w="http://schemas.openxmlformats.org/wordprocessingml/2006/main" xmlns:w14="http://schemas.microsoft.com/office/word/2010/wordml" xmlns:w15="http://schemas.microsoft.com/office/word/2012/wordml" xmlns:w16cex="http://schemas.microsoft.com/office/word/2018/wordml/cex" xmlns:w16cid="http://schemas.microsoft.com/office/word/2016/wordml/cid" xmlns:w16="http://schemas.microsoft.com/office/word/2018/wordml" xmlns:w16sdtdh="http://schemas.microsoft.com/office/word/2020/wordml/sdtdatahash" xmlns:w16se="http://schemas.microsoft.com/office/word/2015/wordml/symex" xmlns:wpg="http://schemas.microsoft.com/office/word/2010/wordprocessingGroup" xmlns:wpi="http://schemas.microsoft.com/office/word/2010/wordprocessingInk" xmlns:wne="http://schemas.microsoft.com/office/word/2006/wordml" xmlns:wps="http://schemas.microsoft.com/office/word/2010/wordprocessingShape" mc:Ignorable="w14 w15 w16se w16cid w16 w16cex w16sdtdh wp14">
+<w:endnotes xmlns:wpc="http://schemas.microsoft.com/office/word/2010/wordprocessingCanvas" xmlns:cx="http://schemas.microsoft.com/office/drawing/2014/chartex" xmlns:cx1="http://schemas.microsoft.com/office/drawing/2015/9/8/chartex" xmlns:cx2="http://schemas.microsoft.com/office/drawing/2015/10/21/chartex" xmlns:cx3="http://schemas.microsoft.com/office/drawing/2016/5/9/chartex" xmlns:cx4="http://schemas.microsoft.com/office/drawing/2016/5/10/chartex" xmlns:cx5="http://schemas.microsoft.com/office/drawing/2016/5/11/chartex" xmlns:cx6="http://schemas.microsoft.com/office/drawing/2016/5/12/chartex" xmlns:cx7="http://schemas.microsoft.com/office/drawing/2016/5/13/chartex" xmlns:cx8="http://schemas.microsoft.com/office/drawing/2016/5/14/chartex" xmlns:mc="http://schemas.openxmlformats.org/markup-compatibility/2006" xmlns:aink="http://schemas.microsoft.com/office/drawing/2016/ink" xmlns:am3d="http://schemas.microsoft.com/office/drawing/2017/model3d" xmlns:o="urn:schemas-microsoft-com:office:office" xmlns:oel="http://schemas.microsoft.com/office/2019/extlst" xmlns:r="http://schemas.openxmlformats.org/officeDocument/2006/relationships" xmlns:m="http://schemas.openxmlformats.org/officeDocument/2006/math" xmlns:v="urn:schemas-microsoft-com:vml" xmlns:wp14="http://schemas.microsoft.com/office/word/2010/wordprocessingDrawing" xmlns:wp="http://schemas.openxmlformats.org/drawingml/2006/wordprocessingDrawing" xmlns:w10="urn:schemas-microsoft-com:office:word" xmlns:w="http://schemas.openxmlformats.org/wordprocessingml/2006/main" xmlns:w14="http://schemas.microsoft.com/office/word/2010/wordml" xmlns:w15="http://schemas.microsoft.com/office/word/2012/wordml" xmlns:w16cex="http://schemas.microsoft.com/office/word/2018/wordml/cex" xmlns:w16cid="http://schemas.microsoft.com/office/word/2016/wordml/cid" xmlns:w16="http://schemas.microsoft.com/office/word/2018/wordml" xmlns:w16du="http://schemas.microsoft.com/office/word/2023/wordml/word16du" xmlns:w16sdtdh="http://schemas.microsoft.com/office/word/2020/wordml/sdtdatahash" xmlns:w16se="http://schemas.microsoft.com/office/word/2015/wordml/symex" xmlns:wpg="http://schemas.microsoft.com/office/word/2010/wordprocessingGroup" xmlns:wpi="http://schemas.microsoft.com/office/word/2010/wordprocessingInk" xmlns:wne="http://schemas.microsoft.com/office/word/2006/wordml" xmlns:wps="http://schemas.microsoft.com/office/word/2010/wordprocessingShape" mc:Ignorable="w14 w15 w16se w16cid w16 w16cex w16sdtdh wp14">
   <w:endnote w:type="separator" w:id="-1">
     <w:p>
       <w:pPr>
@@ -4810,7 +4271,7 @@
 </file>
 
 <file path=word/footer1.xml><?xml version="1.0" encoding="utf-8"?>
-<w:ftr xmlns:wpc="http://schemas.microsoft.com/office/word/2010/wordprocessingCanvas" xmlns:cx="http://schemas.microsoft.com/office/drawing/2014/chartex" xmlns:cx1="http://schemas.microsoft.com/office/drawing/2015/9/8/chartex" xmlns:cx2="http://schemas.microsoft.com/office/drawing/2015/10/21/chartex" xmlns:cx3="http://schemas.microsoft.com/office/drawing/2016/5/9/chartex" xmlns:cx4="http://schemas.microsoft.com/office/drawing/2016/5/10/chartex" xmlns:cx5="http://schemas.microsoft.com/office/drawing/2016/5/11/chartex" xmlns:cx6="http://schemas.microsoft.com/office/drawing/2016/5/12/chartex" xmlns:cx7="http://schemas.microsoft.com/office/drawing/2016/5/13/chartex" xmlns:cx8="http://schemas.microsoft.com/office/drawing/2016/5/14/chartex" xmlns:mc="http://schemas.openxmlformats.org/markup-compatibility/2006" xmlns:aink="http://schemas.microsoft.com/office/drawing/2016/ink" xmlns:am3d="http://schemas.microsoft.com/office/drawing/2017/model3d" xmlns:o="urn:schemas-microsoft-com:office:office" xmlns:r="http://schemas.openxmlformats.org/officeDocument/2006/relationships" xmlns:m="http://schemas.openxmlformats.org/officeDocument/2006/math" xmlns:v="urn:schemas-microsoft-com:vml" xmlns:wp14="http://schemas.microsoft.com/office/word/2010/wordprocessingDrawing" xmlns:wp="http://schemas.openxmlformats.org/drawingml/2006/wordprocessingDrawing" xmlns:w10="urn:schemas-microsoft-com:office:word" xmlns:w="http://schemas.openxmlformats.org/wordprocessingml/2006/main" xmlns:w14="http://schemas.microsoft.com/office/word/2010/wordml" xmlns:w15="http://schemas.microsoft.com/office/word/2012/wordml" xmlns:w16cex="http://schemas.microsoft.com/office/word/2018/wordml/cex" xmlns:w16cid="http://schemas.microsoft.com/office/word/2016/wordml/cid" xmlns:w16="http://schemas.microsoft.com/office/word/2018/wordml" xmlns:w16sdtdh="http://schemas.microsoft.com/office/word/2020/wordml/sdtdatahash" xmlns:w16se="http://schemas.microsoft.com/office/word/2015/wordml/symex" xmlns:wpg="http://schemas.microsoft.com/office/word/2010/wordprocessingGroup" xmlns:wpi="http://schemas.microsoft.com/office/word/2010/wordprocessingInk" xmlns:wne="http://schemas.microsoft.com/office/word/2006/wordml" xmlns:wps="http://schemas.microsoft.com/office/word/2010/wordprocessingShape" mc:Ignorable="w14 w15 w16se w16cid w16 w16cex w16sdtdh wp14">
+<w:ftr xmlns:wpc="http://schemas.microsoft.com/office/word/2010/wordprocessingCanvas" xmlns:cx="http://schemas.microsoft.com/office/drawing/2014/chartex" xmlns:cx1="http://schemas.microsoft.com/office/drawing/2015/9/8/chartex" xmlns:cx2="http://schemas.microsoft.com/office/drawing/2015/10/21/chartex" xmlns:cx3="http://schemas.microsoft.com/office/drawing/2016/5/9/chartex" xmlns:cx4="http://schemas.microsoft.com/office/drawing/2016/5/10/chartex" xmlns:cx5="http://schemas.microsoft.com/office/drawing/2016/5/11/chartex" xmlns:cx6="http://schemas.microsoft.com/office/drawing/2016/5/12/chartex" xmlns:cx7="http://schemas.microsoft.com/office/drawing/2016/5/13/chartex" xmlns:cx8="http://schemas.microsoft.com/office/drawing/2016/5/14/chartex" xmlns:mc="http://schemas.openxmlformats.org/markup-compatibility/2006" xmlns:aink="http://schemas.microsoft.com/office/drawing/2016/ink" xmlns:am3d="http://schemas.microsoft.com/office/drawing/2017/model3d" xmlns:o="urn:schemas-microsoft-com:office:office" xmlns:oel="http://schemas.microsoft.com/office/2019/extlst" xmlns:r="http://schemas.openxmlformats.org/officeDocument/2006/relationships" xmlns:m="http://schemas.openxmlformats.org/officeDocument/2006/math" xmlns:v="urn:schemas-microsoft-com:vml" xmlns:wp14="http://schemas.microsoft.com/office/word/2010/wordprocessingDrawing" xmlns:wp="http://schemas.openxmlformats.org/drawingml/2006/wordprocessingDrawing" xmlns:w10="urn:schemas-microsoft-com:office:word" xmlns:w="http://schemas.openxmlformats.org/wordprocessingml/2006/main" xmlns:w14="http://schemas.microsoft.com/office/word/2010/wordml" xmlns:w15="http://schemas.microsoft.com/office/word/2012/wordml" xmlns:w16cex="http://schemas.microsoft.com/office/word/2018/wordml/cex" xmlns:w16cid="http://schemas.microsoft.com/office/word/2016/wordml/cid" xmlns:w16="http://schemas.microsoft.com/office/word/2018/wordml" xmlns:w16du="http://schemas.microsoft.com/office/word/2023/wordml/word16du" xmlns:w16sdtdh="http://schemas.microsoft.com/office/word/2020/wordml/sdtdatahash" xmlns:w16se="http://schemas.microsoft.com/office/word/2015/wordml/symex" xmlns:wpg="http://schemas.microsoft.com/office/word/2010/wordprocessingGroup" xmlns:wpi="http://schemas.microsoft.com/office/word/2010/wordprocessingInk" xmlns:wne="http://schemas.microsoft.com/office/word/2006/wordml" xmlns:wps="http://schemas.microsoft.com/office/word/2010/wordprocessingShape" mc:Ignorable="w14 w15 w16se w16cid w16 w16cex w16sdtdh wp14">
   <w:p>
     <w:pPr>
       <w:pStyle w:val="PiedepginaAsignatura"/>
@@ -4961,7 +4422,7 @@
         </mc:Choice>
         <mc:Fallback>
           <w:pict>
-            <v:rect w14:anchorId="69563B54" id="Rectángulo 65" o:spid="_x0000_s1026" style="position:absolute;left:0;text-align:left;margin-left:11.25pt;margin-top:793.1pt;width:19.8pt;height:48.2pt;z-index:-251615232;visibility:visible;mso-wrap-style:square;mso-width-percent:0;mso-height-percent:0;mso-wrap-distance-left:9pt;mso-wrap-distance-top:0;mso-wrap-distance-right:19.85pt;mso-wrap-distance-bottom:0;mso-position-horizontal:absolute;mso-position-horizontal-relative:right-margin-area;mso-position-vertical:absolute;mso-position-vertical-relative:page;mso-width-percent:0;mso-height-percent:0;mso-width-relative:margin;mso-height-relative:margin;v-text-anchor:top" o:gfxdata="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" o:allowoverlap="f" fillcolor="#0098cd" stroked="f" strokeweight="1pt">
+            <v:rect w14:anchorId="69563B54" id="Rectángulo 65" o:spid="_x0000_s1026" style="position:absolute;left:0;text-align:left;margin-left:11.25pt;margin-top:793.1pt;width:19.8pt;height:48.2pt;z-index:-251615232;visibility:visible;mso-wrap-style:square;mso-width-percent:0;mso-height-percent:0;mso-wrap-distance-left:9pt;mso-wrap-distance-top:0;mso-wrap-distance-right:19.85pt;mso-wrap-distance-bottom:0;mso-position-horizontal:absolute;mso-position-horizontal-relative:right-margin-area;mso-position-vertical:absolute;mso-position-vertical-relative:page;mso-width-percent:0;mso-height-percent:0;mso-width-relative:margin;mso-height-relative:margin;v-text-anchor:top" o:gfxdata="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" o:allowoverlap="f" fillcolor="#0098cd" stroked="f" strokeweight="1pt">
               <v:textbox inset="0,4mm,0">
                 <w:txbxContent>
                   <w:p>
@@ -5045,7 +4506,7 @@
 </file>
 
 <file path=word/footnotes.xml><?xml version="1.0" encoding="utf-8"?>
-<w:footnotes xmlns:wpc="http://schemas.microsoft.com/office/word/2010/wordprocessingCanvas" xmlns:cx="http://schemas.microsoft.com/office/drawing/2014/chartex" xmlns:cx1="http://schemas.microsoft.com/office/drawing/2015/9/8/chartex" xmlns:cx2="http://schemas.microsoft.com/office/drawing/2015/10/21/chartex" xmlns:cx3="http://schemas.microsoft.com/office/drawing/2016/5/9/chartex" xmlns:cx4="http://schemas.microsoft.com/office/drawing/2016/5/10/chartex" xmlns:cx5="http://schemas.microsoft.com/office/drawing/2016/5/11/chartex" xmlns:cx6="http://schemas.microsoft.com/office/drawing/2016/5/12/chartex" xmlns:cx7="http://schemas.microsoft.com/office/drawing/2016/5/13/chartex" xmlns:cx8="http://schemas.microsoft.com/office/drawing/2016/5/14/chartex" xmlns:mc="http://schemas.openxmlformats.org/markup-compatibility/2006" xmlns:aink="http://schemas.microsoft.com/office/drawing/2016/ink" xmlns:am3d="http://schemas.microsoft.com/office/drawing/2017/model3d" xmlns:o="urn:schemas-microsoft-com:office:office" xmlns:r="http://schemas.openxmlformats.org/officeDocument/2006/relationships" xmlns:m="http://schemas.openxmlformats.org/officeDocument/2006/math" xmlns:v="urn:schemas-microsoft-com:vml" xmlns:wp14="http://schemas.microsoft.com/office/word/2010/wordprocessingDrawing" xmlns:wp="http://schemas.openxmlformats.org/drawingml/2006/wordprocessingDrawing" xmlns:w10="urn:schemas-microsoft-com:office:word" xmlns:w="http://schemas.openxmlformats.org/wordprocessingml/2006/main" xmlns:w14="http://schemas.microsoft.com/office/word/2010/wordml" xmlns:w15="http://schemas.microsoft.com/office/word/2012/wordml" xmlns:w16cex="http://schemas.microsoft.com/office/word/2018/wordml/cex" xmlns:w16cid="http://schemas.microsoft.com/office/word/2016/wordml/cid" xmlns:w16="http://schemas.microsoft.com/office/word/2018/wordml" xmlns:w16sdtdh="http://schemas.microsoft.com/office/word/2020/wordml/sdtdatahash" xmlns:w16se="http://schemas.microsoft.com/office/word/2015/wordml/symex" xmlns:wpg="http://schemas.microsoft.com/office/word/2010/wordprocessingGroup" xmlns:wpi="http://schemas.microsoft.com/office/word/2010/wordprocessingInk" xmlns:wne="http://schemas.microsoft.com/office/word/2006/wordml" xmlns:wps="http://schemas.microsoft.com/office/word/2010/wordprocessingShape" mc:Ignorable="w14 w15 w16se w16cid w16 w16cex w16sdtdh wp14">
+<w:footnotes xmlns:wpc="http://schemas.microsoft.com/office/word/2010/wordprocessingCanvas" xmlns:cx="http://schemas.microsoft.com/office/drawing/2014/chartex" xmlns:cx1="http://schemas.microsoft.com/office/drawing/2015/9/8/chartex" xmlns:cx2="http://schemas.microsoft.com/office/drawing/2015/10/21/chartex" xmlns:cx3="http://schemas.microsoft.com/office/drawing/2016/5/9/chartex" xmlns:cx4="http://schemas.microsoft.com/office/drawing/2016/5/10/chartex" xmlns:cx5="http://schemas.microsoft.com/office/drawing/2016/5/11/chartex" xmlns:cx6="http://schemas.microsoft.com/office/drawing/2016/5/12/chartex" xmlns:cx7="http://schemas.microsoft.com/office/drawing/2016/5/13/chartex" xmlns:cx8="http://schemas.microsoft.com/office/drawing/2016/5/14/chartex" xmlns:mc="http://schemas.openxmlformats.org/markup-compatibility/2006" xmlns:aink="http://schemas.microsoft.com/office/drawing/2016/ink" xmlns:am3d="http://schemas.microsoft.com/office/drawing/2017/model3d" xmlns:o="urn:schemas-microsoft-com:office:office" xmlns:oel="http://schemas.microsoft.com/office/2019/extlst" xmlns:r="http://schemas.openxmlformats.org/officeDocument/2006/relationships" xmlns:m="http://schemas.openxmlformats.org/officeDocument/2006/math" xmlns:v="urn:schemas-microsoft-com:vml" xmlns:wp14="http://schemas.microsoft.com/office/word/2010/wordprocessingDrawing" xmlns:wp="http://schemas.openxmlformats.org/drawingml/2006/wordprocessingDrawing" xmlns:w10="urn:schemas-microsoft-com:office:word" xmlns:w="http://schemas.openxmlformats.org/wordprocessingml/2006/main" xmlns:w14="http://schemas.microsoft.com/office/word/2010/wordml" xmlns:w15="http://schemas.microsoft.com/office/word/2012/wordml" xmlns:w16cex="http://schemas.microsoft.com/office/word/2018/wordml/cex" xmlns:w16cid="http://schemas.microsoft.com/office/word/2016/wordml/cid" xmlns:w16="http://schemas.microsoft.com/office/word/2018/wordml" xmlns:w16du="http://schemas.microsoft.com/office/word/2023/wordml/word16du" xmlns:w16sdtdh="http://schemas.microsoft.com/office/word/2020/wordml/sdtdatahash" xmlns:w16se="http://schemas.microsoft.com/office/word/2015/wordml/symex" xmlns:wpg="http://schemas.microsoft.com/office/word/2010/wordprocessingGroup" xmlns:wpi="http://schemas.microsoft.com/office/word/2010/wordprocessingInk" xmlns:wne="http://schemas.microsoft.com/office/word/2006/wordml" xmlns:wps="http://schemas.microsoft.com/office/word/2010/wordprocessingShape" mc:Ignorable="w14 w15 w16se w16cid w16 w16cex w16sdtdh wp14">
   <w:footnote w:type="separator" w:id="-1">
     <w:p>
       <w:pPr>
@@ -5070,7 +4531,7 @@
 </file>
 
 <file path=word/header1.xml><?xml version="1.0" encoding="utf-8"?>
-<w:hdr xmlns:wpc="http://schemas.microsoft.com/office/word/2010/wordprocessingCanvas" xmlns:cx="http://schemas.microsoft.com/office/drawing/2014/chartex" xmlns:cx1="http://schemas.microsoft.com/office/drawing/2015/9/8/chartex" xmlns:cx2="http://schemas.microsoft.com/office/drawing/2015/10/21/chartex" xmlns:cx3="http://schemas.microsoft.com/office/drawing/2016/5/9/chartex" xmlns:cx4="http://schemas.microsoft.com/office/drawing/2016/5/10/chartex" xmlns:cx5="http://schemas.microsoft.com/office/drawing/2016/5/11/chartex" xmlns:cx6="http://schemas.microsoft.com/office/drawing/2016/5/12/chartex" xmlns:cx7="http://schemas.microsoft.com/office/drawing/2016/5/13/chartex" xmlns:cx8="http://schemas.microsoft.com/office/drawing/2016/5/14/chartex" xmlns:mc="http://schemas.openxmlformats.org/markup-compatibility/2006" xmlns:aink="http://schemas.microsoft.com/office/drawing/2016/ink" xmlns:am3d="http://schemas.microsoft.com/office/drawing/2017/model3d" xmlns:o="urn:schemas-microsoft-com:office:office" xmlns:r="http://schemas.openxmlformats.org/officeDocument/2006/relationships" xmlns:m="http://schemas.openxmlformats.org/officeDocument/2006/math" xmlns:v="urn:schemas-microsoft-com:vml" xmlns:wp14="http://schemas.microsoft.com/office/word/2010/wordprocessingDrawing" xmlns:wp="http://schemas.openxmlformats.org/drawingml/2006/wordprocessingDrawing" xmlns:w10="urn:schemas-microsoft-com:office:word" xmlns:w="http://schemas.openxmlformats.org/wordprocessingml/2006/main" xmlns:w14="http://schemas.microsoft.com/office/word/2010/wordml" xmlns:w15="http://schemas.microsoft.com/office/word/2012/wordml" xmlns:w16cex="http://schemas.microsoft.com/office/word/2018/wordml/cex" xmlns:w16cid="http://schemas.microsoft.com/office/word/2016/wordml/cid" xmlns:w16="http://schemas.microsoft.com/office/word/2018/wordml" xmlns:w16sdtdh="http://schemas.microsoft.com/office/word/2020/wordml/sdtdatahash" xmlns:w16se="http://schemas.microsoft.com/office/word/2015/wordml/symex" xmlns:wpg="http://schemas.microsoft.com/office/word/2010/wordprocessingGroup" xmlns:wpi="http://schemas.microsoft.com/office/word/2010/wordprocessingInk" xmlns:wne="http://schemas.microsoft.com/office/word/2006/wordml" xmlns:wps="http://schemas.microsoft.com/office/word/2010/wordprocessingShape" mc:Ignorable="w14 w15 w16se w16cid w16 w16cex w16sdtdh wp14">
+<w:hdr xmlns:wpc="http://schemas.microsoft.com/office/word/2010/wordprocessingCanvas" xmlns:cx="http://schemas.microsoft.com/office/drawing/2014/chartex" xmlns:cx1="http://schemas.microsoft.com/office/drawing/2015/9/8/chartex" xmlns:cx2="http://schemas.microsoft.com/office/drawing/2015/10/21/chartex" xmlns:cx3="http://schemas.microsoft.com/office/drawing/2016/5/9/chartex" xmlns:cx4="http://schemas.microsoft.com/office/drawing/2016/5/10/chartex" xmlns:cx5="http://schemas.microsoft.com/office/drawing/2016/5/11/chartex" xmlns:cx6="http://schemas.microsoft.com/office/drawing/2016/5/12/chartex" xmlns:cx7="http://schemas.microsoft.com/office/drawing/2016/5/13/chartex" xmlns:cx8="http://schemas.microsoft.com/office/drawing/2016/5/14/chartex" xmlns:mc="http://schemas.openxmlformats.org/markup-compatibility/2006" xmlns:aink="http://schemas.microsoft.com/office/drawing/2016/ink" xmlns:am3d="http://schemas.microsoft.com/office/drawing/2017/model3d" xmlns:o="urn:schemas-microsoft-com:office:office" xmlns:oel="http://schemas.microsoft.com/office/2019/extlst" xmlns:r="http://schemas.openxmlformats.org/officeDocument/2006/relationships" xmlns:m="http://schemas.openxmlformats.org/officeDocument/2006/math" xmlns:v="urn:schemas-microsoft-com:vml" xmlns:wp14="http://schemas.microsoft.com/office/word/2010/wordprocessingDrawing" xmlns:wp="http://schemas.openxmlformats.org/drawingml/2006/wordprocessingDrawing" xmlns:w10="urn:schemas-microsoft-com:office:word" xmlns:w="http://schemas.openxmlformats.org/wordprocessingml/2006/main" xmlns:w14="http://schemas.microsoft.com/office/word/2010/wordml" xmlns:w15="http://schemas.microsoft.com/office/word/2012/wordml" xmlns:w16cex="http://schemas.microsoft.com/office/word/2018/wordml/cex" xmlns:w16cid="http://schemas.microsoft.com/office/word/2016/wordml/cid" xmlns:w16="http://schemas.microsoft.com/office/word/2018/wordml" xmlns:w16du="http://schemas.microsoft.com/office/word/2023/wordml/word16du" xmlns:w16sdtdh="http://schemas.microsoft.com/office/word/2020/wordml/sdtdatahash" xmlns:w16se="http://schemas.microsoft.com/office/word/2015/wordml/symex" xmlns:wpg="http://schemas.microsoft.com/office/word/2010/wordprocessingGroup" xmlns:wpi="http://schemas.microsoft.com/office/word/2010/wordprocessingInk" xmlns:wne="http://schemas.microsoft.com/office/word/2006/wordml" xmlns:wps="http://schemas.microsoft.com/office/word/2010/wordprocessingShape" mc:Ignorable="w14 w15 w16se w16cid w16 w16cex w16sdtdh wp14">
   <w:tbl>
     <w:tblPr>
       <w:tblStyle w:val="TablaUNIR30"/>
@@ -5283,7 +4744,7 @@
 </file>
 
 <file path=word/numbering.xml><?xml version="1.0" encoding="utf-8"?>
-<w:numbering xmlns:wpc="http://schemas.microsoft.com/office/word/2010/wordprocessingCanvas" xmlns:cx="http://schemas.microsoft.com/office/drawing/2014/chartex" xmlns:cx1="http://schemas.microsoft.com/office/drawing/2015/9/8/chartex" xmlns:cx2="http://schemas.microsoft.com/office/drawing/2015/10/21/chartex" xmlns:cx3="http://schemas.microsoft.com/office/drawing/2016/5/9/chartex" xmlns:cx4="http://schemas.microsoft.com/office/drawing/2016/5/10/chartex" xmlns:cx5="http://schemas.microsoft.com/office/drawing/2016/5/11/chartex" xmlns:cx6="http://schemas.microsoft.com/office/drawing/2016/5/12/chartex" xmlns:cx7="http://schemas.microsoft.com/office/drawing/2016/5/13/chartex" xmlns:cx8="http://schemas.microsoft.com/office/drawing/2016/5/14/chartex" xmlns:mc="http://schemas.openxmlformats.org/markup-compatibility/2006" xmlns:aink="http://schemas.microsoft.com/office/drawing/2016/ink" xmlns:am3d="http://schemas.microsoft.com/office/drawing/2017/model3d" xmlns:o="urn:schemas-microsoft-com:office:office" xmlns:r="http://schemas.openxmlformats.org/officeDocument/2006/relationships" xmlns:m="http://schemas.openxmlformats.org/officeDocument/2006/math" xmlns:v="urn:schemas-microsoft-com:vml" xmlns:wp14="http://schemas.microsoft.com/office/word/2010/wordprocessingDrawing" xmlns:wp="http://schemas.openxmlformats.org/drawingml/2006/wordprocessingDrawing" xmlns:w10="urn:schemas-microsoft-com:office:word" xmlns:w="http://schemas.openxmlformats.org/wordprocessingml/2006/main" xmlns:w14="http://schemas.microsoft.com/office/word/2010/wordml" xmlns:w15="http://schemas.microsoft.com/office/word/2012/wordml" xmlns:w16cex="http://schemas.microsoft.com/office/word/2018/wordml/cex" xmlns:w16cid="http://schemas.microsoft.com/office/word/2016/wordml/cid" xmlns:w16="http://schemas.microsoft.com/office/word/2018/wordml" xmlns:w16sdtdh="http://schemas.microsoft.com/office/word/2020/wordml/sdtdatahash" xmlns:w16se="http://schemas.microsoft.com/office/word/2015/wordml/symex" xmlns:wpg="http://schemas.microsoft.com/office/word/2010/wordprocessingGroup" xmlns:wpi="http://schemas.microsoft.com/office/word/2010/wordprocessingInk" xmlns:wne="http://schemas.microsoft.com/office/word/2006/wordml" xmlns:wps="http://schemas.microsoft.com/office/word/2010/wordprocessingShape" mc:Ignorable="w14 w15 w16se w16cid w16 w16cex w16sdtdh wp14">
+<w:numbering xmlns:wpc="http://schemas.microsoft.com/office/word/2010/wordprocessingCanvas" xmlns:cx="http://schemas.microsoft.com/office/drawing/2014/chartex" xmlns:cx1="http://schemas.microsoft.com/office/drawing/2015/9/8/chartex" xmlns:cx2="http://schemas.microsoft.com/office/drawing/2015/10/21/chartex" xmlns:cx3="http://schemas.microsoft.com/office/drawing/2016/5/9/chartex" xmlns:cx4="http://schemas.microsoft.com/office/drawing/2016/5/10/chartex" xmlns:cx5="http://schemas.microsoft.com/office/drawing/2016/5/11/chartex" xmlns:cx6="http://schemas.microsoft.com/office/drawing/2016/5/12/chartex" xmlns:cx7="http://schemas.microsoft.com/office/drawing/2016/5/13/chartex" xmlns:cx8="http://schemas.microsoft.com/office/drawing/2016/5/14/chartex" xmlns:mc="http://schemas.openxmlformats.org/markup-compatibility/2006" xmlns:aink="http://schemas.microsoft.com/office/drawing/2016/ink" xmlns:am3d="http://schemas.microsoft.com/office/drawing/2017/model3d" xmlns:o="urn:schemas-microsoft-com:office:office" xmlns:oel="http://schemas.microsoft.com/office/2019/extlst" xmlns:r="http://schemas.openxmlformats.org/officeDocument/2006/relationships" xmlns:m="http://schemas.openxmlformats.org/officeDocument/2006/math" xmlns:v="urn:schemas-microsoft-com:vml" xmlns:wp14="http://schemas.microsoft.com/office/word/2010/wordprocessingDrawing" xmlns:wp="http://schemas.openxmlformats.org/drawingml/2006/wordprocessingDrawing" xmlns:w10="urn:schemas-microsoft-com:office:word" xmlns:w="http://schemas.openxmlformats.org/wordprocessingml/2006/main" xmlns:w14="http://schemas.microsoft.com/office/word/2010/wordml" xmlns:w15="http://schemas.microsoft.com/office/word/2012/wordml" xmlns:w16cex="http://schemas.microsoft.com/office/word/2018/wordml/cex" xmlns:w16cid="http://schemas.microsoft.com/office/word/2016/wordml/cid" xmlns:w16="http://schemas.microsoft.com/office/word/2018/wordml" xmlns:w16du="http://schemas.microsoft.com/office/word/2023/wordml/word16du" xmlns:w16sdtdh="http://schemas.microsoft.com/office/word/2020/wordml/sdtdatahash" xmlns:w16se="http://schemas.microsoft.com/office/word/2015/wordml/symex" xmlns:wpg="http://schemas.microsoft.com/office/word/2010/wordprocessingGroup" xmlns:wpi="http://schemas.microsoft.com/office/word/2010/wordprocessingInk" xmlns:wne="http://schemas.microsoft.com/office/word/2006/wordml" xmlns:wps="http://schemas.microsoft.com/office/word/2010/wordprocessingShape" mc:Ignorable="w14 w15 w16se w16cid w16 w16cex w16sdtdh wp14">
   <w:abstractNum w:abstractNumId="0" w15:restartNumberingAfterBreak="0">
     <w:nsid w:val="009C15F1"/>
     <w:multiLevelType w:val="hybridMultilevel"/>
@@ -6384,123 +5845,24 @@
     <w:numStyleLink w:val="VietasUNIR"/>
   </w:abstractNum>
   <w:abstractNum w:abstractNumId="19" w15:restartNumberingAfterBreak="0">
-    <w:nsid w:val="31973022"/>
-    <w:multiLevelType w:val="multilevel"/>
-    <w:tmpl w:val="B37C3B20"/>
-    <w:lvl w:ilvl="0">
-      <w:numFmt w:val="decimal"/>
-      <w:pStyle w:val="PiedepginaSecciones"/>
-      <w:lvlText w:val=""/>
-      <w:lvlJc w:val="left"/>
-      <w:pPr>
-        <w:ind w:left="284" w:hanging="284"/>
-      </w:pPr>
-      <w:rPr>
-        <w:rFonts w:ascii="Wingdings 3" w:hAnsi="Wingdings 3" w:hint="default"/>
-        <w:color w:val="0098CD"/>
-        <w:sz w:val="18"/>
-      </w:rPr>
-    </w:lvl>
-    <w:lvl w:ilvl="1">
-      <w:numFmt w:val="decimal"/>
-      <w:lvlText w:val="•"/>
-      <w:lvlJc w:val="left"/>
-      <w:pPr>
-        <w:ind w:left="567" w:hanging="283"/>
-      </w:pPr>
-      <w:rPr>
-        <w:rFonts w:ascii="Calibri" w:hAnsi="Calibri" w:cs="Times New Roman" w:hint="default"/>
-        <w:color w:val="0098CD"/>
-        <w:sz w:val="22"/>
-      </w:rPr>
-    </w:lvl>
-    <w:lvl w:ilvl="2">
-      <w:numFmt w:val="decimal"/>
-      <w:lvlText w:val=""/>
-      <w:lvlJc w:val="left"/>
-      <w:pPr>
-        <w:ind w:left="851" w:hanging="284"/>
-      </w:pPr>
-      <w:rPr>
-        <w:rFonts w:ascii="Wingdings" w:hAnsi="Wingdings" w:hint="default"/>
-        <w:color w:val="0098CD"/>
-        <w:sz w:val="24"/>
-      </w:rPr>
-    </w:lvl>
-    <w:lvl w:ilvl="3">
-      <w:start w:val="1"/>
-      <w:numFmt w:val="decimal"/>
-      <w:lvlText w:val="(%4)"/>
-      <w:lvlJc w:val="left"/>
-      <w:pPr>
-        <w:ind w:left="2160" w:hanging="360"/>
-      </w:pPr>
-    </w:lvl>
-    <w:lvl w:ilvl="4">
-      <w:start w:val="1"/>
-      <w:numFmt w:val="lowerLetter"/>
-      <w:lvlText w:val="(%5)"/>
-      <w:lvlJc w:val="left"/>
-      <w:pPr>
-        <w:ind w:left="2520" w:hanging="360"/>
-      </w:pPr>
-    </w:lvl>
-    <w:lvl w:ilvl="5">
-      <w:start w:val="1"/>
-      <w:numFmt w:val="lowerRoman"/>
-      <w:lvlText w:val="(%6)"/>
-      <w:lvlJc w:val="left"/>
-      <w:pPr>
-        <w:ind w:left="2880" w:hanging="360"/>
-      </w:pPr>
-    </w:lvl>
-    <w:lvl w:ilvl="6">
-      <w:start w:val="1"/>
-      <w:numFmt w:val="decimal"/>
-      <w:lvlText w:val="%7."/>
-      <w:lvlJc w:val="left"/>
-      <w:pPr>
-        <w:ind w:left="3240" w:hanging="360"/>
-      </w:pPr>
-    </w:lvl>
-    <w:lvl w:ilvl="7">
-      <w:start w:val="1"/>
-      <w:numFmt w:val="lowerLetter"/>
-      <w:lvlText w:val="%8."/>
-      <w:lvlJc w:val="left"/>
-      <w:pPr>
-        <w:ind w:left="3600" w:hanging="360"/>
-      </w:pPr>
-    </w:lvl>
-    <w:lvl w:ilvl="8">
-      <w:start w:val="1"/>
-      <w:numFmt w:val="lowerRoman"/>
-      <w:lvlText w:val="%9."/>
-      <w:lvlJc w:val="left"/>
-      <w:pPr>
-        <w:ind w:left="3960" w:hanging="360"/>
-      </w:pPr>
-    </w:lvl>
-  </w:abstractNum>
-  <w:abstractNum w:abstractNumId="20" w15:restartNumberingAfterBreak="0">
     <w:nsid w:val="31C63678"/>
     <w:multiLevelType w:val="multilevel"/>
     <w:tmpl w:val="B0E0186E"/>
     <w:numStyleLink w:val="NmeracinTest"/>
   </w:abstractNum>
-  <w:abstractNum w:abstractNumId="21" w15:restartNumberingAfterBreak="0">
+  <w:abstractNum w:abstractNumId="20" w15:restartNumberingAfterBreak="0">
     <w:nsid w:val="374D34AD"/>
     <w:multiLevelType w:val="multilevel"/>
     <w:tmpl w:val="B37C3B20"/>
     <w:numStyleLink w:val="VietasUNIR"/>
   </w:abstractNum>
-  <w:abstractNum w:abstractNumId="22" w15:restartNumberingAfterBreak="0">
+  <w:abstractNum w:abstractNumId="21" w15:restartNumberingAfterBreak="0">
     <w:nsid w:val="3798755D"/>
     <w:multiLevelType w:val="multilevel"/>
     <w:tmpl w:val="B37C3B20"/>
     <w:numStyleLink w:val="VietasUNIR"/>
   </w:abstractNum>
-  <w:abstractNum w:abstractNumId="23" w15:restartNumberingAfterBreak="0">
+  <w:abstractNum w:abstractNumId="22" w15:restartNumberingAfterBreak="0">
     <w:nsid w:val="434A2C50"/>
     <w:multiLevelType w:val="hybridMultilevel"/>
     <w:tmpl w:val="653E76B8"/>
@@ -6614,19 +5976,19 @@
       </w:rPr>
     </w:lvl>
   </w:abstractNum>
-  <w:abstractNum w:abstractNumId="24" w15:restartNumberingAfterBreak="0">
+  <w:abstractNum w:abstractNumId="23" w15:restartNumberingAfterBreak="0">
     <w:nsid w:val="4BE26EC1"/>
     <w:multiLevelType w:val="multilevel"/>
     <w:tmpl w:val="FCB6914A"/>
     <w:numStyleLink w:val="VietasUNIRcombinada"/>
   </w:abstractNum>
-  <w:abstractNum w:abstractNumId="25" w15:restartNumberingAfterBreak="0">
+  <w:abstractNum w:abstractNumId="24" w15:restartNumberingAfterBreak="0">
     <w:nsid w:val="4D255449"/>
     <w:multiLevelType w:val="multilevel"/>
     <w:tmpl w:val="B37C3B20"/>
     <w:numStyleLink w:val="VietasUNIR"/>
   </w:abstractNum>
-  <w:abstractNum w:abstractNumId="26" w15:restartNumberingAfterBreak="0">
+  <w:abstractNum w:abstractNumId="25" w15:restartNumberingAfterBreak="0">
     <w:nsid w:val="5DDA331F"/>
     <w:multiLevelType w:val="hybridMultilevel"/>
     <w:tmpl w:val="D0C00564"/>
@@ -6740,7 +6102,7 @@
       </w:rPr>
     </w:lvl>
   </w:abstractNum>
-  <w:abstractNum w:abstractNumId="27" w15:restartNumberingAfterBreak="0">
+  <w:abstractNum w:abstractNumId="26" w15:restartNumberingAfterBreak="0">
     <w:nsid w:val="5ED2698D"/>
     <w:multiLevelType w:val="hybridMultilevel"/>
     <w:tmpl w:val="243C728E"/>
@@ -6853,7 +6215,7 @@
       </w:rPr>
     </w:lvl>
   </w:abstractNum>
-  <w:abstractNum w:abstractNumId="28" w15:restartNumberingAfterBreak="0">
+  <w:abstractNum w:abstractNumId="27" w15:restartNumberingAfterBreak="0">
     <w:nsid w:val="617F1B7A"/>
     <w:multiLevelType w:val="hybridMultilevel"/>
     <w:tmpl w:val="AD32CCA2"/>
@@ -6967,7 +6329,7 @@
       </w:rPr>
     </w:lvl>
   </w:abstractNum>
-  <w:abstractNum w:abstractNumId="29" w15:restartNumberingAfterBreak="0">
+  <w:abstractNum w:abstractNumId="28" w15:restartNumberingAfterBreak="0">
     <w:nsid w:val="62440D96"/>
     <w:multiLevelType w:val="multilevel"/>
     <w:tmpl w:val="B0E0186E"/>
@@ -7092,7 +6454,7 @@
       </w:rPr>
     </w:lvl>
   </w:abstractNum>
-  <w:abstractNum w:abstractNumId="30" w15:restartNumberingAfterBreak="0">
+  <w:abstractNum w:abstractNumId="29" w15:restartNumberingAfterBreak="0">
     <w:nsid w:val="63A2795F"/>
     <w:multiLevelType w:val="hybridMultilevel"/>
     <w:tmpl w:val="104476D4"/>
@@ -7206,7 +6568,7 @@
       </w:rPr>
     </w:lvl>
   </w:abstractNum>
-  <w:abstractNum w:abstractNumId="31" w15:restartNumberingAfterBreak="0">
+  <w:abstractNum w:abstractNumId="30" w15:restartNumberingAfterBreak="0">
     <w:nsid w:val="67381F71"/>
     <w:multiLevelType w:val="hybridMultilevel"/>
     <w:tmpl w:val="F604AC98"/>
@@ -7319,13 +6681,13 @@
       </w:rPr>
     </w:lvl>
   </w:abstractNum>
-  <w:abstractNum w:abstractNumId="32" w15:restartNumberingAfterBreak="0">
+  <w:abstractNum w:abstractNumId="31" w15:restartNumberingAfterBreak="0">
     <w:nsid w:val="674218A6"/>
     <w:multiLevelType w:val="multilevel"/>
     <w:tmpl w:val="B37C3B20"/>
     <w:numStyleLink w:val="VietasUNIR"/>
   </w:abstractNum>
-  <w:abstractNum w:abstractNumId="33" w15:restartNumberingAfterBreak="0">
+  <w:abstractNum w:abstractNumId="32" w15:restartNumberingAfterBreak="0">
     <w:nsid w:val="67EA536A"/>
     <w:multiLevelType w:val="hybridMultilevel"/>
     <w:tmpl w:val="826A9374"/>
@@ -7440,13 +6802,13 @@
       </w:rPr>
     </w:lvl>
   </w:abstractNum>
-  <w:abstractNum w:abstractNumId="34" w15:restartNumberingAfterBreak="0">
+  <w:abstractNum w:abstractNumId="33" w15:restartNumberingAfterBreak="0">
     <w:nsid w:val="68EB5908"/>
     <w:multiLevelType w:val="multilevel"/>
     <w:tmpl w:val="B37C3B20"/>
     <w:numStyleLink w:val="VietasUNIR"/>
   </w:abstractNum>
-  <w:abstractNum w:abstractNumId="35" w15:restartNumberingAfterBreak="0">
+  <w:abstractNum w:abstractNumId="34" w15:restartNumberingAfterBreak="0">
     <w:nsid w:val="6A5D4437"/>
     <w:multiLevelType w:val="multilevel"/>
     <w:tmpl w:val="FCB6914A"/>
@@ -7567,13 +6929,13 @@
       </w:rPr>
     </w:lvl>
   </w:abstractNum>
-  <w:abstractNum w:abstractNumId="36" w15:restartNumberingAfterBreak="0">
+  <w:abstractNum w:abstractNumId="35" w15:restartNumberingAfterBreak="0">
     <w:nsid w:val="6C542083"/>
     <w:multiLevelType w:val="multilevel"/>
     <w:tmpl w:val="B0E0186E"/>
     <w:numStyleLink w:val="NmeracinTest"/>
   </w:abstractNum>
-  <w:abstractNum w:abstractNumId="37" w15:restartNumberingAfterBreak="0">
+  <w:abstractNum w:abstractNumId="36" w15:restartNumberingAfterBreak="0">
     <w:nsid w:val="7A37623B"/>
     <w:multiLevelType w:val="hybridMultilevel"/>
     <w:tmpl w:val="78AE0B2A"/>
@@ -7687,13 +7049,13 @@
       </w:rPr>
     </w:lvl>
   </w:abstractNum>
-  <w:abstractNum w:abstractNumId="38" w15:restartNumberingAfterBreak="0">
+  <w:abstractNum w:abstractNumId="37" w15:restartNumberingAfterBreak="0">
     <w:nsid w:val="7D254355"/>
     <w:multiLevelType w:val="multilevel"/>
     <w:tmpl w:val="B37C3B20"/>
     <w:numStyleLink w:val="VietasUNIR"/>
   </w:abstractNum>
-  <w:abstractNum w:abstractNumId="39" w15:restartNumberingAfterBreak="0">
+  <w:abstractNum w:abstractNumId="38" w15:restartNumberingAfterBreak="0">
     <w:nsid w:val="7FF07B1A"/>
     <w:multiLevelType w:val="multilevel"/>
     <w:tmpl w:val="F51E1A7A"/>
@@ -7817,118 +7179,118 @@
       </w:rPr>
     </w:lvl>
   </w:abstractNum>
-  <w:num w:numId="1">
+  <w:num w:numId="1" w16cid:durableId="65154720">
     <w:abstractNumId w:val="1"/>
   </w:num>
-  <w:num w:numId="2">
+  <w:num w:numId="2" w16cid:durableId="229654928">
+    <w:abstractNumId w:val="20"/>
+  </w:num>
+  <w:num w:numId="3" w16cid:durableId="219900967">
+    <w:abstractNumId w:val="37"/>
+  </w:num>
+  <w:num w:numId="4" w16cid:durableId="536740004">
     <w:abstractNumId w:val="21"/>
   </w:num>
-  <w:num w:numId="3">
+  <w:num w:numId="5" w16cid:durableId="2081126267">
+    <w:abstractNumId w:val="11"/>
+  </w:num>
+  <w:num w:numId="6" w16cid:durableId="382826037">
+    <w:abstractNumId w:val="4"/>
+  </w:num>
+  <w:num w:numId="7" w16cid:durableId="1703362077">
+    <w:abstractNumId w:val="28"/>
+  </w:num>
+  <w:num w:numId="8" w16cid:durableId="1142699645">
+    <w:abstractNumId w:val="9"/>
+  </w:num>
+  <w:num w:numId="9" w16cid:durableId="1299653461">
+    <w:abstractNumId w:val="34"/>
+  </w:num>
+  <w:num w:numId="10" w16cid:durableId="2049835816">
+    <w:abstractNumId w:val="2"/>
+  </w:num>
+  <w:num w:numId="11" w16cid:durableId="774790191">
     <w:abstractNumId w:val="38"/>
   </w:num>
-  <w:num w:numId="4">
+  <w:num w:numId="12" w16cid:durableId="939869917">
+    <w:abstractNumId w:val="3"/>
+  </w:num>
+  <w:num w:numId="13" w16cid:durableId="444545994">
+    <w:abstractNumId w:val="17"/>
+  </w:num>
+  <w:num w:numId="14" w16cid:durableId="1309165853">
+    <w:abstractNumId w:val="19"/>
+  </w:num>
+  <w:num w:numId="15" w16cid:durableId="395397614">
+    <w:abstractNumId w:val="33"/>
+  </w:num>
+  <w:num w:numId="16" w16cid:durableId="1341077849">
+    <w:abstractNumId w:val="24"/>
+  </w:num>
+  <w:num w:numId="17" w16cid:durableId="326902560">
+    <w:abstractNumId w:val="18"/>
+  </w:num>
+  <w:num w:numId="18" w16cid:durableId="1990593177">
+    <w:abstractNumId w:val="35"/>
+  </w:num>
+  <w:num w:numId="19" w16cid:durableId="957682665">
+    <w:abstractNumId w:val="5"/>
+  </w:num>
+  <w:num w:numId="20" w16cid:durableId="711349889">
+    <w:abstractNumId w:val="16"/>
+  </w:num>
+  <w:num w:numId="21" w16cid:durableId="1687823511">
+    <w:abstractNumId w:val="23"/>
+  </w:num>
+  <w:num w:numId="22" w16cid:durableId="1743211991">
+    <w:abstractNumId w:val="15"/>
+  </w:num>
+  <w:num w:numId="23" w16cid:durableId="1402143776">
+    <w:abstractNumId w:val="8"/>
+  </w:num>
+  <w:num w:numId="24" w16cid:durableId="245382589">
     <w:abstractNumId w:val="22"/>
   </w:num>
-  <w:num w:numId="5">
-    <w:abstractNumId w:val="11"/>
+  <w:num w:numId="25" w16cid:durableId="1259370785">
+    <w:abstractNumId w:val="32"/>
   </w:num>
-  <w:num w:numId="6">
-    <w:abstractNumId w:val="4"/>
+  <w:num w:numId="26" w16cid:durableId="676469566">
+    <w:abstractNumId w:val="10"/>
   </w:num>
-  <w:num w:numId="7">
+  <w:num w:numId="27" w16cid:durableId="1342779486">
+    <w:abstractNumId w:val="31"/>
+  </w:num>
+  <w:num w:numId="28" w16cid:durableId="536968516">
+    <w:abstractNumId w:val="25"/>
+  </w:num>
+  <w:num w:numId="29" w16cid:durableId="593779655">
+    <w:abstractNumId w:val="7"/>
+  </w:num>
+  <w:num w:numId="30" w16cid:durableId="89816925">
+    <w:abstractNumId w:val="36"/>
+  </w:num>
+  <w:num w:numId="31" w16cid:durableId="1810046856">
+    <w:abstractNumId w:val="27"/>
+  </w:num>
+  <w:num w:numId="32" w16cid:durableId="1770849483">
     <w:abstractNumId w:val="29"/>
   </w:num>
-  <w:num w:numId="8">
-    <w:abstractNumId w:val="9"/>
+  <w:num w:numId="33" w16cid:durableId="1058630402">
+    <w:abstractNumId w:val="30"/>
   </w:num>
-  <w:num w:numId="9">
-    <w:abstractNumId w:val="35"/>
+  <w:num w:numId="34" w16cid:durableId="1194150647">
+    <w:abstractNumId w:val="13"/>
   </w:num>
-  <w:num w:numId="10">
-    <w:abstractNumId w:val="2"/>
+  <w:num w:numId="35" w16cid:durableId="816532062">
+    <w:abstractNumId w:val="0"/>
   </w:num>
-  <w:num w:numId="11">
-    <w:abstractNumId w:val="39"/>
-  </w:num>
-  <w:num w:numId="12">
-    <w:abstractNumId w:val="3"/>
-  </w:num>
-  <w:num w:numId="13">
-    <w:abstractNumId w:val="17"/>
-  </w:num>
-  <w:num w:numId="14">
-    <w:abstractNumId w:val="20"/>
-  </w:num>
-  <w:num w:numId="15">
-    <w:abstractNumId w:val="34"/>
-  </w:num>
-  <w:num w:numId="16">
-    <w:abstractNumId w:val="25"/>
-  </w:num>
-  <w:num w:numId="17">
-    <w:abstractNumId w:val="18"/>
-  </w:num>
-  <w:num w:numId="18">
-    <w:abstractNumId w:val="36"/>
-  </w:num>
-  <w:num w:numId="19">
-    <w:abstractNumId w:val="5"/>
-  </w:num>
-  <w:num w:numId="20">
-    <w:abstractNumId w:val="16"/>
-  </w:num>
-  <w:num w:numId="21">
-    <w:abstractNumId w:val="24"/>
-  </w:num>
-  <w:num w:numId="22">
-    <w:abstractNumId w:val="15"/>
-  </w:num>
-  <w:num w:numId="23">
-    <w:abstractNumId w:val="8"/>
-  </w:num>
-  <w:num w:numId="24">
-    <w:abstractNumId w:val="23"/>
-  </w:num>
-  <w:num w:numId="25">
-    <w:abstractNumId w:val="33"/>
-  </w:num>
-  <w:num w:numId="26">
-    <w:abstractNumId w:val="10"/>
-  </w:num>
-  <w:num w:numId="27">
-    <w:abstractNumId w:val="32"/>
-  </w:num>
-  <w:num w:numId="28">
+  <w:num w:numId="36" w16cid:durableId="985933748">
     <w:abstractNumId w:val="26"/>
   </w:num>
-  <w:num w:numId="29">
-    <w:abstractNumId w:val="7"/>
-  </w:num>
-  <w:num w:numId="30">
-    <w:abstractNumId w:val="37"/>
-  </w:num>
-  <w:num w:numId="31">
-    <w:abstractNumId w:val="28"/>
-  </w:num>
-  <w:num w:numId="32">
-    <w:abstractNumId w:val="30"/>
-  </w:num>
-  <w:num w:numId="33">
-    <w:abstractNumId w:val="31"/>
-  </w:num>
-  <w:num w:numId="34">
-    <w:abstractNumId w:val="13"/>
-  </w:num>
-  <w:num w:numId="35">
-    <w:abstractNumId w:val="0"/>
-  </w:num>
-  <w:num w:numId="36">
-    <w:abstractNumId w:val="27"/>
-  </w:num>
-  <w:num w:numId="37">
+  <w:num w:numId="37" w16cid:durableId="636684292">
     <w:abstractNumId w:val="14"/>
   </w:num>
-  <w:num w:numId="38">
+  <w:num w:numId="38" w16cid:durableId="1168592464">
     <w:abstractNumId w:val="6"/>
     <w:lvlOverride w:ilvl="0"/>
     <w:lvlOverride w:ilvl="1"/>
@@ -7952,11 +7314,8 @@
       <w:startOverride w:val="1"/>
     </w:lvlOverride>
   </w:num>
-  <w:num w:numId="39">
+  <w:num w:numId="39" w16cid:durableId="1401444264">
     <w:abstractNumId w:val="12"/>
-  </w:num>
-  <w:num w:numId="40">
-    <w:abstractNumId w:val="19"/>
   </w:num>
   <w:numIdMacAtCleanup w:val="10"/>
 </w:numbering>
@@ -10189,6 +9548,19 @@
 </file>
 
 <file path=customXml/item2.xml><?xml version="1.0" encoding="utf-8"?>
+<?mso-contentType ?>
+<FormTemplates xmlns="http://schemas.microsoft.com/sharepoint/v3/contenttype/forms">
+  <Display>DocumentLibraryForm</Display>
+  <Edit>DocumentLibraryForm</Edit>
+  <New>DocumentLibraryForm</New>
+</FormTemplates>
+</file>
+
+<file path=customXml/item3.xml><?xml version="1.0" encoding="utf-8"?>
+<b:Sources xmlns:b="http://schemas.openxmlformats.org/officeDocument/2006/bibliography" xmlns="http://schemas.openxmlformats.org/officeDocument/2006/bibliography" SelectedStyle="\APASixthEditionOfficeOnline.xsl" StyleName="APA" Version="6"/>
+</file>
+
+<file path=customXml/item4.xml><?xml version="1.0" encoding="utf-8"?>
 <p:properties xmlns:p="http://schemas.microsoft.com/office/2006/metadata/properties" xmlns:xsi="http://www.w3.org/2001/XMLSchema-instance" xmlns:pc="http://schemas.microsoft.com/office/infopath/2007/PartnerControls">
   <documentManagement>
     <lcf76f155ced4ddcb4097134ff3c332f xmlns="27c1adeb-3674-457c-b08c-8a73f31b6e23">
@@ -10198,19 +9570,6 @@
     <_Flow_SignoffStatus xmlns="27c1adeb-3674-457c-b08c-8a73f31b6e23" xsi:nil="true"/>
   </documentManagement>
 </p:properties>
-</file>
-
-<file path=customXml/item3.xml><?xml version="1.0" encoding="utf-8"?>
-<b:Sources xmlns:b="http://schemas.openxmlformats.org/officeDocument/2006/bibliography" xmlns="http://schemas.openxmlformats.org/officeDocument/2006/bibliography" SelectedStyle="\APASixthEditionOfficeOnline.xsl" StyleName="APA" Version="6"/>
-</file>
-
-<file path=customXml/item4.xml><?xml version="1.0" encoding="utf-8"?>
-<?mso-contentType ?>
-<FormTemplates xmlns="http://schemas.microsoft.com/sharepoint/v3/contenttype/forms">
-  <Display>DocumentLibraryForm</Display>
-  <Edit>DocumentLibraryForm</Edit>
-  <New>DocumentLibraryForm</New>
-</FormTemplates>
 </file>
 
 <file path=customXml/itemProps1.xml><?xml version="1.0" encoding="utf-8"?>
@@ -10233,12 +9592,9 @@
 </file>
 
 <file path=customXml/itemProps2.xml><?xml version="1.0" encoding="utf-8"?>
-<ds:datastoreItem xmlns:ds="http://schemas.openxmlformats.org/officeDocument/2006/customXml" ds:itemID="{5DA6F32C-6FAE-4705-8722-B42C5F1E24E2}">
+<ds:datastoreItem xmlns:ds="http://schemas.openxmlformats.org/officeDocument/2006/customXml" ds:itemID="{DADA22EA-30AF-48ED-8DC0-06AFFED52517}">
   <ds:schemaRefs>
-    <ds:schemaRef ds:uri="http://schemas.microsoft.com/office/2006/metadata/properties"/>
-    <ds:schemaRef ds:uri="http://schemas.microsoft.com/office/infopath/2007/PartnerControls"/>
-    <ds:schemaRef ds:uri="27c1adeb-3674-457c-b08c-8a73f31b6e23"/>
-    <ds:schemaRef ds:uri="0a70e875-3d35-4be2-921f-7117c31bab9b"/>
+    <ds:schemaRef ds:uri="http://schemas.microsoft.com/sharepoint/v3/contenttype/forms"/>
   </ds:schemaRefs>
 </ds:datastoreItem>
 </file>
@@ -10252,9 +9608,12 @@
 </file>
 
 <file path=customXml/itemProps4.xml><?xml version="1.0" encoding="utf-8"?>
-<ds:datastoreItem xmlns:ds="http://schemas.openxmlformats.org/officeDocument/2006/customXml" ds:itemID="{DADA22EA-30AF-48ED-8DC0-06AFFED52517}">
+<ds:datastoreItem xmlns:ds="http://schemas.openxmlformats.org/officeDocument/2006/customXml" ds:itemID="{5DA6F32C-6FAE-4705-8722-B42C5F1E24E2}">
   <ds:schemaRefs>
-    <ds:schemaRef ds:uri="http://schemas.microsoft.com/sharepoint/v3/contenttype/forms"/>
+    <ds:schemaRef ds:uri="http://schemas.microsoft.com/office/2006/metadata/properties"/>
+    <ds:schemaRef ds:uri="http://schemas.microsoft.com/office/infopath/2007/PartnerControls"/>
+    <ds:schemaRef ds:uri="27c1adeb-3674-457c-b08c-8a73f31b6e23"/>
+    <ds:schemaRef ds:uri="0a70e875-3d35-4be2-921f-7117c31bab9b"/>
   </ds:schemaRefs>
 </ds:datastoreItem>
 </file>
</xml_diff>